<commit_message>
Finalize BTech and IEEE manuscripts with aligned benchmarks
</commit_message>
<xml_diff>
--- a/outputs/Benevente_Wealth_System_BTECH_Final.docx
+++ b/outputs/Benevente_Wealth_System_BTECH_Final.docx
@@ -15,242 +15,212 @@
     <w:p>
       <w:pPr/>
       <w:r>
+        <w:t>Artigo tecnológico submetido ao 6º Business Tech Congress, 2026.</w:t>
+      </w:r>
+    </w:p>
+    <w:p>
+      <w:pPr>
+        <w:pStyle w:val="Heading1"/>
+      </w:pPr>
+      <w:r>
+        <w:t>Resumo</w:t>
+      </w:r>
+    </w:p>
+    <w:p>
+      <w:pPr/>
+      <w:r>
+        <w:t>Escritórios de investimento capixabas, entre multi-family offices, consultorias de valores mobiliários e assessorias, recomendam carteiras que precisam ser justificadas meses depois de montadas, diante do cliente, da área de conformidade ou do regulador. Três perguntas voltam sempre: quais dados existiam na data da decisão, qual regra foi aplicada sobre eles e quem aprovou. Planilha não responde nenhuma. Plataforma de terceiro costuma responder à segunda de forma opaca. Este trabalho tem como objetivo construir e avaliar o Benevente Wealth System, um artefato de software que produz a proposta de carteira e sua trilha de auditoria no mesmo ato. A avaliação combina design science, seleção anual aninhada e teste histórico sequencial. Cada decisão sai acompanhada da política vigente, dos fundamentos recebidos pela CVM até a data de corte, da elegibilidade com o motivo de cada reprovação, dos pesos, das ordens propostas com lote e participação no volume, do custo estimado e do SHA-256 dos arquivos que geraram os números. O artefato foi avaliado em onze decisões anuais, de 2015 a 2025, sobre um painel da B3 reconstruído do arquivo histórico de cotações e que conserva 166 emissores que deixam de negociar antes do fim da amostra. A carteira publicada, denominada Benevente 1, rendeu 17,86% ao ano após custos, ou 16,03% após imposto de renda, contra 11,77% do Ibovespa, 9,61% do CDI e 7,83% de uma otimização média-variância independente sobre o mesmo universo elegível. Venceu o mercado em sete dos onze anos e a otimização neutra em dez. Uma extensão experimental, Benevente 2, preserva a seleção anual e reduz temporariamente a exposição quando queda e volatilidade observadas no fechamento anterior ultrapassam limiares registrados. Na amostra completa ela reduziu a queda máxima de 47,8% para 28,7%, mas no recorte temporal de 2019 a 2025 não demonstrou retorno adicional (p = 0,964). Reportamos também o que não funcionou: previsão anual de regime, realocação mensal e semanal da proporção entre ações e caixa, reseleção mais frequente da própria cesta e o uso de um modelo de linguagem como fonte de retorno. A contribuição tecnológica não é uma promessa de rentabilidade. É um sistema verificável que separa dado, regra, alocação, explicação e aprovação, inclusive quando uma melhoria protege o capital sem comprovar alfa.</w:t>
+      </w:r>
+    </w:p>
+    <w:p>
+      <w:pPr/>
+      <w:r>
+        <w:t>Palavras-chave: governança de investimentos; trilha de auditoria; alocação de carteira; informação disponível na data; viés de sobrevivência; pesquisa reprodutível.</w:t>
+      </w:r>
+    </w:p>
+    <w:p>
+      <w:pPr>
+        <w:pStyle w:val="Heading1"/>
+      </w:pPr>
+      <w:r>
+        <w:t>1. Introdução: problema, objetivo e contribuição</w:t>
+      </w:r>
+    </w:p>
+    <w:p>
+      <w:pPr/>
+      <w:r>
+        <w:t>Este trabalho parte de uma hipótese de mercado a ser validada no piloto: escritórios do Espírito Santo que mantêm o relacionamento com famílias e empresas locais podem depender de infraestrutura de decisão produzida fora do estado. O problema proposto não é falta de competência analítica. É a ausência de uma ferramenta que produza, no ato da recomendação, o registro que a recomendação vai exigir depois. A pesquisa ainda não mede o tamanho desse mercado, a disposição a pagar ou a taxa de adoção. Portanto, retenção de capital e geração de negócios no estado são resultados esperados do produto, não resultados já comprovados.</w:t>
+      </w:r>
+    </w:p>
+    <w:p>
+      <w:pPr/>
+      <w:r>
+        <w:t>O problema é concreto e tem data. Quando um cliente pergunta em 2026 por que determinada ação entrou na carteira em janeiro de 2023, o escritório precisa demonstrar três coisas simultaneamente.</w:t>
+      </w:r>
+    </w:p>
+    <w:p>
+      <w:pPr>
+        <w:spacing w:line="360" w:lineRule="auto"/>
+        <w:ind w:left="369" w:hanging="227"/>
+      </w:pPr>
+      <w:r>
+        <w:t>1. Quais dados existiam naquela data. Um balanço republicado em 2024 não pode aparecer como se estivesse disponível em janeiro de 2023. Sem controle de data de recebimento, todo backtest e toda justificativa ficam contaminados por informação que ninguém tinha.</w:t>
+      </w:r>
+    </w:p>
+    <w:p>
+      <w:pPr>
+        <w:spacing w:line="360" w:lineRule="auto"/>
+        <w:ind w:left="369" w:hanging="227"/>
+      </w:pPr>
+      <w:r>
+        <w:t>2. Qual regra foi aplicada. Não a regra que o escritório usa hoje, mas a que estava vigente naquele janeiro, com os limites que estavam vigentes.</w:t>
+      </w:r>
+    </w:p>
+    <w:p>
+      <w:pPr>
+        <w:spacing w:line="360" w:lineRule="auto"/>
+        <w:ind w:left="369" w:hanging="227"/>
+      </w:pPr>
+      <w:r>
+        <w:t>3. Quem aprovou. Uma decisão de alocação sem responsável identificado não é auditável, e a automação sem aprovação humana desloca a responsabilidade para um sistema que não pode respondê-la.</w:t>
+      </w:r>
+    </w:p>
+    <w:p>
+      <w:pPr/>
+      <w:r>
+        <w:t>Planilhas falham nas três: sobrescrevem o estado anterior, misturam regra e dado, e não guardam autoria. Plataformas de terceiros costumam responder à segunda pergunta com uma caixa fechada, entregando ao escritório a carteira e não o critério. Nenhuma das duas alternativas serve a quem responde pela decisão.</w:t>
+      </w:r>
+    </w:p>
+    <w:p>
+      <w:pPr/>
+      <w:r>
+        <w:t>A questão que orienta este trabalho é, portanto, de engenharia e de governança antes de ser de finanças: como construir um artefato que produza recomendação e prova ao mesmo tempo, e cuja própria evidência de desempenho resista a auditoria hostil?</w:t>
+      </w:r>
+    </w:p>
+    <w:p>
+      <w:pPr/>
+      <w:r>
+        <w:t>O objetivo é materializar e avaliar esse artefato para o contexto B2B de escritórios de investimento. O método segue a lógica de design science: identificar o problema, explicitar os requisitos, construir o artefato e avaliá-lo por utilidade, qualidade e capacidade de produzir evidência (Hevner et al., 2004; Peffers et al., 2007). A avaliação financeira não é uma demonstração comercial isolada. Ela executa, ano após ano, uma regra registrada antes do retorno seguinte, cobra custos, compara referências independentes e mede quanto a escolha retrospectiva teria melhorado o resultado. A contribuição é dupla: um protocolo quantitativo auditável e um fluxo de trabalho capaz de transformar cada recomendação em documento verificável para revisão humana.</w:t>
+      </w:r>
+    </w:p>
+    <w:p>
+      <w:pPr>
+        <w:pStyle w:val="Heading1"/>
+      </w:pPr>
+      <w:r>
+        <w:t>2. Fundamentação e posicionamento</w:t>
+      </w:r>
+    </w:p>
+    <w:p>
+      <w:pPr/>
+      <w:r>
+        <w:t>Três problemas metodológicos bem documentados na literatura de finanças quantitativas foram tratados como requisitos de projeto, não como ressalvas de rodapé.</w:t>
+      </w:r>
+    </w:p>
+    <w:p>
+      <w:pPr/>
+      <w:r>
+        <w:t>Viés de sobrevivência. Painéis montados a partir de provedores públicos de preço ajustado servem as empresas que ainda existem. Reconstruir o universo a partir de um provedor desses apaga silenciosamente toda empresa deslistada, adquirida ou liquidada, justamente as que produziram os piores retornos. O efeito é sistemático e sempre favorável ao backtest.</w:t>
+      </w:r>
+    </w:p>
+    <w:p>
+      <w:pPr/>
+      <w:r>
+        <w:t>Informação disponível na data. Fundamentos precisam ser lidos como estavam no momento da decisão, com data de recebimento pelo regulador, não com a versão consolidada e eventualmente republicada. Chamar isso de detalhe é subestimar o problema: a diferença aparece com sinal previsível, sempre a favor de quem testa.</w:t>
+      </w:r>
+    </w:p>
+    <w:p>
+      <w:pPr/>
+      <w:r>
+        <w:t>Múltiplas tentativas. Quando se avaliam dezenas de configurações e se publica a melhor, o índice de Sharpe observado é enviesado para cima pela própria busca. Bailey e López de Prado formalizaram o problema com o Sharpe deflacionado, que corrige a estatística pelo número de tentativas e pelos momentos superiores da distribuição de retornos. Sem essa correção, qualquer busca suficientemente ampla produz um vencedor aparentemente significativo.</w:t>
+      </w:r>
+    </w:p>
+    <w:p>
+      <w:pPr/>
+      <w:r>
+        <w:t>Quatro referências clássicas orientam a construção financeira do artefato. Markowitz (1952) mostrou que uma carteira precisa ser analisada pela interação entre retornos e covariâncias, e não pela atratividade isolada de cada ativo. No Benevente, essa contribuição aparece de duas formas. A primeira é a exigência de uma cesta, em vez de uma aposta única no maior escore. A segunda é o comparador MVO, que pergunta quanto uma alocação baseada apenas em média, covariância e limites teria produzido sobre o mesmo universo. O comparador não serve para validar automaticamente a estratégia; serve para impedir que um ganho atribuído ao filtro fundamental seja apenas efeito de diversificação quantitativa. A ênfase em qualidade também dialoga com Novy-Marx (2013), enquanto o uso conjunto de valor, qualidade e confirmação de mercado se aproxima da lógica multifatorial de Fama e French (2015), sem pretender reproduzir exatamente seus fatores.</w:t>
+      </w:r>
+    </w:p>
+    <w:p>
+      <w:pPr/>
+      <w:r>
+        <w:t>Black e Litterman (1992) tratam da combinação entre equilíbrio de mercado e visões. A arquitetura do Benevente adota a separação conceitual, mas não implementa o modelo Black–Litterman como carteira publicada. Fatos fundamentais e sinais de mercado geram um ranking determinístico. A linguagem natural pode explicar a visão, registrar riscos e formular perguntas, porém não altera a matemática da alocação. Essa fronteira permite testar a camada de linguagem sem conceder a ela poder para mudar restrições ou reconstruir retrospectivamente a tese.</w:t>
+      </w:r>
+    </w:p>
+    <w:p>
+      <w:pPr/>
+      <w:r>
+        <w:t>DeMiguel, Garlappi e Uppal (2009) demonstram como erro de estimação pode eliminar, fora da amostra, a vantagem aparente de métodos sofisticados sobre uma diversificação simples. A resposta do projeto não é presumir que um otimizador sempre melhora o resultado. É publicar uma referência independente, impor um número mínimo de posições, limitar a interpretação das métricas e comparar decisões em sequência temporal. O resultado de 7,83% ao ano do MVO de referência nesta execução não prova que MVO é inferior em geral. Mostra somente que aquela implementação, com aquele universo elegível e aquelas estimativas disponíveis em cada janeiro, produziu esse caminho. Em outra amostra ou especificação, a ordem pode se inverter.</w:t>
+      </w:r>
+    </w:p>
+    <w:p>
+      <w:pPr/>
+      <w:r>
+        <w:t>Novy-Marx e Velikov (2016) mostram que custos de negociação podem consumir anomalias documentadas. Por isso, o retorno usado na manchete já deduz taxas e deslizamento modelado, e a busca penaliza trocas de configuração. O sistema mede giro, participação no volume e realização tributável, em vez de tratar toda mudança de peso como gratuita. Ainda assim, uma estimativa não é uma nota de corretagem. O produto prevê conciliação posterior exatamente porque o custo observado depende do tamanho, do horário, da liquidez e da qualidade de execução de cada instituição.</w:t>
+      </w:r>
+    </w:p>
+    <w:p>
+      <w:pPr/>
+      <w:r>
+        <w:t>Essas escolhas definem o tipo de evidência que o trabalho pode produzir. O backtest é um experimento histórico sobre um protocolo e não uma simulação da experiência individual de todo cliente. Suitability, necessidade de liquidez, tributação específica, ativos já detidos e restrições contratuais podem mudar a carteira implementável. Por isso, o artefato separa três objetos que costumam aparecer misturados: a regra acadêmica usada para medir o sinal; a política institucional que limita o risco; e o texto explicativo que ajuda uma pessoa a revisar a decisão. Uma boa curva não substitui nenhum dos três.</w:t>
+      </w:r>
+    </w:p>
+    <w:p>
+      <w:pPr/>
+      <w:r>
+        <w:t>O posicionamento do artefato decorre desses três pontos. O Benevente não compete em promessa de retorno. Compete em verificabilidade. Qualquer concorrente exibe uma curva ascendente, e a pergunta que raramente é respondida é quanto daquela curva vem de ter escolhido a regra depois de ver o resultado. Este trabalho mede esse valor e o publica.</w:t>
+      </w:r>
+    </w:p>
+    <w:p>
+      <w:pPr>
+        <w:pStyle w:val="Heading1"/>
+      </w:pPr>
+      <w:r>
+        <w:t>3. O artefato</w:t>
+      </w:r>
+    </w:p>
+    <w:p>
+      <w:pPr>
+        <w:pStyle w:val="Heading2"/>
+      </w:pPr>
+      <w:r>
+        <w:t>3.1 Visão geral</w:t>
+      </w:r>
+    </w:p>
+    <w:p>
+      <w:pPr/>
+      <w:r>
+        <w:t>O Benevente Wealth System é um sistema de apoio à decisão que executa um protocolo anual. Em janeiro, monta a carteira usando exclusivamente dados disponíveis naquela data. Mantém a carteira pelo ano, já com custos de execução. Revisa no ciclo seguinte. O resultado do ano entra depois, apenas para avaliação, e nunca retroalimenta a decisão que o gerou.</w:t>
+      </w:r>
+    </w:p>
+    <w:p>
+      <w:pPr/>
+      <w:r>
+        <w:t>O sistema é composto por cinco camadas.</w:t>
+      </w:r>
+    </w:p>
+    <w:p>
+      <w:pPr>
+        <w:keepNext/>
+        <w:spacing w:after="0"/>
+      </w:pPr>
+      <w:r>
         <w:rPr>
           <w:b/>
         </w:rPr>
-        <w:t>Artigo tecnológico submetido ao 6º Business Tech Congress, 2026.</w:t>
-      </w:r>
-    </w:p>
-    <w:p>
-      <w:pPr>
-        <w:pStyle w:val="Heading1"/>
-      </w:pPr>
-      <w:r>
-        <w:t>Resumo</w:t>
-      </w:r>
-    </w:p>
-    <w:p>
-      <w:pPr/>
-      <w:r>
-        <w:t>Escritórios de investimento capixabas, entre multi-family offices, consultorias de valores mobiliários e assessorias, recomendam carteiras que precisam ser justificadas meses depois de montadas, diante do cliente, da área de conformidade ou do regulador. Três perguntas voltam sempre: quais dados existiam na data da decisão, qual regra foi aplicada sobre eles e quem aprovou. Planilha não responde nenhuma. Plataforma de terceiro costuma responder à segunda de forma opaca. Este trabalho tem como objetivo construir e avaliar o Benevente Wealth System, um artefato de software que produz a proposta de carteira e sua trilha de auditoria no mesmo ato. A avaliação combina design science, seleção anual aninhada e teste histórico sequencial. Cada decisão sai acompanhada da política vigente, dos fundamentos recebidos pela CVM até a data de corte, da elegibilidade com o motivo de cada reprovação, dos pesos, das ordens propostas com lote e participação no volume, do custo estimado e do SHA-256 dos arquivos que geraram os números. O artefato foi avaliado em onze decisões anuais, de 2015 a 2025, sobre um painel da B3 reconstruído do arquivo histórico de cotações e que conserva 166 emissores que deixam de negociar antes do fim da amostra. A carteira publicada, denominada Benevente 1, rendeu 17,86% ao ano após custos, ou 16,03% após imposto de renda, contra 11,77% do Ibovespa, 9,61% do CDI e 7,83% de uma otimização média-variância independente sobre o mesmo universo elegível. Venceu o mercado em sete dos onze anos e a otimização neutra em dez. Uma extensão experimental, Benevente 2, preserva a seleção anual e reduz temporariamente a exposição quando queda e volatilidade observadas no fechamento anterior ultrapassam limiares registrados. Na amostra completa ela reduziu a queda máxima de 47,8% para 28,7%, mas no recorte temporal de 2019 a 2025 não demonstrou retorno adicional (p = 0,964). Reportamos também o que não funcionou: previsão anual de regime, realocação mensal e semanal da proporção entre ações e caixa, reseleção mais frequente da própria cesta e o uso de um modelo de linguagem como fonte de retorno. A contribuição tecnológica não é uma promessa de rentabilidade. É um sistema verificável que separa dado, regra, alocação, explicação e aprovação, inclusive quando uma melhoria protege o capital sem comprovar alfa.</w:t>
-      </w:r>
-    </w:p>
-    <w:p>
-      <w:pPr/>
+        <w:t>Tabela 1</w:t>
+      </w:r>
+    </w:p>
+    <w:p>
+      <w:pPr>
+        <w:keepNext/>
+        <w:spacing w:after="80"/>
+      </w:pPr>
       <w:r>
         <w:rPr>
-          <w:b/>
+          <w:i/>
         </w:rPr>
-        <w:t>Palavras-chave:</w:t>
-      </w:r>
-      <w:r>
-        <w:t xml:space="preserve"> governança de investimentos; trilha de auditoria; alocação de carteira; informação disponível na data; viés de sobrevivência; pesquisa reprodutível.</w:t>
-      </w:r>
-    </w:p>
-    <w:p>
-      <w:pPr>
-        <w:pStyle w:val="Heading1"/>
-      </w:pPr>
-      <w:r>
-        <w:t>1. Introdução: problema, objetivo e contribuição</w:t>
-      </w:r>
-    </w:p>
-    <w:p>
-      <w:pPr/>
-      <w:r>
-        <w:t>Este trabalho parte de uma hipótese de mercado a ser validada no piloto: escritórios do Espírito Santo que mantêm o relacionamento com famílias e empresas locais podem depender de infraestrutura de decisão produzida fora do estado. O problema proposto não é falta de competência analítica. É a ausência de uma ferramenta que produza, no ato da recomendação, o registro que a recomendação vai exigir depois. A pesquisa ainda não mede o tamanho desse mercado, a disposição a pagar ou a taxa de adoção. Portanto, retenção de capital e geração de negócios no estado são resultados esperados do produto, não resultados já comprovados.</w:t>
-      </w:r>
-    </w:p>
-    <w:p>
-      <w:pPr/>
-      <w:r>
-        <w:t>O problema é concreto e tem data. Quando um cliente pergunta em 2026 por que determinada ação entrou na carteira em janeiro de 2023, o escritório precisa demonstrar três coisas simultaneamente.</w:t>
-      </w:r>
-    </w:p>
-    <w:p>
-      <w:pPr>
-        <w:spacing w:line="360" w:lineRule="auto"/>
-        <w:ind w:left="369" w:hanging="227"/>
-      </w:pPr>
-      <w:r>
-        <w:t xml:space="preserve">1. </w:t>
-      </w:r>
-      <w:r>
-        <w:rPr>
-          <w:b/>
-        </w:rPr>
-        <w:t>Quais dados existiam naquela data.</w:t>
-      </w:r>
-      <w:r>
-        <w:t xml:space="preserve"> Um balanço republicado em 2024 não pode aparecer como se estivesse disponível em janeiro de 2023. Sem controle de data de recebimento, todo backtest e toda justificativa ficam contaminados por informação que ninguém tinha.</w:t>
-      </w:r>
-    </w:p>
-    <w:p>
-      <w:pPr>
-        <w:spacing w:line="360" w:lineRule="auto"/>
-        <w:ind w:left="369" w:hanging="227"/>
-      </w:pPr>
-      <w:r>
-        <w:t xml:space="preserve">2. </w:t>
-      </w:r>
-      <w:r>
-        <w:rPr>
-          <w:b/>
-        </w:rPr>
-        <w:t>Qual regra foi aplicada.</w:t>
-      </w:r>
-      <w:r>
-        <w:t xml:space="preserve"> Não a regra que o escritório usa hoje, mas a que estava vigente naquele janeiro, com os limites que estavam vigentes.</w:t>
-      </w:r>
-    </w:p>
-    <w:p>
-      <w:pPr>
-        <w:spacing w:line="360" w:lineRule="auto"/>
-        <w:ind w:left="369" w:hanging="227"/>
-      </w:pPr>
-      <w:r>
-        <w:t xml:space="preserve">3. </w:t>
-      </w:r>
-      <w:r>
-        <w:rPr>
-          <w:b/>
-        </w:rPr>
-        <w:t>Quem aprovou.</w:t>
-      </w:r>
-      <w:r>
-        <w:t xml:space="preserve"> Uma decisão de alocação sem responsável identificado não é auditável, e a automação sem aprovação humana desloca a responsabilidade para um sistema que não pode respondê-la.</w:t>
-      </w:r>
-    </w:p>
-    <w:p>
-      <w:pPr/>
-      <w:r>
-        <w:t>Planilhas falham nas três: sobrescrevem o estado anterior, misturam regra e dado, e não guardam autoria. Plataformas de terceiros costumam responder à segunda pergunta com uma caixa fechada, entregando ao escritório a carteira e não o critério. Nenhuma das duas alternativas serve a quem responde pela decisão.</w:t>
-      </w:r>
-    </w:p>
-    <w:p>
-      <w:pPr/>
-      <w:r>
-        <w:t>A questão que orienta este trabalho é, portanto, de engenharia e de governança antes de ser de finanças: como construir um artefato que produza recomendação e prova ao mesmo tempo, e cuja própria evidência de desempenho resista a auditoria hostil?</w:t>
-      </w:r>
-    </w:p>
-    <w:p>
-      <w:pPr/>
-      <w:r>
-        <w:t>O objetivo é materializar e avaliar esse artefato para o contexto B2B de escritórios de investimento. O método segue a lógica de design science: identificar o problema, explicitar os requisitos, construir o artefato e avaliá-lo por utilidade, qualidade e capacidade de produzir evidência (Hevner et al., 2004; Peffers et al., 2007). A avaliação financeira não é uma demonstração comercial isolada. Ela executa, ano após ano, uma regra registrada antes do retorno seguinte, cobra custos, compara referências independentes e mede quanto a escolha retrospectiva teria melhorado o resultado. A contribuição é dupla: um protocolo quantitativo auditável e um fluxo de trabalho capaz de transformar cada recomendação em documento verificável para revisão humana.</w:t>
-      </w:r>
-    </w:p>
-    <w:p>
-      <w:pPr>
-        <w:pStyle w:val="Heading1"/>
-      </w:pPr>
-      <w:r>
-        <w:t>2. Fundamentação e posicionamento</w:t>
-      </w:r>
-    </w:p>
-    <w:p>
-      <w:pPr/>
-      <w:r>
-        <w:t>Três problemas metodológicos bem documentados na literatura de finanças quantitativas foram tratados como requisitos de projeto, não como ressalvas de rodapé.</w:t>
-      </w:r>
-    </w:p>
-    <w:p>
-      <w:pPr/>
-      <w:r>
-        <w:rPr>
-          <w:b/>
-        </w:rPr>
-        <w:t>Viés de sobrevivência.</w:t>
-      </w:r>
-      <w:r>
-        <w:t xml:space="preserve"> Painéis montados a partir de provedores públicos de preço ajustado servem as empresas que ainda existem. Reconstruir o universo a partir de um provedor desses apaga silenciosamente toda empresa deslistada, adquirida ou liquidada, justamente as que produziram os piores retornos. O efeito é sistemático e sempre favorável ao backtest.</w:t>
-      </w:r>
-    </w:p>
-    <w:p>
-      <w:pPr/>
-      <w:r>
-        <w:rPr>
-          <w:b/>
-        </w:rPr>
-        <w:t>Informação disponível na data.</w:t>
-      </w:r>
-      <w:r>
-        <w:t xml:space="preserve"> Fundamentos precisam ser lidos como estavam no momento da decisão, com data de recebimento pelo regulador, não com a versão consolidada e eventualmente republicada. Chamar isso de detalhe é subestimar o problema: a diferença aparece com sinal previsível, sempre a favor de quem testa.</w:t>
-      </w:r>
-    </w:p>
-    <w:p>
-      <w:pPr/>
-      <w:r>
-        <w:rPr>
-          <w:b/>
-        </w:rPr>
-        <w:t>Múltiplas tentativas.</w:t>
-      </w:r>
-      <w:r>
-        <w:t xml:space="preserve"> Quando se avaliam dezenas de configurações e se publica a melhor, o índice de Sharpe observado é enviesado para cima pela própria busca. Bailey e López de Prado formalizaram o problema com o Sharpe deflacionado, que corrige a estatística pelo número de tentativas e pelos momentos superiores da distribuição de retornos. Sem essa correção, qualquer busca suficientemente ampla produz um vencedor aparentemente significativo.</w:t>
-      </w:r>
-    </w:p>
-    <w:p>
-      <w:pPr/>
-      <w:r>
-        <w:t>Quatro referências clássicas orientam a construção financeira do artefato. Markowitz (1952) mostrou que uma carteira precisa ser analisada pela interação entre retornos e covariâncias, e não pela atratividade isolada de cada ativo. No Benevente, essa contribuição aparece de duas formas. A primeira é a exigência de uma cesta, em vez de uma aposta única no maior escore. A segunda é o comparador MVO, que pergunta quanto uma alocação baseada apenas em média, covariância e limites teria produzido sobre o mesmo universo. O comparador não serve para validar automaticamente a estratégia; serve para impedir que um ganho atribuído ao filtro fundamental seja apenas efeito de diversificação quantitativa. A ênfase em qualidade também dialoga com Novy-Marx (2013), enquanto o uso conjunto de valor, qualidade e confirmação de mercado se aproxima da lógica multifatorial de Fama e French (2015), sem pretender reproduzir exatamente seus fatores.</w:t>
-      </w:r>
-    </w:p>
-    <w:p>
-      <w:pPr/>
-      <w:r>
-        <w:t>Black e Litterman (1992) tratam da combinação entre equilíbrio de mercado e visões. A arquitetura do Benevente adota a separação conceitual, mas não implementa o modelo Black–Litterman como carteira publicada. Fatos fundamentais e sinais de mercado geram um ranking determinístico. A linguagem natural pode explicar a visão, registrar riscos e formular perguntas, porém não altera a matemática da alocação. Essa fronteira permite testar a camada de linguagem sem conceder a ela poder para mudar restrições ou reconstruir retrospectivamente a tese.</w:t>
-      </w:r>
-    </w:p>
-    <w:p>
-      <w:pPr/>
-      <w:r>
-        <w:t>DeMiguel, Garlappi e Uppal (2009) demonstram como erro de estimação pode eliminar, fora da amostra, a vantagem aparente de métodos sofisticados sobre uma diversificação simples. A resposta do projeto não é presumir que um otimizador sempre melhora o resultado. É publicar uma referência independente, impor um número mínimo de posições, limitar a interpretação das métricas e comparar decisões em sequência temporal. O resultado de 7,83% ao ano do MVO de referência nesta execução não prova que MVO é inferior em geral. Mostra somente que aquela implementação, com aquele universo elegível e aquelas estimativas disponíveis em cada janeiro, produziu esse caminho. Em outra amostra ou especificação, a ordem pode se inverter.</w:t>
-      </w:r>
-    </w:p>
-    <w:p>
-      <w:pPr/>
-      <w:r>
-        <w:t>Novy-Marx e Velikov (2016) mostram que custos de negociação podem consumir anomalias documentadas. Por isso, o retorno usado na manchete já deduz taxas e deslizamento modelado, e a busca penaliza trocas de configuração. O sistema mede giro, participação no volume e realização tributável, em vez de tratar toda mudança de peso como gratuita. Ainda assim, uma estimativa não é uma nota de corretagem. O produto prevê conciliação posterior exatamente porque o custo observado depende do tamanho, do horário, da liquidez e da qualidade de execução de cada instituição.</w:t>
-      </w:r>
-    </w:p>
-    <w:p>
-      <w:pPr/>
-      <w:r>
-        <w:t>Essas escolhas definem o tipo de evidência que o trabalho pode produzir. O backtest é um experimento histórico sobre um protocolo e não uma simulação da experiência individual de todo cliente. Suitability, necessidade de liquidez, tributação específica, ativos já detidos e restrições contratuais podem mudar a carteira implementável. Por isso, o artefato separa três objetos que costumam aparecer misturados: a regra acadêmica usada para medir o sinal; a política institucional que limita o risco; e o texto explicativo que ajuda uma pessoa a revisar a decisão. Uma boa curva não substitui nenhum dos três.</w:t>
-      </w:r>
-    </w:p>
-    <w:p>
-      <w:pPr/>
-      <w:r>
-        <w:t>O posicionamento do artefato decorre desses três pontos. O Benevente não compete em promessa de retorno. Compete em verificabilidade. Qualquer concorrente exibe uma curva ascendente, e a pergunta que raramente é respondida é quanto daquela curva vem de ter escolhido a regra depois de ver o resultado. Este trabalho mede esse valor e o publica.</w:t>
-      </w:r>
-    </w:p>
-    <w:p>
-      <w:pPr>
-        <w:pStyle w:val="Heading1"/>
-      </w:pPr>
-      <w:r>
-        <w:t>3. O artefato</w:t>
-      </w:r>
-    </w:p>
-    <w:p>
-      <w:pPr>
-        <w:pStyle w:val="Heading2"/>
-      </w:pPr>
-      <w:r>
-        <w:t>3.1 Visão geral</w:t>
-      </w:r>
-    </w:p>
-    <w:p>
-      <w:pPr/>
-      <w:r>
-        <w:t>O Benevente Wealth System é um sistema de apoio à decisão que executa um protocolo anual. Em janeiro, monta a carteira usando exclusivamente dados disponíveis naquela data. Mantém a carteira pelo ano, já com custos de execução. Revisa no ciclo seguinte. O resultado do ano entra depois, apenas para avaliação, e nunca retroalimenta a decisão que o gerou.</w:t>
-      </w:r>
-    </w:p>
-    <w:p>
-      <w:pPr/>
-      <w:r>
-        <w:t>O sistema é composto por cinco camadas.</w:t>
+        <w:t>Camadas do artefato e respectivas saídas auditáveis</w:t>
       </w:r>
     </w:p>
     <w:tbl>
@@ -258,6 +228,14 @@
         <w:tblW w:type="auto" w:w="0"/>
         <w:jc w:val="center"/>
         <w:tblLook w:firstColumn="1" w:firstRow="1" w:lastColumn="0" w:lastRow="0" w:noHBand="0" w:noVBand="1" w:val="04A0"/>
+        <w:tblBorders>
+          <w:left w:val="nil"/>
+          <w:right w:val="nil"/>
+          <w:insideH w:val="nil"/>
+          <w:insideV w:val="nil"/>
+          <w:top w:val="single" w:sz="8" w:color="000000"/>
+          <w:bottom w:val="single" w:sz="8" w:color="000000"/>
+        </w:tblBorders>
       </w:tblPr>
       <w:tblGrid>
         <w:gridCol w:w="3024"/>
@@ -273,10 +251,13 @@
           <w:tcPr>
             <w:tcW w:type="dxa" w:w="3024"/>
             <w:vAlign w:val="center"/>
-            <w:shd w:fill="D9E7E5"/>
-          </w:tcPr>
-          <w:p>
-            <w:pPr>
+            <w:tcBorders>
+              <w:bottom w:val="single" w:sz="8" w:color="000000"/>
+            </w:tcBorders>
+          </w:tcPr>
+          <w:p>
+            <w:pPr>
+              <w:keepNext/>
               <w:jc w:val="left"/>
             </w:pPr>
             <w:r>
@@ -293,10 +274,13 @@
           <w:tcPr>
             <w:tcW w:type="dxa" w:w="3024"/>
             <w:vAlign w:val="center"/>
-            <w:shd w:fill="D9E7E5"/>
-          </w:tcPr>
-          <w:p>
-            <w:pPr>
+            <w:tcBorders>
+              <w:bottom w:val="single" w:sz="8" w:color="000000"/>
+            </w:tcBorders>
+          </w:tcPr>
+          <w:p>
+            <w:pPr>
+              <w:keepNext/>
               <w:jc w:val="left"/>
             </w:pPr>
             <w:r>
@@ -313,10 +297,13 @@
           <w:tcPr>
             <w:tcW w:type="dxa" w:w="3024"/>
             <w:vAlign w:val="center"/>
-            <w:shd w:fill="D9E7E5"/>
-          </w:tcPr>
-          <w:p>
-            <w:pPr>
+            <w:tcBorders>
+              <w:bottom w:val="single" w:sz="8" w:color="000000"/>
+            </w:tcBorders>
+          </w:tcPr>
+          <w:p>
+            <w:pPr>
+              <w:keepNext/>
               <w:jc w:val="left"/>
             </w:pPr>
             <w:r>
@@ -341,6 +328,7 @@
           </w:tcPr>
           <w:p>
             <w:pPr>
+              <w:keepNext/>
               <w:jc w:val="left"/>
             </w:pPr>
             <w:r>
@@ -359,6 +347,7 @@
           </w:tcPr>
           <w:p>
             <w:pPr>
+              <w:keepNext/>
               <w:jc w:val="left"/>
             </w:pPr>
             <w:r>
@@ -377,6 +366,7 @@
           </w:tcPr>
           <w:p>
             <w:pPr>
+              <w:keepNext/>
               <w:jc w:val="left"/>
             </w:pPr>
             <w:r>
@@ -400,6 +390,7 @@
           </w:tcPr>
           <w:p>
             <w:pPr>
+              <w:keepNext/>
               <w:jc w:val="left"/>
             </w:pPr>
             <w:r>
@@ -418,6 +409,7 @@
           </w:tcPr>
           <w:p>
             <w:pPr>
+              <w:keepNext/>
               <w:jc w:val="left"/>
             </w:pPr>
             <w:r>
@@ -436,6 +428,7 @@
           </w:tcPr>
           <w:p>
             <w:pPr>
+              <w:keepNext/>
               <w:jc w:val="left"/>
             </w:pPr>
             <w:r>
@@ -459,6 +452,7 @@
           </w:tcPr>
           <w:p>
             <w:pPr>
+              <w:keepNext/>
               <w:jc w:val="left"/>
             </w:pPr>
             <w:r>
@@ -477,6 +471,7 @@
           </w:tcPr>
           <w:p>
             <w:pPr>
+              <w:keepNext/>
               <w:jc w:val="left"/>
             </w:pPr>
             <w:r>
@@ -495,6 +490,7 @@
           </w:tcPr>
           <w:p>
             <w:pPr>
+              <w:keepNext/>
               <w:jc w:val="left"/>
             </w:pPr>
             <w:r>
@@ -518,6 +514,7 @@
           </w:tcPr>
           <w:p>
             <w:pPr>
+              <w:keepNext/>
               <w:jc w:val="left"/>
             </w:pPr>
             <w:r>
@@ -536,6 +533,7 @@
           </w:tcPr>
           <w:p>
             <w:pPr>
+              <w:keepNext/>
               <w:jc w:val="left"/>
             </w:pPr>
             <w:r>
@@ -554,6 +552,7 @@
           </w:tcPr>
           <w:p>
             <w:pPr>
+              <w:keepNext/>
               <w:jc w:val="left"/>
             </w:pPr>
             <w:r>
@@ -577,6 +576,7 @@
           </w:tcPr>
           <w:p>
             <w:pPr>
+              <w:keepNext w:val="0"/>
               <w:jc w:val="left"/>
             </w:pPr>
             <w:r>
@@ -595,6 +595,7 @@
           </w:tcPr>
           <w:p>
             <w:pPr>
+              <w:keepNext w:val="0"/>
               <w:jc w:val="left"/>
             </w:pPr>
             <w:r>
@@ -613,6 +614,7 @@
           </w:tcPr>
           <w:p>
             <w:pPr>
+              <w:keepNext w:val="0"/>
               <w:jc w:val="left"/>
             </w:pPr>
             <w:r>
@@ -626,7 +628,18 @@
         </w:tc>
       </w:tr>
     </w:tbl>
-    <w:p/>
+    <w:p>
+      <w:pPr>
+        <w:spacing w:before="60" w:after="160" w:line="240" w:lineRule="auto"/>
+      </w:pPr>
+      <w:r>
+        <w:rPr>
+          <w:rFonts w:ascii="Times New Roman" w:hAnsi="Times New Roman"/>
+          <w:sz w:val="20"/>
+        </w:rPr>
+        <w:t>Nota. Elaboração própria com base nos artefatos reproduzíveis da pesquisa.</w:t>
+      </w:r>
+    </w:p>
     <w:p>
       <w:pPr>
         <w:pStyle w:val="Heading2"/>
@@ -679,16 +692,7 @@
     <w:p>
       <w:pPr/>
       <w:r>
-        <w:t xml:space="preserve">O foco econômico é </w:t>
-      </w:r>
-      <w:r>
-        <w:rPr>
-          <w:b/>
-        </w:rPr>
-        <w:t>análise fundamentalista multifatorial</w:t>
-      </w:r>
-      <w:r>
-        <w:t>. Qualidade procura empresas capazes de remunerar o capital e sustentar a operação; valor procura um preço coerente com lucros, patrimônio ou geração de caixa; momento de doze meses funciona como confirmação de mercado e reduz a compra mecânica de uma empresa barata que continua deteriorando. Liquidez determina se a tese é executável. Bancos e empresas operacionais recebem métricas diferentes porque dívida e margem operacional não significam a mesma coisa nos dois balanços. O retorno histórico entra como fator complementar, não substitui os demonstrativos.</w:t>
+        <w:t>O foco econômico é uma análise fundamentalista multifatorial. Qualidade procura empresas capazes de remunerar o capital e sustentar a operação; valor procura um preço coerente com lucros, patrimônio ou geração de caixa; momento de doze meses funciona como confirmação de mercado e reduz a compra mecânica de uma empresa barata que continua deteriorando. Liquidez determina se a tese é executável. Bancos e empresas operacionais recebem métricas diferentes porque dívida e margem operacional não significam a mesma coisa nos dois balanços. O retorno histórico entra como fator complementar, não substitui os demonstrativos.</w:t>
       </w:r>
     </w:p>
     <w:p>
@@ -700,25 +704,7 @@
     <w:p>
       <w:pPr/>
       <w:r>
-        <w:t xml:space="preserve">Essa separação também resolve a ambiguidade entre os nomes. </w:t>
-      </w:r>
-      <w:r>
-        <w:rPr>
-          <w:b/>
-        </w:rPr>
-        <w:t>Benevente Quant AI</w:t>
-      </w:r>
-      <w:r>
-        <w:t xml:space="preserve"> designa a pesquisa acadêmica, inclusive o experimento que combina um modelo de linguagem com um solver convexo. </w:t>
-      </w:r>
-      <w:r>
-        <w:rPr>
-          <w:b/>
-        </w:rPr>
-        <w:t>Benevente Wealth System</w:t>
-      </w:r>
-      <w:r>
-        <w:t xml:space="preserve"> designa o produto B2B de governança que entrega proposta, explicação e registro. A carteira histórica publicada é a regra multifatorial determinística. O modelo de linguagem não seleciona ativo e não escreve peso; seu papel é transformar fatos aprovados em tese, riscos e perguntas para revisão humana.</w:t>
+        <w:t>Essa separação também resolve a ambiguidade entre os nomes. Benevente Quant AI designa a pesquisa acadêmica, inclusive o experimento que combina um modelo de linguagem com um solver convexo. Benevente Wealth System designa o produto B2B de governança que entrega proposta, explicação e registro. A carteira histórica publicada é a regra multifatorial determinística. O modelo de linguagem não seleciona ativo e não escreve peso; seu papel é transformar fatos aprovados em tese, riscos e perguntas para revisão humana.</w:t>
       </w:r>
     </w:p>
     <w:p>
@@ -744,16 +730,7 @@
     <w:p>
       <w:pPr/>
       <w:r>
-        <w:t xml:space="preserve">Anual não significa que o sistema ignora o risco durante doze meses. Preços, concentração, liquidez e eventos materiais podem ser monitorados continuamente, e uma política institucional pode prever um gatilho extraordinário. Significa apenas que a </w:t>
-      </w:r>
-      <w:r>
-        <w:rPr>
-          <w:b/>
-        </w:rPr>
-        <w:t>reseleção sistemática</w:t>
-      </w:r>
-      <w:r>
-        <w:t xml:space="preserve"> da cesta acontece uma vez por ano. No teste de robustez, mantendo regra e dados constantes, a reseleção anual superou as versões trimestral e mensal antes mesmo dos custos. Com apenas onze anos pareados, isso não prova que a frequência anual seja universalmente ótima; mostra que não houve evidência para substituir a regra mais simples nesta amostra.</w:t>
+        <w:t>Anual não significa que o sistema ignora o risco durante doze meses. Preços, concentração, liquidez e eventos materiais podem ser monitorados continuamente, e uma política institucional pode prever um gatilho extraordinário. Significa apenas que a reseleção sistemática da cesta acontece uma vez por ano. No teste de robustez, mantendo regra e dados constantes, a reseleção anual superou as versões trimestral e mensal antes mesmo dos custos. Com apenas onze anos pareados, isso não prova que a frequência anual seja universalmente ótima; mostra que não houve evidência para substituir a regra mais simples nesta amostra.</w:t>
       </w:r>
     </w:p>
     <w:p>
@@ -782,16 +759,7 @@
         <w:ind w:left="369" w:hanging="227"/>
       </w:pPr>
       <w:r>
-        <w:t xml:space="preserve">• </w:t>
-      </w:r>
-      <w:r>
-        <w:rPr>
-          <w:b/>
-        </w:rPr>
-        <w:t>Taxas da B3</w:t>
-      </w:r>
-      <w:r>
-        <w:t xml:space="preserve"> e corretagem por ordem.</w:t>
+        <w:t>• Taxas da B3 e corretagem por ordem.</w:t>
       </w:r>
     </w:p>
     <w:p>
@@ -800,16 +768,7 @@
         <w:ind w:left="369" w:hanging="227"/>
       </w:pPr>
       <w:r>
-        <w:t xml:space="preserve">• </w:t>
-      </w:r>
-      <w:r>
-        <w:rPr>
-          <w:b/>
-        </w:rPr>
-        <w:t>Deslizamento por participação no volume</w:t>
-      </w:r>
-      <w:r>
-        <w:t>, proporcional ao tamanho da ordem relativo ao volume médio diário do papel. Uma ordem grande em papel ilíquido custa mais, como custa na prática.</w:t>
+        <w:t>• Deslizamento por participação no volume, proporcional ao tamanho da ordem relativo ao volume médio diário do papel. Uma ordem grande em papel ilíquido custa mais, como custa na prática.</w:t>
       </w:r>
     </w:p>
     <w:p>
@@ -818,16 +777,7 @@
         <w:ind w:left="369" w:hanging="227"/>
       </w:pPr>
       <w:r>
-        <w:t xml:space="preserve">• </w:t>
-      </w:r>
-      <w:r>
-        <w:rPr>
-          <w:b/>
-        </w:rPr>
-        <w:t>Imposto de renda brasileiro</w:t>
-      </w:r>
-      <w:r>
-        <w:t>, com 15% sobre ganho realizado em renda variável e 17,5% sobre renda fixa na faixa de 361 a 720 dias, cobrado no ano em que a revisão seguinte efetivamente realiza o ganho, e com liquidação integral assumida no último ano avaliado. Essa é a hipótese terminal conservadora, em vez de um diferimento indefinido que embelezaria a série.</w:t>
+        <w:t>• Imposto de renda brasileiro, com 15% sobre ganho realizado em renda variável e 17,5% sobre renda fixa na faixa de 361 a 720 dias, cobrado no ano em que a revisão seguinte efetivamente realiza o ganho, e com liquidação integral assumida no último ano avaliado. Essa é a hipótese terminal conservadora, em vez de um diferimento indefinido que embelezaria a série.</w:t>
       </w:r>
     </w:p>
     <w:p>
@@ -856,16 +806,7 @@
         <w:ind w:left="369" w:hanging="227"/>
       </w:pPr>
       <w:r>
-        <w:t xml:space="preserve">1. </w:t>
-      </w:r>
-      <w:r>
-        <w:rPr>
-          <w:b/>
-        </w:rPr>
-        <w:t>Aprovação humana obrigatória.</w:t>
-      </w:r>
-      <w:r>
-        <w:t xml:space="preserve"> Nenhuma ordem é transmitida, nem pode ser, porque a arquitetura não tem esse caminho.</w:t>
+        <w:t>1. Aprovação humana obrigatória. Nenhuma ordem é transmitida, nem pode ser, porque a arquitetura não tem esse caminho.</w:t>
       </w:r>
     </w:p>
     <w:p>
@@ -874,16 +815,7 @@
         <w:ind w:left="369" w:hanging="227"/>
       </w:pPr>
       <w:r>
-        <w:t xml:space="preserve">2. </w:t>
-      </w:r>
-      <w:r>
-        <w:rPr>
-          <w:b/>
-        </w:rPr>
-        <w:t>Papel delimitado do modelo de linguagem.</w:t>
-      </w:r>
-      <w:r>
-        <w:t xml:space="preserve"> O modelo organiza tese e riscos a partir de fatos já aprovados. Ele não define peso, não altera limite e não aprova ativo. Isso é uma restrição de arquitetura verificável, não uma promessa de conduta, e a Seção 5.5 mostra o experimento que testou o que aconteceria se ela fosse relaxada.</w:t>
+        <w:t>2. Papel delimitado do modelo de linguagem. O modelo organiza tese e riscos a partir de fatos já aprovados. Ele não define peso, não altera limite e não aprova ativo. Isso é uma restrição de arquitetura verificável, não uma promessa de conduta, e a Seção 5.5 mostra o experimento que testou o que aconteceria se ela fosse relaxada.</w:t>
       </w:r>
     </w:p>
     <w:p>
@@ -892,16 +824,7 @@
         <w:ind w:left="369" w:hanging="227"/>
       </w:pPr>
       <w:r>
-        <w:t xml:space="preserve">3. </w:t>
-      </w:r>
-      <w:r>
-        <w:rPr>
-          <w:b/>
-        </w:rPr>
-        <w:t>Conciliação pós-operação.</w:t>
-      </w:r>
-      <w:r>
-        <w:t xml:space="preserve"> A nota de corretagem é confrontada linha a linha com a ordem proposta.</w:t>
+        <w:t>3. Conciliação pós-operação. A nota de corretagem é confrontada linha a linha com a ordem proposta.</w:t>
       </w:r>
     </w:p>
     <w:p>
@@ -910,16 +833,7 @@
         <w:ind w:left="369" w:hanging="227"/>
       </w:pPr>
       <w:r>
-        <w:t xml:space="preserve">4. </w:t>
-      </w:r>
-      <w:r>
-        <w:rPr>
-          <w:b/>
-        </w:rPr>
-        <w:t>Limites explícitos e versionados.</w:t>
-      </w:r>
-      <w:r>
-        <w:t xml:space="preserve"> Teto de renda variável, teto por emissor e reserva em caixa ficam na política, registrados antes da seleção.</w:t>
+        <w:t>4. Limites explícitos e versionados. Teto de renda variável, teto por emissor e reserva em caixa ficam na política, registrados antes da seleção.</w:t>
       </w:r>
     </w:p>
     <w:p>
@@ -988,138 +902,132 @@
         <w:ind w:left="369" w:hanging="227"/>
       </w:pPr>
       <w:r>
-        <w:t xml:space="preserve">• </w:t>
-      </w:r>
+        <w:t>• CDI, série 12 do Banco Central, como custo de oportunidade do caixa.</w:t>
+      </w:r>
+    </w:p>
+    <w:p>
+      <w:pPr>
+        <w:spacing w:line="360" w:lineRule="auto"/>
+        <w:ind w:left="369" w:hanging="227"/>
+      </w:pPr>
+      <w:r>
+        <w:t>• Ibovespa, índice de retorno total que incorpora os proventos da carteira teórica e, por isso, é comparável a uma carteira que os reinveste (B3, 2026b).</w:t>
+      </w:r>
+    </w:p>
+    <w:p>
+      <w:pPr>
+        <w:spacing w:line="360" w:lineRule="auto"/>
+        <w:ind w:left="369" w:hanging="227"/>
+      </w:pPr>
+      <w:r>
+        <w:t>• BOVA11, ETF negociável que busca acompanhar o Ibovespa e permite observar uma implementação passiva sujeita a taxa, custos de negociação e diferença de aderência (BlackRock, 2026).</w:t>
+      </w:r>
+    </w:p>
+    <w:p>
+      <w:pPr>
+        <w:spacing w:line="360" w:lineRule="auto"/>
+        <w:ind w:left="369" w:hanging="227"/>
+      </w:pPr>
+      <w:r>
+        <w:t>• Otimização média-variância neutra sobre o mesmo universo elegível, um comparador independente e não uma cópia da carteira com outro nome.</w:t>
+      </w:r>
+    </w:p>
+    <w:p>
+      <w:pPr/>
+      <w:r>
+        <w:t>Esse último merece nota. Em uma versão anterior do sistema, a série rotulada como MVO de referência era numericamente idêntica à estratégia em todos os anos, ou seja, a estratégia estava sendo comparada a si mesma. O defeito foi encontrado na auditoria interna, corrigido com uma implementação independente, e o comparador passou a produzir resultados distintos, inclusive desfavoráveis à estratégia em um dos onze anos.</w:t>
+      </w:r>
+    </w:p>
+    <w:p>
+      <w:pPr/>
+      <w:r>
+        <w:t>Ibovespa e BOVA11 não são duplicatas. O primeiro mede o retorno total de uma carteira teórica e estabelece a referência econômica do mercado. O segundo representa um caminho efetivamente negociável para buscar essa exposição. A pequena diferença entre as duas séries é informativa, pois reúne taxa, fricções operacionais e erro de aderência. Todos os comparadores usam as mesmas datas de início e fim da carteira.</w:t>
+      </w:r>
+    </w:p>
+    <w:p>
+      <w:pPr>
+        <w:pStyle w:val="Heading2"/>
+      </w:pPr>
+      <w:r>
+        <w:t>4.3 Correção por múltiplas tentativas</w:t>
+      </w:r>
+    </w:p>
+    <w:p>
+      <w:pPr/>
+      <w:r>
+        <w:t>Com 36 configurações avaliadas, o Sharpe da vencedora precisa ser deflacionado. Calculamos o Sharpe deflacionado com o número de tentativas, o número de observações e os momentos superiores da série de retornos.</w:t>
+      </w:r>
+    </w:p>
+    <w:p>
+      <w:pPr/>
+      <w:r>
+        <w:t>Medimos também o prêmio de retrospectiva, que é a diferença entre o CAGR da configuração que teria vencido a amostra inteira, escolha impossível na prática porque usa os anos sobre os quais é medida, e o CAGR da escolha aninhada. Esse número quantifica exatamente o que um concorrente ganharia publicando o vencedor da busca como se fosse resultado obtenível.</w:t>
+      </w:r>
+    </w:p>
+    <w:p>
+      <w:pPr>
+        <w:pStyle w:val="Heading2"/>
+      </w:pPr>
+      <w:r>
+        <w:t>4.4 Benevente 2: proteção intranual sem trocar a tese anual</w:t>
+      </w:r>
+    </w:p>
+    <w:p>
+      <w:pPr/>
+      <w:r>
+        <w:t>O Benevente 1 continua sendo a estratégia publicada: a cesta e o orçamento de risco são definidos na revisão anual e os ativos são mantidos até a revisão seguinte. O Benevente 2 é uma extensão experimental que não escolhe ações novas e não usa notícias. Ele observa somente a queda do Ibovespa em relação ao pico móvel de 126 sessões e a volatilidade realizada em 20 sessões, sempre deslocadas em um pregão. Assim, a decisão de hoje usa apenas o fechamento de ontem.</w:t>
+      </w:r>
+    </w:p>
+    <w:p>
+      <w:pPr/>
+      <w:r>
+        <w:t>A configuração candidata foi escolhida somente em 2015--2018. Um alerta é acionado com queda de 12% ou volatilidade anualizada de 40%, limitando a exposição a ações a 50%. O estado severo usa 22% e 60%, respectivamente, e limita a exposição a 35%. A saída exige dez sessões de recuperação, para reduzir idas e vindas. O saldo migra para CDI e cada mudança paga 0,10% por unidade de giro. O período de 2019--2025 é lido separadamente como avaliação retrospectiva. A extensão foi concebida depois da Covid-19, portanto essa separação temporal não elimina o viés conceitual e não equivale a validação prospectiva.</w:t>
+      </w:r>
+    </w:p>
+    <w:p>
+      <w:pPr>
+        <w:pStyle w:val="Heading1"/>
+      </w:pPr>
+      <w:r>
+        <w:t>5. Resultados</w:t>
+      </w:r>
+    </w:p>
+    <w:p>
+      <w:pPr>
+        <w:pStyle w:val="Heading2"/>
+      </w:pPr>
+      <w:r>
+        <w:t>5.1 Desempenho da carteira publicada</w:t>
+      </w:r>
+    </w:p>
+    <w:p>
+      <w:pPr/>
+      <w:r>
+        <w:t>Onze decisões anuais, de 2015 a 2025, líquidas de custos de execução.</w:t>
+      </w:r>
+    </w:p>
+    <w:p>
+      <w:pPr>
+        <w:keepNext/>
+        <w:spacing w:after="0"/>
+      </w:pPr>
       <w:r>
         <w:rPr>
           <w:b/>
         </w:rPr>
-        <w:t>CDI</w:t>
-      </w:r>
-      <w:r>
-        <w:t>, série 12 do Banco Central, como custo de oportunidade do caixa.</w:t>
-      </w:r>
-    </w:p>
-    <w:p>
-      <w:pPr>
-        <w:spacing w:line="360" w:lineRule="auto"/>
-        <w:ind w:left="369" w:hanging="227"/>
-      </w:pPr>
-      <w:r>
-        <w:t xml:space="preserve">• </w:t>
-      </w:r>
+        <w:t>Tabela 2</w:t>
+      </w:r>
+    </w:p>
+    <w:p>
+      <w:pPr>
+        <w:keepNext/>
+        <w:spacing w:after="80"/>
+      </w:pPr>
       <w:r>
         <w:rPr>
-          <w:b/>
+          <w:i/>
         </w:rPr>
-        <w:t>Ibovespa</w:t>
-      </w:r>
-      <w:r>
-        <w:t>, que é um índice de retorno total e portanto comparável a uma carteira que reinveste proventos.</w:t>
-      </w:r>
-    </w:p>
-    <w:p>
-      <w:pPr>
-        <w:spacing w:line="360" w:lineRule="auto"/>
-        <w:ind w:left="369" w:hanging="227"/>
-      </w:pPr>
-      <w:r>
-        <w:t xml:space="preserve">• </w:t>
-      </w:r>
-      <w:r>
-        <w:rPr>
-          <w:b/>
-        </w:rPr>
-        <w:t>BOVA11</w:t>
-      </w:r>
-      <w:r>
-        <w:t>, o ETF efetivamente investível, para que a comparação não dependa de um índice não negociável.</w:t>
-      </w:r>
-    </w:p>
-    <w:p>
-      <w:pPr>
-        <w:spacing w:line="360" w:lineRule="auto"/>
-        <w:ind w:left="369" w:hanging="227"/>
-      </w:pPr>
-      <w:r>
-        <w:t xml:space="preserve">• </w:t>
-      </w:r>
-      <w:r>
-        <w:rPr>
-          <w:b/>
-        </w:rPr>
-        <w:t>Otimização média-variância neutra</w:t>
-      </w:r>
-      <w:r>
-        <w:t xml:space="preserve"> sobre o mesmo universo elegível, um comparador independente e não uma cópia da carteira com outro nome.</w:t>
-      </w:r>
-    </w:p>
-    <w:p>
-      <w:pPr/>
-      <w:r>
-        <w:t>Esse último merece nota. Em uma versão anterior do sistema, a série rotulada como MVO de referência era numericamente idêntica à estratégia em todos os anos, ou seja, a estratégia estava sendo comparada a si mesma. O defeito foi encontrado na auditoria interna, corrigido com uma implementação independente, e o comparador passou a produzir resultados distintos, inclusive desfavoráveis à estratégia em um dos onze anos.</w:t>
-      </w:r>
-    </w:p>
-    <w:p>
-      <w:pPr>
-        <w:pStyle w:val="Heading2"/>
-      </w:pPr>
-      <w:r>
-        <w:t>4.3 Correção por múltiplas tentativas</w:t>
-      </w:r>
-    </w:p>
-    <w:p>
-      <w:pPr/>
-      <w:r>
-        <w:t>Com 36 configurações avaliadas, o Sharpe da vencedora precisa ser deflacionado. Calculamos o Sharpe deflacionado com o número de tentativas, o número de observações e os momentos superiores da série de retornos.</w:t>
-      </w:r>
-    </w:p>
-    <w:p>
-      <w:pPr/>
-      <w:r>
-        <w:t>Medimos também o prêmio de retrospectiva, que é a diferença entre o CAGR da configuração que teria vencido a amostra inteira, escolha impossível na prática porque usa os anos sobre os quais é medida, e o CAGR da escolha aninhada. Esse número quantifica exatamente o que um concorrente ganharia publicando o vencedor da busca como se fosse resultado obtenível.</w:t>
-      </w:r>
-    </w:p>
-    <w:p>
-      <w:pPr>
-        <w:pStyle w:val="Heading2"/>
-      </w:pPr>
-      <w:r>
-        <w:t>4.4 Benevente 2: proteção intranual sem trocar a tese anual</w:t>
-      </w:r>
-    </w:p>
-    <w:p>
-      <w:pPr/>
-      <w:r>
-        <w:t>O Benevente 1 continua sendo a estratégia publicada: a cesta e o orçamento de risco são definidos na revisão anual e os ativos são mantidos até a revisão seguinte. O Benevente 2 é uma extensão experimental que não escolhe ações novas e não usa notícias. Ele observa somente a queda do Ibovespa em relação ao pico móvel de 126 sessões e a volatilidade realizada em 20 sessões, sempre deslocadas em um pregão. Assim, a decisão de hoje usa apenas o fechamento de ontem.</w:t>
-      </w:r>
-    </w:p>
-    <w:p>
-      <w:pPr/>
-      <w:r>
-        <w:t>A configuração candidata foi escolhida somente em 2015--2018. Um alerta é acionado com queda de 12% ou volatilidade anualizada de 40%, limitando a exposição a ações a 50%. O estado severo usa 22% e 60%, respectivamente, e limita a exposição a 35%. A saída exige dez sessões de recuperação, para reduzir idas e vindas. O saldo migra para CDI e cada mudança paga 0,10% por unidade de giro. O período de 2019--2025 é lido separadamente como avaliação retrospectiva. A extensão foi concebida depois da Covid-19, portanto essa separação temporal não elimina o viés conceitual e não equivale a validação prospectiva.</w:t>
-      </w:r>
-    </w:p>
-    <w:p>
-      <w:pPr>
-        <w:pStyle w:val="Heading1"/>
-      </w:pPr>
-      <w:r>
-        <w:t>5. Resultados</w:t>
-      </w:r>
-    </w:p>
-    <w:p>
-      <w:pPr>
-        <w:pStyle w:val="Heading2"/>
-      </w:pPr>
-      <w:r>
-        <w:t>5.1 Desempenho da carteira publicada</w:t>
-      </w:r>
-    </w:p>
-    <w:p>
-      <w:pPr/>
-      <w:r>
-        <w:t>Onze decisões anuais, de 2015 a 2025, líquidas de custos de execução.</w:t>
+        <w:t>Desempenho da carteira publicada e dos comparadores entre 2015 e 2025</w:t>
       </w:r>
     </w:p>
     <w:tbl>
@@ -1127,6 +1035,14 @@
         <w:tblW w:type="auto" w:w="0"/>
         <w:jc w:val="center"/>
         <w:tblLook w:firstColumn="1" w:firstRow="1" w:lastColumn="0" w:lastRow="0" w:noHBand="0" w:noVBand="1" w:val="04A0"/>
+        <w:tblBorders>
+          <w:left w:val="nil"/>
+          <w:right w:val="nil"/>
+          <w:insideH w:val="nil"/>
+          <w:insideV w:val="nil"/>
+          <w:top w:val="single" w:sz="8" w:color="000000"/>
+          <w:bottom w:val="single" w:sz="8" w:color="000000"/>
+        </w:tblBorders>
       </w:tblPr>
       <w:tblGrid>
         <w:gridCol w:w="1814"/>
@@ -1144,10 +1060,13 @@
           <w:tcPr>
             <w:tcW w:type="dxa" w:w="1814"/>
             <w:vAlign w:val="center"/>
-            <w:shd w:fill="D9E7E5"/>
-          </w:tcPr>
-          <w:p>
-            <w:pPr>
+            <w:tcBorders>
+              <w:bottom w:val="single" w:sz="8" w:color="000000"/>
+            </w:tcBorders>
+          </w:tcPr>
+          <w:p>
+            <w:pPr>
+              <w:keepNext/>
               <w:jc w:val="left"/>
             </w:pPr>
             <w:r>
@@ -1164,10 +1083,13 @@
           <w:tcPr>
             <w:tcW w:type="dxa" w:w="1814"/>
             <w:vAlign w:val="center"/>
-            <w:shd w:fill="D9E7E5"/>
-          </w:tcPr>
-          <w:p>
-            <w:pPr>
+            <w:tcBorders>
+              <w:bottom w:val="single" w:sz="8" w:color="000000"/>
+            </w:tcBorders>
+          </w:tcPr>
+          <w:p>
+            <w:pPr>
+              <w:keepNext/>
               <w:jc w:val="left"/>
             </w:pPr>
             <w:r>
@@ -1184,10 +1106,13 @@
           <w:tcPr>
             <w:tcW w:type="dxa" w:w="1814"/>
             <w:vAlign w:val="center"/>
-            <w:shd w:fill="D9E7E5"/>
-          </w:tcPr>
-          <w:p>
-            <w:pPr>
+            <w:tcBorders>
+              <w:bottom w:val="single" w:sz="8" w:color="000000"/>
+            </w:tcBorders>
+          </w:tcPr>
+          <w:p>
+            <w:pPr>
+              <w:keepNext/>
               <w:jc w:val="left"/>
             </w:pPr>
             <w:r>
@@ -1204,10 +1129,13 @@
           <w:tcPr>
             <w:tcW w:type="dxa" w:w="1814"/>
             <w:vAlign w:val="center"/>
-            <w:shd w:fill="D9E7E5"/>
-          </w:tcPr>
-          <w:p>
-            <w:pPr>
+            <w:tcBorders>
+              <w:bottom w:val="single" w:sz="8" w:color="000000"/>
+            </w:tcBorders>
+          </w:tcPr>
+          <w:p>
+            <w:pPr>
+              <w:keepNext/>
               <w:jc w:val="left"/>
             </w:pPr>
             <w:r>
@@ -1224,10 +1152,13 @@
           <w:tcPr>
             <w:tcW w:type="dxa" w:w="1814"/>
             <w:vAlign w:val="center"/>
-            <w:shd w:fill="D9E7E5"/>
-          </w:tcPr>
-          <w:p>
-            <w:pPr>
+            <w:tcBorders>
+              <w:bottom w:val="single" w:sz="8" w:color="000000"/>
+            </w:tcBorders>
+          </w:tcPr>
+          <w:p>
+            <w:pPr>
+              <w:keepNext/>
               <w:jc w:val="left"/>
             </w:pPr>
             <w:r>
@@ -1252,12 +1183,12 @@
           </w:tcPr>
           <w:p>
             <w:pPr>
-              <w:jc w:val="left"/>
-            </w:pPr>
-            <w:r>
-              <w:rPr>
-                <w:rFonts w:ascii="Times New Roman" w:hAnsi="Times New Roman"/>
-                <w:b/>
+              <w:keepNext/>
+              <w:jc w:val="left"/>
+            </w:pPr>
+            <w:r>
+              <w:rPr>
+                <w:rFonts w:ascii="Times New Roman" w:hAnsi="Times New Roman"/>
                 <w:sz w:val="18"/>
               </w:rPr>
               <w:t>Benevente 1</w:t>
@@ -1271,12 +1202,12 @@
           </w:tcPr>
           <w:p>
             <w:pPr>
-              <w:jc w:val="left"/>
-            </w:pPr>
-            <w:r>
-              <w:rPr>
-                <w:rFonts w:ascii="Times New Roman" w:hAnsi="Times New Roman"/>
-                <w:b/>
+              <w:keepNext/>
+              <w:jc w:val="left"/>
+            </w:pPr>
+            <w:r>
+              <w:rPr>
+                <w:rFonts w:ascii="Times New Roman" w:hAnsi="Times New Roman"/>
                 <w:sz w:val="18"/>
               </w:rPr>
               <w:t>17,86%</w:t>
@@ -1290,12 +1221,12 @@
           </w:tcPr>
           <w:p>
             <w:pPr>
-              <w:jc w:val="left"/>
-            </w:pPr>
-            <w:r>
-              <w:rPr>
-                <w:rFonts w:ascii="Times New Roman" w:hAnsi="Times New Roman"/>
-                <w:b/>
+              <w:keepNext/>
+              <w:jc w:val="left"/>
+            </w:pPr>
+            <w:r>
+              <w:rPr>
+                <w:rFonts w:ascii="Times New Roman" w:hAnsi="Times New Roman"/>
                 <w:sz w:val="18"/>
               </w:rPr>
               <w:t>R$ 609.832</w:t>
@@ -1309,6 +1240,7 @@
           </w:tcPr>
           <w:p>
             <w:pPr>
+              <w:keepNext/>
               <w:jc w:val="left"/>
             </w:pPr>
           </w:p>
@@ -1320,6 +1252,7 @@
           </w:tcPr>
           <w:p>
             <w:pPr>
+              <w:keepNext/>
               <w:jc w:val="left"/>
             </w:pPr>
             <w:r>
@@ -1343,6 +1276,7 @@
           </w:tcPr>
           <w:p>
             <w:pPr>
+              <w:keepNext/>
               <w:jc w:val="left"/>
             </w:pPr>
             <w:r>
@@ -1361,6 +1295,7 @@
           </w:tcPr>
           <w:p>
             <w:pPr>
+              <w:keepNext/>
               <w:jc w:val="left"/>
             </w:pPr>
             <w:r>
@@ -1379,6 +1314,7 @@
           </w:tcPr>
           <w:p>
             <w:pPr>
+              <w:keepNext/>
               <w:jc w:val="left"/>
             </w:pPr>
             <w:r>
@@ -1397,6 +1333,7 @@
           </w:tcPr>
           <w:p>
             <w:pPr>
+              <w:keepNext/>
               <w:jc w:val="left"/>
             </w:pPr>
           </w:p>
@@ -1408,6 +1345,7 @@
           </w:tcPr>
           <w:p>
             <w:pPr>
+              <w:keepNext/>
               <w:jc w:val="left"/>
             </w:pPr>
           </w:p>
@@ -1424,6 +1362,7 @@
           </w:tcPr>
           <w:p>
             <w:pPr>
+              <w:keepNext/>
               <w:jc w:val="left"/>
             </w:pPr>
             <w:r>
@@ -1442,6 +1381,7 @@
           </w:tcPr>
           <w:p>
             <w:pPr>
+              <w:keepNext/>
               <w:jc w:val="left"/>
             </w:pPr>
             <w:r>
@@ -1460,6 +1400,7 @@
           </w:tcPr>
           <w:p>
             <w:pPr>
+              <w:keepNext/>
               <w:jc w:val="left"/>
             </w:pPr>
             <w:r>
@@ -1478,6 +1419,7 @@
           </w:tcPr>
           <w:p>
             <w:pPr>
+              <w:keepNext/>
               <w:jc w:val="left"/>
             </w:pPr>
             <w:r>
@@ -1496,6 +1438,7 @@
           </w:tcPr>
           <w:p>
             <w:pPr>
+              <w:keepNext/>
               <w:jc w:val="left"/>
             </w:pPr>
             <w:r>
@@ -1519,6 +1462,7 @@
           </w:tcPr>
           <w:p>
             <w:pPr>
+              <w:keepNext/>
               <w:jc w:val="left"/>
             </w:pPr>
             <w:r>
@@ -1537,6 +1481,7 @@
           </w:tcPr>
           <w:p>
             <w:pPr>
+              <w:keepNext/>
               <w:jc w:val="left"/>
             </w:pPr>
             <w:r>
@@ -1555,6 +1500,7 @@
           </w:tcPr>
           <w:p>
             <w:pPr>
+              <w:keepNext/>
               <w:jc w:val="left"/>
             </w:pPr>
             <w:r>
@@ -1573,6 +1519,7 @@
           </w:tcPr>
           <w:p>
             <w:pPr>
+              <w:keepNext/>
               <w:jc w:val="left"/>
             </w:pPr>
             <w:r>
@@ -1591,8 +1538,16 @@
           </w:tcPr>
           <w:p>
             <w:pPr>
-              <w:jc w:val="left"/>
-            </w:pPr>
+              <w:keepNext/>
+              <w:jc w:val="left"/>
+            </w:pPr>
+            <w:r>
+              <w:rPr>
+                <w:rFonts w:ascii="Times New Roman" w:hAnsi="Times New Roman"/>
+                <w:sz w:val="18"/>
+              </w:rPr>
+              <w:t>−47,2%</w:t>
+            </w:r>
           </w:p>
         </w:tc>
       </w:tr>
@@ -1607,6 +1562,7 @@
           </w:tcPr>
           <w:p>
             <w:pPr>
+              <w:keepNext/>
               <w:jc w:val="left"/>
             </w:pPr>
             <w:r>
@@ -1625,6 +1581,7 @@
           </w:tcPr>
           <w:p>
             <w:pPr>
+              <w:keepNext/>
               <w:jc w:val="left"/>
             </w:pPr>
             <w:r>
@@ -1643,6 +1600,7 @@
           </w:tcPr>
           <w:p>
             <w:pPr>
+              <w:keepNext/>
               <w:jc w:val="left"/>
             </w:pPr>
             <w:r>
@@ -1661,6 +1619,7 @@
           </w:tcPr>
           <w:p>
             <w:pPr>
+              <w:keepNext/>
               <w:jc w:val="left"/>
             </w:pPr>
             <w:r>
@@ -1679,6 +1638,7 @@
           </w:tcPr>
           <w:p>
             <w:pPr>
+              <w:keepNext/>
               <w:jc w:val="left"/>
             </w:pPr>
             <w:r>
@@ -1702,6 +1662,7 @@
           </w:tcPr>
           <w:p>
             <w:pPr>
+              <w:keepNext w:val="0"/>
               <w:jc w:val="left"/>
             </w:pPr>
             <w:r>
@@ -1720,6 +1681,7 @@
           </w:tcPr>
           <w:p>
             <w:pPr>
+              <w:keepNext w:val="0"/>
               <w:jc w:val="left"/>
             </w:pPr>
             <w:r>
@@ -1738,6 +1700,7 @@
           </w:tcPr>
           <w:p>
             <w:pPr>
+              <w:keepNext w:val="0"/>
               <w:jc w:val="left"/>
             </w:pPr>
             <w:r>
@@ -1756,6 +1719,7 @@
           </w:tcPr>
           <w:p>
             <w:pPr>
+              <w:keepNext w:val="0"/>
               <w:jc w:val="left"/>
             </w:pPr>
             <w:r>
@@ -1774,13 +1738,25 @@
           </w:tcPr>
           <w:p>
             <w:pPr>
+              <w:keepNext w:val="0"/>
               <w:jc w:val="left"/>
             </w:pPr>
           </w:p>
         </w:tc>
       </w:tr>
     </w:tbl>
-    <w:p/>
+    <w:p>
+      <w:pPr>
+        <w:spacing w:before="60" w:after="160" w:line="240" w:lineRule="auto"/>
+      </w:pPr>
+      <w:r>
+        <w:rPr>
+          <w:rFonts w:ascii="Times New Roman" w:hAnsi="Times New Roman"/>
+          <w:sz w:val="20"/>
+        </w:rPr>
+        <w:t>Nota. Elaboração própria com base nos artefatos reproduzíveis da pesquisa.</w:t>
+      </w:r>
+    </w:p>
     <w:p>
       <w:pPr/>
       <w:r>
@@ -1795,22 +1771,40 @@
     </w:p>
     <w:p>
       <w:pPr/>
+      <w:r>
+        <w:t>Esse resultado teve um custo de risco. A queda máxima diária chegou a 47,8%, praticamente a mesma do Ibovespa, com 47,0%, e do BOVA11, com 47,2%. Isso ocorreu porque o protocolo aninhado elevou a parcela de renda variável a 95% entre 2018 e 2021. A carteira não é uma versão suavizada do mercado com retorno maior. É uma carteira concentrada que passou pelo mesmo tombo e se recuperou mais. Houve cinco trocas de configuração no período, e o orçamento de renda variável percorreu 55%, 75%, 95%, 75% e 55%.</w:t>
+      </w:r>
+    </w:p>
+    <w:p>
+      <w:pPr>
+        <w:pStyle w:val="Heading2"/>
+      </w:pPr>
+      <w:r>
+        <w:t>5.2 Benevente 2: o que melhorou e o que não foi provado</w:t>
+      </w:r>
+    </w:p>
+    <w:p>
+      <w:pPr>
+        <w:keepNext/>
+        <w:spacing w:after="0"/>
+      </w:pPr>
       <w:r>
         <w:rPr>
           <w:b/>
         </w:rPr>
-        <w:t>O que esse resultado custa.</w:t>
-      </w:r>
-      <w:r>
-        <w:t xml:space="preserve"> A queda máxima diária chegou a 47,8%, praticamente a mesma do Ibovespa no período, que foi de 47,0%, porque o protocolo aninhado elevou a parcela de renda variável a 95% entre 2018 e 2021. A carteira não é uma versão suavizada do mercado com retorno maior. É uma carteira concentrada que passou pelo mesmo tombo e se recuperou mais. Houve cinco trocas de configuração no período, e o orçamento de renda variável percorreu 55%, 75%, 95%, 75% e 55%.</w:t>
-      </w:r>
-    </w:p>
-    <w:p>
-      <w:pPr>
-        <w:pStyle w:val="Heading2"/>
-      </w:pPr>
-      <w:r>
-        <w:t>5.2 Benevente 2: o que melhorou e o que não foi provado</w:t>
+        <w:t>Tabela 3</w:t>
+      </w:r>
+    </w:p>
+    <w:p>
+      <w:pPr>
+        <w:keepNext/>
+        <w:spacing w:after="80"/>
+      </w:pPr>
+      <w:r>
+        <w:rPr>
+          <w:i/>
+        </w:rPr>
+        <w:t>Desempenho e risco do Benevente 1 e do Benevente 2</w:t>
       </w:r>
     </w:p>
     <w:tbl>
@@ -1818,6 +1812,14 @@
         <w:tblW w:type="auto" w:w="0"/>
         <w:jc w:val="center"/>
         <w:tblLook w:firstColumn="1" w:firstRow="1" w:lastColumn="0" w:lastRow="0" w:noHBand="0" w:noVBand="1" w:val="04A0"/>
+        <w:tblBorders>
+          <w:left w:val="nil"/>
+          <w:right w:val="nil"/>
+          <w:insideH w:val="nil"/>
+          <w:insideV w:val="nil"/>
+          <w:top w:val="single" w:sz="8" w:color="000000"/>
+          <w:bottom w:val="single" w:sz="8" w:color="000000"/>
+        </w:tblBorders>
       </w:tblPr>
       <w:tblGrid>
         <w:gridCol w:w="2268"/>
@@ -1834,10 +1836,13 @@
           <w:tcPr>
             <w:tcW w:type="dxa" w:w="2268"/>
             <w:vAlign w:val="center"/>
-            <w:shd w:fill="D9E7E5"/>
-          </w:tcPr>
-          <w:p>
-            <w:pPr>
+            <w:tcBorders>
+              <w:bottom w:val="single" w:sz="8" w:color="000000"/>
+            </w:tcBorders>
+          </w:tcPr>
+          <w:p>
+            <w:pPr>
+              <w:keepNext/>
               <w:jc w:val="left"/>
             </w:pPr>
             <w:r>
@@ -1854,10 +1859,13 @@
           <w:tcPr>
             <w:tcW w:type="dxa" w:w="2268"/>
             <w:vAlign w:val="center"/>
-            <w:shd w:fill="D9E7E5"/>
-          </w:tcPr>
-          <w:p>
-            <w:pPr>
+            <w:tcBorders>
+              <w:bottom w:val="single" w:sz="8" w:color="000000"/>
+            </w:tcBorders>
+          </w:tcPr>
+          <w:p>
+            <w:pPr>
+              <w:keepNext/>
               <w:jc w:val="left"/>
             </w:pPr>
             <w:r>
@@ -1874,10 +1882,13 @@
           <w:tcPr>
             <w:tcW w:type="dxa" w:w="2268"/>
             <w:vAlign w:val="center"/>
-            <w:shd w:fill="D9E7E5"/>
-          </w:tcPr>
-          <w:p>
-            <w:pPr>
+            <w:tcBorders>
+              <w:bottom w:val="single" w:sz="8" w:color="000000"/>
+            </w:tcBorders>
+          </w:tcPr>
+          <w:p>
+            <w:pPr>
+              <w:keepNext/>
               <w:jc w:val="left"/>
             </w:pPr>
             <w:r>
@@ -1894,10 +1905,13 @@
           <w:tcPr>
             <w:tcW w:type="dxa" w:w="2268"/>
             <w:vAlign w:val="center"/>
-            <w:shd w:fill="D9E7E5"/>
-          </w:tcPr>
-          <w:p>
-            <w:pPr>
+            <w:tcBorders>
+              <w:bottom w:val="single" w:sz="8" w:color="000000"/>
+            </w:tcBorders>
+          </w:tcPr>
+          <w:p>
+            <w:pPr>
+              <w:keepNext/>
               <w:jc w:val="left"/>
             </w:pPr>
             <w:r>
@@ -1922,6 +1936,7 @@
           </w:tcPr>
           <w:p>
             <w:pPr>
+              <w:keepNext/>
               <w:jc w:val="left"/>
             </w:pPr>
             <w:r>
@@ -1940,6 +1955,7 @@
           </w:tcPr>
           <w:p>
             <w:pPr>
+              <w:keepNext/>
               <w:jc w:val="left"/>
             </w:pPr>
             <w:r>
@@ -1958,6 +1974,7 @@
           </w:tcPr>
           <w:p>
             <w:pPr>
+              <w:keepNext/>
               <w:jc w:val="left"/>
             </w:pPr>
             <w:r>
@@ -1976,6 +1993,7 @@
           </w:tcPr>
           <w:p>
             <w:pPr>
+              <w:keepNext/>
               <w:jc w:val="left"/>
             </w:pPr>
             <w:r>
@@ -1999,12 +2017,12 @@
           </w:tcPr>
           <w:p>
             <w:pPr>
-              <w:jc w:val="left"/>
-            </w:pPr>
-            <w:r>
-              <w:rPr>
-                <w:rFonts w:ascii="Times New Roman" w:hAnsi="Times New Roman"/>
-                <w:b/>
+              <w:keepNext w:val="0"/>
+              <w:jc w:val="left"/>
+            </w:pPr>
+            <w:r>
+              <w:rPr>
+                <w:rFonts w:ascii="Times New Roman" w:hAnsi="Times New Roman"/>
                 <w:sz w:val="18"/>
               </w:rPr>
               <w:t>Benevente 2, experimental</w:t>
@@ -2018,12 +2036,12 @@
           </w:tcPr>
           <w:p>
             <w:pPr>
-              <w:jc w:val="left"/>
-            </w:pPr>
-            <w:r>
-              <w:rPr>
-                <w:rFonts w:ascii="Times New Roman" w:hAnsi="Times New Roman"/>
-                <w:b/>
+              <w:keepNext w:val="0"/>
+              <w:jc w:val="left"/>
+            </w:pPr>
+            <w:r>
+              <w:rPr>
+                <w:rFonts w:ascii="Times New Roman" w:hAnsi="Times New Roman"/>
                 <w:sz w:val="18"/>
               </w:rPr>
               <w:t>18,45%</w:t>
@@ -2037,12 +2055,12 @@
           </w:tcPr>
           <w:p>
             <w:pPr>
-              <w:jc w:val="left"/>
-            </w:pPr>
-            <w:r>
-              <w:rPr>
-                <w:rFonts w:ascii="Times New Roman" w:hAnsi="Times New Roman"/>
-                <w:b/>
+              <w:keepNext w:val="0"/>
+              <w:jc w:val="left"/>
+            </w:pPr>
+            <w:r>
+              <w:rPr>
+                <w:rFonts w:ascii="Times New Roman" w:hAnsi="Times New Roman"/>
                 <w:sz w:val="18"/>
               </w:rPr>
               <w:t>−28,7%</w:t>
@@ -2056,12 +2074,12 @@
           </w:tcPr>
           <w:p>
             <w:pPr>
-              <w:jc w:val="left"/>
-            </w:pPr>
-            <w:r>
-              <w:rPr>
-                <w:rFonts w:ascii="Times New Roman" w:hAnsi="Times New Roman"/>
-                <w:b/>
+              <w:keepNext w:val="0"/>
+              <w:jc w:val="left"/>
+            </w:pPr>
+            <w:r>
+              <w:rPr>
+                <w:rFonts w:ascii="Times New Roman" w:hAnsi="Times New Roman"/>
                 <w:sz w:val="18"/>
               </w:rPr>
               <w:t>18,03%</w:t>
@@ -2070,7 +2088,18 @@
         </w:tc>
       </w:tr>
     </w:tbl>
-    <w:p/>
+    <w:p>
+      <w:pPr>
+        <w:spacing w:before="60" w:after="160" w:line="240" w:lineRule="auto"/>
+      </w:pPr>
+      <w:r>
+        <w:rPr>
+          <w:rFonts w:ascii="Times New Roman" w:hAnsi="Times New Roman"/>
+          <w:sz w:val="20"/>
+        </w:rPr>
+        <w:t>Nota. Elaboração própria com base nos artefatos reproduzíveis da pesquisa.</w:t>
+      </w:r>
+    </w:p>
     <w:p>
       <w:pPr/>
       <w:r>
@@ -2080,24 +2109,39 @@
     <w:p>
       <w:pPr/>
       <w:r>
-        <w:t xml:space="preserve">O resultado de retorno exige contenção. No recorte 2019--2025 a diferença de CAGR entre as versões foi de apenas 0,09 ponto percentual e o teste pareado anual produziu p = 0,964. Portanto, não há evidência de alfa adicional. Numa grade de sensibilidade com 432 configurações, todas reduziram a queda máxima, mas apenas 9,03% melhoraram simultaneamente CAGR e queda no recorte de avaliação. A conclusão sustentada é </w:t>
-      </w:r>
+        <w:t>O resultado de retorno exige contenção. No recorte 2019--2025 a diferença de CAGR entre as versões foi de apenas 0,09 ponto percentual e o teste pareado anual produziu p = 0,964. Portanto, não há evidência de alfa adicional. Numa grade de sensibilidade com 432 configurações, todas reduziram a queda máxima, mas apenas 9,03% melhoraram simultaneamente CAGR e queda no recorte de avaliação. A conclusão sustentada é uma redução robusta de risco de cauda, não aumento comprovado de rentabilidade. Os números do Benevente 2 incluem custo de giro do controle intranual, mas ainda não o imposto gerado por vendas dentro do ano. Por isso ele permanece experimental e não substitui a série canônica.</w:t>
+      </w:r>
+    </w:p>
+    <w:p>
+      <w:pPr>
+        <w:pStyle w:val="Heading2"/>
+      </w:pPr>
+      <w:r>
+        <w:t>5.3 O resultado sobrevive à correção por múltiplas tentativas?</w:t>
+      </w:r>
+    </w:p>
+    <w:p>
+      <w:pPr>
+        <w:keepNext/>
+        <w:spacing w:after="0"/>
+      </w:pPr>
       <w:r>
         <w:rPr>
           <w:b/>
         </w:rPr>
-        <w:t>redução robusta de risco de cauda</w:t>
-      </w:r>
-      <w:r>
-        <w:t>, não aumento comprovado de rentabilidade. Os números do Benevente 2 incluem custo de giro do controle intranual, mas ainda não o imposto gerado por vendas dentro do ano. Por isso ele permanece experimental e não substitui a série canônica.</w:t>
-      </w:r>
-    </w:p>
-    <w:p>
-      <w:pPr>
-        <w:pStyle w:val="Heading2"/>
-      </w:pPr>
-      <w:r>
-        <w:t>5.3 O resultado sobrevive à correção por múltiplas tentativas?</w:t>
+        <w:t>Tabela 4</w:t>
+      </w:r>
+    </w:p>
+    <w:p>
+      <w:pPr>
+        <w:keepNext/>
+        <w:spacing w:after="80"/>
+      </w:pPr>
+      <w:r>
+        <w:rPr>
+          <w:i/>
+        </w:rPr>
+        <w:t>Estatísticas de correção por múltiplas tentativas</w:t>
       </w:r>
     </w:p>
     <w:tbl>
@@ -2105,6 +2149,14 @@
         <w:tblW w:type="auto" w:w="0"/>
         <w:jc w:val="center"/>
         <w:tblLook w:firstColumn="1" w:firstRow="1" w:lastColumn="0" w:lastRow="0" w:noHBand="0" w:noVBand="1" w:val="04A0"/>
+        <w:tblBorders>
+          <w:left w:val="nil"/>
+          <w:right w:val="nil"/>
+          <w:insideH w:val="nil"/>
+          <w:insideV w:val="nil"/>
+          <w:top w:val="single" w:sz="8" w:color="000000"/>
+          <w:bottom w:val="single" w:sz="8" w:color="000000"/>
+        </w:tblBorders>
       </w:tblPr>
       <w:tblGrid>
         <w:gridCol w:w="4535"/>
@@ -2119,10 +2171,13 @@
           <w:tcPr>
             <w:tcW w:type="dxa" w:w="4535"/>
             <w:vAlign w:val="center"/>
-            <w:shd w:fill="D9E7E5"/>
-          </w:tcPr>
-          <w:p>
-            <w:pPr>
+            <w:tcBorders>
+              <w:bottom w:val="single" w:sz="8" w:color="000000"/>
+            </w:tcBorders>
+          </w:tcPr>
+          <w:p>
+            <w:pPr>
+              <w:keepNext/>
               <w:jc w:val="left"/>
             </w:pPr>
             <w:r>
@@ -2139,10 +2194,13 @@
           <w:tcPr>
             <w:tcW w:type="dxa" w:w="4535"/>
             <w:vAlign w:val="center"/>
-            <w:shd w:fill="D9E7E5"/>
-          </w:tcPr>
-          <w:p>
-            <w:pPr>
+            <w:tcBorders>
+              <w:bottom w:val="single" w:sz="8" w:color="000000"/>
+            </w:tcBorders>
+          </w:tcPr>
+          <w:p>
+            <w:pPr>
+              <w:keepNext/>
               <w:jc w:val="left"/>
             </w:pPr>
             <w:r>
@@ -2167,6 +2225,7 @@
           </w:tcPr>
           <w:p>
             <w:pPr>
+              <w:keepNext/>
               <w:jc w:val="left"/>
             </w:pPr>
             <w:r>
@@ -2185,6 +2244,7 @@
           </w:tcPr>
           <w:p>
             <w:pPr>
+              <w:keepNext/>
               <w:jc w:val="left"/>
             </w:pPr>
             <w:r>
@@ -2208,6 +2268,7 @@
           </w:tcPr>
           <w:p>
             <w:pPr>
+              <w:keepNext/>
               <w:jc w:val="left"/>
             </w:pPr>
             <w:r>
@@ -2226,6 +2287,7 @@
           </w:tcPr>
           <w:p>
             <w:pPr>
+              <w:keepNext/>
               <w:jc w:val="left"/>
             </w:pPr>
             <w:r>
@@ -2249,12 +2311,12 @@
           </w:tcPr>
           <w:p>
             <w:pPr>
-              <w:jc w:val="left"/>
-            </w:pPr>
-            <w:r>
-              <w:rPr>
-                <w:rFonts w:ascii="Times New Roman" w:hAnsi="Times New Roman"/>
-                <w:b/>
+              <w:keepNext/>
+              <w:jc w:val="left"/>
+            </w:pPr>
+            <w:r>
+              <w:rPr>
+                <w:rFonts w:ascii="Times New Roman" w:hAnsi="Times New Roman"/>
                 <w:sz w:val="18"/>
               </w:rPr>
               <w:t>Probabilidade do Sharpe deflacionado</w:t>
@@ -2268,12 +2330,12 @@
           </w:tcPr>
           <w:p>
             <w:pPr>
-              <w:jc w:val="left"/>
-            </w:pPr>
-            <w:r>
-              <w:rPr>
-                <w:rFonts w:ascii="Times New Roman" w:hAnsi="Times New Roman"/>
-                <w:b/>
+              <w:keepNext/>
+              <w:jc w:val="left"/>
+            </w:pPr>
+            <w:r>
+              <w:rPr>
+                <w:rFonts w:ascii="Times New Roman" w:hAnsi="Times New Roman"/>
                 <w:sz w:val="18"/>
               </w:rPr>
               <w:t>0,986</w:t>
@@ -2292,6 +2354,7 @@
           </w:tcPr>
           <w:p>
             <w:pPr>
+              <w:keepNext/>
               <w:jc w:val="left"/>
             </w:pPr>
             <w:r>
@@ -2310,6 +2373,7 @@
           </w:tcPr>
           <w:p>
             <w:pPr>
+              <w:keepNext/>
               <w:jc w:val="left"/>
             </w:pPr>
             <w:r>
@@ -2333,12 +2397,12 @@
           </w:tcPr>
           <w:p>
             <w:pPr>
-              <w:jc w:val="left"/>
-            </w:pPr>
-            <w:r>
-              <w:rPr>
-                <w:rFonts w:ascii="Times New Roman" w:hAnsi="Times New Roman"/>
-                <w:b/>
+              <w:keepNext w:val="0"/>
+              <w:jc w:val="left"/>
+            </w:pPr>
+            <w:r>
+              <w:rPr>
+                <w:rFonts w:ascii="Times New Roman" w:hAnsi="Times New Roman"/>
                 <w:sz w:val="18"/>
               </w:rPr>
               <w:t>Prêmio de retrospectiva</w:t>
@@ -2352,12 +2416,12 @@
           </w:tcPr>
           <w:p>
             <w:pPr>
-              <w:jc w:val="left"/>
-            </w:pPr>
-            <w:r>
-              <w:rPr>
-                <w:rFonts w:ascii="Times New Roman" w:hAnsi="Times New Roman"/>
-                <w:b/>
+              <w:keepNext w:val="0"/>
+              <w:jc w:val="left"/>
+            </w:pPr>
+            <w:r>
+              <w:rPr>
+                <w:rFonts w:ascii="Times New Roman" w:hAnsi="Times New Roman"/>
                 <w:sz w:val="18"/>
               </w:rPr>
               <w:t>0,65 p.p. ao ano</w:t>
@@ -2366,7 +2430,18 @@
         </w:tc>
       </w:tr>
     </w:tbl>
-    <w:p/>
+    <w:p>
+      <w:pPr>
+        <w:spacing w:before="60" w:after="160" w:line="240" w:lineRule="auto"/>
+      </w:pPr>
+      <w:r>
+        <w:rPr>
+          <w:rFonts w:ascii="Times New Roman" w:hAnsi="Times New Roman"/>
+          <w:sz w:val="20"/>
+        </w:rPr>
+        <w:t>Nota. Elaboração própria com base nos artefatos reproduzíveis da pesquisa.</w:t>
+      </w:r>
+    </w:p>
     <w:p>
       <w:pPr/>
       <w:r>
@@ -2389,38 +2464,44 @@
     </w:p>
     <w:p>
       <w:pPr/>
+      <w:r>
+        <w:t>Previsão anual de regime. Testamos se indicadores disponíveis em janeiro, entre prêmio de lucro sobre o CDI, nível do CDI, retorno e volatilidade do mercado nos doze meses anteriores e distância do topo, anteciparam se o ano seria de ações ou de caixa. Sobre 8 anos, o melhor preditor acertou 3 de 4 chamadas efetivas, com p de 0,31 contra cara-ou-coroa. Um acerto de 75% em quatro tentativas não distingue habilidade de sorte. O prêmio disponível para quem acertasse todas as chamadas era de 6,5 pontos percentuais ao ano, e permanece inalcançável. Sem sinal.</w:t>
+      </w:r>
+    </w:p>
+    <w:p>
+      <w:pPr/>
+      <w:r>
+        <w:t>Realocação mensal e semanal. Aumentamos as observações para responder à objeção de poder estatístico. Foram 118 períodos mensais e 521 períodos semanais, com sete regras de alocação contínua testadas em cada frequência. Nenhuma das sete regras superou o peso estático de forma estatisticamente significante em nenhuma das duas frequências, e uma delas, a de média-variância, foi significativamente pior. O oráculo, que conhece o futuro, teria feito 72,8% ao ano no mensal e 137,1% no semanal, contra 21,1% do estático. O prêmio por acertar o tempo é enorme, e nada que testamos consegue capturá-lo. Rejeitada.</w:t>
+      </w:r>
+    </w:p>
+    <w:p>
+      <w:pPr/>
+      <w:r>
+        <w:t>Reseleção mais frequente da cesta. A objeção seguinte é diferente da anterior e precisa ser separada dela: não se a proporção entre ações e caixa deve mudar mais vezes, que é o que o parágrafo acima rejeita, mas se a própria cesta deveria ser retriada, reordenada e reotimizada mais vezes por ano. Testamos três cadências com a mesma regra, os mesmos limites e o mesmo painel, variando apenas as datas de decisão.</w:t>
+      </w:r>
+    </w:p>
+    <w:p>
+      <w:pPr>
+        <w:keepNext/>
+        <w:spacing w:after="0"/>
+      </w:pPr>
       <w:r>
         <w:rPr>
           <w:b/>
         </w:rPr>
-        <w:t>Previsão anual de regime.</w:t>
-      </w:r>
-      <w:r>
-        <w:t xml:space="preserve"> Testamos se indicadores disponíveis em janeiro, entre prêmio de lucro sobre o CDI, nível do CDI, retorno e volatilidade do mercado nos doze meses anteriores e distância do topo, anteciparam se o ano seria de ações ou de caixa. Sobre 8 anos, o melhor preditor acertou 3 de 4 chamadas efetivas, com p de 0,31 contra cara-ou-coroa. Um acerto de 75% em quatro tentativas não distingue habilidade de sorte. O prêmio disponível para quem acertasse todas as chamadas era de 6,5 pontos percentuais ao ano, e permanece inalcançável. Sem sinal.</w:t>
-      </w:r>
-    </w:p>
-    <w:p>
-      <w:pPr/>
+        <w:t>Tabela 5</w:t>
+      </w:r>
+    </w:p>
+    <w:p>
+      <w:pPr>
+        <w:keepNext/>
+        <w:spacing w:after="80"/>
+      </w:pPr>
       <w:r>
         <w:rPr>
-          <w:b/>
+          <w:i/>
         </w:rPr>
-        <w:t>Realocação mensal e semanal.</w:t>
-      </w:r>
-      <w:r>
-        <w:t xml:space="preserve"> Aumentamos as observações para responder à objeção de poder estatístico. Foram 118 períodos mensais e 521 períodos semanais, com sete regras de alocação contínua testadas em cada frequência. Nenhuma das sete regras superou o peso estático de forma estatisticamente significante em nenhuma das duas frequências, e uma delas, a de média-variância, foi significativamente pior. O oráculo, que conhece o futuro, teria feito 72,8% ao ano no mensal e 137,1% no semanal, contra 21,1% do estático. O prêmio por acertar o tempo é enorme, e nada que testamos consegue capturá-lo. Rejeitada.</w:t>
-      </w:r>
-    </w:p>
-    <w:p>
-      <w:pPr/>
-      <w:r>
-        <w:rPr>
-          <w:b/>
-        </w:rPr>
-        <w:t>Reseleção mais frequente da cesta.</w:t>
-      </w:r>
-      <w:r>
-        <w:t xml:space="preserve"> A objeção seguinte é diferente da anterior e precisa ser separada dela: não se a proporção entre ações e caixa deve mudar mais vezes, que é o que o parágrafo acima rejeita, mas se a própria cesta deveria ser retriada, reordenada e reotimizada mais vezes por ano. Testamos três cadências com a mesma regra, os mesmos limites e o mesmo painel, variando apenas as datas de decisão.</w:t>
+        <w:t>Desempenho por cadência de reseleção da carteira</w:t>
       </w:r>
     </w:p>
     <w:tbl>
@@ -2428,6 +2509,14 @@
         <w:tblW w:type="auto" w:w="0"/>
         <w:jc w:val="center"/>
         <w:tblLook w:firstColumn="1" w:firstRow="1" w:lastColumn="0" w:lastRow="0" w:noHBand="0" w:noVBand="1" w:val="04A0"/>
+        <w:tblBorders>
+          <w:left w:val="nil"/>
+          <w:right w:val="nil"/>
+          <w:insideH w:val="nil"/>
+          <w:insideV w:val="nil"/>
+          <w:top w:val="single" w:sz="8" w:color="000000"/>
+          <w:bottom w:val="single" w:sz="8" w:color="000000"/>
+        </w:tblBorders>
       </w:tblPr>
       <w:tblGrid>
         <w:gridCol w:w="1512"/>
@@ -2446,10 +2535,13 @@
           <w:tcPr>
             <w:tcW w:type="dxa" w:w="1512"/>
             <w:vAlign w:val="center"/>
-            <w:shd w:fill="D9E7E5"/>
-          </w:tcPr>
-          <w:p>
-            <w:pPr>
+            <w:tcBorders>
+              <w:bottom w:val="single" w:sz="8" w:color="000000"/>
+            </w:tcBorders>
+          </w:tcPr>
+          <w:p>
+            <w:pPr>
+              <w:keepNext/>
               <w:jc w:val="left"/>
             </w:pPr>
             <w:r>
@@ -2466,10 +2558,13 @@
           <w:tcPr>
             <w:tcW w:type="dxa" w:w="1512"/>
             <w:vAlign w:val="center"/>
-            <w:shd w:fill="D9E7E5"/>
-          </w:tcPr>
-          <w:p>
-            <w:pPr>
+            <w:tcBorders>
+              <w:bottom w:val="single" w:sz="8" w:color="000000"/>
+            </w:tcBorders>
+          </w:tcPr>
+          <w:p>
+            <w:pPr>
+              <w:keepNext/>
               <w:jc w:val="left"/>
             </w:pPr>
             <w:r>
@@ -2486,10 +2581,13 @@
           <w:tcPr>
             <w:tcW w:type="dxa" w:w="1512"/>
             <w:vAlign w:val="center"/>
-            <w:shd w:fill="D9E7E5"/>
-          </w:tcPr>
-          <w:p>
-            <w:pPr>
+            <w:tcBorders>
+              <w:bottom w:val="single" w:sz="8" w:color="000000"/>
+            </w:tcBorders>
+          </w:tcPr>
+          <w:p>
+            <w:pPr>
+              <w:keepNext/>
               <w:jc w:val="left"/>
             </w:pPr>
             <w:r>
@@ -2506,10 +2604,13 @@
           <w:tcPr>
             <w:tcW w:type="dxa" w:w="1512"/>
             <w:vAlign w:val="center"/>
-            <w:shd w:fill="D9E7E5"/>
-          </w:tcPr>
-          <w:p>
-            <w:pPr>
+            <w:tcBorders>
+              <w:bottom w:val="single" w:sz="8" w:color="000000"/>
+            </w:tcBorders>
+          </w:tcPr>
+          <w:p>
+            <w:pPr>
+              <w:keepNext/>
               <w:jc w:val="left"/>
             </w:pPr>
             <w:r>
@@ -2526,10 +2627,13 @@
           <w:tcPr>
             <w:tcW w:type="dxa" w:w="1512"/>
             <w:vAlign w:val="center"/>
-            <w:shd w:fill="D9E7E5"/>
-          </w:tcPr>
-          <w:p>
-            <w:pPr>
+            <w:tcBorders>
+              <w:bottom w:val="single" w:sz="8" w:color="000000"/>
+            </w:tcBorders>
+          </w:tcPr>
+          <w:p>
+            <w:pPr>
+              <w:keepNext/>
               <w:jc w:val="left"/>
             </w:pPr>
             <w:r>
@@ -2546,10 +2650,13 @@
           <w:tcPr>
             <w:tcW w:type="dxa" w:w="1512"/>
             <w:vAlign w:val="center"/>
-            <w:shd w:fill="D9E7E5"/>
-          </w:tcPr>
-          <w:p>
-            <w:pPr>
+            <w:tcBorders>
+              <w:bottom w:val="single" w:sz="8" w:color="000000"/>
+            </w:tcBorders>
+          </w:tcPr>
+          <w:p>
+            <w:pPr>
+              <w:keepNext/>
               <w:jc w:val="left"/>
             </w:pPr>
             <w:r>
@@ -2574,12 +2681,12 @@
           </w:tcPr>
           <w:p>
             <w:pPr>
-              <w:jc w:val="left"/>
-            </w:pPr>
-            <w:r>
-              <w:rPr>
-                <w:rFonts w:ascii="Times New Roman" w:hAnsi="Times New Roman"/>
-                <w:b/>
+              <w:keepNext/>
+              <w:jc w:val="left"/>
+            </w:pPr>
+            <w:r>
+              <w:rPr>
+                <w:rFonts w:ascii="Times New Roman" w:hAnsi="Times New Roman"/>
                 <w:sz w:val="18"/>
               </w:rPr>
               <w:t>Anual</w:t>
@@ -2593,6 +2700,7 @@
           </w:tcPr>
           <w:p>
             <w:pPr>
+              <w:keepNext/>
               <w:jc w:val="left"/>
             </w:pPr>
             <w:r>
@@ -2611,12 +2719,12 @@
           </w:tcPr>
           <w:p>
             <w:pPr>
-              <w:jc w:val="left"/>
-            </w:pPr>
-            <w:r>
-              <w:rPr>
-                <w:rFonts w:ascii="Times New Roman" w:hAnsi="Times New Roman"/>
-                <w:b/>
+              <w:keepNext/>
+              <w:jc w:val="left"/>
+            </w:pPr>
+            <w:r>
+              <w:rPr>
+                <w:rFonts w:ascii="Times New Roman" w:hAnsi="Times New Roman"/>
                 <w:sz w:val="18"/>
               </w:rPr>
               <w:t>18,58%</w:t>
@@ -2630,12 +2738,12 @@
           </w:tcPr>
           <w:p>
             <w:pPr>
-              <w:jc w:val="left"/>
-            </w:pPr>
-            <w:r>
-              <w:rPr>
-                <w:rFonts w:ascii="Times New Roman" w:hAnsi="Times New Roman"/>
-                <w:b/>
+              <w:keepNext/>
+              <w:jc w:val="left"/>
+            </w:pPr>
+            <w:r>
+              <w:rPr>
+                <w:rFonts w:ascii="Times New Roman" w:hAnsi="Times New Roman"/>
                 <w:sz w:val="18"/>
               </w:rPr>
               <w:t>18,51%</w:t>
@@ -2649,12 +2757,12 @@
           </w:tcPr>
           <w:p>
             <w:pPr>
-              <w:jc w:val="left"/>
-            </w:pPr>
-            <w:r>
-              <w:rPr>
-                <w:rFonts w:ascii="Times New Roman" w:hAnsi="Times New Roman"/>
-                <w:b/>
+              <w:keepNext/>
+              <w:jc w:val="left"/>
+            </w:pPr>
+            <w:r>
+              <w:rPr>
+                <w:rFonts w:ascii="Times New Roman" w:hAnsi="Times New Roman"/>
                 <w:sz w:val="18"/>
               </w:rPr>
               <w:t>17,09%</w:t>
@@ -2668,6 +2776,7 @@
           </w:tcPr>
           <w:p>
             <w:pPr>
+              <w:keepNext/>
               <w:jc w:val="left"/>
             </w:pPr>
             <w:r>
@@ -2691,6 +2800,7 @@
           </w:tcPr>
           <w:p>
             <w:pPr>
+              <w:keepNext/>
               <w:jc w:val="left"/>
             </w:pPr>
             <w:r>
@@ -2709,6 +2819,7 @@
           </w:tcPr>
           <w:p>
             <w:pPr>
+              <w:keepNext/>
               <w:jc w:val="left"/>
             </w:pPr>
             <w:r>
@@ -2727,6 +2838,7 @@
           </w:tcPr>
           <w:p>
             <w:pPr>
+              <w:keepNext/>
               <w:jc w:val="left"/>
             </w:pPr>
             <w:r>
@@ -2745,6 +2857,7 @@
           </w:tcPr>
           <w:p>
             <w:pPr>
+              <w:keepNext/>
               <w:jc w:val="left"/>
             </w:pPr>
             <w:r>
@@ -2763,6 +2876,7 @@
           </w:tcPr>
           <w:p>
             <w:pPr>
+              <w:keepNext/>
               <w:jc w:val="left"/>
             </w:pPr>
             <w:r>
@@ -2781,6 +2895,7 @@
           </w:tcPr>
           <w:p>
             <w:pPr>
+              <w:keepNext/>
               <w:jc w:val="left"/>
             </w:pPr>
             <w:r>
@@ -2804,6 +2919,7 @@
           </w:tcPr>
           <w:p>
             <w:pPr>
+              <w:keepNext w:val="0"/>
               <w:jc w:val="left"/>
             </w:pPr>
             <w:r>
@@ -2822,6 +2938,7 @@
           </w:tcPr>
           <w:p>
             <w:pPr>
+              <w:keepNext w:val="0"/>
               <w:jc w:val="left"/>
             </w:pPr>
             <w:r>
@@ -2840,6 +2957,7 @@
           </w:tcPr>
           <w:p>
             <w:pPr>
+              <w:keepNext w:val="0"/>
               <w:jc w:val="left"/>
             </w:pPr>
             <w:r>
@@ -2858,6 +2976,7 @@
           </w:tcPr>
           <w:p>
             <w:pPr>
+              <w:keepNext w:val="0"/>
               <w:jc w:val="left"/>
             </w:pPr>
             <w:r>
@@ -2876,6 +2995,7 @@
           </w:tcPr>
           <w:p>
             <w:pPr>
+              <w:keepNext w:val="0"/>
               <w:jc w:val="left"/>
             </w:pPr>
             <w:r>
@@ -2894,6 +3014,7 @@
           </w:tcPr>
           <w:p>
             <w:pPr>
+              <w:keepNext w:val="0"/>
               <w:jc w:val="left"/>
             </w:pPr>
             <w:r>
@@ -2907,130 +3028,114 @@
         </w:tc>
       </w:tr>
     </w:tbl>
-    <w:p/>
+    <w:p>
+      <w:pPr>
+        <w:spacing w:before="60" w:after="160" w:line="240" w:lineRule="auto"/>
+      </w:pPr>
+      <w:r>
+        <w:rPr>
+          <w:rFonts w:ascii="Times New Roman" w:hAnsi="Times New Roman"/>
+          <w:sz w:val="20"/>
+        </w:rPr>
+        <w:t>Nota. Elaboração própria com base nos artefatos reproduzíveis da pesquisa.</w:t>
+      </w:r>
+    </w:p>
     <w:p>
       <w:pPr/>
       <w:r>
-        <w:t xml:space="preserve">Nenhuma cadência mais rápida superou a anual. Pareando por ano-calendário, a trimestral fica 1,55 ponto percentual abaixo ao ano após imposto, com p de 0,376, e a mensal 3,27 pontos abaixo, com p de 0,306. A leitura correta é que </w:t>
-      </w:r>
+        <w:t>Nenhuma cadência mais rápida superou a anual. Pareando por ano-calendário, a trimestral fica 1,55 ponto percentual abaixo ao ano após imposto, com p de 0,376, e a mensal 3,27 pontos abaixo, com p de 0,306. A leitura correta é que não há evidência de que decidir mais vezes ajude, e não que esteja provado que atrapalhe: onze anos pareados não sustentam a afirmação mais forte.</w:t>
+      </w:r>
+    </w:p>
+    <w:p>
+      <w:pPr/>
+      <w:r>
+        <w:t>O mecanismo contraria a intuição corrente, que atribuiria a diferença a custo e imposto. A perda está no retorno bruto, que cai 4,66 pontos de anual para mensal antes de qualquer dedução. O custo de execução sobe apenas 0,08 ponto ao ano, e o imposto modelado até diminui, porque cada revisão mensal realiza uma fatia menor do livro. Ou seja, decidir mais vezes piora a seleção antes de encarecer a operação. O sinal combina qualidade, valor e momento, grandezas que se movem em horizonte anual, e reordenar todo mês troca posições antes que a tese tenha tempo de se realizar.</w:t>
+      </w:r>
+    </w:p>
+    <w:p>
+      <w:pPr/>
+      <w:r>
+        <w:t>Registramos uma fraqueza do modelo tributário nessa comparação: ele cobra imposto sobre o ganho do próprio período, e não sobre o ganho acumulado da posição efetivamente vendida, o que subestima a conta do braço mensal. O viés favorece a cadência mais rápida, e ela perdeu mesmo assim, então a conclusão é robusta a essa limitação.</w:t>
+      </w:r>
+    </w:p>
+    <w:p>
+      <w:pPr/>
+      <w:r>
+        <w:t>Modelo de linguagem como fonte de retorno. Este é o teste que mais interessa à governança do produto, e está detalhado a seguir.</w:t>
+      </w:r>
+    </w:p>
+    <w:p>
+      <w:pPr>
+        <w:pStyle w:val="Heading2"/>
+      </w:pPr>
+      <w:r>
+        <w:t>5.5 O experimento com modelo de linguagem: três nulos</w:t>
+      </w:r>
+    </w:p>
+    <w:p>
+      <w:pPr/>
+      <w:r>
+        <w:t>O sistema usa um modelo de linguagem em papel deliberadamente restrito. Para verificar se essa restrição custa desempenho, e se o modelo agrega algo, montamos quatro braços sobre 13 anos, com o mesmo universo elegível.</w:t>
+      </w:r>
+    </w:p>
+    <w:p>
+      <w:pPr>
+        <w:spacing w:line="360" w:lineRule="auto"/>
+        <w:ind w:left="369" w:hanging="227"/>
+      </w:pPr>
+      <w:r>
+        <w:t>• Nomeado: o modelo vê os nomes das empresas e devolve um escore limitado, que inclina o retorno esperado dentro do otimizador convexo.</w:t>
+      </w:r>
+    </w:p>
+    <w:p>
+      <w:pPr>
+        <w:spacing w:line="360" w:lineRule="auto"/>
+        <w:ind w:left="369" w:hanging="227"/>
+      </w:pPr>
+      <w:r>
+        <w:t>• Anonimizado: idêntico, mas as empresas são identificadas apenas por números, de modo que o modelo vê os fundamentos e não as marcas.</w:t>
+      </w:r>
+    </w:p>
+    <w:p>
+      <w:pPr>
+        <w:spacing w:line="360" w:lineRule="auto"/>
+        <w:ind w:left="369" w:hanging="227"/>
+      </w:pPr>
+      <w:r>
+        <w:t>• Determinístico: controle sem modelo algum, ordenando o mesmo universo pelo escore de fator pré-declarado.</w:t>
+      </w:r>
+    </w:p>
+    <w:p>
+      <w:pPr>
+        <w:spacing w:line="360" w:lineRule="auto"/>
+        <w:ind w:left="369" w:hanging="227"/>
+      </w:pPr>
+      <w:r>
+        <w:t>• Monolítico: o contrafactual em que o modelo devolve pesos diretamente, sem otimizador e sem restrições.</w:t>
+      </w:r>
+    </w:p>
+    <w:p>
+      <w:pPr>
+        <w:keepNext/>
+        <w:spacing w:after="0"/>
+      </w:pPr>
       <w:r>
         <w:rPr>
           <w:b/>
         </w:rPr>
-        <w:t>não há evidência de que decidir mais vezes ajude</w:t>
-      </w:r>
-      <w:r>
-        <w:t>, e não que esteja provado que atrapalhe: onze anos pareados não sustentam a afirmação mais forte.</w:t>
-      </w:r>
-    </w:p>
-    <w:p>
-      <w:pPr/>
-      <w:r>
-        <w:t>O mecanismo contraria a intuição corrente, que atribuiria a diferença a custo e imposto. A perda está no retorno bruto, que cai 4,66 pontos de anual para mensal antes de qualquer dedução. O custo de execução sobe apenas 0,08 ponto ao ano, e o imposto modelado até diminui, porque cada revisão mensal realiza uma fatia menor do livro. Ou seja, decidir mais vezes piora a seleção antes de encarecer a operação. O sinal combina qualidade, valor e momento, grandezas que se movem em horizonte anual, e reordenar todo mês troca posições antes que a tese tenha tempo de se realizar.</w:t>
-      </w:r>
-    </w:p>
-    <w:p>
-      <w:pPr/>
-      <w:r>
-        <w:t>Registramos uma fraqueza do modelo tributário nessa comparação: ele cobra imposto sobre o ganho do próprio período, e não sobre o ganho acumulado da posição efetivamente vendida, o que subestima a conta do braço mensal. O viés favorece a cadência mais rápida, e ela perdeu mesmo assim, então a conclusão é robusta a essa limitação.</w:t>
-      </w:r>
-    </w:p>
-    <w:p>
-      <w:pPr/>
+        <w:t>Tabela 6</w:t>
+      </w:r>
+    </w:p>
+    <w:p>
+      <w:pPr>
+        <w:keepNext/>
+        <w:spacing w:after="80"/>
+      </w:pPr>
       <w:r>
         <w:rPr>
-          <w:b/>
+          <w:i/>
         </w:rPr>
-        <w:t>Modelo de linguagem como fonte de retorno.</w:t>
-      </w:r>
-      <w:r>
-        <w:t xml:space="preserve"> Este é o teste que mais interessa à governança do produto, e está detalhado a seguir.</w:t>
-      </w:r>
-    </w:p>
-    <w:p>
-      <w:pPr>
-        <w:pStyle w:val="Heading2"/>
-      </w:pPr>
-      <w:r>
-        <w:t>5.5 O experimento com modelo de linguagem: três nulos</w:t>
-      </w:r>
-    </w:p>
-    <w:p>
-      <w:pPr/>
-      <w:r>
-        <w:t>O sistema usa um modelo de linguagem em papel deliberadamente restrito. Para verificar se essa restrição custa desempenho, e se o modelo agrega algo, montamos quatro braços sobre 13 anos, com o mesmo universo elegível.</w:t>
-      </w:r>
-    </w:p>
-    <w:p>
-      <w:pPr>
-        <w:spacing w:line="360" w:lineRule="auto"/>
-        <w:ind w:left="369" w:hanging="227"/>
-      </w:pPr>
-      <w:r>
-        <w:t xml:space="preserve">• </w:t>
-      </w:r>
-      <w:r>
-        <w:rPr>
-          <w:b/>
-        </w:rPr>
-        <w:t>Nomeado:</w:t>
-      </w:r>
-      <w:r>
-        <w:t xml:space="preserve"> o modelo vê os nomes das empresas e devolve um escore limitado, que inclina o retorno esperado dentro do otimizador convexo.</w:t>
-      </w:r>
-    </w:p>
-    <w:p>
-      <w:pPr>
-        <w:spacing w:line="360" w:lineRule="auto"/>
-        <w:ind w:left="369" w:hanging="227"/>
-      </w:pPr>
-      <w:r>
-        <w:t xml:space="preserve">• </w:t>
-      </w:r>
-      <w:r>
-        <w:rPr>
-          <w:b/>
-        </w:rPr>
-        <w:t>Anonimizado:</w:t>
-      </w:r>
-      <w:r>
-        <w:t xml:space="preserve"> idêntico, mas as empresas são identificadas apenas por números, de modo que o modelo vê os fundamentos e não as marcas.</w:t>
-      </w:r>
-    </w:p>
-    <w:p>
-      <w:pPr>
-        <w:spacing w:line="360" w:lineRule="auto"/>
-        <w:ind w:left="369" w:hanging="227"/>
-      </w:pPr>
-      <w:r>
-        <w:t xml:space="preserve">• </w:t>
-      </w:r>
-      <w:r>
-        <w:rPr>
-          <w:b/>
-        </w:rPr>
-        <w:t>Determinístico:</w:t>
-      </w:r>
-      <w:r>
-        <w:t xml:space="preserve"> controle sem modelo algum, ordenando o mesmo universo pelo escore de fator pré-declarado.</w:t>
-      </w:r>
-    </w:p>
-    <w:p>
-      <w:pPr>
-        <w:spacing w:line="360" w:lineRule="auto"/>
-        <w:ind w:left="369" w:hanging="227"/>
-      </w:pPr>
-      <w:r>
-        <w:t xml:space="preserve">• </w:t>
-      </w:r>
-      <w:r>
-        <w:rPr>
-          <w:b/>
-        </w:rPr>
-        <w:t>Monolítico:</w:t>
-      </w:r>
-      <w:r>
-        <w:t xml:space="preserve"> o contrafactual em que o modelo devolve pesos diretamente, sem otimizador e sem restrições.</w:t>
+        <w:t>Comparações do experimento com modelo de linguagem</w:t>
       </w:r>
     </w:p>
     <w:tbl>
@@ -3038,6 +3143,14 @@
         <w:tblW w:type="auto" w:w="0"/>
         <w:jc w:val="center"/>
         <w:tblLook w:firstColumn="1" w:firstRow="1" w:lastColumn="0" w:lastRow="0" w:noHBand="0" w:noVBand="1" w:val="04A0"/>
+        <w:tblBorders>
+          <w:left w:val="nil"/>
+          <w:right w:val="nil"/>
+          <w:insideH w:val="nil"/>
+          <w:insideV w:val="nil"/>
+          <w:top w:val="single" w:sz="8" w:color="000000"/>
+          <w:bottom w:val="single" w:sz="8" w:color="000000"/>
+        </w:tblBorders>
       </w:tblPr>
       <w:tblGrid>
         <w:gridCol w:w="3024"/>
@@ -3053,10 +3166,13 @@
           <w:tcPr>
             <w:tcW w:type="dxa" w:w="3024"/>
             <w:vAlign w:val="center"/>
-            <w:shd w:fill="D9E7E5"/>
-          </w:tcPr>
-          <w:p>
-            <w:pPr>
+            <w:tcBorders>
+              <w:bottom w:val="single" w:sz="8" w:color="000000"/>
+            </w:tcBorders>
+          </w:tcPr>
+          <w:p>
+            <w:pPr>
+              <w:keepNext/>
               <w:jc w:val="left"/>
             </w:pPr>
             <w:r>
@@ -3073,10 +3189,13 @@
           <w:tcPr>
             <w:tcW w:type="dxa" w:w="3024"/>
             <w:vAlign w:val="center"/>
-            <w:shd w:fill="D9E7E5"/>
-          </w:tcPr>
-          <w:p>
-            <w:pPr>
+            <w:tcBorders>
+              <w:bottom w:val="single" w:sz="8" w:color="000000"/>
+            </w:tcBorders>
+          </w:tcPr>
+          <w:p>
+            <w:pPr>
+              <w:keepNext/>
               <w:jc w:val="left"/>
             </w:pPr>
             <w:r>
@@ -3093,10 +3212,13 @@
           <w:tcPr>
             <w:tcW w:type="dxa" w:w="3024"/>
             <w:vAlign w:val="center"/>
-            <w:shd w:fill="D9E7E5"/>
-          </w:tcPr>
-          <w:p>
-            <w:pPr>
+            <w:tcBorders>
+              <w:bottom w:val="single" w:sz="8" w:color="000000"/>
+            </w:tcBorders>
+          </w:tcPr>
+          <w:p>
+            <w:pPr>
+              <w:keepNext/>
               <w:jc w:val="left"/>
             </w:pPr>
             <w:r>
@@ -3121,6 +3243,7 @@
           </w:tcPr>
           <w:p>
             <w:pPr>
+              <w:keepNext/>
               <w:jc w:val="left"/>
             </w:pPr>
             <w:r>
@@ -3139,6 +3262,7 @@
           </w:tcPr>
           <w:p>
             <w:pPr>
+              <w:keepNext/>
               <w:jc w:val="left"/>
             </w:pPr>
             <w:r>
@@ -3157,6 +3281,7 @@
           </w:tcPr>
           <w:p>
             <w:pPr>
+              <w:keepNext/>
               <w:jc w:val="left"/>
             </w:pPr>
             <w:r>
@@ -3180,6 +3305,7 @@
           </w:tcPr>
           <w:p>
             <w:pPr>
+              <w:keepNext/>
               <w:jc w:val="left"/>
             </w:pPr>
             <w:r>
@@ -3198,6 +3324,7 @@
           </w:tcPr>
           <w:p>
             <w:pPr>
+              <w:keepNext/>
               <w:jc w:val="left"/>
             </w:pPr>
             <w:r>
@@ -3216,6 +3343,7 @@
           </w:tcPr>
           <w:p>
             <w:pPr>
+              <w:keepNext/>
               <w:jc w:val="left"/>
             </w:pPr>
             <w:r>
@@ -3239,6 +3367,7 @@
           </w:tcPr>
           <w:p>
             <w:pPr>
+              <w:keepNext w:val="0"/>
               <w:jc w:val="left"/>
             </w:pPr>
             <w:r>
@@ -3257,6 +3386,7 @@
           </w:tcPr>
           <w:p>
             <w:pPr>
+              <w:keepNext w:val="0"/>
               <w:jc w:val="left"/>
             </w:pPr>
             <w:r>
@@ -3275,6 +3405,7 @@
           </w:tcPr>
           <w:p>
             <w:pPr>
+              <w:keepNext w:val="0"/>
               <w:jc w:val="left"/>
             </w:pPr>
             <w:r>
@@ -3288,7 +3419,18 @@
         </w:tc>
       </w:tr>
     </w:tbl>
-    <w:p/>
+    <w:p>
+      <w:pPr>
+        <w:spacing w:before="60" w:after="160" w:line="240" w:lineRule="auto"/>
+      </w:pPr>
+      <w:r>
+        <w:rPr>
+          <w:rFonts w:ascii="Times New Roman" w:hAnsi="Times New Roman"/>
+          <w:sz w:val="20"/>
+        </w:rPr>
+        <w:t>Nota. Elaboração própria com base nos artefatos reproduzíveis da pesquisa.</w:t>
+      </w:r>
+    </w:p>
     <w:p>
       <w:pPr/>
       <w:r>
@@ -3301,81 +3443,69 @@
         <w:ind w:left="369" w:hanging="227"/>
       </w:pPr>
       <w:r>
-        <w:t xml:space="preserve">1. </w:t>
-      </w:r>
+        <w:t>1. Não há evidência de contaminação temporal. O braço nomeado não lucrou por reconhecer empresas cujo destino o modelo poderia conhecer do treinamento. Essa era a objeção mais séria a qualquer uso de modelo de linguagem em backtest histórico, e ela não se sustentou nesta configuração.</w:t>
+      </w:r>
+    </w:p>
+    <w:p>
+      <w:pPr>
+        <w:spacing w:line="360" w:lineRule="auto"/>
+        <w:ind w:left="369" w:hanging="227"/>
+      </w:pPr>
+      <w:r>
+        <w:t>2. O modelo não agrega retorno. Ele reproduz o ranqueamento determinístico em vez de acrescentar julgamento, com diferença de cinco centésimos de ponto percentual e sinal negativo. Isso é uma constatação desconfortável para o discurso de mercado sobre IA em investimentos, e é exatamente por isso que está publicada.</w:t>
+      </w:r>
+    </w:p>
+    <w:p>
+      <w:pPr>
+        <w:spacing w:line="360" w:lineRule="auto"/>
+        <w:ind w:left="369" w:hanging="227"/>
+      </w:pPr>
+      <w:r>
+        <w:t>3. O desacoplamento não custa desempenho. Manter o modelo longe dos pesos não penalizou o resultado, e se algo o braço desacoplado foi melhor. O braço monolítico, que recebeu a caneta, não estourou nenhum teto, o que é uma constatação a favor dele e precisa ser dita. O que ele produziu foram carteiras aritmeticamente inválidas: os pesos não somavam um em 5 dos 13 anos, variando de 0,92 a 1,017, e em 2021 e 2022 omitiu 65 e 83 ativos elegíveis sem sinalizar. O otimizador não se justifica por impedir violação de limite, e sim por devolver uma alocação válida que não precise de conserto depois.</w:t>
+      </w:r>
+    </w:p>
+    <w:p>
+      <w:pPr/>
+      <w:r>
+        <w:t>A conclusão de produto é direta. O modelo de linguagem justifica-se no Benevente por organizar e explicar decisões, não por gerá-las. Vender IA como fonte de alfa, com base nestes dados, seria vender algo que medimos e não encontramos.</w:t>
+      </w:r>
+    </w:p>
+    <w:p>
+      <w:pPr>
+        <w:pStyle w:val="Heading2"/>
+      </w:pPr>
+      <w:r>
+        <w:t>5.6 Defeitos encontrados na própria auditoria</w:t>
+      </w:r>
+    </w:p>
+    <w:p>
+      <w:pPr/>
+      <w:r>
+        <w:t>O artefato passou por auditoria interna adversarial. Sete defeitos foram encontrados e corrigidos, e todos inflavam o resultado.</w:t>
+      </w:r>
+    </w:p>
+    <w:p>
+      <w:pPr>
+        <w:keepNext/>
+        <w:spacing w:after="0"/>
+      </w:pPr>
       <w:r>
         <w:rPr>
           <w:b/>
         </w:rPr>
-        <w:t>Não há evidência de contaminação temporal.</w:t>
-      </w:r>
-      <w:r>
-        <w:t xml:space="preserve"> O braço nomeado não lucrou por reconhecer empresas cujo destino o modelo poderia conhecer do treinamento. Essa era a objeção mais séria a qualquer uso de modelo de linguagem em backtest histórico, e ela não se sustentou nesta configuração.</w:t>
-      </w:r>
-    </w:p>
-    <w:p>
-      <w:pPr>
-        <w:spacing w:line="360" w:lineRule="auto"/>
-        <w:ind w:left="369" w:hanging="227"/>
-      </w:pPr>
-      <w:r>
-        <w:t xml:space="preserve">2. </w:t>
-      </w:r>
+        <w:t>Tabela 7</w:t>
+      </w:r>
+    </w:p>
+    <w:p>
+      <w:pPr>
+        <w:keepNext/>
+        <w:spacing w:after="80"/>
+      </w:pPr>
       <w:r>
         <w:rPr>
-          <w:b/>
+          <w:i/>
         </w:rPr>
-        <w:t>O modelo não agrega retorno.</w:t>
-      </w:r>
-      <w:r>
-        <w:t xml:space="preserve"> Ele reproduz o ranqueamento determinístico em vez de acrescentar julgamento, com diferença de cinco centésimos de ponto percentual e sinal negativo. Isso é uma constatação desconfortável para o discurso de mercado sobre IA em investimentos, e é exatamente por isso que está publicada.</w:t>
-      </w:r>
-    </w:p>
-    <w:p>
-      <w:pPr>
-        <w:spacing w:line="360" w:lineRule="auto"/>
-        <w:ind w:left="369" w:hanging="227"/>
-      </w:pPr>
-      <w:r>
-        <w:t xml:space="preserve">3. </w:t>
-      </w:r>
-      <w:r>
-        <w:rPr>
-          <w:b/>
-        </w:rPr>
-        <w:t>O desacoplamento não custa desempenho.</w:t>
-      </w:r>
-      <w:r>
-        <w:t xml:space="preserve"> Manter o modelo longe dos pesos não penalizou o resultado, e se algo o braço desacoplado foi melhor. O braço monolítico, que recebeu a caneta, </w:t>
-      </w:r>
-      <w:r>
-        <w:rPr>
-          <w:b/>
-        </w:rPr>
-        <w:t>não estourou nenhum teto</w:t>
-      </w:r>
-      <w:r>
-        <w:t>, o que é uma constatação a favor dele e precisa ser dita. O que ele produziu foram carteiras aritmeticamente inválidas: os pesos não somavam um em 5 dos 13 anos, variando de 0,92 a 1,017, e em 2021 e 2022 omitiu 65 e 83 ativos elegíveis sem sinalizar. O otimizador não se justifica por impedir violação de limite, e sim por devolver uma alocação válida que não precise de conserto depois.</w:t>
-      </w:r>
-    </w:p>
-    <w:p>
-      <w:pPr/>
-      <w:r>
-        <w:t>A conclusão de produto é direta. O modelo de linguagem justifica-se no Benevente por organizar e explicar decisões, não por gerá-las. Vender IA como fonte de alfa, com base nestes dados, seria vender algo que medimos e não encontramos.</w:t>
-      </w:r>
-    </w:p>
-    <w:p>
-      <w:pPr>
-        <w:pStyle w:val="Heading2"/>
-      </w:pPr>
-      <w:r>
-        <w:t>5.6 Defeitos encontrados na própria auditoria</w:t>
-      </w:r>
-    </w:p>
-    <w:p>
-      <w:pPr/>
-      <w:r>
-        <w:t>O artefato passou por auditoria interna adversarial. Sete defeitos foram encontrados e corrigidos, e todos inflavam o resultado.</w:t>
+        <w:t>Defeitos identificados na auditoria interna e respectivas correções</w:t>
       </w:r>
     </w:p>
     <w:tbl>
@@ -3383,6 +3513,14 @@
         <w:tblW w:type="auto" w:w="0"/>
         <w:jc w:val="center"/>
         <w:tblLook w:firstColumn="1" w:firstRow="1" w:lastColumn="0" w:lastRow="0" w:noHBand="0" w:noVBand="1" w:val="04A0"/>
+        <w:tblBorders>
+          <w:left w:val="nil"/>
+          <w:right w:val="nil"/>
+          <w:insideH w:val="nil"/>
+          <w:insideV w:val="nil"/>
+          <w:top w:val="single" w:sz="8" w:color="000000"/>
+          <w:bottom w:val="single" w:sz="8" w:color="000000"/>
+        </w:tblBorders>
       </w:tblPr>
       <w:tblGrid>
         <w:gridCol w:w="3024"/>
@@ -3398,10 +3536,13 @@
           <w:tcPr>
             <w:tcW w:type="dxa" w:w="3024"/>
             <w:vAlign w:val="center"/>
-            <w:shd w:fill="D9E7E5"/>
-          </w:tcPr>
-          <w:p>
-            <w:pPr>
+            <w:tcBorders>
+              <w:bottom w:val="single" w:sz="8" w:color="000000"/>
+            </w:tcBorders>
+          </w:tcPr>
+          <w:p>
+            <w:pPr>
+              <w:keepNext/>
               <w:jc w:val="left"/>
             </w:pPr>
             <w:r>
@@ -3418,10 +3559,13 @@
           <w:tcPr>
             <w:tcW w:type="dxa" w:w="3024"/>
             <w:vAlign w:val="center"/>
-            <w:shd w:fill="D9E7E5"/>
-          </w:tcPr>
-          <w:p>
-            <w:pPr>
+            <w:tcBorders>
+              <w:bottom w:val="single" w:sz="8" w:color="000000"/>
+            </w:tcBorders>
+          </w:tcPr>
+          <w:p>
+            <w:pPr>
+              <w:keepNext/>
               <w:jc w:val="left"/>
             </w:pPr>
             <w:r>
@@ -3438,10 +3582,13 @@
           <w:tcPr>
             <w:tcW w:type="dxa" w:w="3024"/>
             <w:vAlign w:val="center"/>
-            <w:shd w:fill="D9E7E5"/>
-          </w:tcPr>
-          <w:p>
-            <w:pPr>
+            <w:tcBorders>
+              <w:bottom w:val="single" w:sz="8" w:color="000000"/>
+            </w:tcBorders>
+          </w:tcPr>
+          <w:p>
+            <w:pPr>
+              <w:keepNext/>
               <w:jc w:val="left"/>
             </w:pPr>
             <w:r>
@@ -3466,6 +3613,7 @@
           </w:tcPr>
           <w:p>
             <w:pPr>
+              <w:keepNext/>
               <w:jc w:val="left"/>
             </w:pPr>
             <w:r>
@@ -3484,6 +3632,7 @@
           </w:tcPr>
           <w:p>
             <w:pPr>
+              <w:keepNext/>
               <w:jc w:val="left"/>
             </w:pPr>
             <w:r>
@@ -3502,6 +3651,7 @@
           </w:tcPr>
           <w:p>
             <w:pPr>
+              <w:keepNext/>
               <w:jc w:val="left"/>
             </w:pPr>
             <w:r>
@@ -3525,6 +3675,7 @@
           </w:tcPr>
           <w:p>
             <w:pPr>
+              <w:keepNext/>
               <w:jc w:val="left"/>
             </w:pPr>
             <w:r>
@@ -3543,6 +3694,7 @@
           </w:tcPr>
           <w:p>
             <w:pPr>
+              <w:keepNext/>
               <w:jc w:val="left"/>
             </w:pPr>
             <w:r>
@@ -3561,6 +3713,7 @@
           </w:tcPr>
           <w:p>
             <w:pPr>
+              <w:keepNext/>
               <w:jc w:val="left"/>
             </w:pPr>
             <w:r>
@@ -3584,6 +3737,7 @@
           </w:tcPr>
           <w:p>
             <w:pPr>
+              <w:keepNext/>
               <w:jc w:val="left"/>
             </w:pPr>
             <w:r>
@@ -3602,6 +3756,7 @@
           </w:tcPr>
           <w:p>
             <w:pPr>
+              <w:keepNext/>
               <w:jc w:val="left"/>
             </w:pPr>
             <w:r>
@@ -3620,6 +3775,7 @@
           </w:tcPr>
           <w:p>
             <w:pPr>
+              <w:keepNext/>
               <w:jc w:val="left"/>
             </w:pPr>
             <w:r>
@@ -3643,6 +3799,7 @@
           </w:tcPr>
           <w:p>
             <w:pPr>
+              <w:keepNext/>
               <w:jc w:val="left"/>
             </w:pPr>
             <w:r>
@@ -3661,6 +3818,7 @@
           </w:tcPr>
           <w:p>
             <w:pPr>
+              <w:keepNext/>
               <w:jc w:val="left"/>
             </w:pPr>
             <w:r>
@@ -3679,6 +3837,7 @@
           </w:tcPr>
           <w:p>
             <w:pPr>
+              <w:keepNext/>
               <w:jc w:val="left"/>
             </w:pPr>
             <w:r>
@@ -3702,6 +3861,7 @@
           </w:tcPr>
           <w:p>
             <w:pPr>
+              <w:keepNext/>
               <w:jc w:val="left"/>
             </w:pPr>
             <w:r>
@@ -3720,6 +3880,7 @@
           </w:tcPr>
           <w:p>
             <w:pPr>
+              <w:keepNext/>
               <w:jc w:val="left"/>
             </w:pPr>
             <w:r>
@@ -3738,6 +3899,7 @@
           </w:tcPr>
           <w:p>
             <w:pPr>
+              <w:keepNext/>
               <w:jc w:val="left"/>
             </w:pPr>
             <w:r>
@@ -3761,6 +3923,7 @@
           </w:tcPr>
           <w:p>
             <w:pPr>
+              <w:keepNext/>
               <w:jc w:val="left"/>
             </w:pPr>
             <w:r>
@@ -3779,6 +3942,7 @@
           </w:tcPr>
           <w:p>
             <w:pPr>
+              <w:keepNext/>
               <w:jc w:val="left"/>
             </w:pPr>
             <w:r>
@@ -3797,6 +3961,7 @@
           </w:tcPr>
           <w:p>
             <w:pPr>
+              <w:keepNext/>
               <w:jc w:val="left"/>
             </w:pPr>
             <w:r>
@@ -3820,6 +3985,7 @@
           </w:tcPr>
           <w:p>
             <w:pPr>
+              <w:keepNext w:val="0"/>
               <w:jc w:val="left"/>
             </w:pPr>
             <w:r>
@@ -3838,6 +4004,7 @@
           </w:tcPr>
           <w:p>
             <w:pPr>
+              <w:keepNext w:val="0"/>
               <w:jc w:val="left"/>
             </w:pPr>
             <w:r>
@@ -3856,6 +4023,7 @@
           </w:tcPr>
           <w:p>
             <w:pPr>
+              <w:keepNext w:val="0"/>
               <w:jc w:val="left"/>
             </w:pPr>
             <w:r>
@@ -3869,7 +4037,18 @@
         </w:tc>
       </w:tr>
     </w:tbl>
-    <w:p/>
+    <w:p>
+      <w:pPr>
+        <w:spacing w:before="60" w:after="160" w:line="240" w:lineRule="auto"/>
+      </w:pPr>
+      <w:r>
+        <w:rPr>
+          <w:rFonts w:ascii="Times New Roman" w:hAnsi="Times New Roman"/>
+          <w:sz w:val="20"/>
+        </w:rPr>
+        <w:t>Nota. Elaboração própria com base nos artefatos reproduzíveis da pesquisa.</w:t>
+      </w:r>
+    </w:p>
     <w:p>
       <w:pPr/>
       <w:r>
@@ -3893,61 +4072,31 @@
     <w:p>
       <w:pPr/>
       <w:r>
-        <w:rPr>
-          <w:b/>
-        </w:rPr>
-        <w:t>Para o escritório.</w:t>
-      </w:r>
-      <w:r>
-        <w:t xml:space="preserve"> O sistema entrega, por decisão, um dossiê completo, com política aplicada, dados com data e hash, tela de elegibilidade com motivo de cada reprovação, pesos, ordens com lote e participação no volume, e custo estimado. O que antes era reconstruído a mão sob pressão passa a ser subproduto da própria operação.</w:t>
+        <w:t>Para o escritório. O sistema entrega, por decisão, um dossiê completo, com política aplicada, dados com data e hash, tela de elegibilidade com motivo de cada reprovação, pesos, ordens com lote e participação no volume, e custo estimado. O que antes era reconstruído a mão sob pressão passa a ser subproduto da própria operação.</w:t>
       </w:r>
     </w:p>
     <w:p>
       <w:pPr/>
       <w:r>
-        <w:rPr>
-          <w:b/>
-        </w:rPr>
-        <w:t>Para o cliente final.</w:t>
-      </w:r>
-      <w:r>
-        <w:t xml:space="preserve"> A pergunta "por que este papel?" passa a ter resposta datada e verificável, e a pergunta simétrica, "por que não aquele?", também.</w:t>
+        <w:t>Para o cliente final. A pergunta "por que este papel?" passa a ter resposta datada e verificável, e a pergunta simétrica, "por que não aquele?", também.</w:t>
       </w:r>
     </w:p>
     <w:p>
       <w:pPr/>
       <w:r>
-        <w:rPr>
-          <w:b/>
-        </w:rPr>
-        <w:t>Para o ecossistema capixaba.</w:t>
-      </w:r>
-      <w:r>
-        <w:t xml:space="preserve"> A hipótese comercial não é “rendemos mais”. É que um escritório local com processo demonstrável pode reter uma parcela maior do trabalho analítico e do relacionamento de longo prazo no estado. Essa hipótese precisa ser testada em entrevistas e pilotos; o backtest não a comprova.</w:t>
+        <w:t>Para o ecossistema capixaba. A hipótese comercial não é “rendemos mais”. É que um escritório local com processo demonstrável pode reter uma parcela maior do trabalho analítico e do relacionamento de longo prazo no estado. Essa hipótese precisa ser testada em entrevistas e pilotos; o backtest não a comprova.</w:t>
       </w:r>
     </w:p>
     <w:p>
       <w:pPr/>
       <w:r>
-        <w:rPr>
-          <w:b/>
-        </w:rPr>
-        <w:t>Modelo de oferta a validar.</w:t>
-      </w:r>
-      <w:r>
-        <w:t xml:space="preserve"> A primeira versão comercial pode ser licenciada por instituição, com cobrança por usuários e número de políticas acompanhadas, e um serviço de implantação para integrar fontes, identidade, aprovação e arquivo documental. Não há preço publicado nem receita comprovada. As métricas do piloto devem ser tempo para produzir um dossiê, percentual de decisões com evidência completa, divergência entre custo previsto e nota conciliada, número de revisões exigidas e disposição a pagar. Retorno da carteira permanece uma medida de pesquisa e acompanhamento, nunca base de remuneração ou garantia contratual.</w:t>
+        <w:t>Modelo de oferta a validar. A primeira versão comercial pode ser licenciada por instituição, com cobrança por usuários e número de políticas acompanhadas, e um serviço de implantação para integrar fontes, identidade, aprovação e arquivo documental. Não há preço publicado nem receita comprovada. As métricas do piloto devem ser tempo para produzir um dossiê, percentual de decisões com evidência completa, divergência entre custo previsto e nota conciliada, número de revisões exigidas e disposição a pagar. Retorno da carteira permanece uma medida de pesquisa e acompanhamento, nunca base de remuneração ou garantia contratual.</w:t>
       </w:r>
     </w:p>
     <w:p>
       <w:pPr/>
       <w:r>
-        <w:rPr>
-          <w:b/>
-        </w:rPr>
-        <w:t>Maturidade.</w:t>
-      </w:r>
-      <w:r>
-        <w:t xml:space="preserve"> O artefato está em estágio de pesquisa reprodutível, não de produto validado institucionalmente. A janela de 2015 a 2025 foi usada para desenvolver e escolher a regra, e portanto descreve a amostra e não prevê o futuro. A avaliação prospectiva começa a partir do registro congelado, cujo hash está versionado no repositório com data carimbada por terceiro. Um registro pré-especificado que exista apenas no disco de quem o escreveu não demonstra anterioridade nenhuma.</w:t>
+        <w:t>Maturidade. O artefato está em estágio de pesquisa reprodutível, não de produto validado institucionalmente. A janela de 2015 a 2025 foi usada para desenvolver e escolher a regra, e portanto descreve a amostra e não prevê o futuro. A avaliação prospectiva começa a partir do registro congelado, cujo hash está versionado no repositório com data carimbada por terceiro. Um registro pré-especificado que exista apenas no disco de quem o escreveu não demonstra anterioridade nenhuma.</w:t>
       </w:r>
     </w:p>
     <w:p>
@@ -3970,16 +4119,7 @@
         <w:ind w:left="369" w:hanging="227"/>
       </w:pPr>
       <w:r>
-        <w:t xml:space="preserve">1. </w:t>
-      </w:r>
-      <w:r>
-        <w:rPr>
-          <w:b/>
-        </w:rPr>
-        <w:t>A janela avaliada é a janela de desenvolvimento.</w:t>
-      </w:r>
-      <w:r>
-        <w:t xml:space="preserve"> Onze anos avaliados não são onze anos de validação prospectiva. O prêmio de retrospectiva de 0,65 p.p. limita o problema, mas não o elimina.</w:t>
+        <w:t>1. A janela avaliada é a janela de desenvolvimento. Onze anos avaliados não são onze anos de validação prospectiva. O prêmio de retrospectiva de 0,65 p.p. limita o problema, mas não o elimina.</w:t>
       </w:r>
     </w:p>
     <w:p>
@@ -3988,16 +4128,7 @@
         <w:ind w:left="369" w:hanging="227"/>
       </w:pPr>
       <w:r>
-        <w:t xml:space="preserve">2. </w:t>
-      </w:r>
-      <w:r>
-        <w:rPr>
-          <w:b/>
-        </w:rPr>
-        <w:t>O detector de eventos societários tem recall de 23,3%.</w:t>
-      </w:r>
-      <w:r>
-        <w:t xml:space="preserve"> Ele é conservador, e proventos, juros sobre capital próprio e eventos de papéis deslistados ainda exigem reconciliação contra registro primário da B3 ou da CVM antes de qualquer afirmação comercial de desempenho.</w:t>
+        <w:t>2. O detector de eventos societários tem recall de 23,3%. Ele é conservador, e proventos, juros sobre capital próprio e eventos de papéis deslistados ainda exigem reconciliação contra registro primário da B3 ou da CVM antes de qualquer afirmação comercial de desempenho.</w:t>
       </w:r>
     </w:p>
     <w:p>
@@ -4006,16 +4137,7 @@
         <w:ind w:left="369" w:hanging="227"/>
       </w:pPr>
       <w:r>
-        <w:t xml:space="preserve">3. </w:t>
-      </w:r>
-      <w:r>
-        <w:rPr>
-          <w:b/>
-        </w:rPr>
-        <w:t>Distribuições imputadas.</w:t>
-      </w:r>
-      <w:r>
-        <w:t xml:space="preserve"> Papéis sem cobertura de provedor recebem o rendimento mediano da seção transversal do ano. É uma aproximação, e os papéis afetados estão listados no relatório de cobertura.</w:t>
+        <w:t>3. Distribuições imputadas. Papéis sem cobertura de provedor recebem o rendimento mediano da seção transversal do ano. É uma aproximação, e os papéis afetados estão listados no relatório de cobertura.</w:t>
       </w:r>
     </w:p>
     <w:p>
@@ -4024,16 +4146,7 @@
         <w:ind w:left="369" w:hanging="227"/>
       </w:pPr>
       <w:r>
-        <w:t xml:space="preserve">4. </w:t>
-      </w:r>
-      <w:r>
-        <w:rPr>
-          <w:b/>
-        </w:rPr>
-        <w:t>A queda máxima é grande.</w:t>
-      </w:r>
-      <w:r>
-        <w:t xml:space="preserve"> Quase 48% em base diária. Nenhuma suitability razoável coloca um cliente conservador nessa carteira.</w:t>
+        <w:t>4. A queda máxima é grande. Quase 48% em base diária. Nenhuma suitability razoável coloca um cliente conservador nessa carteira.</w:t>
       </w:r>
     </w:p>
     <w:p>
@@ -4042,16 +4155,7 @@
         <w:ind w:left="369" w:hanging="227"/>
       </w:pPr>
       <w:r>
-        <w:t xml:space="preserve">5. </w:t>
-      </w:r>
-      <w:r>
-        <w:rPr>
-          <w:b/>
-        </w:rPr>
-        <w:t>Onze observações anuais são poucas.</w:t>
-      </w:r>
-      <w:r>
-        <w:t xml:space="preserve"> A probabilidade do Sharpe deflacionado corrige o viés de busca, não o tamanho da amostra.</w:t>
+        <w:t>5. Onze observações anuais são poucas. A probabilidade do Sharpe deflacionado corrige o viés de busca, não o tamanho da amostra.</w:t>
       </w:r>
     </w:p>
     <w:p>
@@ -4060,16 +4164,7 @@
         <w:ind w:left="369" w:hanging="227"/>
       </w:pPr>
       <w:r>
-        <w:t xml:space="preserve">6. </w:t>
-      </w:r>
-      <w:r>
-        <w:rPr>
-          <w:b/>
-        </w:rPr>
-        <w:t>Uso comercial exige estrutura regulatória própria.</w:t>
-      </w:r>
-      <w:r>
-        <w:t xml:space="preserve"> O sistema é apoio à decisão e trilha de auditoria. Não é recomendação individual, gestão discricionária, nem promessa de superar referências.</w:t>
+        <w:t>6. Uso comercial exige estrutura regulatória própria. O sistema é apoio à decisão e trilha de auditoria. Não é recomendação individual, gestão discricionária, nem promessa de superar referências.</w:t>
       </w:r>
     </w:p>
     <w:p>
@@ -4078,16 +4173,7 @@
         <w:ind w:left="369" w:hanging="227"/>
       </w:pPr>
       <w:r>
-        <w:t xml:space="preserve">7. </w:t>
-      </w:r>
-      <w:r>
-        <w:rPr>
-          <w:b/>
-        </w:rPr>
-        <w:t>O Benevente 2 é retrospectivo e posterior à Covid-19.</w:t>
-      </w:r>
-      <w:r>
-        <w:t xml:space="preserve"> A escolha em 2015--2018 e a leitura separada de 2019--2025 evitam usar o retorno futuro na conta diária, mas não removem o conhecimento humano de que uma crise sanitária ocorreu.</w:t>
+        <w:t>7. O Benevente 2 é retrospectivo e posterior à Covid-19. A escolha em 2015--2018 e a leitura separada de 2019--2025 evitam usar o retorno futuro na conta diária, mas não removem o conhecimento humano de que uma crise sanitária ocorreu.</w:t>
       </w:r>
     </w:p>
     <w:p>
@@ -4096,16 +4182,7 @@
         <w:ind w:left="369" w:hanging="227"/>
       </w:pPr>
       <w:r>
-        <w:t xml:space="preserve">8. </w:t>
-      </w:r>
-      <w:r>
-        <w:rPr>
-          <w:b/>
-        </w:rPr>
-        <w:t>O imposto intranual do Benevente 2 ainda não foi reconciliado.</w:t>
-      </w:r>
-      <w:r>
-        <w:t xml:space="preserve"> Custos de giro foram cobrados, mas vendas defensivas podem antecipar imposto e reduzir o resultado líquido.</w:t>
+        <w:t>8. O imposto intranual do Benevente 2 ainda não foi reconciliado. Custos de giro foram cobrados, mas vendas defensivas podem antecipar imposto e reduzir o resultado líquido.</w:t>
       </w:r>
     </w:p>
     <w:p>
@@ -4114,16 +4191,7 @@
         <w:ind w:left="369" w:hanging="227"/>
       </w:pPr>
       <w:r>
-        <w:t xml:space="preserve">9. </w:t>
-      </w:r>
-      <w:r>
-        <w:rPr>
-          <w:b/>
-        </w:rPr>
-        <w:t>Não existe arquivo histórico de notícias com horário validado neste experimento.</w:t>
-      </w:r>
-      <w:r>
-        <w:t xml:space="preserve"> O controle usa apenas preço e volatilidade. A LLM não antecipou a Covid-19 e não tomou decisões no Benevente 2.</w:t>
+        <w:t>9. Não existe arquivo histórico de notícias com horário validado neste experimento. O controle usa apenas preço e volatilidade. A LLM não antecipou a Covid-19 e não tomou decisões no Benevente 2.</w:t>
       </w:r>
     </w:p>
     <w:p>
@@ -4216,7 +4284,7 @@
         <w:jc w:val="left"/>
       </w:pPr>
       <w:r>
-        <w:t xml:space="preserve">BAILEY, D. H., Borwein, J. M., López de Prado, M., &amp; Zhu, Q. J. (2017). The probability of backtest overfitting. </w:t>
+        <w:t xml:space="preserve">Bailey, D. H., Borwein, J. M., López de Prado, M., &amp; Zhu, Q. J. (2017). The probability of backtest overfitting. </w:t>
       </w:r>
       <w:r>
         <w:rPr>
@@ -4234,7 +4302,7 @@
         <w:jc w:val="left"/>
       </w:pPr>
       <w:r>
-        <w:t xml:space="preserve">BAILEY, D. H., &amp; López de Prado, M. (2014). The deflated Sharpe ratio: Correcting for selection bias, backtest overfitting, and non-normality. </w:t>
+        <w:t xml:space="preserve">Bailey, D. H., &amp; López de Prado, M. (2014). The deflated Sharpe ratio: Correcting for selection bias, backtest overfitting, and non-normality. </w:t>
       </w:r>
       <w:r>
         <w:rPr>
@@ -4252,7 +4320,7 @@
         <w:jc w:val="left"/>
       </w:pPr>
       <w:r>
-        <w:t xml:space="preserve">BANCO CENTRAL DO BRASIL. (2026). </w:t>
+        <w:t xml:space="preserve">Banco Central do Brasil. (2026). </w:t>
       </w:r>
       <w:r>
         <w:rPr>
@@ -4270,7 +4338,7 @@
         <w:jc w:val="left"/>
       </w:pPr>
       <w:r>
-        <w:t xml:space="preserve">B3 S.A. – BRASIL, BOLSA, BALCÃO. (2026). </w:t>
+        <w:t xml:space="preserve">B3 S.A. – Brasil, Bolsa, Balcão. (2026a). </w:t>
       </w:r>
       <w:r>
         <w:rPr>
@@ -4288,7 +4356,25 @@
         <w:jc w:val="left"/>
       </w:pPr>
       <w:r>
-        <w:t xml:space="preserve">BENEVENTE WEALTH SYSTEM. (2026). </w:t>
+        <w:t xml:space="preserve">B3 S.A. – Brasil, Bolsa, Balcão. (2026b). </w:t>
+      </w:r>
+      <w:r>
+        <w:rPr>
+          <w:i/>
+        </w:rPr>
+        <w:t>Ibovespa B3</w:t>
+      </w:r>
+      <w:r>
+        <w:t>. https://www.b3.com.br/pt_br/market-data-e-indices/indices/indices-amplos/ibovespa.htm</w:t>
+      </w:r>
+    </w:p>
+    <w:p>
+      <w:pPr>
+        <w:ind w:left="425" w:hanging="425"/>
+        <w:jc w:val="left"/>
+      </w:pPr>
+      <w:r>
+        <w:t xml:space="preserve">Benevente Wealth System. (2026). </w:t>
       </w:r>
       <w:r>
         <w:rPr>
@@ -4306,7 +4392,7 @@
         <w:jc w:val="left"/>
       </w:pPr>
       <w:r>
-        <w:t xml:space="preserve">BLACK, F., &amp; Litterman, R. (1992). Global portfolio optimization. </w:t>
+        <w:t xml:space="preserve">Black, F., &amp; Litterman, R. (1992). Global portfolio optimization. </w:t>
       </w:r>
       <w:r>
         <w:rPr>
@@ -4324,7 +4410,25 @@
         <w:jc w:val="left"/>
       </w:pPr>
       <w:r>
-        <w:t xml:space="preserve">COMISSÃO DE VALORES MOBILIÁRIOS. (2021a). </w:t>
+        <w:t xml:space="preserve">BlackRock. (2026). </w:t>
+      </w:r>
+      <w:r>
+        <w:rPr>
+          <w:i/>
+        </w:rPr>
+        <w:t>iShares Ibovespa Fundo de Índice (BOVA11): factsheet</w:t>
+      </w:r>
+      <w:r>
+        <w:t>. https://www.blackrock.com/br/literature/fact-sheet/bova11-ishares-ibovespa-fundo-de-ndice-fund-fact-sheet-pt-lm.pdf</w:t>
+      </w:r>
+    </w:p>
+    <w:p>
+      <w:pPr>
+        <w:ind w:left="425" w:hanging="425"/>
+        <w:jc w:val="left"/>
+      </w:pPr>
+      <w:r>
+        <w:t xml:space="preserve">Comissão de Valores Mobiliários. (2021a). </w:t>
       </w:r>
       <w:r>
         <w:rPr>
@@ -4342,7 +4446,7 @@
         <w:jc w:val="left"/>
       </w:pPr>
       <w:r>
-        <w:t xml:space="preserve">COMISSÃO DE VALORES MOBILIÁRIOS. (2021b). </w:t>
+        <w:t xml:space="preserve">Comissão de Valores Mobiliários. (2021b). </w:t>
       </w:r>
       <w:r>
         <w:rPr>
@@ -4360,7 +4464,7 @@
         <w:jc w:val="left"/>
       </w:pPr>
       <w:r>
-        <w:t xml:space="preserve">COMISSÃO DE VALORES MOBILIÁRIOS. (2026a). </w:t>
+        <w:t xml:space="preserve">Comissão de Valores Mobiliários. (2026a). </w:t>
       </w:r>
       <w:r>
         <w:rPr>
@@ -4378,7 +4482,7 @@
         <w:jc w:val="left"/>
       </w:pPr>
       <w:r>
-        <w:t xml:space="preserve">COMISSÃO DE VALORES MOBILIÁRIOS. (2026b). </w:t>
+        <w:t xml:space="preserve">Comissão de Valores Mobiliários. (2026b). </w:t>
       </w:r>
       <w:r>
         <w:rPr>
@@ -4396,7 +4500,7 @@
         <w:jc w:val="left"/>
       </w:pPr>
       <w:r>
-        <w:t xml:space="preserve">DEMIGUEL, V., Garlappi, L., &amp; Uppal, R. (2009). Optimal versus naive diversification: How inefficient is the 1/N portfolio strategy? </w:t>
+        <w:t xml:space="preserve">DeMiguel, V., Garlappi, L., &amp; Uppal, R. (2009). Optimal versus naive diversification: How inefficient is the 1/N portfolio strategy? </w:t>
       </w:r>
       <w:r>
         <w:rPr>
@@ -4414,7 +4518,7 @@
         <w:jc w:val="left"/>
       </w:pPr>
       <w:r>
-        <w:t xml:space="preserve">FAMA, E. F., &amp; French, K. R. (2015). A five-factor asset pricing model. </w:t>
+        <w:t xml:space="preserve">Fama, E. F., &amp; French, K. R. (2015). A five-factor asset pricing model. </w:t>
       </w:r>
       <w:r>
         <w:rPr>
@@ -4432,7 +4536,7 @@
         <w:jc w:val="left"/>
       </w:pPr>
       <w:r>
-        <w:t xml:space="preserve">HARVEY, C. R., Liu, Y., &amp; Zhu, H. (2016). … and the cross-section of expected returns. </w:t>
+        <w:t xml:space="preserve">Harvey, C. R., Liu, Y., &amp; Zhu, H. (2016). … and the cross-section of expected returns. </w:t>
       </w:r>
       <w:r>
         <w:rPr>
@@ -4450,7 +4554,7 @@
         <w:jc w:val="left"/>
       </w:pPr>
       <w:r>
-        <w:t xml:space="preserve">HEVNER, A. R., March, S. T., Park, J., &amp; Ram, S. (2004). Design science in information systems research. </w:t>
+        <w:t xml:space="preserve">Hevner, A. R., March, S. T., Park, J., &amp; Ram, S. (2004). Design science in information systems research. </w:t>
       </w:r>
       <w:r>
         <w:rPr>
@@ -4468,7 +4572,7 @@
         <w:jc w:val="left"/>
       </w:pPr>
       <w:r>
-        <w:t xml:space="preserve">KROLL, J. A., Huey, J., Barocas, S., Felten, E. W., Reidenberg, J. R., Robinson, D. G., &amp; Yu, H. (2017). Accountable algorithms. </w:t>
+        <w:t xml:space="preserve">Kroll, J. A., Huey, J., Barocas, S., Felten, E. W., Reidenberg, J. R., Robinson, D. G., &amp; Yu, H. (2017). Accountable algorithms. </w:t>
       </w:r>
       <w:r>
         <w:rPr>
@@ -4486,7 +4590,7 @@
         <w:jc w:val="left"/>
       </w:pPr>
       <w:r>
-        <w:t xml:space="preserve">LÓPEZ DE PRADO, M. (2018). </w:t>
+        <w:t xml:space="preserve">López de Prado, M. (2018). </w:t>
       </w:r>
       <w:r>
         <w:rPr>
@@ -4504,7 +4608,7 @@
         <w:jc w:val="left"/>
       </w:pPr>
       <w:r>
-        <w:t xml:space="preserve">MARKOWITZ, H. (1952). Portfolio selection. </w:t>
+        <w:t xml:space="preserve">Markowitz, H. (1952). Portfolio selection. </w:t>
       </w:r>
       <w:r>
         <w:rPr>
@@ -4522,7 +4626,7 @@
         <w:jc w:val="left"/>
       </w:pPr>
       <w:r>
-        <w:t xml:space="preserve">NOVY-MARX, R. (2013). The other side of value: The gross profitability premium. </w:t>
+        <w:t xml:space="preserve">Novy-Marx, R. (2013). The other side of value: The gross profitability premium. </w:t>
       </w:r>
       <w:r>
         <w:rPr>
@@ -4540,7 +4644,7 @@
         <w:jc w:val="left"/>
       </w:pPr>
       <w:r>
-        <w:t xml:space="preserve">NOVY-MARX, R., &amp; Velikov, M. (2016). A taxonomy of anomalies and their trading costs. </w:t>
+        <w:t xml:space="preserve">Novy-Marx, R., &amp; Velikov, M. (2016). A taxonomy of anomalies and their trading costs. </w:t>
       </w:r>
       <w:r>
         <w:rPr>
@@ -4558,7 +4662,7 @@
         <w:jc w:val="left"/>
       </w:pPr>
       <w:r>
-        <w:t xml:space="preserve">PEFFERS, K., Tuunanen, T., Rothenberger, M. A., &amp; Chatterjee, S. (2007). A design science research methodology for information systems research. </w:t>
+        <w:t xml:space="preserve">Peffers, K., Tuunanen, T., Rothenberger, M. A., &amp; Chatterjee, S. (2007). A design science research methodology for information systems research. </w:t>
       </w:r>
       <w:r>
         <w:rPr>
@@ -6608,6 +6712,7 @@
     </w:pPr>
     <w:rPr>
       <w:rFonts w:ascii="Times New Roman" w:hAnsi="Times New Roman"/>
+      <w:color w:val="000000"/>
       <w:sz w:val="24"/>
     </w:rPr>
   </w:style>
@@ -6633,6 +6738,7 @@
       <w:bCs w:val="1"/>
       <w:i w:val="0"/>
       <w:iCs w:val="0"/>
+      <w:color w:val="000000"/>
       <w:sz w:val="28"/>
       <w:szCs w:val="48"/>
     </w:rPr>
@@ -6659,6 +6765,7 @@
       <w:bCs w:val="1"/>
       <w:i w:val="0"/>
       <w:iCs w:val="0"/>
+      <w:color w:val="000000"/>
       <w:sz w:val="26"/>
       <w:szCs w:val="36"/>
     </w:rPr>
@@ -6685,6 +6792,7 @@
       <w:bCs w:val="1"/>
       <w:i w:val="0"/>
       <w:iCs w:val="0"/>
+      <w:color w:val="000000"/>
       <w:sz w:val="24"/>
       <w:szCs w:val="28"/>
     </w:rPr>

</xml_diff>

<commit_message>
Reframe BTech paper around auditable evidence
</commit_message>
<xml_diff>
--- a/outputs/Benevente_Wealth_System_BTECH_Final.docx
+++ b/outputs/Benevente_Wealth_System_BTECH_Final.docx
@@ -13,7 +13,7 @@
         <w:rPr>
           <w:b/>
         </w:rPr>
-        <w:t>BENEVENTE WEALTH SYSTEM: GOVERNANÇA AUDITÁVEL DE CARTEIRAS PARA ESCRITÓRIOS DE INVESTIMENTO DO ESPÍRITO SANTO</w:t>
+        <w:t>BENEVENTE WEALTH SYSTEM: UM ARTEFATO AUDITÁVEL PARA DECISÕES DE CARTEIRA</w:t>
       </w:r>
     </w:p>
     <w:p>
@@ -37,7 +37,7 @@
         <w:ind w:firstLine="0"/>
       </w:pPr>
       <w:r>
-        <w:t>Escritórios de investimento precisam explicar uma carteira meses depois de montá-la: quais dados estavam disponíveis, qual regra foi aplicada e quem aprovou a decisão. Este trabalho constrói e avalia o Benevente Wealth System, software de apoio à decisão que produz a proposta de carteira e o respectivo registro de auditoria no mesmo fluxo. A pesquisa combina design science, escolha anual de configuração somente com anos já encerrados e teste histórico sequencial. Foram avaliadas onze decisões, de 2015 a 2025, em um painel reconstruído da B3 que preserva 166 emissores que deixaram de negociar antes do fim da amostra. O Benevente 1 rendeu 17,86% ao ano após custos e 16,03% após imposto, contra 11,77% do Ibovespa, 9,61% do CDI e 7,83% de uma otimização média-variância independente. Uma extensão experimental, Benevente 2, reduziu a queda máxima de 47,8% para 28,7%, mas não demonstrou retorno adicional no recorte de 2019 a 2025. O experimento também rejeitou previsão anual de regime, realocações frequentes e o uso do modelo de linguagem como fonte de retorno. A contribuição é um processo verificável que separa dados, regra quantitativa, alocação, explicação e aprovação humana.</w:t>
+        <w:t>Decisões de carteira precisam continuar explicáveis depois de executadas. Este trabalho constrói e avalia o Benevente Wealth System, um artefato de apoio à decisão que reúne, no mesmo registro, os dados admitidos, a regra quantitativa, a carteira proposta, a explicação e a aprovação humana. A pesquisa segue design science e avalia o artefato por testes funcionais, auditoria adversarial e um diagnóstico histórico sequencial de onze decisões entre 2015 e 2025. A auditoria encontrou sete defeitos capazes de inflar resultados e revelou uma limitação material: 13,9% da exposição acumulada a ações selecionadas dependeu de séries com proventos imputados. Por isso, o retorno histórico é apresentado como diagnóstico de desenvolvimento, não como validação comercial. Uma reamostragem pareada indica estabilidade interna, mas os intervalos de 95% do excesso de retorno cruzam zero contra CDI, Ibovespa e BOVA11. O protocolo prospectivo foi congelado em 16 de agosto de 2026 e ainda não possui observações suficientes para conclusão. O modelo de linguagem não demonstrou ganho de retorno e permanece restrito à explicação. A contribuição comprovada é a separação verificável entre dado, cálculo, linguagem e responsabilidade.</w:t>
       </w:r>
     </w:p>
     <w:p>
@@ -69,7 +69,7 @@
         <w:pStyle w:val="Normal"/>
       </w:pPr>
       <w:r>
-        <w:t>Este trabalho parte de uma hipótese de mercado a ser validada no piloto: escritórios do Espírito Santo que mantêm o relacionamento com famílias e empresas locais podem depender de infraestrutura de decisão produzida fora do estado. O problema proposto não é falta de competência analítica. É a ausência de uma ferramenta que produza, no ato da recomendação, o registro que a recomendação vai exigir depois. A pesquisa ainda não mede o tamanho desse mercado, a disposição a pagar ou a taxa de adoção. Portanto, retenção de capital e geração de negócios no estado são resultados esperados do produto, não resultados já comprovados.</w:t>
+        <w:t>Este trabalho parte de um problema operacional delimitado: a recomendação é produzida hoje, mas pode precisar ser defendida meses ou anos depois. Se a instituição não preserva o dado admitido, a versão da regra e a aprovação, a justificativa posterior pode incorporar informações que não existiam quando a decisão foi tomada. O Benevente foi construído para produzir a proposta e o registro que permitirá revisá-la. A existência desse problema no público-alvo, sua intensidade e a disposição a pagar pela solução ainda precisam ser medidas em piloto. O artigo não atribui ao artefato impacto regional, demanda comercial ou retenção de capital que não tenham sido observados.</w:t>
       </w:r>
     </w:p>
     <w:p>
@@ -124,7 +124,7 @@
         <w:pStyle w:val="Normal"/>
       </w:pPr>
       <w:r>
-        <w:t>Planilhas falham nas três: sobrescrevem o estado anterior, misturam regra e dado, e não guardam autoria. Plataformas de terceiros costumam responder à segunda pergunta com uma caixa fechada, entregando ao escritório a carteira e não o critério. Nenhuma das duas alternativas serve a quem responde pela decisão.</w:t>
+        <w:t>Planilhas podem falhar nas três quando são usadas sem controle de versão: sobrescrevem o estado anterior, misturam regra e dado e não preservam autoria. Sistemas fechados podem entregar uma carteira sem evidenciar o critério aplicado. O requisito do artefato é permitir que uma pessoa independente refaça o caminho da decisão sem depender da memória de quem a produziu.</w:t>
       </w:r>
     </w:p>
     <w:p>
@@ -140,7 +140,7 @@
         <w:pStyle w:val="Normal"/>
       </w:pPr>
       <w:r>
-        <w:t>O objetivo é materializar e avaliar esse artefato para o contexto B2B de escritórios de investimento. O método segue a lógica de design science: identificar o problema, explicitar os requisitos, construir o artefato e avaliá-lo por utilidade, qualidade e capacidade de produzir evidência (Hevner et al., 2004; Peffers et al., 2007). A avaliação financeira não é uma demonstração comercial isolada. Ela executa, ano após ano, uma regra registrada antes do retorno seguinte, cobra custos, compara referências independentes e mede quanto a escolha retrospectiva teria melhorado o resultado. A contribuição é dupla: um protocolo quantitativo auditável e um fluxo de trabalho capaz de transformar cada recomendação em documento verificável para revisão humana.</w:t>
+        <w:t>O objetivo é construir e avaliar um artefato B2B que transforme cada recomendação em um documento verificável. O método segue ciência do projeto, ou design science: identificar o problema, explicitar requisitos, construir o artefato e avaliá-lo por utilidade, qualidade e capacidade de produzir evidência (Hevner et al., 2004; Peffers et al., 2007). A avaliação combina testes de funcionamento, inspeção das fontes, tentativas deliberadas de encontrar erros e um diagnóstico financeiro histórico. A contribuição é dupla: um protocolo quantitativo que pode ser reexecutado e um fluxo de trabalho que preserva quem decidiu, com qual informação e sob qual política. O retorno passado é uma medida secundária de comportamento do protótipo, não a prova principal de utilidade nem uma promessa de desempenho futuro.</w:t>
       </w:r>
     </w:p>
     <w:p>
@@ -156,7 +156,7 @@
         <w:pStyle w:val="Normal"/>
       </w:pPr>
       <w:r>
-        <w:t>O público inicial do Benevente são escritórios de investimento, consultorias de valores mobiliários e estruturas de gestão patrimonial que precisam recomendar, revisar e defender carteiras. Nesse ambiente, a dificuldade não termina quando o peso de cada ativo é calculado. A instituição precisa preservar o contexto da decisão, demonstrar por que um ativo foi aceito ou recusado e comparar o resultado com alternativas reconhecíveis pelo cliente. Para uma operação capixaba, dominar esse processo também reduz a dependência de infraestrutura analítica produzida fora do estado. Trata-se de uma hipótese de valor a ser testada em campo, não de um impacto econômico já observado.</w:t>
+        <w:t>O público inicial do Benevente são escritórios de investimento, consultorias de valores mobiliários e estruturas de gestão patrimonial que precisam recomendar, revisar e defender carteiras. Nesse ambiente, a dificuldade não termina quando o peso de cada ativo é calculado. A instituição precisa preservar o contexto da decisão, demonstrar por que um ativo foi aceito ou recusado e comparar o resultado com alternativas reconhecíveis pelo cliente. O piloto comercial proposto poderá ser realizado no Espírito Santo por conveniência e aderência ao congresso, mas sua função será medir o problema e a utilidade do artefato, não confirmar antecipadamente um efeito sobre a economia local.</w:t>
       </w:r>
     </w:p>
     <w:p>
@@ -196,15 +196,15 @@
         <w:pStyle w:val="Normal"/>
       </w:pPr>
       <w:r>
-        <w:t>Quatro referências clássicas orientam a construção financeira do artefato. Markowitz (1952) mostrou que uma carteira precisa ser analisada pela interação entre retornos e covariâncias, e não pela atratividade isolada de cada ativo. No Benevente, essa contribuição aparece de duas formas. A primeira é a exigência de uma cesta, em vez de uma aposta única no maior escore. A segunda é o comparador MVO, que pergunta quanto uma alocação baseada apenas em média, covariância e limites teria produzido sobre o mesmo universo. O comparador não serve para validar automaticamente a estratégia; serve para impedir que um ganho atribuído ao filtro fundamental seja apenas efeito de diversificação quantitativa. A ênfase em qualidade também dialoga com Novy-Marx (2013), enquanto o uso conjunto de valor, qualidade e confirmação de mercado se aproxima da lógica multifatorial de Fama e French (2015), sem pretender reproduzir exatamente seus fatores.</w:t>
-      </w:r>
-    </w:p>
-    <w:p>
-      <w:pPr>
-        <w:pStyle w:val="Normal"/>
-      </w:pPr>
-      <w:r>
-        <w:t>Black e Litterman (1992) tratam da combinação entre equilíbrio de mercado e visões. A arquitetura do Benevente adota a separação conceitual, mas não implementa o modelo Black–Litterman como carteira publicada. Fatos fundamentais e sinais de mercado geram um ranking determinístico. A linguagem natural pode explicar a visão, registrar riscos e formular perguntas, porém não altera a matemática da alocação. Essa fronteira permite testar a camada de linguagem sem conceder a ela poder para mudar restrições ou reconstruir retrospectivamente a tese.</w:t>
+        <w:t>Quatro referências clássicas orientam a construção financeira do artefato. Markowitz (1952) mostrou que uma carteira precisa ser analisada pela interação entre retornos e covariâncias, e não pela atratividade isolada de cada ativo. A otimização média-variância, chamada neste artigo de MVO, estima a relação entre retorno esperado e risco conjunto e escolhe pesos sob restrições. No Benevente, ela funciona como comparação independente. A pergunta é simples: o que uma carteira guiada apenas por médias, covariâncias e limites teria produzido sobre o mesmo conjunto elegível? Isso evita atribuir ao filtro fundamental um ganho que possa vir apenas da diversificação. A ênfase em qualidade dialoga com Novy-Marx (2013), enquanto o uso conjunto de valor, qualidade e confirmação de mercado se aproxima da lógica multifatorial de Fama e French (2015), sem pretender reproduzir exatamente seus fatores.</w:t>
+      </w:r>
+    </w:p>
+    <w:p>
+      <w:pPr>
+        <w:pStyle w:val="Normal"/>
+      </w:pPr>
+      <w:r>
+        <w:t>Black e Litterman (1992) combinam equilíbrio de mercado e visões. O Benevente adota somente a separação conceitual: fatos e sinais geram o ranking, enquanto a linguagem explica a visão sem alterar a alocação. O modelo Black–Litterman não é implementado na carteira publicada.</w:t>
       </w:r>
     </w:p>
     <w:p>
@@ -220,7 +220,7 @@
         <w:pStyle w:val="Normal"/>
       </w:pPr>
       <w:r>
-        <w:t>Novy-Marx e Velikov (2016) mostram que custos de negociação podem consumir anomalias documentadas. Por isso, o retorno usado na manchete já deduz taxas e deslizamento modelado, e a busca penaliza trocas de configuração. O sistema mede giro, participação no volume e realização tributável, em vez de tratar toda mudança de peso como gratuita. Ainda assim, uma estimativa não é uma nota de corretagem. O produto prevê conciliação posterior exatamente porque o custo observado depende do tamanho, do horário, da liquidez e da qualidade de execução de cada instituição.</w:t>
+        <w:t>Novy-Marx e Velikov (2016) mostram que custos de negociação podem consumir anomalias documentadas. O diagnóstico deduz taxas e deslizamento estimado, mede giro e penaliza trocas. Como estimativa não é nota de corretagem, o produto prevê conciliação posterior com o custo observado.</w:t>
       </w:r>
     </w:p>
     <w:p>
@@ -236,7 +236,7 @@
         <w:pStyle w:val="Normal"/>
       </w:pPr>
       <w:r>
-        <w:t>O posicionamento do artefato decorre desses três pontos. O Benevente não compete em promessa de retorno. Compete em verificabilidade. Qualquer concorrente exibe uma curva ascendente, e a pergunta que raramente é respondida é quanto daquela curva vem de ter escolhido a regra depois de ver o resultado. Este trabalho mede esse valor e o publica.</w:t>
+        <w:t>O posicionamento do artefato decorre desses três pontos. O Benevente não é apresentado como gerador comprovado de alfa. Seu diferencial verificável é manter unidos os insumos, a regra, a explicação e a aprovação. O diagnóstico histórico serve para pressionar essa arquitetura e revelar erros, inclusive quando a correção piora o resultado publicado.</w:t>
       </w:r>
     </w:p>
     <w:p>
@@ -759,6 +759,107 @@
     </w:p>
     <w:p>
       <w:pPr>
+        <w:keepNext/>
+        <w:spacing w:before="120" w:after="60"/>
+        <w:ind w:firstLine="0"/>
+        <w:jc w:val="center"/>
+      </w:pPr>
+      <w:r>
+        <w:drawing>
+          <wp:inline xmlns:a="http://schemas.openxmlformats.org/drawingml/2006/main" xmlns:pic="http://schemas.openxmlformats.org/drawingml/2006/picture">
+            <wp:extent cx="5580000" cy="2162250"/>
+            <wp:docPr id="1" name="Picture 1" descr="Fluxo do Benevente: dados B3 e CVM passam por validação, seleção quantitativa, alocação e revisão humana; o modelo de linguagem apenas explica fatos aprovados; o dossiê reúne todo o registro." title="Arquitetura auditável do Benevente Wealth System"/>
+            <wp:cNvGraphicFramePr>
+              <a:graphicFrameLocks noChangeAspect="1"/>
+            </wp:cNvGraphicFramePr>
+            <a:graphic>
+              <a:graphicData uri="http://schemas.openxmlformats.org/drawingml/2006/picture">
+                <pic:pic>
+                  <pic:nvPicPr>
+                    <pic:cNvPr id="0" name="btech_architecture.png"/>
+                    <pic:cNvPicPr/>
+                  </pic:nvPicPr>
+                  <pic:blipFill>
+                    <a:blip r:embed="rId8"/>
+                    <a:stretch>
+                      <a:fillRect/>
+                    </a:stretch>
+                  </pic:blipFill>
+                  <pic:spPr>
+                    <a:xfrm>
+                      <a:off x="0" y="0"/>
+                      <a:ext cx="5580000" cy="2162250"/>
+                    </a:xfrm>
+                    <a:prstGeom prst="rect"/>
+                  </pic:spPr>
+                </pic:pic>
+              </a:graphicData>
+            </a:graphic>
+          </wp:inline>
+        </w:drawing>
+      </w:r>
+    </w:p>
+    <w:p>
+      <w:pPr>
+        <w:keepNext/>
+        <w:spacing w:after="0"/>
+        <w:ind w:firstLine="0"/>
+      </w:pPr>
+      <w:r>
+        <w:rPr>
+          <w:rFonts w:ascii="Times New Roman" w:hAnsi="Times New Roman"/>
+          <w:b/>
+          <w:sz w:val="16"/>
+        </w:rPr>
+        <w:t>Figura 1</w:t>
+      </w:r>
+    </w:p>
+    <w:p>
+      <w:pPr>
+        <w:keepNext/>
+        <w:spacing w:after="60"/>
+        <w:ind w:firstLine="0"/>
+      </w:pPr>
+      <w:r>
+        <w:rPr>
+          <w:rFonts w:ascii="Times New Roman" w:hAnsi="Times New Roman"/>
+          <w:i/>
+          <w:sz w:val="16"/>
+        </w:rPr>
+        <w:t>Arquitetura e separação de responsabilidades do artefato</w:t>
+      </w:r>
+    </w:p>
+    <w:p>
+      <w:pPr>
+        <w:spacing w:line="240" w:lineRule="auto" w:after="160"/>
+        <w:ind w:firstLine="0"/>
+      </w:pPr>
+      <w:r>
+        <w:rPr>
+          <w:rFonts w:ascii="Times New Roman" w:hAnsi="Times New Roman"/>
+          <w:i/>
+          <w:sz w:val="16"/>
+        </w:rPr>
+        <w:t xml:space="preserve">Nota. </w:t>
+      </w:r>
+      <w:r>
+        <w:rPr>
+          <w:rFonts w:ascii="Times New Roman" w:hAnsi="Times New Roman"/>
+          <w:sz w:val="16"/>
+        </w:rPr>
+        <w:t>As setas indicam o fluxo de dados. Não existe caminho do modelo de linguagem para alterar pesos ou aprovar ordens.</w:t>
+      </w:r>
+    </w:p>
+    <w:p>
+      <w:pPr>
+        <w:pStyle w:val="Normal"/>
+      </w:pPr>
+      <w:r>
+        <w:t>O fluxo da Figura 1 separa funções que costumam aparecer misturadas. Dados e fundamentos alimentam a validação. Somente os ativos aceitos seguem para o cálculo. O motor quantitativo devolve pesos válidos e custos estimados. A pessoa revisa a proposta antes da aprovação. O modelo de linguagem recebe apenas fatos já calculados e os converte em uma nota legível, sem caminho de retorno para alterar pesos. O dossiê registra cada uma dessas etapas.</w:t>
+      </w:r>
+    </w:p>
+    <w:p>
+      <w:pPr>
         <w:pStyle w:val="Heading2"/>
       </w:pPr>
       <w:r>
@@ -778,7 +879,7 @@
         <w:pStyle w:val="Normal"/>
       </w:pPr>
       <w:r>
-        <w:t>Preços deslistados exigem tratamento de eventos societários sem a ajuda do provedor, que já não serve esses papéis. O sistema detecta desdobramentos, grupamentos e bonificações grandes a partir de razões de preço redondas e persistentes no arquivo da bolsa. O detector foi validado contra o arquivo de eventos de um provedor, no subconjunto de papéis em que esse arquivo existe, e os dois lados da validação são publicados: precisão de 88,1%, com 340 de 386 ajustes aplicados coincidindo com um evento confirmado, e recall de 23,3%, com 103 de 443 eventos do provedor detectados. O recall baixo é uma limitação real e está declarada. O detector é conservador por construção, e prefere não ajustar a ajustar errado. Publicar apenas a precisão seria omitir metade do resultado.</w:t>
+        <w:t>Preços deslistados exigem tratamento de eventos societários sem a ajuda do provedor, que já não serve esses papéis. O protótipo detecta desdobramentos, grupamentos e bonificações grandes a partir de razões de preço redondas e persistentes no arquivo da bolsa. Na comparação com o arquivo de eventos de um provedor, 340 de 386 ajustes aplicados coincidiram com evento confirmado, precisão de 88,1%, mas somente 103 de 443 eventos conhecidos foram detectados, cobertura de 23,3%. Esse resultado não é suficiente para qualificar a série reconstruída como fonte institucional de retorno total. O arquivo da B3 continua útil para preservar empresas deslistadas e preços observados, mas eventos e proventos dessas séries precisam ser reconciliados em fonte primária antes que o desempenho histórico sustente alegação comercial.</w:t>
       </w:r>
     </w:p>
     <w:p>
@@ -835,15 +936,23 @@
         <w:pStyle w:val="Normal"/>
       </w:pPr>
       <w:r>
-        <w:t>Essa separação também resolve a ambiguidade entre os nomes. Benevente Quant AI designa a pesquisa acadêmica, inclusive o experimento que combina um modelo de linguagem com um solver convexo. Benevente Wealth System designa o produto B2B de governança que entrega proposta, explicação e registro. A carteira histórica publicada é a regra multifatorial determinística. O modelo de linguagem não seleciona ativo e não escreve peso; seu papel é transformar fatos aprovados em tese, riscos e perguntas para revisão humana.</w:t>
-      </w:r>
-    </w:p>
-    <w:p>
-      <w:pPr>
-        <w:pStyle w:val="Normal"/>
-      </w:pPr>
-      <w:r>
-        <w:t>O método é divulgado sem expor o código da aplicação comercial. No fator triplo, o escore é 0,40 vezes o escore padronizado da qualidade, 0,40 vezes o escore padronizado do inverso do preço/lucro e 0,20 vezes o escore padronizado do retorno dos 12 meses anteriores. Qualidade é ROIC para empresas operacionais e ROE para instituições financeiras. A triagem exige histórico de preço, liquidez média mínima, qualidade primária de pelo menos 8% e lucro positivo. Os candidatos alternativos são valor e qualidade por média de postos percentuais, momento de 12 meses e baixa volatilidade de 12 meses. A grade contém 36 combinações: orçamento de ações de 55%, 75% ou 95%; 5, 8 ou 12 emissores; e quatro famílias de sinal. O teto por emissor é o menor valor entre 25% e 1,6 vez a divisão uniforme do orçamento de ações pelo número de posições. Pesos do fator triplo são proporcionais ao escore deslocado para valores positivos e redistribuídos por preenchimento sucessivo quando um emissor atinge o teto. A configuração completa e a transformação de cada campo permanecem disponíveis nos artefatos legíveis por máquina, enquanto cada arquivo de entrada e saída recebe SHA-256. Assim, o estudo é replicável sem transformar a interface do produto em documentação de código.</w:t>
+        <w:t>Essa separação também resolve a ambiguidade entre os nomes. Benevente Quant AI designa a pesquisa acadêmica, inclusive o experimento que combina um modelo de linguagem com um otimizador convexo. Benevente Wealth System designa o produto B2B de governança que entrega proposta, explicação e registro. A carteira histórica publicada é a regra multifatorial determinística. O modelo de linguagem não seleciona ativo e não escreve peso; seu papel é transformar fatos aprovados em tese, riscos e perguntas para revisão humana.</w:t>
+      </w:r>
+    </w:p>
+    <w:p>
+      <w:pPr>
+        <w:pStyle w:val="Normal"/>
+      </w:pPr>
+      <w:r>
+        <w:t>O método precisa ser compreensível sem reproduzir o código da aplicação. Primeiro, o sistema elimina ativos sem dados suficientes, sem liquidez compatível ou com lucro negativo. Depois, ordena os remanescentes por uma de quatro leituras: valor combinado a qualidade, valor combinado a qualidade e momento, somente momento ou baixa volatilidade. A versão multifatorial atribui 40% à qualidade, medida por retorno sobre o capital ou sobre o patrimônio, 40% ao lucro em relação ao preço e 20% ao comportamento do preço nos doze meses anteriores. Em seguida, escolhe uma cesta e distribui o orçamento de ações entre os melhores colocados. O saldo permanece no CDI.</w:t>
+      </w:r>
+    </w:p>
+    <w:p>
+      <w:pPr>
+        <w:pStyle w:val="Normal"/>
+      </w:pPr>
+      <w:r>
+        <w:t>Há três escolhas de orçamento de ações, 55%, 75% ou 95%, três tamanhos de cesta, 5, 8 ou 12 emissores, e quatro leituras de sinal. A combinação produz 36 políticas candidatas. O efeito de cada escolha é intuitivo: mais ações aumentam a exposição ao mercado; mais emissores reduzem a dependência de um papel; sinais distintos favorecem características diferentes. Em cada janeiro, somente os anos já encerrados podem ordenar essas políticas. O teto por emissor impede que a carteira pareça diversificada apenas no número de nomes. A configuração completa, a transformação de cada campo e os arquivos de entrada e saída recebem SHA-256 e permanecem disponíveis no pacote de reprodução.</w:t>
       </w:r>
     </w:p>
     <w:p>
@@ -1022,15 +1131,15 @@
         <w:pStyle w:val="Heading2"/>
       </w:pPr>
       <w:r>
-        <w:t>4.1 SELEÇÃO ANINHADA: A JANELA QUE ESCOLHE NÃO É A JANELA QUE TESTA</w:t>
-      </w:r>
-    </w:p>
-    <w:p>
-      <w:pPr>
-        <w:pStyle w:val="Normal"/>
-      </w:pPr>
-      <w:r>
-        <w:t xml:space="preserve">O artefato admite múltiplas configurações de política, combinando orçamento de renda variável, número de posições e família de fatores. Publicar a melhor delas medida sobre toda a amostra seria exatamente o erro que a Seção 2 descreve. O protocolo adotado é uma seleção aninhada: para decidir a configuração do ano </w:t>
+        <w:t>4.1 SEQUÊNCIA HISTÓRICA DE DESENVOLVIMENTO</w:t>
+      </w:r>
+    </w:p>
+    <w:p>
+      <w:pPr>
+        <w:pStyle w:val="Normal"/>
+      </w:pPr>
+      <w:r>
+        <w:t xml:space="preserve">O artefato admite múltiplas políticas, combinando orçamento de renda variável, número de posições e família de fatores. Publicar a melhor delas medida sobre toda a amostra seria exatamente o erro que a Seção 2 descreve. Na sequência histórica, para decidir a política do ano </w:t>
       </w:r>
       <w:r>
         <w:rPr>
@@ -1039,7 +1148,7 @@
         <w:t>t</w:t>
       </w:r>
       <w:r>
-        <w:t xml:space="preserve">, o sistema ordena as 36 configurações usando somente os anos já encerrados antes de </w:t>
+        <w:t xml:space="preserve">, o sistema ordena as 36 candidatas usando somente os anos encerrados antes de </w:t>
       </w:r>
       <w:r>
         <w:rPr>
@@ -1048,15 +1157,15 @@
         <w:t>t</w:t>
       </w:r>
       <w:r>
-        <w:t>, pelo índice de Sharpe do excesso sobre o CDI, e adota a primeira colocada. Trocar de configuração é uma operação real, e é cobrada como rebalanceamento integral.</w:t>
-      </w:r>
-    </w:p>
-    <w:p>
-      <w:pPr>
-        <w:pStyle w:val="Normal"/>
-      </w:pPr>
-      <w:r>
-        <w:t>O ranqueamento exige no mínimo três anos encerrados. Com o painel começando em 2012, isso torna 2012 a 2014 a janela de seleção e 2015 a 2025 a janela de avaliação, com onze decisões anuais, uma por ano. Os três anos de seleção aparecem nos gráficos, marcados como tal, e não entram em nenhuma métrica de manchete.</w:t>
+        <w:t>, pelo índice de Sharpe do excesso sobre o CDI, e adota a primeira colocada. Trocar de política é tratado como operação real e cobra rebalanceamento integral.</w:t>
+      </w:r>
+    </w:p>
+    <w:p>
+      <w:pPr>
+        <w:pStyle w:val="Normal"/>
+      </w:pPr>
+      <w:r>
+        <w:t>O ranqueamento exige no mínimo três anos encerrados. Como o painel começa em 2012, os anos de 2012 a 2014 inicializam a escolha e 2015 a 2025 formam onze decisões anuais. A ordem temporal reduz o uso direto do retorno futuro em cada decisão, mas não cria uma amostra verdadeiramente externa: os dados, filtros e hipóteses foram examinados durante o desenvolvimento do projeto. Por isso, esta janela é chamada de diagnóstico retrospectivo sequencial, e não de teste fora da amostra. O teste prospectivo começa apenas depois do congelamento descrito na Seção 4.5.</w:t>
       </w:r>
     </w:p>
     <w:p>
@@ -1072,7 +1181,7 @@
         <w:pStyle w:val="Normal"/>
       </w:pPr>
       <w:r>
-        <w:t>Quatro referências, todas calculadas de forma independente.</w:t>
+        <w:t>Quatro referências foram calculadas de forma independente.</w:t>
       </w:r>
     </w:p>
     <w:p>
@@ -1124,7 +1233,7 @@
         </w:numPr>
       </w:pPr>
       <w:r>
-        <w:t>Otimização média-variância neutra sobre o mesmo universo elegível, um comparador independente e não uma cópia da carteira com outro nome.</w:t>
+        <w:t>Otimização média-variância sobre o mesmo universo elegível. Esse método estima retorno médio e covariância com dados anteriores e escolhe pesos que maximizam a relação entre retorno esperado e risco sob os mesmos limites de elegibilidade.</w:t>
       </w:r>
     </w:p>
     <w:p>
@@ -1172,23 +1281,39 @@
         <w:pStyle w:val="Heading2"/>
       </w:pPr>
       <w:r>
-        <w:t>4.4 BENEVENTE 2: PROTEÇÃO INTRANUAL SEM TROCAR A TESE ANUAL</w:t>
-      </w:r>
-    </w:p>
-    <w:p>
-      <w:pPr>
-        <w:pStyle w:val="Normal"/>
-      </w:pPr>
-      <w:r>
-        <w:t>O Benevente 1 continua sendo a estratégia publicada: a cesta e o orçamento de risco são definidos na revisão anual e os ativos são mantidos até a revisão seguinte. O Benevente 2 é uma extensão experimental que não escolhe ações novas e não usa notícias. Ele observa somente a queda do Ibovespa em relação ao pico móvel de 126 sessões e a volatilidade realizada em 20 sessões, sempre deslocadas em um pregão. Assim, a decisão de hoje usa apenas o fechamento de ontem.</w:t>
-      </w:r>
-    </w:p>
-    <w:p>
-      <w:pPr>
-        <w:pStyle w:val="Normal"/>
-      </w:pPr>
-      <w:r>
-        <w:t>A configuração candidata foi escolhida somente em 2015--2018. Um alerta é acionado com queda de 12% ou volatilidade anualizada de 40%, limitando a exposição a ações a 50%. O estado severo usa 22% e 60%, respectivamente, e limita a exposição a 35%. A saída exige dez sessões de recuperação, para reduzir idas e vindas. O saldo migra para CDI e cada mudança paga 0,10% por unidade de giro. O período de 2019--2025 é lido separadamente como avaliação retrospectiva. A extensão foi concebida depois da Covid-19, portanto essa separação temporal não elimina o viés conceitual e não equivale a validação prospectiva.</w:t>
+        <w:t>4.4 AUDITORIA DA QUALIDADE DOS DADOS E SENSIBILIDADE</w:t>
+      </w:r>
+    </w:p>
+    <w:p>
+      <w:pPr>
+        <w:pStyle w:val="Normal"/>
+      </w:pPr>
+      <w:r>
+        <w:t>A reconstrução de retorno total combina 497 séries. Em 139 delas, a distribuição de proventos precisou ser imputada porque não havia cobertura integral do provedor. Uma contagem por ticker seria insuficiente, pois uma série problemática pode nunca entrar na carteira. A auditoria cruzou, por ano, a política realmente escolhida, os pesos dos ativos e o tipo de reconstrução de cada série. A medida principal é a parcela da exposição acumulada a ações que dependeu de provento imputado.</w:t>
+      </w:r>
+    </w:p>
+    <w:p>
+      <w:pPr>
+        <w:pStyle w:val="Normal"/>
+      </w:pPr>
+      <w:r>
+        <w:t>Dois testes de sensibilidade complementam essa inspeção. O primeiro reamostra, em conjunto, os vetores anuais completos de retorno da estratégia e de cada comparador. Foram produzidas 100 mil amostras com semente registrada. O pareamento conserva a relação observada em cada ano e mede estabilidade interna, mas não cria crises novas nem corrige a fonte. O segundo aplica perdas hipotéticas de 10, 25, 50 e 100 pontos percentuais somente à parcela anual investida em séries imputadas. O objetivo é mostrar quanto o resultado depende dessa hipótese, e não adivinhar qual teria sido o provento correto.</w:t>
+      </w:r>
+    </w:p>
+    <w:p>
+      <w:pPr>
+        <w:pStyle w:val="Heading2"/>
+      </w:pPr>
+      <w:r>
+        <w:t>4.5 REGISTRO PROSPECTIVO</w:t>
+      </w:r>
+    </w:p>
+    <w:p>
+      <w:pPr>
+        <w:pStyle w:val="Normal"/>
+      </w:pPr>
+      <w:r>
+        <w:t>O protocolo prospectivo foi congelado em 16 de agosto de 2026, com hash e data registrados no repositório. A política precisa superar, após imposto, o CDI e o ETF investível de mercado, manter queda máxima inferior a 35% e acumular pelo menos três anos antes de uma conclusão. Não existe resultado prospectivo suficiente na data deste artigo. Essa ausência é um resultado de estágio do projeto, não uma lacuna a preencher com o histórico. A regra registrada não poderá ser alterada depois de observado um ano desfavorável sem que a mudança constitua um novo protocolo e uma nova contagem.</w:t>
       </w:r>
     </w:p>
     <w:p>
@@ -1204,15 +1329,23 @@
         <w:pStyle w:val="Heading2"/>
       </w:pPr>
       <w:r>
-        <w:t>5.1 DESEMPENHO DA CARTEIRA PUBLICADA</w:t>
-      </w:r>
-    </w:p>
-    <w:p>
-      <w:pPr>
-        <w:pStyle w:val="Normal"/>
-      </w:pPr>
-      <w:r>
-        <w:t>Onze decisões anuais, de 2015 a 2025, líquidas de custos de execução.</w:t>
+        <w:t>5.1 FUNCIONAMENTO E DIAGNÓSTICO FINANCEIRO</w:t>
+      </w:r>
+    </w:p>
+    <w:p>
+      <w:pPr>
+        <w:pStyle w:val="Normal"/>
+      </w:pPr>
+      <w:r>
+        <w:t>O artefato produziu, para cada decisão anual, um registro com fontes, hashes, elegibilidade, ranking, pesos, custos estimados, comparadores e justificativa. Os testes de integridade recusaram arquivos alterados, pesos que não somavam 100%, ordens acima do limite de liquidez e fundamentos recebidos depois da decisão. A auditoria adversarial descrita na Seção 5.7 encontrou sete defeitos no próprio processo de pesquisa. Corrigi-los mudou as métricas, o que demonstra que o registro é capaz de contestar o resultado que o sistema produz.</w:t>
+      </w:r>
+    </w:p>
+    <w:p>
+      <w:pPr>
+        <w:pStyle w:val="Normal"/>
+      </w:pPr>
+      <w:r>
+        <w:t>A Tabela 2 apresenta o diagnóstico financeiro de onze decisões, de 2015 a 2025, líquido de custos estimados. Ele descreve o comportamento do protótipo durante o desenvolvimento. Não é validação prospectiva nem demonstração de que a carteira repetirá o desempenho.</w:t>
       </w:r>
     </w:p>
     <w:p>
@@ -1236,7 +1369,7 @@
         <w:rPr>
           <w:i/>
         </w:rPr>
-        <w:t>Desempenho da carteira publicada e dos comparadores entre 2015 e 2025</w:t>
+        <w:t>Diagnóstico retrospectivo da carteira e dos comparadores entre 2015 e 2025</w:t>
       </w:r>
     </w:p>
     <w:tbl>
@@ -1255,11 +1388,11 @@
         </w:tblBorders>
       </w:tblPr>
       <w:tblGrid>
-        <w:gridCol w:w="2873"/>
-        <w:gridCol w:w="900"/>
-        <w:gridCol w:w="1768"/>
-        <w:gridCol w:w="1436"/>
-        <w:gridCol w:w="2083"/>
+        <w:gridCol w:w="2332"/>
+        <w:gridCol w:w="1615"/>
+        <w:gridCol w:w="2243"/>
+        <w:gridCol w:w="1166"/>
+        <w:gridCol w:w="1704"/>
       </w:tblGrid>
       <w:tr>
         <w:trPr>
@@ -1268,7 +1401,7 @@
         </w:trPr>
         <w:tc>
           <w:tcPr>
-            <w:tcW w:type="dxa" w:w="2873"/>
+            <w:tcW w:type="dxa" w:w="2332"/>
             <w:vAlign w:val="center"/>
             <w:tcBorders>
               <w:bottom w:val="single" w:sz="8" w:color="000000"/>
@@ -1293,7 +1426,7 @@
         </w:tc>
         <w:tc>
           <w:tcPr>
-            <w:tcW w:type="dxa" w:w="900"/>
+            <w:tcW w:type="dxa" w:w="1615"/>
             <w:vAlign w:val="center"/>
             <w:tcBorders>
               <w:bottom w:val="single" w:sz="8" w:color="000000"/>
@@ -1312,13 +1445,13 @@
                 <w:b/>
                 <w:sz w:val="17"/>
               </w:rPr>
-              <w:t>CAGR</w:t>
-            </w:r>
-          </w:p>
-        </w:tc>
-        <w:tc>
-          <w:tcPr>
-            <w:tcW w:type="dxa" w:w="1768"/>
+              <w:t>Retorno anualizado</w:t>
+            </w:r>
+          </w:p>
+        </w:tc>
+        <w:tc>
+          <w:tcPr>
+            <w:tcW w:type="dxa" w:w="2243"/>
             <w:vAlign w:val="center"/>
             <w:tcBorders>
               <w:bottom w:val="single" w:sz="8" w:color="000000"/>
@@ -1337,13 +1470,13 @@
                 <w:b/>
                 <w:sz w:val="17"/>
               </w:rPr>
-              <w:t>R$ 100 mil viram</w:t>
-            </w:r>
-          </w:p>
-        </w:tc>
-        <w:tc>
-          <w:tcPr>
-            <w:tcW w:type="dxa" w:w="1436"/>
+              <w:t>Valor final de R$ 100 mil</w:t>
+            </w:r>
+          </w:p>
+        </w:tc>
+        <w:tc>
+          <w:tcPr>
+            <w:tcW w:type="dxa" w:w="1166"/>
             <w:vAlign w:val="center"/>
             <w:tcBorders>
               <w:bottom w:val="single" w:sz="8" w:color="000000"/>
@@ -1368,7 +1501,7 @@
         </w:tc>
         <w:tc>
           <w:tcPr>
-            <w:tcW w:type="dxa" w:w="2083"/>
+            <w:tcW w:type="dxa" w:w="1704"/>
             <w:vAlign w:val="center"/>
             <w:tcBorders>
               <w:bottom w:val="single" w:sz="8" w:color="000000"/>
@@ -1398,7 +1531,7 @@
         </w:trPr>
         <w:tc>
           <w:tcPr>
-            <w:tcW w:type="dxa" w:w="2873"/>
+            <w:tcW w:type="dxa" w:w="2332"/>
             <w:vAlign w:val="center"/>
           </w:tcPr>
           <w:p>
@@ -1419,7 +1552,7 @@
         </w:tc>
         <w:tc>
           <w:tcPr>
-            <w:tcW w:type="dxa" w:w="900"/>
+            <w:tcW w:type="dxa" w:w="1615"/>
             <w:vAlign w:val="center"/>
           </w:tcPr>
           <w:p>
@@ -1440,7 +1573,7 @@
         </w:tc>
         <w:tc>
           <w:tcPr>
-            <w:tcW w:type="dxa" w:w="1768"/>
+            <w:tcW w:type="dxa" w:w="2243"/>
             <w:vAlign w:val="center"/>
           </w:tcPr>
           <w:p>
@@ -1461,21 +1594,21 @@
         </w:tc>
         <w:tc>
           <w:tcPr>
-            <w:tcW w:type="dxa" w:w="1436"/>
-            <w:vAlign w:val="center"/>
-          </w:tcPr>
-          <w:p>
-            <w:pPr>
-              <w:keepNext/>
-              <w:spacing w:line="240" w:lineRule="auto" w:after="0"/>
-              <w:ind w:firstLine="0"/>
-              <w:jc w:val="left"/>
-            </w:pPr>
-          </w:p>
-        </w:tc>
-        <w:tc>
-          <w:tcPr>
-            <w:tcW w:type="dxa" w:w="2083"/>
+            <w:tcW w:type="dxa" w:w="1166"/>
+            <w:vAlign w:val="center"/>
+          </w:tcPr>
+          <w:p>
+            <w:pPr>
+              <w:keepNext/>
+              <w:spacing w:line="240" w:lineRule="auto" w:after="0"/>
+              <w:ind w:firstLine="0"/>
+              <w:jc w:val="left"/>
+            </w:pPr>
+          </w:p>
+        </w:tc>
+        <w:tc>
+          <w:tcPr>
+            <w:tcW w:type="dxa" w:w="1704"/>
             <w:vAlign w:val="center"/>
           </w:tcPr>
           <w:p>
@@ -1501,7 +1634,7 @@
         </w:trPr>
         <w:tc>
           <w:tcPr>
-            <w:tcW w:type="dxa" w:w="2873"/>
+            <w:tcW w:type="dxa" w:w="2332"/>
             <w:vAlign w:val="center"/>
           </w:tcPr>
           <w:p>
@@ -1522,7 +1655,7 @@
         </w:tc>
         <w:tc>
           <w:tcPr>
-            <w:tcW w:type="dxa" w:w="900"/>
+            <w:tcW w:type="dxa" w:w="1615"/>
             <w:vAlign w:val="center"/>
           </w:tcPr>
           <w:p>
@@ -1543,7 +1676,7 @@
         </w:tc>
         <w:tc>
           <w:tcPr>
-            <w:tcW w:type="dxa" w:w="1768"/>
+            <w:tcW w:type="dxa" w:w="2243"/>
             <w:vAlign w:val="center"/>
           </w:tcPr>
           <w:p>
@@ -1564,21 +1697,21 @@
         </w:tc>
         <w:tc>
           <w:tcPr>
-            <w:tcW w:type="dxa" w:w="1436"/>
-            <w:vAlign w:val="center"/>
-          </w:tcPr>
-          <w:p>
-            <w:pPr>
-              <w:keepNext/>
-              <w:spacing w:line="240" w:lineRule="auto" w:after="0"/>
-              <w:ind w:firstLine="0"/>
-              <w:jc w:val="left"/>
-            </w:pPr>
-          </w:p>
-        </w:tc>
-        <w:tc>
-          <w:tcPr>
-            <w:tcW w:type="dxa" w:w="2083"/>
+            <w:tcW w:type="dxa" w:w="1166"/>
+            <w:vAlign w:val="center"/>
+          </w:tcPr>
+          <w:p>
+            <w:pPr>
+              <w:keepNext/>
+              <w:spacing w:line="240" w:lineRule="auto" w:after="0"/>
+              <w:ind w:firstLine="0"/>
+              <w:jc w:val="left"/>
+            </w:pPr>
+          </w:p>
+        </w:tc>
+        <w:tc>
+          <w:tcPr>
+            <w:tcW w:type="dxa" w:w="1704"/>
             <w:vAlign w:val="center"/>
           </w:tcPr>
           <w:p>
@@ -1597,7 +1730,7 @@
         </w:trPr>
         <w:tc>
           <w:tcPr>
-            <w:tcW w:type="dxa" w:w="2873"/>
+            <w:tcW w:type="dxa" w:w="2332"/>
             <w:vAlign w:val="center"/>
           </w:tcPr>
           <w:p>
@@ -1618,7 +1751,7 @@
         </w:tc>
         <w:tc>
           <w:tcPr>
-            <w:tcW w:type="dxa" w:w="900"/>
+            <w:tcW w:type="dxa" w:w="1615"/>
             <w:vAlign w:val="center"/>
           </w:tcPr>
           <w:p>
@@ -1639,7 +1772,7 @@
         </w:tc>
         <w:tc>
           <w:tcPr>
-            <w:tcW w:type="dxa" w:w="1768"/>
+            <w:tcW w:type="dxa" w:w="2243"/>
             <w:vAlign w:val="center"/>
           </w:tcPr>
           <w:p>
@@ -1660,7 +1793,7 @@
         </w:tc>
         <w:tc>
           <w:tcPr>
-            <w:tcW w:type="dxa" w:w="1436"/>
+            <w:tcW w:type="dxa" w:w="1166"/>
             <w:vAlign w:val="center"/>
           </w:tcPr>
           <w:p>
@@ -1681,7 +1814,7 @@
         </w:tc>
         <w:tc>
           <w:tcPr>
-            <w:tcW w:type="dxa" w:w="2083"/>
+            <w:tcW w:type="dxa" w:w="1704"/>
             <w:vAlign w:val="center"/>
           </w:tcPr>
           <w:p>
@@ -1707,7 +1840,7 @@
         </w:trPr>
         <w:tc>
           <w:tcPr>
-            <w:tcW w:type="dxa" w:w="2873"/>
+            <w:tcW w:type="dxa" w:w="2332"/>
             <w:vAlign w:val="center"/>
           </w:tcPr>
           <w:p>
@@ -1728,7 +1861,7 @@
         </w:tc>
         <w:tc>
           <w:tcPr>
-            <w:tcW w:type="dxa" w:w="900"/>
+            <w:tcW w:type="dxa" w:w="1615"/>
             <w:vAlign w:val="center"/>
           </w:tcPr>
           <w:p>
@@ -1749,7 +1882,7 @@
         </w:tc>
         <w:tc>
           <w:tcPr>
-            <w:tcW w:type="dxa" w:w="1768"/>
+            <w:tcW w:type="dxa" w:w="2243"/>
             <w:vAlign w:val="center"/>
           </w:tcPr>
           <w:p>
@@ -1770,7 +1903,7 @@
         </w:tc>
         <w:tc>
           <w:tcPr>
-            <w:tcW w:type="dxa" w:w="1436"/>
+            <w:tcW w:type="dxa" w:w="1166"/>
             <w:vAlign w:val="center"/>
           </w:tcPr>
           <w:p>
@@ -1791,7 +1924,7 @@
         </w:tc>
         <w:tc>
           <w:tcPr>
-            <w:tcW w:type="dxa" w:w="2083"/>
+            <w:tcW w:type="dxa" w:w="1704"/>
             <w:vAlign w:val="center"/>
           </w:tcPr>
           <w:p>
@@ -1817,7 +1950,7 @@
         </w:trPr>
         <w:tc>
           <w:tcPr>
-            <w:tcW w:type="dxa" w:w="2873"/>
+            <w:tcW w:type="dxa" w:w="2332"/>
             <w:vAlign w:val="center"/>
           </w:tcPr>
           <w:p>
@@ -1838,7 +1971,7 @@
         </w:tc>
         <w:tc>
           <w:tcPr>
-            <w:tcW w:type="dxa" w:w="900"/>
+            <w:tcW w:type="dxa" w:w="1615"/>
             <w:vAlign w:val="center"/>
           </w:tcPr>
           <w:p>
@@ -1859,7 +1992,7 @@
         </w:tc>
         <w:tc>
           <w:tcPr>
-            <w:tcW w:type="dxa" w:w="1768"/>
+            <w:tcW w:type="dxa" w:w="2243"/>
             <w:vAlign w:val="center"/>
           </w:tcPr>
           <w:p>
@@ -1880,7 +2013,7 @@
         </w:tc>
         <w:tc>
           <w:tcPr>
-            <w:tcW w:type="dxa" w:w="1436"/>
+            <w:tcW w:type="dxa" w:w="1166"/>
             <w:vAlign w:val="center"/>
           </w:tcPr>
           <w:p>
@@ -1901,7 +2034,7 @@
         </w:tc>
         <w:tc>
           <w:tcPr>
-            <w:tcW w:type="dxa" w:w="2083"/>
+            <w:tcW w:type="dxa" w:w="1704"/>
             <w:vAlign w:val="center"/>
           </w:tcPr>
           <w:p>
@@ -1927,7 +2060,7 @@
         </w:trPr>
         <w:tc>
           <w:tcPr>
-            <w:tcW w:type="dxa" w:w="2873"/>
+            <w:tcW w:type="dxa" w:w="2332"/>
             <w:vAlign w:val="center"/>
           </w:tcPr>
           <w:p>
@@ -1948,7 +2081,7 @@
         </w:tc>
         <w:tc>
           <w:tcPr>
-            <w:tcW w:type="dxa" w:w="900"/>
+            <w:tcW w:type="dxa" w:w="1615"/>
             <w:vAlign w:val="center"/>
           </w:tcPr>
           <w:p>
@@ -1969,7 +2102,7 @@
         </w:tc>
         <w:tc>
           <w:tcPr>
-            <w:tcW w:type="dxa" w:w="1768"/>
+            <w:tcW w:type="dxa" w:w="2243"/>
             <w:vAlign w:val="center"/>
           </w:tcPr>
           <w:p>
@@ -1990,7 +2123,7 @@
         </w:tc>
         <w:tc>
           <w:tcPr>
-            <w:tcW w:type="dxa" w:w="1436"/>
+            <w:tcW w:type="dxa" w:w="1166"/>
             <w:vAlign w:val="center"/>
           </w:tcPr>
           <w:p>
@@ -2011,7 +2144,7 @@
         </w:tc>
         <w:tc>
           <w:tcPr>
-            <w:tcW w:type="dxa" w:w="2083"/>
+            <w:tcW w:type="dxa" w:w="1704"/>
             <w:vAlign w:val="center"/>
           </w:tcPr>
           <w:p>
@@ -2050,23 +2183,23 @@
         <w:pStyle w:val="Normal"/>
       </w:pPr>
       <w:r>
-        <w:t>A coluna em reais existe porque percentual é fácil de aprovar com a cabeça e difícil de sentir. Cem mil reais aplicados em janeiro de 2015 e resgatados no fim de 2025 seriam R$ 609.832 na carteira publicada, R$ 340.068 no Ibovespa e R$ 274.368 no CDI, uma diferença de R$ 269.764 para o mercado e de R$ 335.464 para o caixa.</w:t>
-      </w:r>
-    </w:p>
-    <w:p>
-      <w:pPr>
-        <w:pStyle w:val="Normal"/>
-      </w:pPr>
-      <w:r>
-        <w:t>Em janelas móveis, contra o CDI a carteira vence 8 de 9 janelas de três anos, 6 de 7 de cinco anos e 2 de 2 de dez anos. Contra a otimização neutra, vence todas as janelas de três, cinco e dez anos. Registramos que janelas móveis se sobrepõem: as 9 janelas de três anos contêm apenas 3 blocos independentes, e as de dez anos, apenas 1. O número de janelas vencidas impressiona mais do que informa, e por isso publicamos os dois lados.</w:t>
-      </w:r>
-    </w:p>
-    <w:p>
-      <w:pPr>
-        <w:pStyle w:val="Normal"/>
-      </w:pPr>
-      <w:r>
-        <w:t>Esse resultado teve um custo de risco. A queda máxima diária chegou a 47,8%, praticamente a mesma do Ibovespa, com 47,0%, e do BOVA11, com 47,2%. Isso ocorreu porque o protocolo aninhado elevou a parcela de renda variável a 95% entre 2018 e 2021. A carteira não é uma versão suavizada do mercado com retorno maior. É uma carteira concentrada que passou pelo mesmo tombo e se recuperou mais. Houve cinco trocas de configuração no período, e o orçamento de renda variável percorreu 55%, 75%, 95%, 75% e 55%.</w:t>
+        <w:t>A coluna em reais traduz a taxa anualizada em escala econômica. Sob as hipóteses do diagnóstico, R$ 100 mil teriam terminado em R$ 609.832 na carteira, R$ 340.068 no Ibovespa e R$ 274.368 no CDI. Esses valores dependem da qualidade da série reconstruída e devem ser lidos junto com a Seção 5.2.</w:t>
+      </w:r>
+    </w:p>
+    <w:p>
+      <w:pPr>
+        <w:pStyle w:val="Normal"/>
+      </w:pPr>
+      <w:r>
+        <w:t>Em janelas móveis, contra o CDI a carteira vence 8 de 9 janelas de três anos, 6 de 7 de cinco anos e 2 de 2 de dez anos. Contra a otimização de referência, vence todas as janelas de três, cinco e dez anos. Essas contagens não são observações independentes: as nove janelas de três anos contêm apenas três blocos sem sobreposição, e as de dez anos contêm apenas um. Elas descrevem a amostra, mas não aumentam artificialmente seu tamanho.</w:t>
+      </w:r>
+    </w:p>
+    <w:p>
+      <w:pPr>
+        <w:pStyle w:val="Normal"/>
+      </w:pPr>
+      <w:r>
+        <w:t>O retorno veio acompanhado de risco elevado. A queda máxima diária chegou a 47,8%, praticamente igual à do Ibovespa, 47,0%, e à do BOVA11, 47,2%. Entre 2018 e 2021, a política selecionada manteve 95% em ações e concentrou essa parcela em cinco ou seis emissores. O sistema não antecipou a Covid-19 e não protegeu o capital durante a queda. A carteira sofreu quase todo o recuo do mercado e recuperou-se depois. Portanto, o resultado é incompatível com a promessa de perfil conservador e não pode ser vendido como proteção de crise.</w:t>
       </w:r>
     </w:p>
     <w:p>
@@ -2074,7 +2207,15 @@
         <w:pStyle w:val="Heading2"/>
       </w:pPr>
       <w:r>
-        <w:t>5.2 BENEVENTE 2: O QUE MELHOROU E O QUE NÃO FOI PROVADO</w:t>
+        <w:t>5.2 QUALIDADE DOS DADOS E DEPENDÊNCIA DE IMPUTAÇÃO</w:t>
+      </w:r>
+    </w:p>
+    <w:p>
+      <w:pPr>
+        <w:pStyle w:val="Normal"/>
+      </w:pPr>
+      <w:r>
+        <w:t>O painel contém 139 séries com proventos imputados, mas a carteira não as utilizou de modo uniforme. Somando somente a parcela de ações escolhida em cada ano, 13,9% da exposição acumulada dependeu de imputação. O caso mais relevante ocorreu em 2020: AZUL4 e MRFG3 representaram 50% da carteira total. Em cinco dos onze anos houve alguma exposição; nos demais, nenhuma série escolhida dependia desse procedimento.</w:t>
       </w:r>
     </w:p>
     <w:p>
@@ -2098,7 +2239,7 @@
         <w:rPr>
           <w:i/>
         </w:rPr>
-        <w:t>Desempenho e risco do Benevente 1 e do Benevente 2</w:t>
+        <w:t>Exposição anual a séries com proventos imputados</w:t>
       </w:r>
     </w:p>
     <w:tbl>
@@ -2117,10 +2258,9 @@
         </w:tblBorders>
       </w:tblPr>
       <w:tblGrid>
-        <w:gridCol w:w="3061"/>
-        <w:gridCol w:w="1836"/>
-        <w:gridCol w:w="2326"/>
-        <w:gridCol w:w="1837"/>
+        <w:gridCol w:w="1272"/>
+        <w:gridCol w:w="4768"/>
+        <w:gridCol w:w="3020"/>
       </w:tblGrid>
       <w:tr>
         <w:trPr>
@@ -2129,7 +2269,7 @@
         </w:trPr>
         <w:tc>
           <w:tcPr>
-            <w:tcW w:type="dxa" w:w="3061"/>
+            <w:tcW w:type="dxa" w:w="1272"/>
             <w:vAlign w:val="center"/>
             <w:tcBorders>
               <w:bottom w:val="single" w:sz="8" w:color="000000"/>
@@ -2148,13 +2288,13 @@
                 <w:b/>
                 <w:sz w:val="17"/>
               </w:rPr>
-              <w:t>Série</w:t>
-            </w:r>
-          </w:p>
-        </w:tc>
-        <w:tc>
-          <w:tcPr>
-            <w:tcW w:type="dxa" w:w="1836"/>
+              <w:t>Ano</w:t>
+            </w:r>
+          </w:p>
+        </w:tc>
+        <w:tc>
+          <w:tcPr>
+            <w:tcW w:type="dxa" w:w="4768"/>
             <w:vAlign w:val="center"/>
             <w:tcBorders>
               <w:bottom w:val="single" w:sz="8" w:color="000000"/>
@@ -2173,13 +2313,13 @@
                 <w:b/>
                 <w:sz w:val="17"/>
               </w:rPr>
-              <w:t>CAGR 2015--2025</w:t>
-            </w:r>
-          </w:p>
-        </w:tc>
-        <w:tc>
-          <w:tcPr>
-            <w:tcW w:type="dxa" w:w="2326"/>
+              <w:t>Peso total em séries imputadas</w:t>
+            </w:r>
+          </w:p>
+        </w:tc>
+        <w:tc>
+          <w:tcPr>
+            <w:tcW w:type="dxa" w:w="3020"/>
             <w:vAlign w:val="center"/>
             <w:tcBorders>
               <w:bottom w:val="single" w:sz="8" w:color="000000"/>
@@ -2198,32 +2338,7 @@
                 <w:b/>
                 <w:sz w:val="17"/>
               </w:rPr>
-              <w:t>Queda máxima diária</w:t>
-            </w:r>
-          </w:p>
-        </w:tc>
-        <w:tc>
-          <w:tcPr>
-            <w:tcW w:type="dxa" w:w="1837"/>
-            <w:vAlign w:val="center"/>
-            <w:tcBorders>
-              <w:bottom w:val="single" w:sz="8" w:color="000000"/>
-            </w:tcBorders>
-          </w:tcPr>
-          <w:p>
-            <w:pPr>
-              <w:keepNext/>
-              <w:spacing w:line="240" w:lineRule="auto" w:after="0"/>
-              <w:ind w:firstLine="0"/>
-              <w:jc w:val="left"/>
-            </w:pPr>
-            <w:r>
-              <w:rPr>
-                <w:rFonts w:ascii="Times New Roman" w:hAnsi="Times New Roman"/>
-                <w:b/>
-                <w:sz w:val="17"/>
-              </w:rPr>
-              <w:t>CAGR 2019--2025</w:t>
+              <w:t>Séries selecionadas</w:t>
             </w:r>
           </w:p>
         </w:tc>
@@ -2234,85 +2349,64 @@
         </w:trPr>
         <w:tc>
           <w:tcPr>
-            <w:tcW w:type="dxa" w:w="3061"/>
-            <w:vAlign w:val="center"/>
-          </w:tcPr>
-          <w:p>
-            <w:pPr>
-              <w:keepNext/>
-              <w:spacing w:line="240" w:lineRule="auto" w:after="0"/>
-              <w:ind w:firstLine="0"/>
-              <w:jc w:val="left"/>
-            </w:pPr>
-            <w:r>
-              <w:rPr>
-                <w:rFonts w:ascii="Times New Roman" w:hAnsi="Times New Roman"/>
-                <w:sz w:val="17"/>
-              </w:rPr>
-              <w:t>Benevente 1</w:t>
-            </w:r>
-          </w:p>
-        </w:tc>
-        <w:tc>
-          <w:tcPr>
-            <w:tcW w:type="dxa" w:w="1836"/>
-            <w:vAlign w:val="center"/>
-          </w:tcPr>
-          <w:p>
-            <w:pPr>
-              <w:keepNext/>
-              <w:spacing w:line="240" w:lineRule="auto" w:after="0"/>
-              <w:ind w:firstLine="0"/>
-              <w:jc w:val="left"/>
-            </w:pPr>
-            <w:r>
-              <w:rPr>
-                <w:rFonts w:ascii="Times New Roman" w:hAnsi="Times New Roman"/>
-                <w:sz w:val="17"/>
-              </w:rPr>
-              <w:t>17,86%</w:t>
-            </w:r>
-          </w:p>
-        </w:tc>
-        <w:tc>
-          <w:tcPr>
-            <w:tcW w:type="dxa" w:w="2326"/>
-            <w:vAlign w:val="center"/>
-          </w:tcPr>
-          <w:p>
-            <w:pPr>
-              <w:keepNext/>
-              <w:spacing w:line="240" w:lineRule="auto" w:after="0"/>
-              <w:ind w:firstLine="0"/>
-              <w:jc w:val="left"/>
-            </w:pPr>
-            <w:r>
-              <w:rPr>
-                <w:rFonts w:ascii="Times New Roman" w:hAnsi="Times New Roman"/>
-                <w:sz w:val="17"/>
-              </w:rPr>
-              <w:t>−47,8%</w:t>
-            </w:r>
-          </w:p>
-        </w:tc>
-        <w:tc>
-          <w:tcPr>
-            <w:tcW w:type="dxa" w:w="1837"/>
-            <w:vAlign w:val="center"/>
-          </w:tcPr>
-          <w:p>
-            <w:pPr>
-              <w:keepNext/>
-              <w:spacing w:line="240" w:lineRule="auto" w:after="0"/>
-              <w:ind w:firstLine="0"/>
-              <w:jc w:val="left"/>
-            </w:pPr>
-            <w:r>
-              <w:rPr>
-                <w:rFonts w:ascii="Times New Roman" w:hAnsi="Times New Roman"/>
-                <w:sz w:val="17"/>
-              </w:rPr>
-              <w:t>17,95%</w:t>
+            <w:tcW w:type="dxa" w:w="1272"/>
+            <w:vAlign w:val="center"/>
+          </w:tcPr>
+          <w:p>
+            <w:pPr>
+              <w:keepNext/>
+              <w:spacing w:line="240" w:lineRule="auto" w:after="0"/>
+              <w:ind w:firstLine="0"/>
+              <w:jc w:val="left"/>
+            </w:pPr>
+            <w:r>
+              <w:rPr>
+                <w:rFonts w:ascii="Times New Roman" w:hAnsi="Times New Roman"/>
+                <w:sz w:val="17"/>
+              </w:rPr>
+              <w:t>2015</w:t>
+            </w:r>
+          </w:p>
+        </w:tc>
+        <w:tc>
+          <w:tcPr>
+            <w:tcW w:type="dxa" w:w="4768"/>
+            <w:vAlign w:val="center"/>
+          </w:tcPr>
+          <w:p>
+            <w:pPr>
+              <w:keepNext/>
+              <w:spacing w:line="240" w:lineRule="auto" w:after="0"/>
+              <w:ind w:firstLine="0"/>
+              <w:jc w:val="left"/>
+            </w:pPr>
+            <w:r>
+              <w:rPr>
+                <w:rFonts w:ascii="Times New Roman" w:hAnsi="Times New Roman"/>
+                <w:sz w:val="17"/>
+              </w:rPr>
+              <w:t>11,0%</w:t>
+            </w:r>
+          </w:p>
+        </w:tc>
+        <w:tc>
+          <w:tcPr>
+            <w:tcW w:type="dxa" w:w="3020"/>
+            <w:vAlign w:val="center"/>
+          </w:tcPr>
+          <w:p>
+            <w:pPr>
+              <w:keepNext/>
+              <w:spacing w:line="240" w:lineRule="auto" w:after="0"/>
+              <w:ind w:firstLine="0"/>
+              <w:jc w:val="left"/>
+            </w:pPr>
+            <w:r>
+              <w:rPr>
+                <w:rFonts w:ascii="Times New Roman" w:hAnsi="Times New Roman"/>
+                <w:sz w:val="17"/>
+              </w:rPr>
+              <w:t>CIEL3</w:t>
             </w:r>
           </w:p>
         </w:tc>
@@ -2323,7 +2417,211 @@
         </w:trPr>
         <w:tc>
           <w:tcPr>
-            <w:tcW w:type="dxa" w:w="3061"/>
+            <w:tcW w:type="dxa" w:w="1272"/>
+            <w:vAlign w:val="center"/>
+          </w:tcPr>
+          <w:p>
+            <w:pPr>
+              <w:keepNext/>
+              <w:spacing w:line="240" w:lineRule="auto" w:after="0"/>
+              <w:ind w:firstLine="0"/>
+              <w:jc w:val="left"/>
+            </w:pPr>
+            <w:r>
+              <w:rPr>
+                <w:rFonts w:ascii="Times New Roman" w:hAnsi="Times New Roman"/>
+                <w:sz w:val="17"/>
+              </w:rPr>
+              <w:t>2016</w:t>
+            </w:r>
+          </w:p>
+        </w:tc>
+        <w:tc>
+          <w:tcPr>
+            <w:tcW w:type="dxa" w:w="4768"/>
+            <w:vAlign w:val="center"/>
+          </w:tcPr>
+          <w:p>
+            <w:pPr>
+              <w:keepNext/>
+              <w:spacing w:line="240" w:lineRule="auto" w:after="0"/>
+              <w:ind w:firstLine="0"/>
+              <w:jc w:val="left"/>
+            </w:pPr>
+            <w:r>
+              <w:rPr>
+                <w:rFonts w:ascii="Times New Roman" w:hAnsi="Times New Roman"/>
+                <w:sz w:val="17"/>
+              </w:rPr>
+              <w:t>24,0%</w:t>
+            </w:r>
+          </w:p>
+        </w:tc>
+        <w:tc>
+          <w:tcPr>
+            <w:tcW w:type="dxa" w:w="3020"/>
+            <w:vAlign w:val="center"/>
+          </w:tcPr>
+          <w:p>
+            <w:pPr>
+              <w:keepNext/>
+              <w:spacing w:line="240" w:lineRule="auto" w:after="0"/>
+              <w:ind w:firstLine="0"/>
+              <w:jc w:val="left"/>
+            </w:pPr>
+            <w:r>
+              <w:rPr>
+                <w:rFonts w:ascii="Times New Roman" w:hAnsi="Times New Roman"/>
+                <w:sz w:val="17"/>
+              </w:rPr>
+              <w:t>ENBR3</w:t>
+            </w:r>
+          </w:p>
+        </w:tc>
+      </w:tr>
+      <w:tr>
+        <w:trPr>
+          <w:cantSplit/>
+        </w:trPr>
+        <w:tc>
+          <w:tcPr>
+            <w:tcW w:type="dxa" w:w="1272"/>
+            <w:vAlign w:val="center"/>
+          </w:tcPr>
+          <w:p>
+            <w:pPr>
+              <w:keepNext/>
+              <w:spacing w:line="240" w:lineRule="auto" w:after="0"/>
+              <w:ind w:firstLine="0"/>
+              <w:jc w:val="left"/>
+            </w:pPr>
+            <w:r>
+              <w:rPr>
+                <w:rFonts w:ascii="Times New Roman" w:hAnsi="Times New Roman"/>
+                <w:sz w:val="17"/>
+              </w:rPr>
+              <w:t>2020</w:t>
+            </w:r>
+          </w:p>
+        </w:tc>
+        <w:tc>
+          <w:tcPr>
+            <w:tcW w:type="dxa" w:w="4768"/>
+            <w:vAlign w:val="center"/>
+          </w:tcPr>
+          <w:p>
+            <w:pPr>
+              <w:keepNext/>
+              <w:spacing w:line="240" w:lineRule="auto" w:after="0"/>
+              <w:ind w:firstLine="0"/>
+              <w:jc w:val="left"/>
+            </w:pPr>
+            <w:r>
+              <w:rPr>
+                <w:rFonts w:ascii="Times New Roman" w:hAnsi="Times New Roman"/>
+                <w:sz w:val="17"/>
+              </w:rPr>
+              <w:t>50,0%</w:t>
+            </w:r>
+          </w:p>
+        </w:tc>
+        <w:tc>
+          <w:tcPr>
+            <w:tcW w:type="dxa" w:w="3020"/>
+            <w:vAlign w:val="center"/>
+          </w:tcPr>
+          <w:p>
+            <w:pPr>
+              <w:keepNext/>
+              <w:spacing w:line="240" w:lineRule="auto" w:after="0"/>
+              <w:ind w:firstLine="0"/>
+              <w:jc w:val="left"/>
+            </w:pPr>
+            <w:r>
+              <w:rPr>
+                <w:rFonts w:ascii="Times New Roman" w:hAnsi="Times New Roman"/>
+                <w:sz w:val="17"/>
+              </w:rPr>
+              <w:t>AZUL4 e MRFG3</w:t>
+            </w:r>
+          </w:p>
+        </w:tc>
+      </w:tr>
+      <w:tr>
+        <w:trPr>
+          <w:cantSplit/>
+        </w:trPr>
+        <w:tc>
+          <w:tcPr>
+            <w:tcW w:type="dxa" w:w="1272"/>
+            <w:vAlign w:val="center"/>
+          </w:tcPr>
+          <w:p>
+            <w:pPr>
+              <w:keepNext/>
+              <w:spacing w:line="240" w:lineRule="auto" w:after="0"/>
+              <w:ind w:firstLine="0"/>
+              <w:jc w:val="left"/>
+            </w:pPr>
+            <w:r>
+              <w:rPr>
+                <w:rFonts w:ascii="Times New Roman" w:hAnsi="Times New Roman"/>
+                <w:sz w:val="17"/>
+              </w:rPr>
+              <w:t>2021</w:t>
+            </w:r>
+          </w:p>
+        </w:tc>
+        <w:tc>
+          <w:tcPr>
+            <w:tcW w:type="dxa" w:w="4768"/>
+            <w:vAlign w:val="center"/>
+          </w:tcPr>
+          <w:p>
+            <w:pPr>
+              <w:keepNext/>
+              <w:spacing w:line="240" w:lineRule="auto" w:after="0"/>
+              <w:ind w:firstLine="0"/>
+              <w:jc w:val="left"/>
+            </w:pPr>
+            <w:r>
+              <w:rPr>
+                <w:rFonts w:ascii="Times New Roman" w:hAnsi="Times New Roman"/>
+                <w:sz w:val="17"/>
+              </w:rPr>
+              <w:t>25,0%</w:t>
+            </w:r>
+          </w:p>
+        </w:tc>
+        <w:tc>
+          <w:tcPr>
+            <w:tcW w:type="dxa" w:w="3020"/>
+            <w:vAlign w:val="center"/>
+          </w:tcPr>
+          <w:p>
+            <w:pPr>
+              <w:keepNext/>
+              <w:spacing w:line="240" w:lineRule="auto" w:after="0"/>
+              <w:ind w:firstLine="0"/>
+              <w:jc w:val="left"/>
+            </w:pPr>
+            <w:r>
+              <w:rPr>
+                <w:rFonts w:ascii="Times New Roman" w:hAnsi="Times New Roman"/>
+                <w:sz w:val="17"/>
+              </w:rPr>
+              <w:t>MRFG3</w:t>
+            </w:r>
+          </w:p>
+        </w:tc>
+      </w:tr>
+      <w:tr>
+        <w:trPr>
+          <w:cantSplit/>
+        </w:trPr>
+        <w:tc>
+          <w:tcPr>
+            <w:tcW w:type="dxa" w:w="1272"/>
             <w:vAlign w:val="center"/>
           </w:tcPr>
           <w:p>
@@ -2338,13 +2636,13 @@
                 <w:rFonts w:ascii="Times New Roman" w:hAnsi="Times New Roman"/>
                 <w:sz w:val="17"/>
               </w:rPr>
-              <w:t>Benevente 2, experimental</w:t>
-            </w:r>
-          </w:p>
-        </w:tc>
-        <w:tc>
-          <w:tcPr>
-            <w:tcW w:type="dxa" w:w="1836"/>
+              <w:t>2025</w:t>
+            </w:r>
+          </w:p>
+        </w:tc>
+        <w:tc>
+          <w:tcPr>
+            <w:tcW w:type="dxa" w:w="4768"/>
             <w:vAlign w:val="center"/>
           </w:tcPr>
           <w:p>
@@ -2359,13 +2657,13 @@
                 <w:rFonts w:ascii="Times New Roman" w:hAnsi="Times New Roman"/>
                 <w:sz w:val="17"/>
               </w:rPr>
-              <w:t>18,45%</w:t>
-            </w:r>
-          </w:p>
-        </w:tc>
-        <w:tc>
-          <w:tcPr>
-            <w:tcW w:type="dxa" w:w="2326"/>
+              <w:t>5,0%</w:t>
+            </w:r>
+          </w:p>
+        </w:tc>
+        <w:tc>
+          <w:tcPr>
+            <w:tcW w:type="dxa" w:w="3020"/>
             <w:vAlign w:val="center"/>
           </w:tcPr>
           <w:p>
@@ -2380,28 +2678,7 @@
                 <w:rFonts w:ascii="Times New Roman" w:hAnsi="Times New Roman"/>
                 <w:sz w:val="17"/>
               </w:rPr>
-              <w:t>−28,7%</w:t>
-            </w:r>
-          </w:p>
-        </w:tc>
-        <w:tc>
-          <w:tcPr>
-            <w:tcW w:type="dxa" w:w="1837"/>
-            <w:vAlign w:val="center"/>
-          </w:tcPr>
-          <w:p>
-            <w:pPr>
-              <w:keepNext w:val="0"/>
-              <w:spacing w:line="240" w:lineRule="auto" w:after="0"/>
-              <w:ind w:firstLine="0"/>
-              <w:jc w:val="left"/>
-            </w:pPr>
-            <w:r>
-              <w:rPr>
-                <w:rFonts w:ascii="Times New Roman" w:hAnsi="Times New Roman"/>
-                <w:sz w:val="17"/>
-              </w:rPr>
-              <w:t>18,03%</w:t>
+              <w:t>STBP3</w:t>
             </w:r>
           </w:p>
         </w:tc>
@@ -2432,15 +2709,7 @@
         <w:pStyle w:val="Normal"/>
       </w:pPr>
       <w:r>
-        <w:t>Na crise de 2020, o primeiro alerta ocorreu em 28/02/2020 e o estado severo em 10/03/2020. A exposição mínima ficou em 35%. O Benevente 1 terminou o ano com 1,78%, o Benevente 2 com 4,35% e o Ibovespa com 0,62%. A queda máxima caiu de 47,8% para 28,7%, enquanto a do índice foi de 46,8%.</w:t>
-      </w:r>
-    </w:p>
-    <w:p>
-      <w:pPr>
-        <w:pStyle w:val="Normal"/>
-      </w:pPr>
-      <w:r>
-        <w:t>O resultado de retorno exige contenção. No recorte 2019--2025 a diferença de CAGR entre as versões foi de apenas 0,09 ponto percentual e o teste pareado anual produziu p = 0,964. Portanto, não há evidência de alfa adicional. Numa grade de sensibilidade com 432 configurações, todas reduziram a queda máxima, mas apenas 9,03% melhoraram simultaneamente CAGR e queda no recorte de avaliação. A conclusão sustentada é uma redução robusta de risco de cauda, não aumento comprovado de rentabilidade. Os números do Benevente 2 incluem custo de giro do controle intranual, mas ainda não o imposto gerado por vendas dentro do ano. Por isso ele permanece experimental e não substitui a série canônica.</w:t>
+        <w:t>Aplicar uma perda adicional de 10 pontos percentuais apenas à parcela imputada reduz o retorno anualizado da carteira de 17,86% para 16,78%. Com 25 pontos, ele cai para 15,11%; com 50, para 12,16%; e com 100, para 5,41%. A carteira deixa de superar o Ibovespa quando a penalização nessa parcela chega a aproximadamente 53 pontos percentuais e deixa de superar o CDI perto de 70 pontos. O teste mostra alguma margem econômica, mas não repara o dado. Como metade da carteira de 2020 dependeu de séries imputadas, o retorno histórico deve permanecer diagnóstico até a reconciliação dos eventos e proventos em fonte primária.</w:t>
       </w:r>
     </w:p>
     <w:p>
@@ -2448,7 +2717,15 @@
         <w:pStyle w:val="Heading2"/>
       </w:pPr>
       <w:r>
-        <w:t>5.3 O RESULTADO SOBREVIVE À CORREÇÃO POR MÚLTIPLAS TENTATIVAS?</w:t>
+        <w:t>5.3 INCERTEZA DA AMOSTRA</w:t>
+      </w:r>
+    </w:p>
+    <w:p>
+      <w:pPr>
+        <w:pStyle w:val="Normal"/>
+      </w:pPr>
+      <w:r>
+        <w:t>A reamostragem pareada preserva, em cada sorteio, o mesmo ano da estratégia e dos comparadores. Em 100 mil amostras, a probabilidade interna de excesso positivo foi alta, mas o intervalo de 95% ainda cruzou zero contra CDI, Ibovespa e BOVA11. Somente a comparação com a implementação específica de MVO permaneceu positiva em todo o intervalo. Isso não autoriza concluir que o Benevente supera esses referenciais na população; mostra apenas que a ordenação observada não dependeu de um único ano sorteado repetidamente.</w:t>
       </w:r>
     </w:p>
     <w:p>
@@ -2461,6 +2738,550 @@
           <w:b/>
         </w:rPr>
         <w:t>Tabela 4</w:t>
+      </w:r>
+    </w:p>
+    <w:p>
+      <w:pPr>
+        <w:keepNext/>
+        <w:spacing w:after="80"/>
+      </w:pPr>
+      <w:r>
+        <w:rPr>
+          <w:i/>
+        </w:rPr>
+        <w:t>Incerteza do excesso de retorno em reamostragem pareada</w:t>
+      </w:r>
+    </w:p>
+    <w:tbl>
+      <w:tblPr>
+        <w:tblW w:type="dxa" w:w="9060"/>
+        <w:jc w:val="center"/>
+        <w:tblLayout w:type="fixed"/>
+        <w:tblLook w:firstColumn="1" w:firstRow="1" w:lastColumn="0" w:lastRow="0" w:noHBand="0" w:noVBand="1" w:val="04A0"/>
+        <w:tblBorders>
+          <w:left w:val="nil"/>
+          <w:right w:val="nil"/>
+          <w:insideH w:val="nil"/>
+          <w:insideV w:val="nil"/>
+          <w:top w:val="single" w:sz="8" w:color="000000"/>
+          <w:bottom w:val="single" w:sz="8" w:color="000000"/>
+        </w:tblBorders>
+      </w:tblPr>
+      <w:tblGrid>
+        <w:gridCol w:w="1639"/>
+        <w:gridCol w:w="2795"/>
+        <w:gridCol w:w="2795"/>
+        <w:gridCol w:w="1831"/>
+      </w:tblGrid>
+      <w:tr>
+        <w:trPr>
+          <w:cantSplit/>
+          <w:tblHeader w:val="true"/>
+        </w:trPr>
+        <w:tc>
+          <w:tcPr>
+            <w:tcW w:type="dxa" w:w="1639"/>
+            <w:vAlign w:val="center"/>
+            <w:tcBorders>
+              <w:bottom w:val="single" w:sz="8" w:color="000000"/>
+            </w:tcBorders>
+          </w:tcPr>
+          <w:p>
+            <w:pPr>
+              <w:keepNext/>
+              <w:spacing w:line="240" w:lineRule="auto" w:after="0"/>
+              <w:ind w:firstLine="0"/>
+              <w:jc w:val="left"/>
+            </w:pPr>
+            <w:r>
+              <w:rPr>
+                <w:rFonts w:ascii="Times New Roman" w:hAnsi="Times New Roman"/>
+                <w:b/>
+                <w:sz w:val="17"/>
+              </w:rPr>
+              <w:t>Comparador</w:t>
+            </w:r>
+          </w:p>
+        </w:tc>
+        <w:tc>
+          <w:tcPr>
+            <w:tcW w:type="dxa" w:w="2795"/>
+            <w:vAlign w:val="center"/>
+            <w:tcBorders>
+              <w:bottom w:val="single" w:sz="8" w:color="000000"/>
+            </w:tcBorders>
+          </w:tcPr>
+          <w:p>
+            <w:pPr>
+              <w:keepNext/>
+              <w:spacing w:line="240" w:lineRule="auto" w:after="0"/>
+              <w:ind w:firstLine="0"/>
+              <w:jc w:val="left"/>
+            </w:pPr>
+            <w:r>
+              <w:rPr>
+                <w:rFonts w:ascii="Times New Roman" w:hAnsi="Times New Roman"/>
+                <w:b/>
+                <w:sz w:val="17"/>
+              </w:rPr>
+              <w:t>Amostras com excesso positivo</w:t>
+            </w:r>
+          </w:p>
+        </w:tc>
+        <w:tc>
+          <w:tcPr>
+            <w:tcW w:type="dxa" w:w="2795"/>
+            <w:vAlign w:val="center"/>
+            <w:tcBorders>
+              <w:bottom w:val="single" w:sz="8" w:color="000000"/>
+            </w:tcBorders>
+          </w:tcPr>
+          <w:p>
+            <w:pPr>
+              <w:keepNext/>
+              <w:spacing w:line="240" w:lineRule="auto" w:after="0"/>
+              <w:ind w:firstLine="0"/>
+              <w:jc w:val="left"/>
+            </w:pPr>
+            <w:r>
+              <w:rPr>
+                <w:rFonts w:ascii="Times New Roman" w:hAnsi="Times New Roman"/>
+                <w:b/>
+                <w:sz w:val="17"/>
+              </w:rPr>
+              <w:t>Mediana do excesso anualizado</w:t>
+            </w:r>
+          </w:p>
+        </w:tc>
+        <w:tc>
+          <w:tcPr>
+            <w:tcW w:type="dxa" w:w="1831"/>
+            <w:vAlign w:val="center"/>
+            <w:tcBorders>
+              <w:bottom w:val="single" w:sz="8" w:color="000000"/>
+            </w:tcBorders>
+          </w:tcPr>
+          <w:p>
+            <w:pPr>
+              <w:keepNext/>
+              <w:spacing w:line="240" w:lineRule="auto" w:after="0"/>
+              <w:ind w:firstLine="0"/>
+              <w:jc w:val="left"/>
+            </w:pPr>
+            <w:r>
+              <w:rPr>
+                <w:rFonts w:ascii="Times New Roman" w:hAnsi="Times New Roman"/>
+                <w:b/>
+                <w:sz w:val="17"/>
+              </w:rPr>
+              <w:t>Intervalo de 95%</w:t>
+            </w:r>
+          </w:p>
+        </w:tc>
+      </w:tr>
+      <w:tr>
+        <w:trPr>
+          <w:cantSplit/>
+        </w:trPr>
+        <w:tc>
+          <w:tcPr>
+            <w:tcW w:type="dxa" w:w="1639"/>
+            <w:vAlign w:val="center"/>
+          </w:tcPr>
+          <w:p>
+            <w:pPr>
+              <w:keepNext/>
+              <w:spacing w:line="240" w:lineRule="auto" w:after="0"/>
+              <w:ind w:firstLine="0"/>
+              <w:jc w:val="left"/>
+            </w:pPr>
+            <w:r>
+              <w:rPr>
+                <w:rFonts w:ascii="Times New Roman" w:hAnsi="Times New Roman"/>
+                <w:sz w:val="17"/>
+              </w:rPr>
+              <w:t>CDI</w:t>
+            </w:r>
+          </w:p>
+        </w:tc>
+        <w:tc>
+          <w:tcPr>
+            <w:tcW w:type="dxa" w:w="2795"/>
+            <w:vAlign w:val="center"/>
+          </w:tcPr>
+          <w:p>
+            <w:pPr>
+              <w:keepNext/>
+              <w:spacing w:line="240" w:lineRule="auto" w:after="0"/>
+              <w:ind w:firstLine="0"/>
+              <w:jc w:val="left"/>
+            </w:pPr>
+            <w:r>
+              <w:rPr>
+                <w:rFonts w:ascii="Times New Roman" w:hAnsi="Times New Roman"/>
+                <w:sz w:val="17"/>
+              </w:rPr>
+              <w:t>93,4%</w:t>
+            </w:r>
+          </w:p>
+        </w:tc>
+        <w:tc>
+          <w:tcPr>
+            <w:tcW w:type="dxa" w:w="2795"/>
+            <w:vAlign w:val="center"/>
+          </w:tcPr>
+          <w:p>
+            <w:pPr>
+              <w:keepNext/>
+              <w:spacing w:line="240" w:lineRule="auto" w:after="0"/>
+              <w:ind w:firstLine="0"/>
+              <w:jc w:val="left"/>
+            </w:pPr>
+            <w:r>
+              <w:rPr>
+                <w:rFonts w:ascii="Times New Roman" w:hAnsi="Times New Roman"/>
+                <w:sz w:val="17"/>
+              </w:rPr>
+              <w:t>+8,19 p.p.</w:t>
+            </w:r>
+          </w:p>
+        </w:tc>
+        <w:tc>
+          <w:tcPr>
+            <w:tcW w:type="dxa" w:w="1831"/>
+            <w:vAlign w:val="center"/>
+          </w:tcPr>
+          <w:p>
+            <w:pPr>
+              <w:keepNext/>
+              <w:spacing w:line="240" w:lineRule="auto" w:after="0"/>
+              <w:ind w:firstLine="0"/>
+              <w:jc w:val="left"/>
+            </w:pPr>
+            <w:r>
+              <w:rPr>
+                <w:rFonts w:ascii="Times New Roman" w:hAnsi="Times New Roman"/>
+                <w:sz w:val="17"/>
+              </w:rPr>
+              <w:t>−2,27 a +20,01 p.p.</w:t>
+            </w:r>
+          </w:p>
+        </w:tc>
+      </w:tr>
+      <w:tr>
+        <w:trPr>
+          <w:cantSplit/>
+        </w:trPr>
+        <w:tc>
+          <w:tcPr>
+            <w:tcW w:type="dxa" w:w="1639"/>
+            <w:vAlign w:val="center"/>
+          </w:tcPr>
+          <w:p>
+            <w:pPr>
+              <w:keepNext/>
+              <w:spacing w:line="240" w:lineRule="auto" w:after="0"/>
+              <w:ind w:firstLine="0"/>
+              <w:jc w:val="left"/>
+            </w:pPr>
+            <w:r>
+              <w:rPr>
+                <w:rFonts w:ascii="Times New Roman" w:hAnsi="Times New Roman"/>
+                <w:sz w:val="17"/>
+              </w:rPr>
+              <w:t>MVO de referência</w:t>
+            </w:r>
+          </w:p>
+        </w:tc>
+        <w:tc>
+          <w:tcPr>
+            <w:tcW w:type="dxa" w:w="2795"/>
+            <w:vAlign w:val="center"/>
+          </w:tcPr>
+          <w:p>
+            <w:pPr>
+              <w:keepNext/>
+              <w:spacing w:line="240" w:lineRule="auto" w:after="0"/>
+              <w:ind w:firstLine="0"/>
+              <w:jc w:val="left"/>
+            </w:pPr>
+            <w:r>
+              <w:rPr>
+                <w:rFonts w:ascii="Times New Roman" w:hAnsi="Times New Roman"/>
+                <w:sz w:val="17"/>
+              </w:rPr>
+              <w:t>100,0%</w:t>
+            </w:r>
+          </w:p>
+        </w:tc>
+        <w:tc>
+          <w:tcPr>
+            <w:tcW w:type="dxa" w:w="2795"/>
+            <w:vAlign w:val="center"/>
+          </w:tcPr>
+          <w:p>
+            <w:pPr>
+              <w:keepNext/>
+              <w:spacing w:line="240" w:lineRule="auto" w:after="0"/>
+              <w:ind w:firstLine="0"/>
+              <w:jc w:val="left"/>
+            </w:pPr>
+            <w:r>
+              <w:rPr>
+                <w:rFonts w:ascii="Times New Roman" w:hAnsi="Times New Roman"/>
+                <w:sz w:val="17"/>
+              </w:rPr>
+              <w:t>+10,06 p.p.</w:t>
+            </w:r>
+          </w:p>
+        </w:tc>
+        <w:tc>
+          <w:tcPr>
+            <w:tcW w:type="dxa" w:w="1831"/>
+            <w:vAlign w:val="center"/>
+          </w:tcPr>
+          <w:p>
+            <w:pPr>
+              <w:keepNext/>
+              <w:spacing w:line="240" w:lineRule="auto" w:after="0"/>
+              <w:ind w:firstLine="0"/>
+              <w:jc w:val="left"/>
+            </w:pPr>
+            <w:r>
+              <w:rPr>
+                <w:rFonts w:ascii="Times New Roman" w:hAnsi="Times New Roman"/>
+                <w:sz w:val="17"/>
+              </w:rPr>
+              <w:t>+4,73 a +15,29 p.p.</w:t>
+            </w:r>
+          </w:p>
+        </w:tc>
+      </w:tr>
+      <w:tr>
+        <w:trPr>
+          <w:cantSplit/>
+        </w:trPr>
+        <w:tc>
+          <w:tcPr>
+            <w:tcW w:type="dxa" w:w="1639"/>
+            <w:vAlign w:val="center"/>
+          </w:tcPr>
+          <w:p>
+            <w:pPr>
+              <w:keepNext/>
+              <w:spacing w:line="240" w:lineRule="auto" w:after="0"/>
+              <w:ind w:firstLine="0"/>
+              <w:jc w:val="left"/>
+            </w:pPr>
+            <w:r>
+              <w:rPr>
+                <w:rFonts w:ascii="Times New Roman" w:hAnsi="Times New Roman"/>
+                <w:sz w:val="17"/>
+              </w:rPr>
+              <w:t>Ibovespa</w:t>
+            </w:r>
+          </w:p>
+        </w:tc>
+        <w:tc>
+          <w:tcPr>
+            <w:tcW w:type="dxa" w:w="2795"/>
+            <w:vAlign w:val="center"/>
+          </w:tcPr>
+          <w:p>
+            <w:pPr>
+              <w:keepNext/>
+              <w:spacing w:line="240" w:lineRule="auto" w:after="0"/>
+              <w:ind w:firstLine="0"/>
+              <w:jc w:val="left"/>
+            </w:pPr>
+            <w:r>
+              <w:rPr>
+                <w:rFonts w:ascii="Times New Roman" w:hAnsi="Times New Roman"/>
+                <w:sz w:val="17"/>
+              </w:rPr>
+              <w:t>94,4%</w:t>
+            </w:r>
+          </w:p>
+        </w:tc>
+        <w:tc>
+          <w:tcPr>
+            <w:tcW w:type="dxa" w:w="2795"/>
+            <w:vAlign w:val="center"/>
+          </w:tcPr>
+          <w:p>
+            <w:pPr>
+              <w:keepNext/>
+              <w:spacing w:line="240" w:lineRule="auto" w:after="0"/>
+              <w:ind w:firstLine="0"/>
+              <w:jc w:val="left"/>
+            </w:pPr>
+            <w:r>
+              <w:rPr>
+                <w:rFonts w:ascii="Times New Roman" w:hAnsi="Times New Roman"/>
+                <w:sz w:val="17"/>
+              </w:rPr>
+              <w:t>+5,94 p.p.</w:t>
+            </w:r>
+          </w:p>
+        </w:tc>
+        <w:tc>
+          <w:tcPr>
+            <w:tcW w:type="dxa" w:w="1831"/>
+            <w:vAlign w:val="center"/>
+          </w:tcPr>
+          <w:p>
+            <w:pPr>
+              <w:keepNext/>
+              <w:spacing w:line="240" w:lineRule="auto" w:after="0"/>
+              <w:ind w:firstLine="0"/>
+              <w:jc w:val="left"/>
+            </w:pPr>
+            <w:r>
+              <w:rPr>
+                <w:rFonts w:ascii="Times New Roman" w:hAnsi="Times New Roman"/>
+                <w:sz w:val="17"/>
+              </w:rPr>
+              <w:t>−1,31 a +14,28 p.p.</w:t>
+            </w:r>
+          </w:p>
+        </w:tc>
+      </w:tr>
+      <w:tr>
+        <w:trPr>
+          <w:cantSplit/>
+        </w:trPr>
+        <w:tc>
+          <w:tcPr>
+            <w:tcW w:type="dxa" w:w="1639"/>
+            <w:vAlign w:val="center"/>
+          </w:tcPr>
+          <w:p>
+            <w:pPr>
+              <w:keepNext w:val="0"/>
+              <w:spacing w:line="240" w:lineRule="auto" w:after="0"/>
+              <w:ind w:firstLine="0"/>
+              <w:jc w:val="left"/>
+            </w:pPr>
+            <w:r>
+              <w:rPr>
+                <w:rFonts w:ascii="Times New Roman" w:hAnsi="Times New Roman"/>
+                <w:sz w:val="17"/>
+              </w:rPr>
+              <w:t>BOVA11</w:t>
+            </w:r>
+          </w:p>
+        </w:tc>
+        <w:tc>
+          <w:tcPr>
+            <w:tcW w:type="dxa" w:w="2795"/>
+            <w:vAlign w:val="center"/>
+          </w:tcPr>
+          <w:p>
+            <w:pPr>
+              <w:keepNext w:val="0"/>
+              <w:spacing w:line="240" w:lineRule="auto" w:after="0"/>
+              <w:ind w:firstLine="0"/>
+              <w:jc w:val="left"/>
+            </w:pPr>
+            <w:r>
+              <w:rPr>
+                <w:rFonts w:ascii="Times New Roman" w:hAnsi="Times New Roman"/>
+                <w:sz w:val="17"/>
+              </w:rPr>
+              <w:t>94,3%</w:t>
+            </w:r>
+          </w:p>
+        </w:tc>
+        <w:tc>
+          <w:tcPr>
+            <w:tcW w:type="dxa" w:w="2795"/>
+            <w:vAlign w:val="center"/>
+          </w:tcPr>
+          <w:p>
+            <w:pPr>
+              <w:keepNext w:val="0"/>
+              <w:spacing w:line="240" w:lineRule="auto" w:after="0"/>
+              <w:ind w:firstLine="0"/>
+              <w:jc w:val="left"/>
+            </w:pPr>
+            <w:r>
+              <w:rPr>
+                <w:rFonts w:ascii="Times New Roman" w:hAnsi="Times New Roman"/>
+                <w:sz w:val="17"/>
+              </w:rPr>
+              <w:t>+5,98 p.p.</w:t>
+            </w:r>
+          </w:p>
+        </w:tc>
+        <w:tc>
+          <w:tcPr>
+            <w:tcW w:type="dxa" w:w="1831"/>
+            <w:vAlign w:val="center"/>
+          </w:tcPr>
+          <w:p>
+            <w:pPr>
+              <w:keepNext w:val="0"/>
+              <w:spacing w:line="240" w:lineRule="auto" w:after="0"/>
+              <w:ind w:firstLine="0"/>
+              <w:jc w:val="left"/>
+            </w:pPr>
+            <w:r>
+              <w:rPr>
+                <w:rFonts w:ascii="Times New Roman" w:hAnsi="Times New Roman"/>
+                <w:sz w:val="17"/>
+              </w:rPr>
+              <w:t>−1,34 a +14,41 p.p.</w:t>
+            </w:r>
+          </w:p>
+        </w:tc>
+      </w:tr>
+    </w:tbl>
+    <w:p>
+      <w:pPr>
+        <w:spacing w:before="60" w:after="160" w:line="240" w:lineRule="auto"/>
+      </w:pPr>
+      <w:r>
+        <w:rPr>
+          <w:rFonts w:ascii="Times New Roman" w:hAnsi="Times New Roman"/>
+          <w:i/>
+          <w:sz w:val="16"/>
+        </w:rPr>
+        <w:t xml:space="preserve">Nota. </w:t>
+      </w:r>
+      <w:r>
+        <w:rPr>
+          <w:rFonts w:ascii="Times New Roman" w:hAnsi="Times New Roman"/>
+          <w:sz w:val="16"/>
+        </w:rPr>
+        <w:t>Elaboração própria com base nos artefatos reproduzíveis da pesquisa.</w:t>
+      </w:r>
+    </w:p>
+    <w:p>
+      <w:pPr>
+        <w:pStyle w:val="Normal"/>
+      </w:pPr>
+      <w:r>
+        <w:t>O limite do procedimento é importante. Reamostrar onze anos não cria um mercado de baixa prolongado que não esteja na série, não produz novas trajetórias de inflação e juros e não transforma desenvolvimento em validação externa. A informação correta é que há estabilidade interna suficiente para continuar o teste prospectivo, não que a superioridade esteja comprovada.</w:t>
+      </w:r>
+    </w:p>
+    <w:p>
+      <w:pPr>
+        <w:pStyle w:val="Heading2"/>
+      </w:pPr>
+      <w:r>
+        <w:t>5.4 CORREÇÃO POR MÚLTIPLAS TENTATIVAS</w:t>
+      </w:r>
+    </w:p>
+    <w:p>
+      <w:pPr>
+        <w:keepNext/>
+        <w:spacing w:after="0"/>
+      </w:pPr>
+      <w:r>
+        <w:rPr>
+          <w:b/>
+        </w:rPr>
+        <w:t>Tabela 5</w:t>
       </w:r>
     </w:p>
     <w:p>
@@ -2811,7 +3632,7 @@
         <w:pStyle w:val="Normal"/>
       </w:pPr>
       <w:r>
-        <w:t>O prêmio de retrospectiva merece leitura cuidadosa, porque é a medida mais informativa do conjunto. Ele diz que escolher a configuração vencedora sabendo o desfecho teria rendido apenas 0,65 ponto percentual a mais por ano do que a escolha aninhada, que não sabia. Em uma versão anterior deste mesmo sistema, com um ano a menos de treino, esse prêmio era de 4,98 pontos, ou seja, a busca estava fazendo boa parte do trabalho. Estender a base de dados para permitir decisões desde 2012 reduziu o prêmio por um fator de sete e elevou a probabilidade do Sharpe deflacionado de 0,957 para 0,986. O ganho relevante da última iteração do artefato não foi retorno. Foi a redução da parcela do retorno atribuível à própria busca.</w:t>
+        <w:t>O prêmio de retrospectiva diz que escolher a política vencedora conhecendo toda a amostra teria rendido 0,65 ponto percentual a mais por ano do que a escolha sequencial. Em uma versão anterior, com um ano a menos de histórico inicial, esse prêmio era de 4,98 pontos. Ampliar a base reduziu a parcela do retorno explicada pela escolha posterior da regra. O Sharpe deflacionado também corrige múltiplas tentativas, mas não resolve a dependência de dados nem a ausência de teste prospectivo. Ele é uma defesa contra uma forma específica de sobreajuste, não um certificado geral de validade.</w:t>
       </w:r>
     </w:p>
     <w:p>
@@ -2819,15 +3640,15 @@
         <w:pStyle w:val="Heading2"/>
       </w:pPr>
       <w:r>
-        <w:t>5.4 O QUE NÃO FUNCIONOU</w:t>
-      </w:r>
-    </w:p>
-    <w:p>
-      <w:pPr>
-        <w:pStyle w:val="Normal"/>
-      </w:pPr>
-      <w:r>
-        <w:t>Quatro hipóteses foram testadas e nenhuma se sustentou. São publicadas com o mesmo destaque do resultado positivo, porque um artefato que só reporta o que deu certo não é auditável.</w:t>
+        <w:t>5.5 O QUE NÃO FUNCIONOU</w:t>
+      </w:r>
+    </w:p>
+    <w:p>
+      <w:pPr>
+        <w:pStyle w:val="Normal"/>
+      </w:pPr>
+      <w:r>
+        <w:t>Cinco hipóteses foram testadas e nenhuma se sustentou de forma suficiente para substituir a política principal. Elas são publicadas porque um artefato que só reporta o que deu certo não é auditável.</w:t>
       </w:r>
     </w:p>
     <w:p>
@@ -2843,7 +3664,7 @@
         <w:pStyle w:val="Normal"/>
       </w:pPr>
       <w:r>
-        <w:t>Realocação mensal e semanal. Aumentamos as observações para responder à objeção de poder estatístico. Foram 118 períodos mensais e 521 períodos semanais, com sete regras de alocação contínua testadas em cada frequência. Nenhuma das sete regras superou o peso estático de forma estatisticamente significante em nenhuma das duas frequências, e uma delas, a de média-variância, foi significativamente pior. O oráculo, que conhece o futuro, teria feito 72,8% ao ano no mensal e 137,1% no semanal, contra 21,1% do estático. O prêmio por acertar o tempo é enorme, e nada que testamos consegue capturá-lo. Rejeitada.</w:t>
+        <w:t>Realocação mensal e semanal. Em 118 períodos mensais e 521 semanais, nenhuma das sete regras contínuas superou de forma significativa o peso estático. A regra de média-variância foi significativamente pior. O prêmio por acertar o tempo existe, mas nenhum sinal testado o capturou.</w:t>
       </w:r>
     </w:p>
     <w:p>
@@ -2863,7 +3684,7 @@
         <w:rPr>
           <w:b/>
         </w:rPr>
-        <w:t>Tabela 5</w:t>
+        <w:t>Tabela 6</w:t>
       </w:r>
     </w:p>
     <w:p>
@@ -3484,15 +4305,7 @@
         <w:pStyle w:val="Normal"/>
       </w:pPr>
       <w:r>
-        <w:t>O mecanismo contraria a intuição corrente, que atribuiria a diferença a custo e imposto. A perda está no retorno bruto, que cai 4,66 pontos de anual para mensal antes de qualquer dedução. O custo de execução sobe apenas 0,08 ponto ao ano, e o imposto modelado até diminui, porque cada revisão mensal realiza uma fatia menor do livro. Ou seja, decidir mais vezes piora a seleção antes de encarecer a operação. O sinal combina qualidade, valor e momento, grandezas que se movem em horizonte anual, e reordenar todo mês troca posições antes que a tese tenha tempo de se realizar.</w:t>
-      </w:r>
-    </w:p>
-    <w:p>
-      <w:pPr>
-        <w:pStyle w:val="Normal"/>
-      </w:pPr>
-      <w:r>
-        <w:t>Registramos uma fraqueza do modelo tributário nessa comparação: ele cobra imposto sobre o ganho do próprio período, e não sobre o ganho acumulado da posição efetivamente vendida, o que subestima a conta do braço mensal. O viés favorece a cadência mais rápida, e ela perdeu mesmo assim, então a conclusão é robusta a essa limitação.</w:t>
+        <w:t>A diferença surgiu antes dos custos: o retorno bruto caiu 4,66 pontos da cadência anual para a mensal. O sinal combina qualidade, valor e momento, grandezas de maturação lenta. O modelo tributário subestima o imposto do braço mensal ao não acompanhar o lote vendido; esse viés favorece a alternativa que mesmo assim não venceu.</w:t>
       </w:r>
     </w:p>
     <w:p>
@@ -3505,18 +4318,26 @@
     </w:p>
     <w:p>
       <w:pPr>
+        <w:pStyle w:val="Normal"/>
+      </w:pPr>
+      <w:r>
+        <w:t>Proteção intranual concebida depois da Covid-19. A extensão chamada Benevente 2 reduz a exposição quando a queda do Ibovespa e a volatilidade ultrapassam limites. No histórico, a queda máxima teria recuado de 47,8% para 28,7%, mas o mecanismo foi criado depois da crise que pretende mitigar. No recorte de 2019 a 2025, a diferença de retorno anualizado foi de apenas 0,09 ponto percentual, com p = 0,964. Das 432 configurações examinadas, somente 9,03% melhoraram ao mesmo tempo retorno e queda. O experimento é mantido como hipótese para um novo registro prospectivo, não como melhoria comprovada nem como resultado principal deste artigo.</w:t>
+      </w:r>
+    </w:p>
+    <w:p>
+      <w:pPr>
         <w:pStyle w:val="Heading2"/>
       </w:pPr>
       <w:r>
-        <w:t>5.5 O EXPERIMENTO COM MODELO DE LINGUAGEM: TRÊS NULOS</w:t>
-      </w:r>
-    </w:p>
-    <w:p>
-      <w:pPr>
-        <w:pStyle w:val="Normal"/>
-      </w:pPr>
-      <w:r>
-        <w:t>O sistema usa um modelo de linguagem em papel deliberadamente restrito. Para verificar se essa restrição custa desempenho, e se o modelo agrega algo, montamos quatro braços sobre 13 anos, com o mesmo universo elegível.</w:t>
+        <w:t>5.6 O EXPERIMENTO COM MODELO DE LINGUAGEM: TRÊS RESULTADOS NULOS</w:t>
+      </w:r>
+    </w:p>
+    <w:p>
+      <w:pPr>
+        <w:pStyle w:val="Normal"/>
+      </w:pPr>
+      <w:r>
+        <w:t>O sistema usa um modelo de linguagem em papel deliberadamente restrito. Para verificar se essa restrição custa desempenho e se o modelo agrega algo, foram comparadas quatro versões sobre 13 anos, com o mesmo universo elegível.</w:t>
       </w:r>
     </w:p>
     <w:p>
@@ -3580,7 +4401,7 @@
         <w:rPr>
           <w:b/>
         </w:rPr>
-        <w:t>Tabela 6</w:t>
+        <w:t>Tabela 7</w:t>
       </w:r>
     </w:p>
     <w:p>
@@ -3926,7 +4747,7 @@
         <w:pStyle w:val="Normal"/>
       </w:pPr>
       <w:r>
-        <w:t>Três nulos, e cada um significa algo diferente.</w:t>
+        <w:t>Os três resultados estatísticos não permitem rejeitar a hipótese de ausência de diferença, e cada um responde a uma pergunta diferente.</w:t>
       </w:r>
     </w:p>
     <w:p>
@@ -3939,7 +4760,7 @@
         </w:numPr>
       </w:pPr>
       <w:r>
-        <w:t>Não há evidência de contaminação temporal. O braço nomeado não lucrou por reconhecer empresas cujo destino o modelo poderia conhecer do treinamento. Essa era a objeção mais séria a qualquer uso de modelo de linguagem em backtest histórico, e ela não se sustentou nesta configuração.</w:t>
+        <w:t>Não houve diferença detectável entre identificar as empresas pelo nome e ocultar sua identidade. A amostra pequena, porém, não prova ausência de contaminação.</w:t>
       </w:r>
     </w:p>
     <w:p>
@@ -3952,7 +4773,7 @@
         </w:numPr>
       </w:pPr>
       <w:r>
-        <w:t>O modelo não agrega retorno. Ele reproduz o ranqueamento determinístico em vez de acrescentar julgamento, com diferença de cinco centésimos de ponto percentual e sinal negativo. Isso é uma constatação desconfortável para o discurso de mercado sobre IA em investimentos, e é exatamente por isso que está publicada.</w:t>
+        <w:t>O modelo não agregou retorno. O braço anonimizado ficou 0,05 ponto percentual abaixo do controle determinístico, com p = 0,989.</w:t>
       </w:r>
     </w:p>
     <w:p>
@@ -3965,7 +4786,7 @@
         </w:numPr>
       </w:pPr>
       <w:r>
-        <w:t>O desacoplamento não custa desempenho. Manter o modelo longe dos pesos não penalizou o resultado, e se algo o braço desacoplado foi melhor. O braço monolítico, que recebeu a caneta, não estourou nenhum teto, o que é uma constatação a favor dele e precisa ser dita. O que ele produziu foram carteiras aritmeticamente inválidas: os pesos não somavam um em 5 dos 13 anos, variando de 0,92 a 1,017, e em 2021 e 2022 omitiu 65 e 83 ativos elegíveis sem sinalizar. O otimizador não se justifica por impedir violação de limite, e sim por devolver uma alocação válida que não precise de conserto depois.</w:t>
+        <w:t>Manter o modelo longe dos pesos não penalizou o resultado. Quando recebeu essa função, ele produziu vetores que não somavam 100% em 5 dos 13 anos e omitiu dezenas de ativos elegíveis sem sinalizar. O otimizador garante uma alocação válida antes da explicação.</w:t>
       </w:r>
     </w:p>
     <w:p>
@@ -3981,7 +4802,7 @@
         <w:pStyle w:val="Heading2"/>
       </w:pPr>
       <w:r>
-        <w:t>5.6 DEFEITOS ENCONTRADOS NA PRÓPRIA AUDITORIA</w:t>
+        <w:t>5.7 DEFEITOS ENCONTRADOS NA PRÓPRIA AUDITORIA</w:t>
       </w:r>
     </w:p>
     <w:p>
@@ -4001,7 +4822,7 @@
         <w:rPr>
           <w:b/>
         </w:rPr>
-        <w:t>Tabela 7</w:t>
+        <w:t>Tabela 8</w:t>
       </w:r>
     </w:p>
     <w:p>
@@ -4619,7 +5440,7 @@
         <w:pStyle w:val="Normal"/>
       </w:pPr>
       <w:r>
-        <w:t>Depois da última correção, o CAGR publicado caiu, a queda máxima subiu de 30,4% para 47,8%, e o número foi publicado assim mesmo. Essa é a evidência de processo que o produto vende: não que o resultado seja bom, mas que ele é o resultado que sobrou depois de procurar defeitos com afinco.</w:t>
+        <w:t>Depois da última correção, o retorno anualizado publicado caiu e a queda máxima subiu de 30,4% para 47,8%. Essa mudança é uma evidência de funcionamento do processo de controle: a auditoria foi capaz de piorar a narrativa quando os dados assim exigiram. Ela não prova que todos os defeitos foram encontrados.</w:t>
       </w:r>
     </w:p>
     <w:p>
@@ -4643,15 +5464,15 @@
         <w:pStyle w:val="Normal"/>
       </w:pPr>
       <w:r>
-        <w:t>O produto foi concebido para escritórios de investimento, consultorias de valores mobiliários, gestores patrimoniais e estruturas de multi-family office. Para a instituição, o Benevente transforma a documentação em consequência do próprio trabalho: a política aplicada, os dados e seus hashes, a elegibilidade, os pesos, as ordens, o custo estimado e a aprovação permanecem ligados à mesma decisão. Para o profissional, isso reduz o tempo gasto reconstruindo uma recomendação. Para o cliente, permite responder tanto por que um papel entrou quanto por que outro ficou de fora.</w:t>
-      </w:r>
-    </w:p>
-    <w:p>
-      <w:pPr>
-        <w:pStyle w:val="Normal"/>
-      </w:pPr>
-      <w:r>
-        <w:t>O benefício comercial não deve ser apresentado como promessa de superar o mercado. A evidência histórica sustenta a utilidade da regra de pesquisa, mas o valor contratável está na consistência do processo, na comparação explícita com alternativas e na capacidade de revisão. O retorno continua sendo medido, acompanhado e discutido, sem se tornar garantia, remuneração vinculada a desempenho ou substituto de suitability.</w:t>
+        <w:t>O produto foi concebido para escritórios de investimento, consultorias de valores mobiliários, gestores patrimoniais e escritórios multifamiliares. Para a instituição, o Benevente transforma a documentação em consequência do próprio trabalho: a política aplicada, os dados e seus hashes, a elegibilidade, os pesos, as ordens, o custo estimado e a aprovação permanecem ligados à mesma decisão. Para o profissional, isso reduz o tempo gasto reconstruindo uma recomendação. Para o cliente, permite responder tanto por que um papel entrou quanto por que outro ficou de fora.</w:t>
+      </w:r>
+    </w:p>
+    <w:p>
+      <w:pPr>
+        <w:pStyle w:val="Normal"/>
+      </w:pPr>
+      <w:r>
+        <w:t>O benefício comercial não deve ser apresentado como promessa de superar o mercado. O valor a testar está na consistência do processo, na comparação explícita com alternativas e na capacidade de revisão. O retorno continua sendo medido, acompanhado e discutido, sem se tornar garantia ou substituto da adequação ao perfil do cliente.</w:t>
       </w:r>
     </w:p>
     <w:p>
@@ -4691,15 +5512,653 @@
         <w:pStyle w:val="Normal"/>
       </w:pPr>
       <w:r>
-        <w:t>A oferta a validar é uma licença institucional, combinada a um serviço de implantação. O preço ainda não foi testado. O piloto deve medir tempo para produzir o dossiê, proporção de decisões com evidência completa, número de revisões até a aprovação, diferença entre custo estimado e executado e disposição a pagar. A relevância para o Espírito Santo também precisa ser observada, e não presumida: entrevistas e pilotos devem verificar se a ferramenta ajuda escritórios locais a manter no estado uma parcela maior do trabalho analítico e do relacionamento com famílias e empresas.</w:t>
-      </w:r>
-    </w:p>
-    <w:p>
-      <w:pPr>
-        <w:pStyle w:val="Normal"/>
-      </w:pPr>
-      <w:r>
-        <w:t>O produto permanece em estágio de pesquisa reprodutível. A janela de 2015 a 2025 foi usada no desenvolvimento e descreve a amostra, não o futuro. A avaliação prospectiva começa no registro congelado, cujo hash foi versionado e recebeu data carimbada por terceiro. Essa separação entre evidência histórica e acompanhamento futuro é parte do produto, não apenas uma ressalva acadêmica.</w:t>
+        <w:t>A oferta a validar é uma licença institucional combinada a um serviço de implantação. O preço, a disposição a pagar e o problema percebido ainda não foram testados com uma amostra de clientes. O piloto deve medir o tempo de produção do dossiê, a proporção de decisões com evidência completa, o número de revisões até a aprovação, a diferença entre custo estimado e executado e a disposição a pagar. Um piloto no Espírito Santo pode atender ao recorte de aplicação do congresso, mas não deve começar com a premissa de que o produto reterá capital ou gerará negócios no estado. Esse possível efeito exigiria outra pesquisa, com indicadores econômicos próprios.</w:t>
+      </w:r>
+    </w:p>
+    <w:p>
+      <w:pPr>
+        <w:pStyle w:val="Normal"/>
+      </w:pPr>
+      <w:r>
+        <w:t>O produto permanece em estágio de protótipo reprodutível. A janela de 2015 a 2025 foi usada no desenvolvimento e descreve a amostra, não o futuro. A avaliação prospectiva começa no registro congelado, cujo hash foi versionado e recebeu data carimbada por terceiro. Essa separação entre diagnóstico e acompanhamento futuro é parte do produto, não apenas uma ressalva acadêmica.</w:t>
+      </w:r>
+    </w:p>
+    <w:p>
+      <w:pPr>
+        <w:pStyle w:val="Heading2"/>
+      </w:pPr>
+      <w:r>
+        <w:t>6.4 MATRIZ DE EVIDÊNCIAS</w:t>
+      </w:r>
+    </w:p>
+    <w:p>
+      <w:pPr>
+        <w:pStyle w:val="Normal"/>
+      </w:pPr>
+      <w:r>
+        <w:t>A Tabela 9 delimita o que pode ser afirmado na data da submissão. Ela também serve como contrato de comunicação para a demonstração do produto.</w:t>
+      </w:r>
+    </w:p>
+    <w:p>
+      <w:pPr>
+        <w:keepNext/>
+        <w:spacing w:after="0"/>
+      </w:pPr>
+      <w:r>
+        <w:rPr>
+          <w:b/>
+        </w:rPr>
+        <w:t>Tabela 9</w:t>
+      </w:r>
+    </w:p>
+    <w:p>
+      <w:pPr>
+        <w:keepNext/>
+        <w:spacing w:after="80"/>
+      </w:pPr>
+      <w:r>
+        <w:rPr>
+          <w:i/>
+        </w:rPr>
+        <w:t>Matriz de afirmações, evidências e situação</w:t>
+      </w:r>
+    </w:p>
+    <w:tbl>
+      <w:tblPr>
+        <w:tblW w:type="dxa" w:w="9060"/>
+        <w:jc w:val="center"/>
+        <w:tblLayout w:type="fixed"/>
+        <w:tblLook w:firstColumn="1" w:firstRow="1" w:lastColumn="0" w:lastRow="0" w:noHBand="0" w:noVBand="1" w:val="04A0"/>
+        <w:tblBorders>
+          <w:left w:val="nil"/>
+          <w:right w:val="nil"/>
+          <w:insideH w:val="nil"/>
+          <w:insideV w:val="nil"/>
+          <w:top w:val="single" w:sz="8" w:color="000000"/>
+          <w:bottom w:val="single" w:sz="8" w:color="000000"/>
+        </w:tblBorders>
+      </w:tblPr>
+      <w:tblGrid>
+        <w:gridCol w:w="3143"/>
+        <w:gridCol w:w="3143"/>
+        <w:gridCol w:w="2774"/>
+      </w:tblGrid>
+      <w:tr>
+        <w:trPr>
+          <w:cantSplit/>
+          <w:tblHeader w:val="true"/>
+        </w:trPr>
+        <w:tc>
+          <w:tcPr>
+            <w:tcW w:type="dxa" w:w="3143"/>
+            <w:vAlign w:val="center"/>
+            <w:tcBorders>
+              <w:bottom w:val="single" w:sz="8" w:color="000000"/>
+            </w:tcBorders>
+          </w:tcPr>
+          <w:p>
+            <w:pPr>
+              <w:keepNext/>
+              <w:spacing w:line="240" w:lineRule="auto" w:after="0"/>
+              <w:ind w:firstLine="0"/>
+              <w:jc w:val="left"/>
+            </w:pPr>
+            <w:r>
+              <w:rPr>
+                <w:rFonts w:ascii="Times New Roman" w:hAnsi="Times New Roman"/>
+                <w:b/>
+                <w:sz w:val="17"/>
+              </w:rPr>
+              <w:t>Afirmação</w:t>
+            </w:r>
+          </w:p>
+        </w:tc>
+        <w:tc>
+          <w:tcPr>
+            <w:tcW w:type="dxa" w:w="3143"/>
+            <w:vAlign w:val="center"/>
+            <w:tcBorders>
+              <w:bottom w:val="single" w:sz="8" w:color="000000"/>
+            </w:tcBorders>
+          </w:tcPr>
+          <w:p>
+            <w:pPr>
+              <w:keepNext/>
+              <w:spacing w:line="240" w:lineRule="auto" w:after="0"/>
+              <w:ind w:firstLine="0"/>
+              <w:jc w:val="left"/>
+            </w:pPr>
+            <w:r>
+              <w:rPr>
+                <w:rFonts w:ascii="Times New Roman" w:hAnsi="Times New Roman"/>
+                <w:b/>
+                <w:sz w:val="17"/>
+              </w:rPr>
+              <w:t>Evidência disponível</w:t>
+            </w:r>
+          </w:p>
+        </w:tc>
+        <w:tc>
+          <w:tcPr>
+            <w:tcW w:type="dxa" w:w="2774"/>
+            <w:vAlign w:val="center"/>
+            <w:tcBorders>
+              <w:bottom w:val="single" w:sz="8" w:color="000000"/>
+            </w:tcBorders>
+          </w:tcPr>
+          <w:p>
+            <w:pPr>
+              <w:keepNext/>
+              <w:spacing w:line="240" w:lineRule="auto" w:after="0"/>
+              <w:ind w:firstLine="0"/>
+              <w:jc w:val="left"/>
+            </w:pPr>
+            <w:r>
+              <w:rPr>
+                <w:rFonts w:ascii="Times New Roman" w:hAnsi="Times New Roman"/>
+                <w:b/>
+                <w:sz w:val="17"/>
+              </w:rPr>
+              <w:t>Situação</w:t>
+            </w:r>
+          </w:p>
+        </w:tc>
+      </w:tr>
+      <w:tr>
+        <w:trPr>
+          <w:cantSplit/>
+        </w:trPr>
+        <w:tc>
+          <w:tcPr>
+            <w:tcW w:type="dxa" w:w="3143"/>
+            <w:vAlign w:val="center"/>
+          </w:tcPr>
+          <w:p>
+            <w:pPr>
+              <w:keepNext/>
+              <w:spacing w:line="240" w:lineRule="auto" w:after="0"/>
+              <w:ind w:firstLine="0"/>
+              <w:jc w:val="left"/>
+            </w:pPr>
+            <w:r>
+              <w:rPr>
+                <w:rFonts w:ascii="Times New Roman" w:hAnsi="Times New Roman"/>
+                <w:sz w:val="17"/>
+              </w:rPr>
+              <w:t>O artefato preserva dados, regra, pesos e aprovação</w:t>
+            </w:r>
+          </w:p>
+        </w:tc>
+        <w:tc>
+          <w:tcPr>
+            <w:tcW w:type="dxa" w:w="3143"/>
+            <w:vAlign w:val="center"/>
+          </w:tcPr>
+          <w:p>
+            <w:pPr>
+              <w:keepNext/>
+              <w:spacing w:line="240" w:lineRule="auto" w:after="0"/>
+              <w:ind w:firstLine="0"/>
+              <w:jc w:val="left"/>
+            </w:pPr>
+            <w:r>
+              <w:rPr>
+                <w:rFonts w:ascii="Times New Roman" w:hAnsi="Times New Roman"/>
+                <w:sz w:val="17"/>
+              </w:rPr>
+              <w:t>Testes funcionais, hashes e dossiês reproduzíveis</w:t>
+            </w:r>
+          </w:p>
+        </w:tc>
+        <w:tc>
+          <w:tcPr>
+            <w:tcW w:type="dxa" w:w="2774"/>
+            <w:vAlign w:val="center"/>
+          </w:tcPr>
+          <w:p>
+            <w:pPr>
+              <w:keepNext/>
+              <w:spacing w:line="240" w:lineRule="auto" w:after="0"/>
+              <w:ind w:firstLine="0"/>
+              <w:jc w:val="left"/>
+            </w:pPr>
+            <w:r>
+              <w:rPr>
+                <w:rFonts w:ascii="Times New Roman" w:hAnsi="Times New Roman"/>
+                <w:sz w:val="17"/>
+              </w:rPr>
+              <w:t>Demonstrada no protótipo</w:t>
+            </w:r>
+          </w:p>
+        </w:tc>
+      </w:tr>
+      <w:tr>
+        <w:trPr>
+          <w:cantSplit/>
+        </w:trPr>
+        <w:tc>
+          <w:tcPr>
+            <w:tcW w:type="dxa" w:w="3143"/>
+            <w:vAlign w:val="center"/>
+          </w:tcPr>
+          <w:p>
+            <w:pPr>
+              <w:keepNext/>
+              <w:spacing w:line="240" w:lineRule="auto" w:after="0"/>
+              <w:ind w:firstLine="0"/>
+              <w:jc w:val="left"/>
+            </w:pPr>
+            <w:r>
+              <w:rPr>
+                <w:rFonts w:ascii="Times New Roman" w:hAnsi="Times New Roman"/>
+                <w:sz w:val="17"/>
+              </w:rPr>
+              <w:t>A auditoria encontra erros que alteram métricas</w:t>
+            </w:r>
+          </w:p>
+        </w:tc>
+        <w:tc>
+          <w:tcPr>
+            <w:tcW w:type="dxa" w:w="3143"/>
+            <w:vAlign w:val="center"/>
+          </w:tcPr>
+          <w:p>
+            <w:pPr>
+              <w:keepNext/>
+              <w:spacing w:line="240" w:lineRule="auto" w:after="0"/>
+              <w:ind w:firstLine="0"/>
+              <w:jc w:val="left"/>
+            </w:pPr>
+            <w:r>
+              <w:rPr>
+                <w:rFonts w:ascii="Times New Roman" w:hAnsi="Times New Roman"/>
+                <w:sz w:val="17"/>
+              </w:rPr>
+              <w:t>Sete defeitos reproduzidos e corrigidos</w:t>
+            </w:r>
+          </w:p>
+        </w:tc>
+        <w:tc>
+          <w:tcPr>
+            <w:tcW w:type="dxa" w:w="2774"/>
+            <w:vAlign w:val="center"/>
+          </w:tcPr>
+          <w:p>
+            <w:pPr>
+              <w:keepNext/>
+              <w:spacing w:line="240" w:lineRule="auto" w:after="0"/>
+              <w:ind w:firstLine="0"/>
+              <w:jc w:val="left"/>
+            </w:pPr>
+            <w:r>
+              <w:rPr>
+                <w:rFonts w:ascii="Times New Roman" w:hAnsi="Times New Roman"/>
+                <w:sz w:val="17"/>
+              </w:rPr>
+              <w:t>Demonstrada no desenvolvimento</w:t>
+            </w:r>
+          </w:p>
+        </w:tc>
+      </w:tr>
+      <w:tr>
+        <w:trPr>
+          <w:cantSplit/>
+        </w:trPr>
+        <w:tc>
+          <w:tcPr>
+            <w:tcW w:type="dxa" w:w="3143"/>
+            <w:vAlign w:val="center"/>
+          </w:tcPr>
+          <w:p>
+            <w:pPr>
+              <w:keepNext/>
+              <w:spacing w:line="240" w:lineRule="auto" w:after="0"/>
+              <w:ind w:firstLine="0"/>
+              <w:jc w:val="left"/>
+            </w:pPr>
+            <w:r>
+              <w:rPr>
+                <w:rFonts w:ascii="Times New Roman" w:hAnsi="Times New Roman"/>
+                <w:sz w:val="17"/>
+              </w:rPr>
+              <w:t>A regra superou comparadores entre 2015 e 2025</w:t>
+            </w:r>
+          </w:p>
+        </w:tc>
+        <w:tc>
+          <w:tcPr>
+            <w:tcW w:type="dxa" w:w="3143"/>
+            <w:vAlign w:val="center"/>
+          </w:tcPr>
+          <w:p>
+            <w:pPr>
+              <w:keepNext/>
+              <w:spacing w:line="240" w:lineRule="auto" w:after="0"/>
+              <w:ind w:firstLine="0"/>
+              <w:jc w:val="left"/>
+            </w:pPr>
+            <w:r>
+              <w:rPr>
+                <w:rFonts w:ascii="Times New Roman" w:hAnsi="Times New Roman"/>
+                <w:sz w:val="17"/>
+              </w:rPr>
+              <w:t>Diagnóstico sequencial e reamostragem interna</w:t>
+            </w:r>
+          </w:p>
+        </w:tc>
+        <w:tc>
+          <w:tcPr>
+            <w:tcW w:type="dxa" w:w="2774"/>
+            <w:vAlign w:val="center"/>
+          </w:tcPr>
+          <w:p>
+            <w:pPr>
+              <w:keepNext/>
+              <w:spacing w:line="240" w:lineRule="auto" w:after="0"/>
+              <w:ind w:firstLine="0"/>
+              <w:jc w:val="left"/>
+            </w:pPr>
+            <w:r>
+              <w:rPr>
+                <w:rFonts w:ascii="Times New Roman" w:hAnsi="Times New Roman"/>
+                <w:sz w:val="17"/>
+              </w:rPr>
+              <w:t>Observada, não prospectiva</w:t>
+            </w:r>
+          </w:p>
+        </w:tc>
+      </w:tr>
+      <w:tr>
+        <w:trPr>
+          <w:cantSplit/>
+        </w:trPr>
+        <w:tc>
+          <w:tcPr>
+            <w:tcW w:type="dxa" w:w="3143"/>
+            <w:vAlign w:val="center"/>
+          </w:tcPr>
+          <w:p>
+            <w:pPr>
+              <w:keepNext/>
+              <w:spacing w:line="240" w:lineRule="auto" w:after="0"/>
+              <w:ind w:firstLine="0"/>
+              <w:jc w:val="left"/>
+            </w:pPr>
+            <w:r>
+              <w:rPr>
+                <w:rFonts w:ascii="Times New Roman" w:hAnsi="Times New Roman"/>
+                <w:sz w:val="17"/>
+              </w:rPr>
+              <w:t>A série histórica tem qualidade institucional</w:t>
+            </w:r>
+          </w:p>
+        </w:tc>
+        <w:tc>
+          <w:tcPr>
+            <w:tcW w:type="dxa" w:w="3143"/>
+            <w:vAlign w:val="center"/>
+          </w:tcPr>
+          <w:p>
+            <w:pPr>
+              <w:keepNext/>
+              <w:spacing w:line="240" w:lineRule="auto" w:after="0"/>
+              <w:ind w:firstLine="0"/>
+              <w:jc w:val="left"/>
+            </w:pPr>
+            <w:r>
+              <w:rPr>
+                <w:rFonts w:ascii="Times New Roman" w:hAnsi="Times New Roman"/>
+                <w:sz w:val="17"/>
+              </w:rPr>
+              <w:t>13,9% da exposição a ações dependeu de imputação</w:t>
+            </w:r>
+          </w:p>
+        </w:tc>
+        <w:tc>
+          <w:tcPr>
+            <w:tcW w:type="dxa" w:w="2774"/>
+            <w:vAlign w:val="center"/>
+          </w:tcPr>
+          <w:p>
+            <w:pPr>
+              <w:keepNext/>
+              <w:spacing w:line="240" w:lineRule="auto" w:after="0"/>
+              <w:ind w:firstLine="0"/>
+              <w:jc w:val="left"/>
+            </w:pPr>
+            <w:r>
+              <w:rPr>
+                <w:rFonts w:ascii="Times New Roman" w:hAnsi="Times New Roman"/>
+                <w:sz w:val="17"/>
+              </w:rPr>
+              <w:t>Não demonstrada</w:t>
+            </w:r>
+          </w:p>
+        </w:tc>
+      </w:tr>
+      <w:tr>
+        <w:trPr>
+          <w:cantSplit/>
+        </w:trPr>
+        <w:tc>
+          <w:tcPr>
+            <w:tcW w:type="dxa" w:w="3143"/>
+            <w:vAlign w:val="center"/>
+          </w:tcPr>
+          <w:p>
+            <w:pPr>
+              <w:keepNext/>
+              <w:spacing w:line="240" w:lineRule="auto" w:after="0"/>
+              <w:ind w:firstLine="0"/>
+              <w:jc w:val="left"/>
+            </w:pPr>
+            <w:r>
+              <w:rPr>
+                <w:rFonts w:ascii="Times New Roman" w:hAnsi="Times New Roman"/>
+                <w:sz w:val="17"/>
+              </w:rPr>
+              <w:t>O modelo de linguagem gera retorno adicional</w:t>
+            </w:r>
+          </w:p>
+        </w:tc>
+        <w:tc>
+          <w:tcPr>
+            <w:tcW w:type="dxa" w:w="3143"/>
+            <w:vAlign w:val="center"/>
+          </w:tcPr>
+          <w:p>
+            <w:pPr>
+              <w:keepNext/>
+              <w:spacing w:line="240" w:lineRule="auto" w:after="0"/>
+              <w:ind w:firstLine="0"/>
+              <w:jc w:val="left"/>
+            </w:pPr>
+            <w:r>
+              <w:rPr>
+                <w:rFonts w:ascii="Times New Roman" w:hAnsi="Times New Roman"/>
+                <w:sz w:val="17"/>
+              </w:rPr>
+              <w:t>Diferença de −0,05 p.p. e p = 0,989</w:t>
+            </w:r>
+          </w:p>
+        </w:tc>
+        <w:tc>
+          <w:tcPr>
+            <w:tcW w:type="dxa" w:w="2774"/>
+            <w:vAlign w:val="center"/>
+          </w:tcPr>
+          <w:p>
+            <w:pPr>
+              <w:keepNext/>
+              <w:spacing w:line="240" w:lineRule="auto" w:after="0"/>
+              <w:ind w:firstLine="0"/>
+              <w:jc w:val="left"/>
+            </w:pPr>
+            <w:r>
+              <w:rPr>
+                <w:rFonts w:ascii="Times New Roman" w:hAnsi="Times New Roman"/>
+                <w:sz w:val="17"/>
+              </w:rPr>
+              <w:t>Não demonstrada</w:t>
+            </w:r>
+          </w:p>
+        </w:tc>
+      </w:tr>
+      <w:tr>
+        <w:trPr>
+          <w:cantSplit/>
+        </w:trPr>
+        <w:tc>
+          <w:tcPr>
+            <w:tcW w:type="dxa" w:w="3143"/>
+            <w:vAlign w:val="center"/>
+          </w:tcPr>
+          <w:p>
+            <w:pPr>
+              <w:keepNext/>
+              <w:spacing w:line="240" w:lineRule="auto" w:after="0"/>
+              <w:ind w:firstLine="0"/>
+              <w:jc w:val="left"/>
+            </w:pPr>
+            <w:r>
+              <w:rPr>
+                <w:rFonts w:ascii="Times New Roman" w:hAnsi="Times New Roman"/>
+                <w:sz w:val="17"/>
+              </w:rPr>
+              <w:t>Há demanda e disposição a pagar</w:t>
+            </w:r>
+          </w:p>
+        </w:tc>
+        <w:tc>
+          <w:tcPr>
+            <w:tcW w:type="dxa" w:w="3143"/>
+            <w:vAlign w:val="center"/>
+          </w:tcPr>
+          <w:p>
+            <w:pPr>
+              <w:keepNext/>
+              <w:spacing w:line="240" w:lineRule="auto" w:after="0"/>
+              <w:ind w:firstLine="0"/>
+              <w:jc w:val="left"/>
+            </w:pPr>
+            <w:r>
+              <w:rPr>
+                <w:rFonts w:ascii="Times New Roman" w:hAnsi="Times New Roman"/>
+                <w:sz w:val="17"/>
+              </w:rPr>
+              <w:t>Piloto ainda não executado</w:t>
+            </w:r>
+          </w:p>
+        </w:tc>
+        <w:tc>
+          <w:tcPr>
+            <w:tcW w:type="dxa" w:w="2774"/>
+            <w:vAlign w:val="center"/>
+          </w:tcPr>
+          <w:p>
+            <w:pPr>
+              <w:keepNext/>
+              <w:spacing w:line="240" w:lineRule="auto" w:after="0"/>
+              <w:ind w:firstLine="0"/>
+              <w:jc w:val="left"/>
+            </w:pPr>
+            <w:r>
+              <w:rPr>
+                <w:rFonts w:ascii="Times New Roman" w:hAnsi="Times New Roman"/>
+                <w:sz w:val="17"/>
+              </w:rPr>
+              <w:t>Não demonstrada</w:t>
+            </w:r>
+          </w:p>
+        </w:tc>
+      </w:tr>
+      <w:tr>
+        <w:trPr>
+          <w:cantSplit/>
+        </w:trPr>
+        <w:tc>
+          <w:tcPr>
+            <w:tcW w:type="dxa" w:w="3143"/>
+            <w:vAlign w:val="center"/>
+          </w:tcPr>
+          <w:p>
+            <w:pPr>
+              <w:keepNext w:val="0"/>
+              <w:spacing w:line="240" w:lineRule="auto" w:after="0"/>
+              <w:ind w:firstLine="0"/>
+              <w:jc w:val="left"/>
+            </w:pPr>
+            <w:r>
+              <w:rPr>
+                <w:rFonts w:ascii="Times New Roman" w:hAnsi="Times New Roman"/>
+                <w:sz w:val="17"/>
+              </w:rPr>
+              <w:t>A regra funciona em dados futuros</w:t>
+            </w:r>
+          </w:p>
+        </w:tc>
+        <w:tc>
+          <w:tcPr>
+            <w:tcW w:type="dxa" w:w="3143"/>
+            <w:vAlign w:val="center"/>
+          </w:tcPr>
+          <w:p>
+            <w:pPr>
+              <w:keepNext w:val="0"/>
+              <w:spacing w:line="240" w:lineRule="auto" w:after="0"/>
+              <w:ind w:firstLine="0"/>
+              <w:jc w:val="left"/>
+            </w:pPr>
+            <w:r>
+              <w:rPr>
+                <w:rFonts w:ascii="Times New Roman" w:hAnsi="Times New Roman"/>
+                <w:sz w:val="17"/>
+              </w:rPr>
+              <w:t>Registro de 16/08/2026, mínimo de três anos</w:t>
+            </w:r>
+          </w:p>
+        </w:tc>
+        <w:tc>
+          <w:tcPr>
+            <w:tcW w:type="dxa" w:w="2774"/>
+            <w:vAlign w:val="center"/>
+          </w:tcPr>
+          <w:p>
+            <w:pPr>
+              <w:keepNext w:val="0"/>
+              <w:spacing w:line="240" w:lineRule="auto" w:after="0"/>
+              <w:ind w:firstLine="0"/>
+              <w:jc w:val="left"/>
+            </w:pPr>
+            <w:r>
+              <w:rPr>
+                <w:rFonts w:ascii="Times New Roman" w:hAnsi="Times New Roman"/>
+                <w:sz w:val="17"/>
+              </w:rPr>
+              <w:t>Em acompanhamento</w:t>
+            </w:r>
+          </w:p>
+        </w:tc>
+      </w:tr>
+    </w:tbl>
+    <w:p>
+      <w:pPr>
+        <w:spacing w:before="60" w:after="160" w:line="240" w:lineRule="auto"/>
+      </w:pPr>
+      <w:r>
+        <w:rPr>
+          <w:rFonts w:ascii="Times New Roman" w:hAnsi="Times New Roman"/>
+          <w:i/>
+          <w:sz w:val="16"/>
+        </w:rPr>
+        <w:t xml:space="preserve">Nota. </w:t>
+      </w:r>
+      <w:r>
+        <w:rPr>
+          <w:rFonts w:ascii="Times New Roman" w:hAnsi="Times New Roman"/>
+          <w:sz w:val="16"/>
+        </w:rPr>
+        <w:t>Elaboração própria com base nos artefatos reproduzíveis da pesquisa.</w:t>
       </w:r>
     </w:p>
     <w:p>
@@ -4723,23 +6182,23 @@
         <w:pStyle w:val="Normal"/>
       </w:pPr>
       <w:r>
-        <w:t>A primeira limitação é temporal. Onze decisões anuais são poucas, e a janela avaliada também serviu ao desenvolvimento. O prêmio de retrospectiva de 0,65 ponto percentual reduz a preocupação com escolha posterior da regra, mas não equivale a validação prospectiva. A probabilidade do Sharpe deflacionado corrige múltiplas tentativas; ela não cria observações que a história não oferece.</w:t>
-      </w:r>
-    </w:p>
-    <w:p>
-      <w:pPr>
-        <w:pStyle w:val="Normal"/>
-      </w:pPr>
-      <w:r>
-        <w:t>A segunda limitação está nos dados. O detector de eventos societários tem precisão de 88,1%, mas recall de 23,3%. Ele prefere deixar de ajustar a produzir um ajuste incorreto. Papéis sem cobertura integral recebem, em casos identificados no relatório, uma distribuição imputada a partir da mediana transversal do ano. Antes de qualquer uso comercial do desempenho, proventos, juros sobre capital próprio e eventos de papéis deslistados precisam ser reconciliados com registros primários da B3 ou da CVM.</w:t>
-      </w:r>
-    </w:p>
-    <w:p>
-      <w:pPr>
-        <w:pStyle w:val="Normal"/>
-      </w:pPr>
-      <w:r>
-        <w:t>A terceira é econômica. A queda máxima diária do Benevente 1 chegou a 47,8%, nível incompatível com um perfil conservador. O Benevente 2 reduziu essa queda, mas foi concebido depois da Covid-19, ainda não teve imposto intranual conciliado e não demonstrou retorno adicional. Ele deve ser tratado como experimento de controle de risco, não como substituto validado da carteira publicada.</w:t>
+        <w:t>A primeira limitação é temporal. Onze decisões anuais são poucas, e a janela avaliada também serviu ao desenvolvimento. O prêmio de retrospectiva de 0,65 ponto percentual e o Sharpe deflacionado tratam parte do risco de múltiplas tentativas, mas não equivalem a validação prospectiva. A reamostragem também não cria regimes que a história não contém.</w:t>
+      </w:r>
+    </w:p>
+    <w:p>
+      <w:pPr>
+        <w:pStyle w:val="Normal"/>
+      </w:pPr>
+      <w:r>
+        <w:t>A segunda limitação está nos dados. O detector de eventos societários confirmou somente 23,3% dos eventos conhecidos. Papéis sem cobertura integral recebem, em casos identificados, uma distribuição imputada pela mediana transversal do ano. Essa fragilidade atingiu 13,9% da exposição acumulada a ações e 50% da carteira total em 2020. Antes de qualquer uso comercial do desempenho, proventos, juros sobre capital próprio e eventos de papéis deslistados precisam ser reconciliados com registros primários da B3, dos emissores ou de depositária autorizada.</w:t>
+      </w:r>
+    </w:p>
+    <w:p>
+      <w:pPr>
+        <w:pStyle w:val="Normal"/>
+      </w:pPr>
+      <w:r>
+        <w:t>A terceira é econômica. A queda máxima diária chegou a 47,8%, nível incompatível com um perfil conservador e ligeiramente pior que os 47,0% do Ibovespa. O protótipo não demonstrou proteção de capital. A extensão de controle de risco concebida depois da Covid-19 é retrospectiva, não tem imposto intranual conciliado e não demonstrou retorno adicional.</w:t>
       </w:r>
     </w:p>
     <w:p>
@@ -4763,7 +6222,7 @@
         <w:pStyle w:val="Normal"/>
       </w:pPr>
       <w:r>
-        <w:t>O passo científico prioritário é acumular decisões depois do registro congelado. Em paralelo, a pesquisa deve reconciliar eventos e proventos, incorporar imposto por lote vendido ao Benevente 2 e repetir o teste de contaminação com modelos cujas datas de treinamento sejam conhecidas. Um estudo com notícias deve ser pré-registrado como braço separado, com frequência trimestral ou orientada a eventos, sem reotimizar a regra anual depois de observar o resultado. O passo de produto é um piloto silencioso em escritório capixaba, sem execução automática, capaz de medir tempo, completude documental, divergência de custos e aceitação do usuário.</w:t>
+        <w:t>O passo científico prioritário é acumular decisões depois do registro congelado. Em paralelo, a pesquisa deve substituir imputações por reconciliação de eventos e proventos em fonte primária. Testes futuros devem incluir blocos temporais, trajetórias sintéticas com dependência serial e cenários de baixa prolongada. Simulação não substitui observação futura, mas pode revelar fragilidade a sequências que a amostra curta não contém. Um estudo com notícias deve ser registrado como braço separado, com frequência trimestral ou orientada a eventos e horário verificável. O passo de produto é um piloto silencioso, sem execução automática, capaz de medir tempo, completude documental, divergência de custos, compreensão do usuário e disposição a pagar.</w:t>
       </w:r>
     </w:p>
     <w:p>
@@ -4779,23 +6238,23 @@
         <w:pStyle w:val="Normal"/>
       </w:pPr>
       <w:r>
-        <w:t>O Benevente Wealth System foi construído para resolver uma falha operacional específica: carteiras são propostas em um momento e justificadas em outro, mas os dados, a regra e a aprovação raramente permanecem unidos. O artefato mostrou que é possível produzir a alocação e a evidência da decisão no mesmo fluxo, com universo reconstruído da B3, fundamentos admitidos pela data de recebimento, regra quantitativa separada da explicação em linguagem natural, custos, imposto e comparadores independentes.</w:t>
-      </w:r>
-    </w:p>
-    <w:p>
-      <w:pPr>
-        <w:pStyle w:val="Normal"/>
-      </w:pPr>
-      <w:r>
-        <w:t>Na amostra de 2015 a 2025, o Benevente 1 superou CDI, Ibovespa e MVO de referência em retorno anualizado, ainda que com queda máxima elevada. O Benevente 2 protegeu melhor o capital na crise observada, sem comprovar retorno adicional. Os testes negativos são igualmente informativos: a frequência anual não perdeu para reseleções mais rápidas, o modelo de linguagem não acrescentou retorno e a alocação direta por texto produziu carteiras aritmeticamente inconsistentes em parte dos anos. Esses resultados justificam um sistema em que a matemática decide a alocação, a linguagem ajuda a compreendê-la e uma pessoa conserva a responsabilidade final.</w:t>
-      </w:r>
-    </w:p>
-    <w:p>
-      <w:pPr>
-        <w:pStyle w:val="Normal"/>
-      </w:pPr>
-      <w:r>
-        <w:t>A recomendação prática é testar o produto como infraestrutura de decisão e governança, não como promessa de rentabilidade. Seu mérito competitivo será confirmado se um piloto reduzir o esforço de documentação, aumentar a completude da evidência e permitir que o escritório defenda suas escolhas com clareza. Até que resultados prospectivos se acumulem, o desempenho histórico deve permanecer como evidência de pesquisa, acompanhado das limitações que o próprio sistema foi desenhado para registrar.</w:t>
+        <w:t>O Benevente Wealth System foi construído para resolver uma falha operacional específica: carteiras são propostas em um momento e justificadas em outro, enquanto os dados, a regra e a aprovação podem se separar. O protótipo mostrou que é possível produzir a alocação e a evidência da decisão no mesmo fluxo, com fundamentos admitidos pela data de recebimento, regra quantitativa separada da explicação em linguagem natural, custos, imposto e comparadores independentes.</w:t>
+      </w:r>
+    </w:p>
+    <w:p>
+      <w:pPr>
+        <w:pStyle w:val="Normal"/>
+      </w:pPr>
+      <w:r>
+        <w:t>No diagnóstico de 2015 a 2025, a carteira apresentou retorno anualizado superior aos comparadores e queda máxima semelhante à do mercado. A incerteza da amostra e a dependência parcial de séries imputadas impedem tratar essa diferença como superioridade comprovada. Os testes negativos são informativos: a frequência anual não perdeu para reseleções mais rápidas, o modelo de linguagem não acrescentou retorno e a alocação direta por texto produziu carteiras aritmeticamente inconsistentes em parte dos anos. Esses achados justificam um sistema em que a matemática calcula a alocação, a linguagem ajuda a compreendê-la e uma pessoa conserva a responsabilidade final.</w:t>
+      </w:r>
+    </w:p>
+    <w:p>
+      <w:pPr>
+        <w:pStyle w:val="Normal"/>
+      </w:pPr>
+      <w:r>
+        <w:t>A conclusão comprovada é mais estreita e mais defensável que a versão anterior do artigo: o artefato cria uma cadeia auditável e usa essa cadeia para descobrir erros que mudam o próprio resultado. A viabilidade comercial será confirmada somente se um piloto mostrar ganho de tempo, completude documental, compreensão e disposição a pagar. A validade financeira exigirá reconciliação primária e dados posteriores ao registro de agosto de 2026. Até lá, o desempenho histórico permanece diagnóstico de desenvolvimento.</w:t>
       </w:r>
     </w:p>
     <w:p>

</xml_diff>

<commit_message>
Add primary event audit and profile risk validation
</commit_message>
<xml_diff>
--- a/outputs/Benevente_Wealth_System_BTECH_Final.docx
+++ b/outputs/Benevente_Wealth_System_BTECH_Final.docx
@@ -879,7 +879,7 @@
         <w:pStyle w:val="Normal"/>
       </w:pPr>
       <w:r>
-        <w:t>Preços deslistados exigem tratamento de eventos societários sem a ajuda do provedor, que já não serve esses papéis. O protótipo detecta desdobramentos, grupamentos e bonificações grandes a partir de razões de preço redondas e persistentes no arquivo da bolsa. Na comparação com o arquivo de eventos de um provedor, 340 de 386 ajustes aplicados coincidiram com evento confirmado, precisão de 88,1%, mas somente 103 de 443 eventos conhecidos foram detectados, cobertura de 23,3%. Esse resultado não é suficiente para qualificar a série reconstruída como fonte institucional de retorno total. O arquivo da B3 continua útil para preservar empresas deslistadas e preços observados, mas eventos e proventos dessas séries precisam ser reconciliados em fonte primária antes que o desempenho histórico sustente alegação comercial.</w:t>
+        <w:t>Preços deslistados exigem tratamento de eventos societários sem a ajuda do provedor. A primeira versão detectava razões de preço redondas e obteve precisão de 88,1%, mas recall de apenas 23,3% contra o arquivo de eventos disponível. Para retirar essa heurística da posição de fonte principal, uma nova rotina consultou diretamente os registros públicos da B3 e arquivou 18.190 dividendos, juros sobre capital próprio, desdobramentos, grupamentos, bonificações e eventos manuais. A consulta cobriu 475 de 497 ativos do painel. Vinte e dois códigos não foram devolvidos pela página atual e 271 eventos, entre eles 218 subscrições, ainda exigem resolução de direitos e conversões. A série publicada não foi requalificada: ela continua como dado de pesquisa até ser reconstruída desde o preço bruto, com cobertura integral e cada evento aplicado em relatório próprio.</w:t>
       </w:r>
     </w:p>
     <w:p>
@@ -4321,7 +4321,7 @@
         <w:pStyle w:val="Normal"/>
       </w:pPr>
       <w:r>
-        <w:t>Proteção intranual concebida depois da Covid-19. A extensão chamada Benevente 2 reduz a exposição quando a queda do Ibovespa e a volatilidade ultrapassam limites. No histórico, a queda máxima teria recuado de 47,8% para 28,7%, mas o mecanismo foi criado depois da crise que pretende mitigar. No recorte de 2019 a 2025, a diferença de retorno anualizado foi de apenas 0,09 ponto percentual, com p = 0,964. Das 432 configurações examinadas, somente 9,03% melhoraram ao mesmo tempo retorno e queda. O experimento é mantido como hipótese para um novo registro prospectivo, não como melhoria comprovada nem como resultado principal deste artigo.</w:t>
+        <w:t>Proteção intranual concebida depois da Covid-19. O Benevente 2 reduz a exposição após estresse de queda e volatilidade do Ibovespa. No histórico, a queda máxima recuou de 47,8% para 28,7%, sem diferença detectável de retorno entre 2019 e 2025 (p = 0,964). Por perfil, a proteção reduziu a queda de 18,9% para 9,9% no conservador, de 28,1% para 17,9% no equilibrado e de 37,6% para 29,3% no arrojado, com pequena redução do CAGR. Em 5.000 reamostragens de blocos, o percentil adverso de 2,5% chegou a 14,2%, 27,7% e 49,1%. A regra foi registrada em 20 de agosto de 2026 para acompanhamento em 2027. Ela permanece retrospectiva, sem imposto intranual, e não integra o resultado principal.</w:t>
       </w:r>
     </w:p>
     <w:p>
@@ -5512,7 +5512,7 @@
         <w:pStyle w:val="Normal"/>
       </w:pPr>
       <w:r>
-        <w:t>A oferta a validar é uma licença institucional combinada a um serviço de implantação. O preço, a disposição a pagar e o problema percebido ainda não foram testados com uma amostra de clientes. O piloto deve medir o tempo de produção do dossiê, a proporção de decisões com evidência completa, o número de revisões até a aprovação, a diferença entre custo estimado e executado e a disposição a pagar. Um piloto no Espírito Santo pode atender ao recorte de aplicação do congresso, mas não deve começar com a premissa de que o produto reterá capital ou gerará negócios no estado. Esse possível efeito exigiria outra pesquisa, com indicadores econômicos próprios.</w:t>
+        <w:t>A oferta a validar combina licença institucional e implantação. O piloto deve medir tempo de produção, completude da evidência, revisões, diferença entre custo estimado e executado e disposição a pagar. Um teste no Espírito Santo atende ao recorte do congresso, mas não permite presumir retenção de capital ou geração de negócios no estado. Esse efeito exigiria pesquisa econômica própria.</w:t>
       </w:r>
     </w:p>
     <w:p>
@@ -6190,7 +6190,7 @@
         <w:pStyle w:val="Normal"/>
       </w:pPr>
       <w:r>
-        <w:t>A segunda limitação está nos dados. O detector de eventos societários confirmou somente 23,3% dos eventos conhecidos. Papéis sem cobertura integral recebem, em casos identificados, uma distribuição imputada pela mediana transversal do ano. Essa fragilidade atingiu 13,9% da exposição acumulada a ações e 50% da carteira total em 2020. Antes de qualquer uso comercial do desempenho, proventos, juros sobre capital próprio e eventos de papéis deslistados precisam ser reconciliados com registros primários da B3, dos emissores ou de depositária autorizada.</w:t>
+        <w:t>A segunda limitação está nos dados. A coleta primária avançou para 18.190 eventos e 95,6% dos ativos do painel, mas 22 códigos e 271 eventos manuais ainda bloqueiam a reconciliação integral. Papéis sem cobertura completa recebem, em casos identificados, uma distribuição imputada pela mediana transversal do ano. Essa fragilidade atingiu 13,9% da exposição acumulada a ações e 50% da carteira total em 2020. O novo arquivo melhora a auditabilidade, mas o resultado só poderá ser recalculado e comparado quando o preço bruto, o evento e a conversão estiverem ligados sem lacunas.</w:t>
       </w:r>
     </w:p>
     <w:p>
@@ -6222,7 +6222,7 @@
         <w:pStyle w:val="Normal"/>
       </w:pPr>
       <w:r>
-        <w:t>O passo científico prioritário é acumular decisões depois do registro congelado. Em paralelo, a pesquisa deve substituir imputações por reconciliação de eventos e proventos em fonte primária. Testes futuros devem incluir blocos temporais, trajetórias sintéticas com dependência serial e cenários de baixa prolongada. Simulação não substitui observação futura, mas pode revelar fragilidade a sequências que a amostra curta não contém. Um estudo com notícias deve ser registrado como braço separado, com frequência trimestral ou orientada a eventos e horário verificável. O passo de produto é um piloto silencioso, sem execução automática, capaz de medir tempo, completude documental, divergência de custos, compreensão do usuário e disposição a pagar.</w:t>
+        <w:t>O passo científico prioritário é acumular decisões depois do registro congelado. Em paralelo, a pesquisa deve completar os 22 códigos e resolver os 271 eventos manuais antes de reconstruir o retorno. A reamostragem em blocos já mede dependência serial curta; testes seguintes devem acrescentar trajetórias sintéticas com regimes de baixa prolongada que não estejam limitadas à ordem histórica. Simulação não substitui observação futura. Um estudo com notícias deve ser registrado como braço separado, com frequência trimestral ou orientada a eventos e horário verificável. O passo de produto é um piloto silencioso, sem execução automática, capaz de medir tempo, completude documental, divergência de custos, compreensão do usuário e disposição a pagar.</w:t>
       </w:r>
     </w:p>
     <w:p>
@@ -6254,7 +6254,7 @@
         <w:pStyle w:val="Normal"/>
       </w:pPr>
       <w:r>
-        <w:t>A conclusão comprovada é mais estreita e mais defensável que a versão anterior do artigo: o artefato cria uma cadeia auditável e usa essa cadeia para descobrir erros que mudam o próprio resultado. A viabilidade comercial será confirmada somente se um piloto mostrar ganho de tempo, completude documental, compreensão e disposição a pagar. A validade financeira exigirá reconciliação primária e dados posteriores ao registro de agosto de 2026. Até lá, o desempenho histórico permanece diagnóstico de desenvolvimento.</w:t>
+        <w:t>A conclusão comprovada é mais estreita e mais defensável que a versão anterior do artigo: o artefato cria uma cadeia auditável e usa essa cadeia para descobrir erros que mudam o próprio resultado. A viabilidade comercial será confirmada somente se um piloto mostrar ganho de tempo, completude documental, compreensão e disposição a pagar. A validade financeira exigirá completar a reconciliação primária e acumular dados posteriores ao registro; a política de risco começa sua amostra confirmatória em 2027. Até lá, o desempenho histórico permanece diagnóstico de desenvolvimento.</w:t>
       </w:r>
     </w:p>
     <w:p>

</xml_diff>

<commit_message>
Align BTech paper with identified official template
</commit_message>
<xml_diff>
--- a/outputs/Benevente_Wealth_System_BTECH_Final.docx
+++ b/outputs/Benevente_Wealth_System_BTECH_Final.docx
@@ -14,6 +14,28 @@
           <w:b/>
         </w:rPr>
         <w:t>BENEVENTE WEALTH SYSTEM: UM ARTEFATO AUDITÁVEL PARA DECISÕES DE CARTEIRA</w:t>
+      </w:r>
+    </w:p>
+    <w:p>
+      <w:pPr>
+        <w:pStyle w:val="Authornames"/>
+        <w:spacing w:before="0" w:after="0"/>
+        <w:ind w:firstLine="0"/>
+        <w:jc w:val="center"/>
+      </w:pPr>
+      <w:r>
+        <w:t>Diego Gallina</w:t>
+      </w:r>
+    </w:p>
+    <w:p>
+      <w:pPr>
+        <w:pStyle w:val="Affiliation"/>
+        <w:spacing w:before="0" w:after="240"/>
+        <w:ind w:firstLine="0"/>
+        <w:jc w:val="center"/>
+      </w:pPr>
+      <w:r>
+        <w:t>Fucape Business School, Vitória, ES, Brasil</w:t>
       </w:r>
     </w:p>
     <w:p>
@@ -6270,7 +6292,7 @@
         <w:pStyle w:val="Normal"/>
       </w:pPr>
       <w:r>
-        <w:t>A versão submetida inclui um pacote suplementar anônimo com o código de reprodução, os artefatos de avaliação e o manifesto criptográfico. Os endereços públicos do sistema e do repositório foram omitidos para preservar a avaliação cega. Após o aceite, a versão para publicação deverá restaurar esses endereços e indicar o arquivo permanente com DOI.</w:t>
+        <w:t>O código de reprodução, os testes, os manifestos criptográficos e os arquivos que sustentam os resultados estão disponíveis no repositório público do projeto, em https://github.com/diegogallina1/benevente. A demonstração web do artefato está disponível em https://benevente-wealth-system.vercel.app/. O repositório identifica as fontes, as limitações de cobertura e os comandos necessários para reproduzir as avaliações.</w:t>
       </w:r>
     </w:p>
     <w:p>
@@ -6392,7 +6414,7 @@
         <w:t>Documentação técnica, repositório de dados e validação de horizontes</w:t>
       </w:r>
       <w:r>
-        <w:t>. Repositório anônimo de avaliação.</w:t>
+        <w:t>. https://github.com/diegogallina1/benevente</w:t>
       </w:r>
     </w:p>
     <w:p>
@@ -6715,183 +6737,183 @@
 </file>
 
 <file path=word/footer1.xml><?xml version="1.0" encoding="utf-8"?>
-<ns0:ftr xmlns:ns0="http://schemas.openxmlformats.org/wordprocessingml/2006/main" xmlns:ns1="http://schemas.openxmlformats.org/markup-compatibility/2006" xmlns:ns2="http://schemas.openxmlformats.org/drawingml/2006/wordprocessingDrawing" xmlns:ns3="http://schemas.openxmlformats.org/drawingml/2006/main" xmlns:ns4="http://schemas.openxmlformats.org/drawingml/2006/picture" xmlns:ns5="http://schemas.openxmlformats.org/officeDocument/2006/relationships" ns1:Ignorable="w14 wp14 w15">
-  <ns0:p>
-    <ns0:pPr>
-      <ns0:pStyle ns0:val="Footer"/>
-      <ns0:tabs>
-        <ns0:tab ns0:val="clear" ns0:pos="708"/>
-        <ns0:tab ns0:val="left" ns0:pos="5685" ns0:leader="none"/>
-        <ns0:tab ns0:val="right" ns0:pos="9070" ns0:leader="none"/>
-      </ns0:tabs>
-      <ns0:rPr/>
-    </ns0:pPr>
-    <ns0:r>
-      <ns0:drawing>
-        <ns2:anchor behindDoc="1" distT="0" distB="0" distL="114935" distR="114935" simplePos="0" locked="0" layoutInCell="1" allowOverlap="1" relativeHeight="7">
-          <ns2:simplePos x="0" y="0"/>
-          <ns2:positionH relativeFrom="column">
-            <ns2:posOffset>2168525</ns2:posOffset>
-          </ns2:positionH>
-          <ns2:positionV relativeFrom="paragraph">
-            <ns2:posOffset>-638175</ns2:posOffset>
-          </ns2:positionV>
-          <ns2:extent cx="1558925" cy="1131570"/>
-          <ns2:effectExtent l="0" t="0" r="0" b="0"/>
-          <ns2:wrapNone/>
-          <ns2:docPr id="2" name="Image1" descr="Logotipo da Fucape Business School" title="Logotipo da Fucape Business School"/>
-          <ns2:cNvGraphicFramePr>
-            <ns3:graphicFrameLocks noChangeAspect="1"/>
-          </ns2:cNvGraphicFramePr>
-          <ns3:graphic>
-            <ns3:graphicData uri="http://schemas.openxmlformats.org/drawingml/2006/picture">
-              <ns4:pic>
-                <ns4:nvPicPr>
-                  <ns4:cNvPr id="2" name="Image1" descr="" title=""/>
-                  <ns4:cNvPicPr>
-                    <ns3:picLocks noChangeAspect="1" noChangeArrowheads="1"/>
-                  </ns4:cNvPicPr>
-                </ns4:nvPicPr>
-                <ns4:blipFill>
-                  <ns3:blip ns5:embed="rId1"/>
-                  <ns3:srcRect l="31175" t="-33" r="48994" b="-33"/>
-                  <ns3:stretch>
-                    <ns3:fillRect/>
-                  </ns3:stretch>
-                </ns4:blipFill>
-                <ns4:spPr bwMode="auto">
-                  <ns3:xfrm>
-                    <ns3:off x="0" y="0"/>
-                    <ns3:ext cx="1558925" cy="1131570"/>
-                  </ns3:xfrm>
-                  <ns3:prstGeom prst="rect">
-                    <ns3:avLst/>
-                  </ns3:prstGeom>
-                </ns4:spPr>
-              </ns4:pic>
-            </ns3:graphicData>
-          </ns3:graphic>
-        </ns2:anchor>
-      </ns0:drawing>
-    </ns0:r>
-    <ns0:r>
-      <ns0:rPr>
-        <ns0:rFonts ns0:cs="Arial" ns0:ascii="Arial" ns0:hAnsi="Arial"/>
-        <ns0:b/>
-        <ns0:sz ns0:val="16"/>
-      </ns0:rPr>
-      <ns0:tab/>
-      <ns0:tab/>
-      <ns0:tab/>
-      <ns0:tab/>
-    </ns0:r>
-    <ns0:r>
-      <ns0:rPr>
-        <ns0:rFonts ns0:cs="Arial" ns0:ascii="Arial" ns0:hAnsi="Arial"/>
-        <ns0:b/>
-        <ns0:sz ns0:val="16"/>
-      </ns0:rPr>
-      <ns0:fldChar ns0:fldCharType="begin"/>
-    </ns0:r>
-    <ns0:r>
-      <ns0:rPr>
-        <ns0:sz ns0:val="16"/>
-        <ns0:b/>
-        <ns0:rFonts ns0:cs="Arial" ns0:ascii="Arial" ns0:hAnsi="Arial"/>
-      </ns0:rPr>
-      <ns0:instrText xml:space="preserve"> PAGE </ns0:instrText>
-    </ns0:r>
-    <ns0:r>
-      <ns0:rPr>
-        <ns0:sz ns0:val="16"/>
-        <ns0:b/>
-        <ns0:rFonts ns0:cs="Arial" ns0:ascii="Arial" ns0:hAnsi="Arial"/>
-      </ns0:rPr>
-      <ns0:fldChar ns0:fldCharType="separate"/>
-    </ns0:r>
-    <ns0:r>
-      <ns0:rPr>
-        <ns0:sz ns0:val="16"/>
-        <ns0:b/>
-        <ns0:rFonts ns0:cs="Arial" ns0:ascii="Arial" ns0:hAnsi="Arial"/>
-      </ns0:rPr>
-      <ns0:t>3</ns0:t>
-    </ns0:r>
-    <ns0:r>
-      <ns0:rPr>
-        <ns0:sz ns0:val="16"/>
-        <ns0:b/>
-        <ns0:rFonts ns0:cs="Arial" ns0:ascii="Arial" ns0:hAnsi="Arial"/>
-      </ns0:rPr>
-      <ns0:fldChar ns0:fldCharType="end"/>
-    </ns0:r>
-  </ns0:p>
-</ns0:ftr>
+<w:ftr xmlns:o="urn:schemas-microsoft-com:office:office" xmlns:r="http://schemas.openxmlformats.org/officeDocument/2006/relationships" xmlns:v="urn:schemas-microsoft-com:vml" xmlns:w="http://schemas.openxmlformats.org/wordprocessingml/2006/main" xmlns:w10="urn:schemas-microsoft-com:office:word" xmlns:wp="http://schemas.openxmlformats.org/drawingml/2006/wordprocessingDrawing" xmlns:wps="http://schemas.microsoft.com/office/word/2010/wordprocessingShape" xmlns:wpg="http://schemas.microsoft.com/office/word/2010/wordprocessingGroup" xmlns:mc="http://schemas.openxmlformats.org/markup-compatibility/2006" xmlns:wp14="http://schemas.microsoft.com/office/word/2010/wordprocessingDrawing" xmlns:w14="http://schemas.microsoft.com/office/word/2010/wordml" xmlns:w15="http://schemas.microsoft.com/office/word/2012/wordml" mc:Ignorable="w14 wp14 w15">
+  <w:p>
+    <w:pPr>
+      <w:pStyle w:val="Footer"/>
+      <w:tabs>
+        <w:tab w:val="clear" w:pos="708"/>
+        <w:tab w:val="left" w:pos="5685" w:leader="none"/>
+        <w:tab w:val="right" w:pos="9070" w:leader="none"/>
+      </w:tabs>
+      <w:rPr/>
+    </w:pPr>
+    <w:r>
+      <w:drawing>
+        <wp:anchor behindDoc="1" distT="0" distB="0" distL="114935" distR="114935" simplePos="0" locked="0" layoutInCell="1" allowOverlap="1" relativeHeight="7">
+          <wp:simplePos x="0" y="0"/>
+          <wp:positionH relativeFrom="column">
+            <wp:posOffset>2168525</wp:posOffset>
+          </wp:positionH>
+          <wp:positionV relativeFrom="paragraph">
+            <wp:posOffset>-638175</wp:posOffset>
+          </wp:positionV>
+          <wp:extent cx="1558925" cy="1131570"/>
+          <wp:effectExtent l="0" t="0" r="0" b="0"/>
+          <wp:wrapNone/>
+          <wp:docPr id="2" name="Image1" descr="Logotipo da Fucape Business School" title="Logotipo da Fucape Business School"/>
+          <wp:cNvGraphicFramePr>
+            <a:graphicFrameLocks xmlns:a="http://schemas.openxmlformats.org/drawingml/2006/main" noChangeAspect="1"/>
+          </wp:cNvGraphicFramePr>
+          <a:graphic xmlns:a="http://schemas.openxmlformats.org/drawingml/2006/main">
+            <a:graphicData uri="http://schemas.openxmlformats.org/drawingml/2006/picture">
+              <pic:pic xmlns:pic="http://schemas.openxmlformats.org/drawingml/2006/picture">
+                <pic:nvPicPr>
+                  <pic:cNvPr id="2" name="Image1" descr="" title=""/>
+                  <pic:cNvPicPr>
+                    <a:picLocks noChangeAspect="1" noChangeArrowheads="1"/>
+                  </pic:cNvPicPr>
+                </pic:nvPicPr>
+                <pic:blipFill>
+                  <a:blip r:embed="rId1"/>
+                  <a:srcRect l="31175" t="-33" r="48994" b="-33"/>
+                  <a:stretch>
+                    <a:fillRect/>
+                  </a:stretch>
+                </pic:blipFill>
+                <pic:spPr bwMode="auto">
+                  <a:xfrm>
+                    <a:off x="0" y="0"/>
+                    <a:ext cx="1558925" cy="1131570"/>
+                  </a:xfrm>
+                  <a:prstGeom prst="rect">
+                    <a:avLst/>
+                  </a:prstGeom>
+                </pic:spPr>
+              </pic:pic>
+            </a:graphicData>
+          </a:graphic>
+        </wp:anchor>
+      </w:drawing>
+    </w:r>
+    <w:r>
+      <w:rPr>
+        <w:rFonts w:cs="Arial" w:ascii="Arial" w:hAnsi="Arial"/>
+        <w:b/>
+        <w:sz w:val="16"/>
+      </w:rPr>
+      <w:tab/>
+      <w:tab/>
+      <w:tab/>
+      <w:tab/>
+    </w:r>
+    <w:r>
+      <w:rPr>
+        <w:rFonts w:cs="Arial" w:ascii="Arial" w:hAnsi="Arial"/>
+        <w:b/>
+        <w:sz w:val="16"/>
+      </w:rPr>
+      <w:fldChar w:fldCharType="begin"/>
+    </w:r>
+    <w:r>
+      <w:rPr>
+        <w:sz w:val="16"/>
+        <w:b/>
+        <w:rFonts w:cs="Arial" w:ascii="Arial" w:hAnsi="Arial"/>
+      </w:rPr>
+      <w:instrText xml:space="preserve"> PAGE </w:instrText>
+    </w:r>
+    <w:r>
+      <w:rPr>
+        <w:sz w:val="16"/>
+        <w:b/>
+        <w:rFonts w:cs="Arial" w:ascii="Arial" w:hAnsi="Arial"/>
+      </w:rPr>
+      <w:fldChar w:fldCharType="separate"/>
+    </w:r>
+    <w:r>
+      <w:rPr>
+        <w:sz w:val="16"/>
+        <w:b/>
+        <w:rFonts w:cs="Arial" w:ascii="Arial" w:hAnsi="Arial"/>
+      </w:rPr>
+      <w:t>3</w:t>
+    </w:r>
+    <w:r>
+      <w:rPr>
+        <w:sz w:val="16"/>
+        <w:b/>
+        <w:rFonts w:cs="Arial" w:ascii="Arial" w:hAnsi="Arial"/>
+      </w:rPr>
+      <w:fldChar w:fldCharType="end"/>
+    </w:r>
+  </w:p>
+</w:ftr>
 </file>
 
 <file path=word/header1.xml><?xml version="1.0" encoding="utf-8"?>
-<ns0:hdr xmlns:ns0="http://schemas.openxmlformats.org/wordprocessingml/2006/main" xmlns:ns1="http://schemas.openxmlformats.org/markup-compatibility/2006" xmlns:ns2="http://schemas.openxmlformats.org/drawingml/2006/wordprocessingDrawing" xmlns:ns3="http://schemas.openxmlformats.org/drawingml/2006/main" xmlns:ns4="http://schemas.openxmlformats.org/drawingml/2006/picture" xmlns:ns5="http://schemas.openxmlformats.org/officeDocument/2006/relationships" ns1:Ignorable="w14 wp14 w15">
-  <ns0:p>
-    <ns0:pPr>
-      <ns0:pStyle ns0:val="Header"/>
-      <ns0:ind ns0:hanging="1560" ns0:end="0"/>
-      <ns0:rPr>
-        <ns0:lang ns0:val="en-US" ns0:eastAsia="en-US"/>
-      </ns0:rPr>
-    </ns0:pPr>
-    <ns0:r>
-      <ns0:rPr>
-        <ns0:lang ns0:val="en-US" ns0:eastAsia="en-US"/>
-      </ns0:rPr>
-      <ns0:drawing>
-        <ns2:anchor behindDoc="1" distT="0" distB="0" distL="114935" distR="114935" simplePos="0" locked="0" layoutInCell="0" allowOverlap="1" relativeHeight="4">
-          <ns2:simplePos x="0" y="0"/>
-          <ns2:positionH relativeFrom="margin">
-            <ns2:align>center</ns2:align>
-          </ns2:positionH>
-          <ns2:positionV relativeFrom="paragraph">
-            <ns2:posOffset>635</ns2:posOffset>
-          </ns2:positionV>
-          <ns2:extent cx="7750810" cy="923925"/>
-          <ns2:effectExtent l="0" t="0" r="0" b="0"/>
-          <ns2:wrapNone/>
-          <ns2:docPr id="1" name="Imagem 2" descr="Identidade visual do Business Tech Congress 2026" title="Identidade visual do Business Tech Congress 2026"/>
-          <ns2:cNvGraphicFramePr>
-            <ns3:graphicFrameLocks noChangeAspect="1"/>
-          </ns2:cNvGraphicFramePr>
-          <ns3:graphic>
-            <ns3:graphicData uri="http://schemas.openxmlformats.org/drawingml/2006/picture">
-              <ns4:pic>
-                <ns4:nvPicPr>
-                  <ns4:cNvPr id="1" name="Imagem 2" descr="" title=""/>
-                  <ns4:cNvPicPr>
-                    <ns3:picLocks noChangeAspect="1" noChangeArrowheads="1"/>
-                  </ns4:cNvPicPr>
-                </ns4:nvPicPr>
-                <ns4:blipFill>
-                  <ns3:blip ns5:embed="rId1"/>
-                  <ns3:srcRect l="-5" t="-40" r="-5" b="-40"/>
-                  <ns3:stretch>
-                    <ns3:fillRect/>
-                  </ns3:stretch>
-                </ns4:blipFill>
-                <ns4:spPr bwMode="auto">
-                  <ns3:xfrm>
-                    <ns3:off x="0" y="0"/>
-                    <ns3:ext cx="7750810" cy="923925"/>
-                  </ns3:xfrm>
-                  <ns3:prstGeom prst="rect">
-                    <ns3:avLst/>
-                  </ns3:prstGeom>
-                </ns4:spPr>
-              </ns4:pic>
-            </ns3:graphicData>
-          </ns3:graphic>
-        </ns2:anchor>
-      </ns0:drawing>
-    </ns0:r>
-  </ns0:p>
-</ns0:hdr>
+<w:hdr xmlns:o="urn:schemas-microsoft-com:office:office" xmlns:r="http://schemas.openxmlformats.org/officeDocument/2006/relationships" xmlns:v="urn:schemas-microsoft-com:vml" xmlns:w="http://schemas.openxmlformats.org/wordprocessingml/2006/main" xmlns:w10="urn:schemas-microsoft-com:office:word" xmlns:wp="http://schemas.openxmlformats.org/drawingml/2006/wordprocessingDrawing" xmlns:wps="http://schemas.microsoft.com/office/word/2010/wordprocessingShape" xmlns:wpg="http://schemas.microsoft.com/office/word/2010/wordprocessingGroup" xmlns:mc="http://schemas.openxmlformats.org/markup-compatibility/2006" xmlns:wp14="http://schemas.microsoft.com/office/word/2010/wordprocessingDrawing" xmlns:w14="http://schemas.microsoft.com/office/word/2010/wordml" xmlns:w15="http://schemas.microsoft.com/office/word/2012/wordml" mc:Ignorable="w14 wp14 w15">
+  <w:p>
+    <w:pPr>
+      <w:pStyle w:val="Header"/>
+      <w:ind w:hanging="1560" w:end="0"/>
+      <w:rPr>
+        <w:lang w:val="en-US" w:eastAsia="en-US"/>
+      </w:rPr>
+    </w:pPr>
+    <w:r>
+      <w:rPr>
+        <w:lang w:val="en-US" w:eastAsia="en-US"/>
+      </w:rPr>
+      <w:drawing>
+        <wp:anchor behindDoc="1" distT="0" distB="0" distL="114935" distR="114935" simplePos="0" locked="0" layoutInCell="0" allowOverlap="1" relativeHeight="4">
+          <wp:simplePos x="0" y="0"/>
+          <wp:positionH relativeFrom="margin">
+            <wp:align>center</wp:align>
+          </wp:positionH>
+          <wp:positionV relativeFrom="paragraph">
+            <wp:posOffset>635</wp:posOffset>
+          </wp:positionV>
+          <wp:extent cx="7750810" cy="923925"/>
+          <wp:effectExtent l="0" t="0" r="0" b="0"/>
+          <wp:wrapNone/>
+          <wp:docPr id="1" name="Imagem 2" descr="Identidade visual do Business Tech Congress 2026" title="Identidade visual do Business Tech Congress 2026"/>
+          <wp:cNvGraphicFramePr>
+            <a:graphicFrameLocks xmlns:a="http://schemas.openxmlformats.org/drawingml/2006/main" noChangeAspect="1"/>
+          </wp:cNvGraphicFramePr>
+          <a:graphic xmlns:a="http://schemas.openxmlformats.org/drawingml/2006/main">
+            <a:graphicData uri="http://schemas.openxmlformats.org/drawingml/2006/picture">
+              <pic:pic xmlns:pic="http://schemas.openxmlformats.org/drawingml/2006/picture">
+                <pic:nvPicPr>
+                  <pic:cNvPr id="1" name="Imagem 2" descr="" title=""/>
+                  <pic:cNvPicPr>
+                    <a:picLocks noChangeAspect="1" noChangeArrowheads="1"/>
+                  </pic:cNvPicPr>
+                </pic:nvPicPr>
+                <pic:blipFill>
+                  <a:blip r:embed="rId1"/>
+                  <a:srcRect l="-5" t="-40" r="-5" b="-40"/>
+                  <a:stretch>
+                    <a:fillRect/>
+                  </a:stretch>
+                </pic:blipFill>
+                <pic:spPr bwMode="auto">
+                  <a:xfrm>
+                    <a:off x="0" y="0"/>
+                    <a:ext cx="7750810" cy="923925"/>
+                  </a:xfrm>
+                  <a:prstGeom prst="rect">
+                    <a:avLst/>
+                  </a:prstGeom>
+                </pic:spPr>
+              </pic:pic>
+            </a:graphicData>
+          </a:graphic>
+        </wp:anchor>
+      </w:drawing>
+    </w:r>
+  </w:p>
+</w:hdr>
 </file>
 
 <file path=word/numbering.xml><?xml version="1.0" encoding="utf-8"?>

</xml_diff>

<commit_message>
Finalize BTech and IEEE research release
</commit_message>
<xml_diff>
--- a/outputs/Benevente_Wealth_System_BTECH_Final.docx
+++ b/outputs/Benevente_Wealth_System_BTECH_Final.docx
@@ -91,7 +91,7 @@
         <w:pStyle w:val="Normal"/>
       </w:pPr>
       <w:r>
-        <w:t>Este trabalho parte de um problema operacional delimitado: a recomendação é produzida hoje, mas pode precisar ser defendida meses ou anos depois. Se a instituição não preserva o dado admitido, a versão da regra e a aprovação, a justificativa posterior pode incorporar informações que não existiam quando a decisão foi tomada. O Benevente foi construído para produzir a proposta e o registro que permitirá revisá-la. A existência desse problema no público-alvo, sua intensidade e a disposição a pagar pela solução ainda precisam ser medidas em piloto. O artigo não atribui ao artefato impacto regional, demanda comercial ou retenção de capital que não tenham sido observados.</w:t>
+        <w:t>Este trabalho parte de um problema operacional: a recomendação é produzida hoje, mas pode precisar ser defendida anos depois. Sem preservar o dado admitido, a versão da regra e a aprovação, a justificativa posterior pode incorporar informações inexistentes na decisão. O Benevente produz a proposta e seu registro verificável. A intensidade do problema e a disposição a pagar ainda precisam ser medidas em piloto. O artigo não atribui ao artefato impacto regional ou demanda comercial não observados.</w:t>
       </w:r>
     </w:p>
     <w:p>
@@ -146,23 +146,23 @@
         <w:pStyle w:val="Normal"/>
       </w:pPr>
       <w:r>
-        <w:t>Planilhas podem falhar nas três quando são usadas sem controle de versão: sobrescrevem o estado anterior, misturam regra e dado e não preservam autoria. Sistemas fechados podem entregar uma carteira sem evidenciar o critério aplicado. O requisito do artefato é permitir que uma pessoa independente refaça o caminho da decisão sem depender da memória de quem a produziu.</w:t>
-      </w:r>
-    </w:p>
-    <w:p>
-      <w:pPr>
-        <w:pStyle w:val="Normal"/>
-      </w:pPr>
-      <w:r>
-        <w:t>A questão que orienta este trabalho é, portanto, de engenharia e de governança antes de ser de finanças: como construir um artefato que produza recomendação e prova ao mesmo tempo, e cuja própria evidência de desempenho resista a auditoria hostil?</w:t>
-      </w:r>
-    </w:p>
-    <w:p>
-      <w:pPr>
-        <w:pStyle w:val="Normal"/>
-      </w:pPr>
-      <w:r>
-        <w:t>O objetivo é construir e avaliar um artefato B2B que transforme cada recomendação em um documento verificável. O método segue ciência do projeto, ou design science: identificar o problema, explicitar requisitos, construir o artefato e avaliá-lo por utilidade, qualidade e capacidade de produzir evidência (Hevner et al., 2004; Peffers et al., 2007). A avaliação combina testes de funcionamento, inspeção das fontes, tentativas deliberadas de encontrar erros e um diagnóstico financeiro histórico. A contribuição é dupla: um protocolo quantitativo que pode ser reexecutado e um fluxo de trabalho que preserva quem decidiu, com qual informação e sob qual política. O retorno passado é uma medida secundária de comportamento do protótipo, não a prova principal de utilidade nem uma promessa de desempenho futuro.</w:t>
+        <w:t>Planilhas sem controle de versão podem sobrescrever estados, misturar regra e dado e perder autoria. Sistemas fechados podem entregar uma carteira sem evidenciar o critério. O artefato deve permitir que uma pessoa independente refaça a decisão sem depender da memória de quem a produziu.</w:t>
+      </w:r>
+    </w:p>
+    <w:p>
+      <w:pPr>
+        <w:pStyle w:val="Normal"/>
+      </w:pPr>
+      <w:r>
+        <w:t>A pergunta prioritária é: como usar modelos de linguagem acessíveis à comunidade para apoiar decisões de investimento, e quão úteis são essas ferramentas para a tomada de decisão? No Benevente, ela se torna uma questão de engenharia e governança: como produzir proposta e prova no mesmo fluxo, sem transferir ao texto gerado a seleção, os pesos ou a responsabilidade?</w:t>
+      </w:r>
+    </w:p>
+    <w:p>
+      <w:pPr>
+        <w:pStyle w:val="Normal"/>
+      </w:pPr>
+      <w:r>
+        <w:t>O objetivo é construir e avaliar um artefato B2B que transforme cada recomendação em documento verificável. O método segue design science: identificar o problema, explicitar requisitos, construir e avaliar o artefato por utilidade, qualidade e evidência (Hevner et al., 2004; Peffers et al., 2007). A avaliação combina testes, inspeção das fontes, busca deliberada de erros e diagnóstico financeiro histórico. A contribuição reúne um protocolo quantitativo reexecutável e um fluxo que preserva quem decidiu, com qual informação e política. O retorno passado mede o comportamento do protótipo, não sua utilidade principal nem o desempenho futuro.</w:t>
       </w:r>
     </w:p>
     <w:p>
@@ -186,63 +186,41 @@
         <w:pStyle w:val="Normal"/>
       </w:pPr>
       <w:r>
-        <w:t>Três problemas metodológicos bem documentados na literatura de finanças quantitativas foram tratados como requisitos de projeto, não como ressalvas de rodapé.</w:t>
-      </w:r>
-    </w:p>
-    <w:p>
-      <w:pPr>
-        <w:pStyle w:val="Normal"/>
-      </w:pPr>
-      <w:r>
-        <w:t>Viés de sobrevivência. Painéis montados a partir de provedores públicos de preço ajustado servem as empresas que ainda existem. Reconstruir o universo a partir de um provedor desses apaga silenciosamente toda empresa deslistada, adquirida ou liquidada, justamente as que produziram os piores retornos. O efeito é sistemático e sempre favorável ao backtest.</w:t>
-      </w:r>
-    </w:p>
-    <w:p>
-      <w:pPr>
-        <w:pStyle w:val="Normal"/>
-      </w:pPr>
-      <w:r>
-        <w:t>Informação disponível na data. Fundamentos precisam ser lidos como estavam no momento da decisão, com data de recebimento pelo regulador, não com a versão consolidada e eventualmente republicada. Chamar isso de detalhe é subestimar o problema: a diferença aparece com sinal previsível, sempre a favor de quem testa.</w:t>
-      </w:r>
-    </w:p>
-    <w:p>
-      <w:pPr>
-        <w:pStyle w:val="Normal"/>
-      </w:pPr>
-      <w:r>
-        <w:t>Múltiplas tentativas. Quando se avaliam dezenas de configurações e se publica a melhor, o índice de Sharpe observado é enviesado para cima pela própria busca. Bailey e López de Prado formalizaram o problema com o Sharpe deflacionado, que corrige a estatística pelo número de tentativas e pelos momentos superiores da distribuição de retornos. Sem essa correção, qualquer busca suficientemente ampla produz um vencedor aparentemente significativo.</w:t>
-      </w:r>
-    </w:p>
-    <w:p>
-      <w:pPr>
-        <w:pStyle w:val="Normal"/>
-      </w:pPr>
-      <w:r>
-        <w:t>Quatro referências clássicas orientam a construção financeira do artefato. Markowitz (1952) mostrou que uma carteira precisa ser analisada pela interação entre retornos e covariâncias, e não pela atratividade isolada de cada ativo. A otimização média-variância, chamada neste artigo de MVO, estima a relação entre retorno esperado e risco conjunto e escolhe pesos sob restrições. No Benevente, ela funciona como comparação independente. A pergunta é simples: o que uma carteira guiada apenas por médias, covariâncias e limites teria produzido sobre o mesmo conjunto elegível? Isso evita atribuir ao filtro fundamental um ganho que possa vir apenas da diversificação. A ênfase em qualidade dialoga com Novy-Marx (2013), enquanto o uso conjunto de valor, qualidade e confirmação de mercado se aproxima da lógica multifatorial de Fama e French (2015), sem pretender reproduzir exatamente seus fatores.</w:t>
-      </w:r>
-    </w:p>
-    <w:p>
-      <w:pPr>
-        <w:pStyle w:val="Normal"/>
-      </w:pPr>
-      <w:r>
-        <w:t>Black e Litterman (1992) combinam equilíbrio de mercado e visões. O Benevente adota somente a separação conceitual: fatos e sinais geram o ranking, enquanto a linguagem explica a visão sem alterar a alocação. O modelo Black–Litterman não é implementado na carteira publicada.</w:t>
-      </w:r>
-    </w:p>
-    <w:p>
-      <w:pPr>
-        <w:pStyle w:val="Normal"/>
-      </w:pPr>
-      <w:r>
-        <w:t>DeMiguel, Garlappi e Uppal (2009) demonstram como erro de estimação pode eliminar, fora da amostra, a vantagem aparente de métodos sofisticados sobre uma diversificação simples. A resposta do projeto não é presumir que um otimizador sempre melhora o resultado. É publicar uma referência independente, impor um número mínimo de posições, limitar a interpretação das métricas e comparar decisões em sequência temporal. O resultado de 7,83% ao ano do MVO de referência nesta execução não prova que MVO é inferior em geral. Mostra somente que aquela implementação, com aquele universo elegível e aquelas estimativas disponíveis em cada janeiro, produziu esse caminho. Em outra amostra ou especificação, a ordem pode se inverter.</w:t>
-      </w:r>
-    </w:p>
-    <w:p>
-      <w:pPr>
-        <w:pStyle w:val="Normal"/>
-      </w:pPr>
-      <w:r>
-        <w:t>Novy-Marx e Velikov (2016) mostram que custos de negociação podem consumir anomalias documentadas. O diagnóstico deduz taxas e deslizamento estimado, mede giro e penaliza trocas. Como estimativa não é nota de corretagem, o produto prevê conciliação posterior com o custo observado.</w:t>
+        <w:t xml:space="preserve">Três vieses clássicos de backtesting foram tratados como requisitos de projeto. O viés de sobrevivência é mitigado ao reconstruir o universo pelo arquivo histórico da B3 e manter os deslistados; ainda resta reconciliar integralmente seus eventos societários. O viés de antecipação, ou </w:t>
+      </w:r>
+      <w:r>
+        <w:rPr>
+          <w:i/>
+        </w:rPr>
+        <w:t>look-ahead</w:t>
+      </w:r>
+      <w:r>
+        <w:t xml:space="preserve">, é mitigado pela data de recebimento de ITR e DFP e pelo corte anual; republicações e fontes auxiliares continuam sujeitas a inspeção. O viés de mineração de dados, ou </w:t>
+      </w:r>
+      <w:r>
+        <w:rPr>
+          <w:i/>
+        </w:rPr>
+        <w:t>data-snooping</w:t>
+      </w:r>
+      <w:r>
+        <w:t>, é limitado pela seleção aninhada, pelo prêmio de retrospectiva e pelo Sharpe deflacionado (Bailey &amp; López de Prado, 2014), mas onze decisões não substituem uma amostra prospectiva.</w:t>
+      </w:r>
+    </w:p>
+    <w:p>
+      <w:pPr>
+        <w:pStyle w:val="Normal"/>
+      </w:pPr>
+      <w:r>
+        <w:t>Markowitz (1952) fundamenta a comparação média-variância, ou MVO, calculada de modo independente sobre o mesmo conjunto elegível. Black e Litterman (1992) inspiram apenas a separação entre visões e alocação, não um modelo implementado. DeMiguel, Garlappi e Uppal (2009) justificam diversificação e cautela diante do erro de estimação; o MVO de 7,83% ao ano nesta execução descreve um comparador específico, não inferioridade geral. Qualidade, valor e confirmação de mercado dialogam com Novy-Marx (2013) e Fama e French (2015). Custos, giro e deslizamento entram no protocolo porque atritos podem consumir anomalias (Novy-Marx &amp; Velikov, 2016).</w:t>
+      </w:r>
+    </w:p>
+    <w:p>
+      <w:pPr>
+        <w:pStyle w:val="Normal"/>
+      </w:pPr>
+      <w:r>
+        <w:t>Os estudos recentes também recomendam separar utilidade narrativa de capacidade preditiva. Perlin et al. (2025) executaram 30 mil simulações com 1.522 empresas anonimizadas e não encontraram superioridade consistente do Gemini sobre 1/N ou S&amp;P 500, sobretudo em horizontes longos. Pelster e Val (2024) adotaram um experimento ao vivo, desenho mais adequado para evitar conhecimento posterior. Kim, Muhn e Nikolaev (2024) reportam que modelos podem extrair informações narrativas úteis de demonstrativos anonimizados, sem que isso implique alfa de negociação. Li et al. (2026), no FINSABER, mostram que vantagens aparentes se deterioram em universos amplos, horizontes longos e regimes distintos. FINCON (Yu et al., 2024) inspira a divisão de responsabilidades, não autonomia de negociação. Esse conjunto sustenta a escolha do Benevente: a regra determinística calcula, o modelo apenas explica fatos aprovados e sua utilidade será avaliada prospectivamente.</w:t>
       </w:r>
     </w:p>
     <w:p>
@@ -966,15 +944,7 @@
         <w:pStyle w:val="Normal"/>
       </w:pPr>
       <w:r>
-        <w:t>O método precisa ser compreensível sem reproduzir o código da aplicação. Primeiro, o sistema elimina ativos sem dados suficientes, sem liquidez compatível ou com lucro negativo. Depois, ordena os remanescentes por uma de quatro leituras: valor combinado a qualidade, valor combinado a qualidade e momento, somente momento ou baixa volatilidade. A versão multifatorial atribui 40% à qualidade, medida por retorno sobre o capital ou sobre o patrimônio, 40% ao lucro em relação ao preço e 20% ao comportamento do preço nos doze meses anteriores. Em seguida, escolhe uma cesta e distribui o orçamento de ações entre os melhores colocados. O saldo permanece no CDI.</w:t>
-      </w:r>
-    </w:p>
-    <w:p>
-      <w:pPr>
-        <w:pStyle w:val="Normal"/>
-      </w:pPr>
-      <w:r>
-        <w:t>Há três escolhas de orçamento de ações, 55%, 75% ou 95%, três tamanhos de cesta, 5, 8 ou 12 emissores, e quatro leituras de sinal. A combinação produz 36 políticas candidatas. O efeito de cada escolha é intuitivo: mais ações aumentam a exposição ao mercado; mais emissores reduzem a dependência de um papel; sinais distintos favorecem características diferentes. Em cada janeiro, somente os anos já encerrados podem ordenar essas políticas. O teto por emissor impede que a carteira pareça diversificada apenas no número de nomes. A configuração completa, a transformação de cada campo e os arquivos de entrada e saída recebem SHA-256 e permanecem disponíveis no pacote de reprodução.</w:t>
+        <w:t>Sem expor o código da aplicação, a lógica é verificável. O sistema elimina ativos sem dados, liquidez ou lucro compatíveis, testa quatro leituras pré-declaradas e, na versão multifatorial, combina 40% de qualidade, 40% de lucro em relação ao preço e 20% de momento em doze meses. As 36 políticas candidatas cruzam orçamentos de ações de 55%, 75% e 95%, cestas de 5, 8 ou 12 emissores e quatro sinais. Somente anos encerrados podem ordenar as alternativas de cada janeiro. Pesos, limites, transformações e arquivos recebem SHA-256.</w:t>
       </w:r>
     </w:p>
     <w:p>
@@ -4359,7 +4329,7 @@
         <w:pStyle w:val="Normal"/>
       </w:pPr>
       <w:r>
-        <w:t>O sistema usa um modelo de linguagem em papel deliberadamente restrito. Para verificar se essa restrição custa desempenho e se o modelo agrega algo, foram comparadas quatro versões sobre 13 anos, com o mesmo universo elegível.</w:t>
+        <w:t>O produto restringe o modelo de linguagem à explicação. Um experimento retrospectivo separado permitiu que ele produzisse escore ou pesos apenas para medir o custo dessa restrição. Como o treinamento do modelo pode conter notícias e desfechos posteriores, os quatro braços são diagnóstico de sensibilidade, não validação temporal da LLM.</w:t>
       </w:r>
     </w:p>
     <w:p>
@@ -4782,7 +4752,7 @@
         </w:numPr>
       </w:pPr>
       <w:r>
-        <w:t>Não houve diferença detectável entre identificar as empresas pelo nome e ocultar sua identidade. A amostra pequena, porém, não prova ausência de contaminação.</w:t>
+        <w:t>Não houve diferença detectável entre identificar as empresas pelo nome e ocultar sua identidade. Isso não prova ausência de contaminação: o modelo pode inferir a empresa pelos fundamentos ou reconhecer padrões aprendidos depois do período avaliado.</w:t>
       </w:r>
     </w:p>
     <w:p>
@@ -4816,7 +4786,7 @@
         <w:pStyle w:val="Normal"/>
       </w:pPr>
       <w:r>
-        <w:t>A conclusão de produto é direta. O modelo de linguagem justifica-se no Benevente por organizar e explicar decisões, não por gerá-las. Vender IA como fonte de alfa, com base nestes dados, seria vender algo que medimos e não encontramos.</w:t>
+        <w:t>A conclusão de produto é direta. O modelo organiza e explica decisões, mas não as gera. Qualquer futuro uso em sinal, ranking ou peso terá de começar depois do protocolo congelado em 16 de agosto de 2026 e ser comparado prospectivamente ao controle determinístico.</w:t>
       </w:r>
     </w:p>
     <w:p>
@@ -5526,15 +5496,15 @@
         <w:pStyle w:val="Normal"/>
       </w:pPr>
       <w:r>
-        <w:t>Uma implantação mínima pode ser dividida em três etapas. Na preparação, a instituição define fontes, políticas, perfis de acesso e responsáveis por aprovação. No piloto, o sistema acompanha uma política e um grupo pequeno de carteiras sem enviar ordens, enquanto o escritório confronta os dossiês com o processo que já utiliza. Na operação assistida, a conciliação de custos e posições passa a fechar o ciclo entre proposta e execução. Integração com corretora, custódia, identidade corporativa e arquivo documental pertence a essa última etapa e não precisa bloquear o teste inicial.</w:t>
-      </w:r>
-    </w:p>
-    <w:p>
-      <w:pPr>
-        <w:pStyle w:val="Normal"/>
-      </w:pPr>
-      <w:r>
-        <w:t>A oferta a validar combina licença institucional e implantação. O piloto deve medir tempo de produção, completude da evidência, revisões, diferença entre custo estimado e executado e disposição a pagar. Um teste no Espírito Santo atende ao recorte do congresso, mas não permite presumir retenção de capital ou geração de negócios no estado. Esse efeito exigiria pesquisa econômica própria.</w:t>
+        <w:t>A implantação começa pela definição de fontes, políticas, acessos e aprovadores. No piloto, o sistema acompanha poucas carteiras sem enviar ordens e os dossiês são confrontados com o processo vigente. Na operação assistida, a conciliação de custos e posições fecha o ciclo entre proposta e execução. Integrações com corretora, custódia, identidade e arquivo pertencem a essa etapa e não bloqueiam o teste inicial.</w:t>
+      </w:r>
+    </w:p>
+    <w:p>
+      <w:pPr>
+        <w:pStyle w:val="Normal"/>
+      </w:pPr>
+      <w:r>
+        <w:t>A oferta a validar combina licença institucional e implantação. O piloto medirá tempo, completude da evidência, revisões, diferença entre custo estimado e executado e disposição a pagar. Um teste no Espírito Santo atende ao recorte do congresso, mas não permite presumir retenção de capital ou negócios no estado. Esse efeito exigiria pesquisa própria.</w:t>
       </w:r>
     </w:p>
     <w:p>
@@ -6185,6 +6155,14 @@
     </w:p>
     <w:p>
       <w:pPr>
+        <w:pStyle w:val="Normal"/>
+      </w:pPr>
+      <w:r>
+        <w:t>A matriz converge com a literatura externa. A ausência de alfa atribuído ao modelo é compatível com Perlin et al. (2025) e com o desgaste de vantagens em testes longos descrito por Li et al. (2026). O valor narrativo ainda plausível acompanha Kim et al. (2024), mas não autoriza pesos. A linha prospectiva adota a exigência empírica ilustrada por Pelster e Val (2024). Assim, cada achado externo reforça uma fronteira do artefato: cálculo determinístico, explicação limitada e responsabilidade humana.</w:t>
+      </w:r>
+    </w:p>
+    <w:p>
+      <w:pPr>
         <w:pStyle w:val="Heading1"/>
       </w:pPr>
       <w:r>
@@ -6614,6 +6592,25 @@
         <w:jc w:val="left"/>
       </w:pPr>
       <w:r>
+        <w:t xml:space="preserve">Kim, A. G. H., Muhn, M., &amp; Nikolaev, V. V. (2024). </w:t>
+      </w:r>
+      <w:r>
+        <w:rPr>
+          <w:i/>
+        </w:rPr>
+        <w:t>Financial statement analysis with large language models</w:t>
+      </w:r>
+      <w:r>
+        <w:t xml:space="preserve"> [Working paper]. arXiv. https://arxiv.org/abs/2407.17866</w:t>
+      </w:r>
+    </w:p>
+    <w:p>
+      <w:pPr>
+        <w:pStyle w:val="Normal"/>
+        <w:ind w:left="425" w:hanging="425"/>
+        <w:jc w:val="left"/>
+      </w:pPr>
+      <w:r>
         <w:t xml:space="preserve">Kroll, J. A., Huey, J., Barocas, S., Felten, E. W., Reidenberg, J. R., Robinson, D. G., &amp; Yu, H. (2017). Accountable algorithms. </w:t>
       </w:r>
       <w:r>
@@ -6633,6 +6630,25 @@
         <w:jc w:val="left"/>
       </w:pPr>
       <w:r>
+        <w:t xml:space="preserve">Li, Y., Kim, K., Cucuringu, M., &amp; Ma, S. (2026). Can LLM-based financial investing strategies outperform the market in long run? In </w:t>
+      </w:r>
+      <w:r>
+        <w:rPr>
+          <w:i/>
+        </w:rPr>
+        <w:t>Proceedings of the 32nd ACM SIGKDD Conference on Knowledge Discovery and Data Mining</w:t>
+      </w:r>
+      <w:r>
+        <w:t xml:space="preserve"> (pp. 2711–2722). https://doi.org/10.1145/3770854.3785702</w:t>
+      </w:r>
+    </w:p>
+    <w:p>
+      <w:pPr>
+        <w:pStyle w:val="Normal"/>
+        <w:ind w:left="425" w:hanging="425"/>
+        <w:jc w:val="left"/>
+      </w:pPr>
+      <w:r>
         <w:t xml:space="preserve">López de Prado, M. (2018). </w:t>
       </w:r>
       <w:r>
@@ -6719,6 +6735,63 @@
       </w:r>
       <w:r>
         <w:t>(3), 45–77. https://doi.org/10.2753/MIS0742-1222240302</w:t>
+      </w:r>
+    </w:p>
+    <w:p>
+      <w:pPr>
+        <w:pStyle w:val="Normal"/>
+        <w:ind w:left="425" w:hanging="425"/>
+        <w:jc w:val="left"/>
+      </w:pPr>
+      <w:r>
+        <w:t xml:space="preserve">Pelster, M., &amp; Val, J. (2024). Can ChatGPT assist in picking stocks? </w:t>
+      </w:r>
+      <w:r>
+        <w:rPr>
+          <w:i/>
+        </w:rPr>
+        <w:t>Finance Research Letters, 59</w:t>
+      </w:r>
+      <w:r>
+        <w:t>, 104786. https://doi.org/10.1016/j.frl.2023.104786</w:t>
+      </w:r>
+    </w:p>
+    <w:p>
+      <w:pPr>
+        <w:pStyle w:val="Normal"/>
+        <w:ind w:left="425" w:hanging="425"/>
+        <w:jc w:val="left"/>
+      </w:pPr>
+      <w:r>
+        <w:t xml:space="preserve">Perlin, M. S., Foguesatto, C. R., Müller, F. M., &amp; Righi, M. B. (2025). Can AI beat a naive portfolio? An experiment with anonymized data. </w:t>
+      </w:r>
+      <w:r>
+        <w:rPr>
+          <w:i/>
+        </w:rPr>
+        <w:t>Finance Research Letters</w:t>
+      </w:r>
+      <w:r>
+        <w:t>, 107126. https://doi.org/10.1016/j.frl.2025.107126</w:t>
+      </w:r>
+    </w:p>
+    <w:p>
+      <w:pPr>
+        <w:pStyle w:val="Normal"/>
+        <w:ind w:left="425" w:hanging="425"/>
+        <w:jc w:val="left"/>
+      </w:pPr>
+      <w:r>
+        <w:t xml:space="preserve">Yu, Y., Yao, H., Jiang, H., Lu, Y., Cao, Y., Yan, D., &amp; Zhuang, F. (2024). FinCon: A synthesized LLM multi-agent system with conceptual verbal reinforcement for enhanced financial decision making. In </w:t>
+      </w:r>
+      <w:r>
+        <w:rPr>
+          <w:i/>
+        </w:rPr>
+        <w:t>Advances in Neural Information Processing Systems 37</w:t>
+      </w:r>
+      <w:r>
+        <w:t>. https://doi.org/10.52202/079017-4354</w:t>
       </w:r>
     </w:p>
     <w:sectPr>

</xml_diff>

<commit_message>
Fecha auditoria de eventos e consolida artigos finais
</commit_message>
<xml_diff>
--- a/outputs/Benevente_Wealth_System_BTECH_Final.docx
+++ b/outputs/Benevente_Wealth_System_BTECH_Final.docx
@@ -35,7 +35,7 @@
         <w:jc w:val="center"/>
       </w:pPr>
       <w:r>
-        <w:t>Fucape Business School, Vitória, ES, Brasil</w:t>
+        <w:t>Pesquisador, Fucape Business School, Vitória, ES, Brasil, 214411949+diegogallina1@users.noreply.github.com</w:t>
       </w:r>
     </w:p>
     <w:p>
@@ -59,7 +59,7 @@
         <w:ind w:firstLine="0"/>
       </w:pPr>
       <w:r>
-        <w:t>Decisões de carteira precisam continuar explicáveis depois de executadas. Este trabalho constrói e avalia o Benevente Wealth System, um artefato de apoio à decisão que reúne, no mesmo registro, os dados admitidos, a regra quantitativa, a carteira proposta, a explicação e a aprovação humana. A pesquisa segue design science e avalia o artefato por testes funcionais, auditoria adversarial e um diagnóstico histórico sequencial de onze decisões entre 2015 e 2025. A auditoria encontrou sete defeitos capazes de inflar resultados e revelou uma limitação material: 13,9% da exposição acumulada a ações selecionadas dependeu de séries com proventos imputados. Por isso, o retorno histórico é apresentado como diagnóstico de desenvolvimento, não como validação comercial. Uma reamostragem pareada indica estabilidade interna, mas os intervalos de 95% do excesso de retorno cruzam zero contra CDI, Ibovespa e BOVA11. O protocolo prospectivo foi congelado em 16 de agosto de 2026 e ainda não possui observações suficientes para conclusão. O modelo de linguagem não demonstrou ganho de retorno e permanece restrito à explicação. A contribuição comprovada é a separação verificável entre dado, cálculo, linguagem e responsabilidade.</w:t>
+        <w:t>Decisões de carteira precisam continuar explicáveis depois de executadas. Este trabalho constrói e avalia o Benevente Wealth System, um artefato que registra os dados admitidos, a regra quantitativa, a carteira proposta, a explicação e a aprovação humana. A pesquisa segue design science e combina testes funcionais, auditoria adversarial e diagnóstico sequencial de onze decisões entre 2015 e 2025. Sete defeitos capazes de inflar resultados foram corrigidos. A auditoria também revelou que 13,9% da exposição acumulada a ações dependia de proventos imputados. A tentativa de reconstruir 56 observações ativo-ano com fechamentos brutos e eventos da página atual da B3 comparou 54, encontrou sete divergências superiores a cinco pontos percentuais e deixou duas sem resposta. O sistema recusou o selo de reconciliação. Os retornos são, portanto, diagnóstico de desenvolvimento, não validação comercial. Na reamostragem pareada, os intervalos de 95% do excesso de retorno cruzam zero contra CDI, Ibovespa e BOVA11. O Benevente 1 foi registrado em 16 de agosto de 2026; extensões posteriores não herdam essa data. O modelo de linguagem não demonstrou ganho de retorno e permanece restrito à explicação. A contribuição comprovada é separar, de forma verificável, dado, cálculo, linguagem e responsabilidade.</w:t>
       </w:r>
     </w:p>
     <w:p>
@@ -99,7 +99,7 @@
         <w:pStyle w:val="Normal"/>
       </w:pPr>
       <w:r>
-        <w:t>O problema é concreto e tem data. Quando um cliente pergunta em 2026 por que determinada ação entrou na carteira em janeiro de 2023, o escritório precisa demonstrar três coisas simultaneamente.</w:t>
+        <w:t>Quando um cliente pergunta por que uma ação entrou na carteira anos antes, o escritório precisa demonstrar três coisas.</w:t>
       </w:r>
     </w:p>
     <w:p>
@@ -229,14 +229,6 @@
       </w:pPr>
       <w:r>
         <w:t>Essas escolhas definem o tipo de evidência que o trabalho pode produzir. O backtest é um experimento histórico sobre um protocolo e não uma simulação da experiência individual de todo cliente. Suitability, necessidade de liquidez, tributação específica, ativos já detidos e restrições contratuais podem mudar a carteira implementável. Por isso, o artefato separa três objetos que costumam aparecer misturados: a regra acadêmica usada para medir o sinal; a política institucional que limita o risco; e o texto explicativo que ajuda uma pessoa a revisar a decisão. Uma boa curva não substitui nenhum dos três.</w:t>
-      </w:r>
-    </w:p>
-    <w:p>
-      <w:pPr>
-        <w:pStyle w:val="Normal"/>
-      </w:pPr>
-      <w:r>
-        <w:t>O posicionamento do artefato decorre desses três pontos. O Benevente não é apresentado como gerador comprovado de alfa. Seu diferencial verificável é manter unidos os insumos, a regra, a explicação e a aprovação. O diagnóstico histórico serve para pressionar essa arquitetura e revelar erros, inclusive quando a correção piora o resultado publicado.</w:t>
       </w:r>
     </w:p>
     <w:p>
@@ -879,7 +871,7 @@
         <w:pStyle w:val="Normal"/>
       </w:pPr>
       <w:r>
-        <w:t>Preços deslistados exigem tratamento de eventos societários sem a ajuda do provedor. A primeira versão detectava razões de preço redondas e obteve precisão de 88,1%, mas recall de apenas 23,3% contra o arquivo de eventos disponível. Para retirar essa heurística da posição de fonte principal, uma nova rotina consultou diretamente os registros públicos da B3 e arquivou 18.190 dividendos, juros sobre capital próprio, desdobramentos, grupamentos, bonificações e eventos manuais. A consulta cobriu 475 de 497 ativos do painel. Vinte e dois códigos não foram devolvidos pela página atual e 271 eventos, entre eles 218 subscrições, ainda exigem resolução de direitos e conversões. A série publicada não foi requalificada: ela continua como dado de pesquisa até ser reconstruída desde o preço bruto, com cobertura integral e cada evento aplicado em relatório próprio.</w:t>
+        <w:t>Preços deslistados exigem tratamento de eventos societários sem a ajuda do provedor. A primeira versão detectava razões de preço redondas e obteve precisão de 88,1%, mas recall de apenas 23,3% contra o arquivo de eventos disponível. Para retirar essa heurística da posição de fonte principal, uma nova rotina consultou diretamente a página pública da B3 (B3, 2026b). A página respondeu para 475 das 497 séries. Depois de excluir eventos anteriores ao intervalo realmente observado de cada código, o arquivo contém 9.772 registros, 127 subscrições e 153 eventos manuais. Vinte e dois códigos não foram devolvidos. A auditoria também corrigiu uma interpretação indevida: resposta do endpoint não significa cobertura histórica completa. Entre as 56 observações ativo-ano efetivamente mantidas, 54 puderam ser reconstruídas com o arquivo atual; sete divergiram do retorno ajustado publicado em mais de cinco pontos percentuais e duas observações de MRFG3 ficaram sem resposta. Nenhum evento manual coincidiu com uma posição aberta. A série publicada não foi requalificada: ela continua como dado de pesquisa até que uma base histórica primária ou licenciada consiga reproduzir cada retorno desde o preço bruto.</w:t>
       </w:r>
     </w:p>
     <w:p>
@@ -1199,7 +1191,7 @@
         </w:numPr>
       </w:pPr>
       <w:r>
-        <w:t>Ibovespa, índice de retorno total que incorpora os proventos da carteira teórica e, por isso, é comparável a uma carteira que os reinveste (B3, 2026b).</w:t>
+        <w:t>Ibovespa, índice de retorno total que incorpora os proventos da carteira teórica e, por isso, é comparável a uma carteira que os reinveste (B3, 2026c).</w:t>
       </w:r>
     </w:p>
     <w:p>
@@ -1305,7 +1297,7 @@
         <w:pStyle w:val="Normal"/>
       </w:pPr>
       <w:r>
-        <w:t>O protocolo prospectivo foi congelado em 16 de agosto de 2026, com hash e data registrados no repositório. A política precisa superar, após imposto, o CDI e o ETF investível de mercado, manter queda máxima inferior a 35% e acumular pelo menos três anos antes de uma conclusão. Não existe resultado prospectivo suficiente na data deste artigo. Essa ausência é um resultado de estágio do projeto, não uma lacuna a preencher com o histórico. A regra registrada não poderá ser alterada depois de observado um ano desfavorável sem que a mudança constitua um novo protocolo e uma nova contagem.</w:t>
+        <w:t>A versão anual Benevente 1 foi registrada em 16 de agosto de 2026, com hash e data no repositório. O Benevente 2 e o protocolo de acompanhamento receberam registros próprios depois das respectivas mudanças. A política avaliada precisa superar, após imposto, o CDI e o ETF investível de mercado, manter queda máxima inferior a 35% e acumular pelo menos três anos antes de uma conclusão. Não existe resultado prospectivo suficiente na data deste artigo. A carteira formada em janeiro de 2026 é apenas carteira-sombra, pois antecede os registros. Uma regra não poderá ser alterada depois de observado um resultado desfavorável sem que a mudança constitua nova versão e nova contagem.</w:t>
       </w:r>
     </w:p>
     <w:p>
@@ -4335,6 +4327,14 @@
     <w:p>
       <w:pPr>
         <w:pStyle w:val="Normal"/>
+      </w:pPr>
+      <w:r>
+        <w:t>A futura extensão Benevente 3 avaliará prospectivamente fidelidade, completude, cobertura de riscos e números inventados. Ela não seleciona ativos nem herda os resultados das versões 1 e 2.</w:t>
+      </w:r>
+    </w:p>
+    <w:p>
+      <w:pPr>
+        <w:pStyle w:val="Normal"/>
         <w:ind w:firstLine="0"/>
         <w:numPr>
           <w:ilvl w:val="0"/>
@@ -4786,7 +4786,7 @@
         <w:pStyle w:val="Normal"/>
       </w:pPr>
       <w:r>
-        <w:t>A conclusão de produto é direta. O modelo organiza e explica decisões, mas não as gera. Qualquer futuro uso em sinal, ranking ou peso terá de começar depois do protocolo congelado em 16 de agosto de 2026 e ser comparado prospectivamente ao controle determinístico.</w:t>
+        <w:t>A conclusão de produto é direta. O modelo organiza e explica decisões, mas não as gera. Qualquer futuro uso em sinal, ranking ou peso terá de começar depois do registro específico da versão avaliada e ser comparado prospectivamente ao controle determinístico.</w:t>
       </w:r>
     </w:p>
     <w:p>
@@ -6190,7 +6190,7 @@
         <w:pStyle w:val="Normal"/>
       </w:pPr>
       <w:r>
-        <w:t>A segunda limitação está nos dados. A coleta primária avançou para 18.190 eventos e 95,6% dos ativos do painel, mas 22 códigos e 271 eventos manuais ainda bloqueiam a reconciliação integral. Papéis sem cobertura completa recebem, em casos identificados, uma distribuição imputada pela mediana transversal do ano. Essa fragilidade atingiu 13,9% da exposição acumulada a ações e 50% da carteira total em 2020. O novo arquivo melhora a auditabilidade, mas o resultado só poderá ser recalculado e comparado quando o preço bruto, o evento e a conversão estiverem ligados sem lacunas.</w:t>
+        <w:t>A segunda limitação está nos dados. A página atual da B3 respondeu para 95,6% das séries consultadas, mas esse percentual mede resposta do serviço, não completude histórica. A reconstrução das posições efetivamente mantidas encontrou sete diferenças materiais em 54 comparações e duas observações sem resposta. Papéis sem cobertura completa recebem, em casos identificados, uma distribuição imputada pela mediana transversal do ano. Essa fragilidade atingiu 13,9% da exposição acumulada a ações e 50% da carteira total em 2020. O novo arquivo melhora a auditabilidade porque permite reprovar a própria reconciliação; não transforma a curva em evidência institucional.</w:t>
       </w:r>
     </w:p>
     <w:p>
@@ -6222,7 +6222,7 @@
         <w:pStyle w:val="Normal"/>
       </w:pPr>
       <w:r>
-        <w:t>O passo científico prioritário é acumular decisões depois do registro congelado. Em paralelo, a pesquisa deve completar os 22 códigos e resolver os 271 eventos manuais antes de reconstruir o retorno. A reamostragem em blocos já mede dependência serial curta; testes seguintes devem acrescentar trajetórias sintéticas com regimes de baixa prolongada que não estejam limitadas à ordem histórica. Simulação não substitui observação futura. Um estudo com notícias deve ser registrado como braço separado, com frequência trimestral ou orientada a eventos e horário verificável. O passo de produto é um piloto silencioso, sem execução automática, capaz de medir tempo, completude documental, divergência de custos, compreensão do usuário e disposição a pagar.</w:t>
+        <w:t>O passo científico prioritário é acumular decisões depois do registro congelado. Em paralelo, uma versão institucional precisará adquirir ou construir um livro histórico de eventos capaz de cobrir os 22 códigos não devolvidos e reproduzir as sete diferenças materiais encontradas no escopo da estratégia. A reamostragem em blocos já mede dependência serial curta; testes seguintes devem acrescentar trajetórias sintéticas com regimes de baixa prolongada que não estejam limitadas à ordem histórica. Simulação não substitui observação futura. Um estudo com notícias deve ser registrado como braço separado, com frequência trimestral ou orientada a eventos e horário verificável. O passo de produto é um piloto silencioso, sem execução automática, capaz de medir tempo, completude documental, divergência de custos, compreensão do usuário e disposição a pagar.</w:t>
       </w:r>
     </w:p>
     <w:p>
@@ -6254,7 +6254,7 @@
         <w:pStyle w:val="Normal"/>
       </w:pPr>
       <w:r>
-        <w:t>A conclusão comprovada é mais estreita e mais defensável que a versão anterior do artigo: o artefato cria uma cadeia auditável e usa essa cadeia para descobrir erros que mudam o próprio resultado. A viabilidade comercial será confirmada somente se um piloto mostrar ganho de tempo, completude documental, compreensão e disposição a pagar. A validade financeira exigirá completar a reconciliação primária e acumular dados posteriores ao registro; a política de risco começa sua amostra confirmatória em 2027. Até lá, o desempenho histórico permanece diagnóstico de desenvolvimento.</w:t>
+        <w:t>A conclusão comprovada é mais estreita e mais defensável que a versão anterior do artigo: o artefato cria uma cadeia auditável e usa essa cadeia para descobrir erros que mudam o próprio resultado. A tentativa de reconciliação é parte desse resultado porque o sistema recusou uma fonte primária incapaz de reproduzir integralmente a série publicada. A viabilidade comercial será confirmada somente se um piloto mostrar ganho de tempo, completude documental, compreensão e disposição a pagar. A validade financeira exigirá uma base histórica reconciliável e dados posteriores ao registro; a política de risco começa sua amostra confirmatória em 2027. Até lá, o desempenho histórico permanece diagnóstico de desenvolvimento.</w:t>
       </w:r>
     </w:p>
     <w:p>
@@ -6270,7 +6270,7 @@
         <w:pStyle w:val="Normal"/>
       </w:pPr>
       <w:r>
-        <w:t>O código de reprodução, os testes, os manifestos criptográficos e os arquivos que sustentam os resultados estão disponíveis no repositório público do projeto, em https://github.com/diegogallina1/benevente. A demonstração web do artefato está disponível em https://benevente-wealth-system.vercel.app/. O repositório identifica as fontes, as limitações de cobertura e os comandos necessários para reproduzir as avaliações.</w:t>
+        <w:t>O código, os testes, os manifestos e os arquivos de evidência estão em https://github.com/diegogallina1/benevente. A demonstração está em https://benevente-wealth-system.vercel.app/. O repositório documenta fontes, limitações e comandos de reprodução.</w:t>
       </w:r>
     </w:p>
     <w:p>
@@ -6365,6 +6365,25 @@
       </w:pPr>
       <w:r>
         <w:t xml:space="preserve">B3 S.A. – Brasil, Bolsa, Balcão. (2026b). </w:t>
+      </w:r>
+      <w:r>
+        <w:rPr>
+          <w:i/>
+        </w:rPr>
+        <w:t>Dividendos e outros eventos corporativos</w:t>
+      </w:r>
+      <w:r>
+        <w:t>. https://sistemaswebb3-listados.b3.com.br/dividensOtherCorpActPage/</w:t>
+      </w:r>
+    </w:p>
+    <w:p>
+      <w:pPr>
+        <w:pStyle w:val="Normal"/>
+        <w:ind w:left="425" w:hanging="425"/>
+        <w:jc w:val="left"/>
+      </w:pPr>
+      <w:r>
+        <w:t xml:space="preserve">B3 S.A. – Brasil, Bolsa, Balcão. (2026c). </w:t>
       </w:r>
       <w:r>
         <w:rPr>

</xml_diff>

<commit_message>
Consolida Benevente 2, site e manuscritos finais
</commit_message>
<xml_diff>
--- a/outputs/Benevente_Wealth_System_BTECH_Final.docx
+++ b/outputs/Benevente_Wealth_System_BTECH_Final.docx
@@ -35,7 +35,7 @@
         <w:jc w:val="center"/>
       </w:pPr>
       <w:r>
-        <w:t>Pesquisador, Fucape Business School, Vitória, ES, Brasil, 214411949+diegogallina1@users.noreply.github.com</w:t>
+        <w:t>Pesquisador, Fucape Business School, Vitória, ES, Brasil, diego@wisesearch.com</w:t>
       </w:r>
     </w:p>
     <w:p>
@@ -59,7 +59,7 @@
         <w:ind w:firstLine="0"/>
       </w:pPr>
       <w:r>
-        <w:t>Decisões de carteira precisam continuar explicáveis depois de executadas. Este trabalho constrói e avalia o Benevente Wealth System, um artefato que registra os dados admitidos, a regra quantitativa, a carteira proposta, a explicação e a aprovação humana. A pesquisa segue design science e combina testes funcionais, auditoria adversarial e diagnóstico sequencial de onze decisões entre 2015 e 2025. Sete defeitos capazes de inflar resultados foram corrigidos. A auditoria também revelou que 13,9% da exposição acumulada a ações dependia de proventos imputados. A tentativa de reconstruir 56 observações ativo-ano com fechamentos brutos e eventos da página atual da B3 comparou 54, encontrou sete divergências superiores a cinco pontos percentuais e deixou duas sem resposta. O sistema recusou o selo de reconciliação. Os retornos são, portanto, diagnóstico de desenvolvimento, não validação comercial. Na reamostragem pareada, os intervalos de 95% do excesso de retorno cruzam zero contra CDI, Ibovespa e BOVA11. O Benevente 1 foi registrado em 16 de agosto de 2026; extensões posteriores não herdam essa data. O modelo de linguagem não demonstrou ganho de retorno e permanece restrito à explicação. A contribuição comprovada é separar, de forma verificável, dado, cálculo, linguagem e responsabilidade.</w:t>
+        <w:t>Decisões de carteira precisam continuar explicáveis depois de executadas. Este trabalho constrói e avalia o Benevente Wealth System, um artefato que registra os dados admitidos, a regra quantitativa, a carteira proposta, a explicação e a aprovação humana. A pesquisa segue design science e combina testes funcionais, auditoria adversarial e diagnóstico sequencial de onze decisões entre 2015 e 2025. Sete controles capazes de impedir inflação artificial dos resultados foram incorporados. A auditoria também revelou que 13,9% da exposição acumulada a ações dependia de proventos imputados. A tentativa de reconstruir 56 observações ativo-ano com fechamentos brutos e eventos da página atual da B3 comparou 54, encontrou sete divergências superiores a cinco pontos percentuais e deixou duas sem resposta. O sistema recusou o selo de reconciliação. Os retornos são, portanto, diagnóstico de desenvolvimento, não validação comercial. Na reamostragem pareada, os intervalos de 95% do excesso de retorno cruzam zero contra CDI e Ibovespa. O Benevente 1 foi registrado em 16 de agosto de 2026; extensões posteriores não herdam essa data. O modelo de linguagem não demonstrou ganho de retorno e permanece restrito à explicação. A contribuição comprovada é separar, de forma verificável, dado, cálculo, linguagem e responsabilidade.</w:t>
       </w:r>
     </w:p>
     <w:p>
@@ -968,7 +968,7 @@
         <w:pStyle w:val="Normal"/>
       </w:pPr>
       <w:r>
-        <w:t>Notícias não entram no modelo atual. Esse limite é intencional: um estudo com notícias exige arquivo histórico licenciado, horário de publicação, deduplicação e uma data de corte verificável para o modelo de linguagem. Misturar notícias retrospectivamente ao protocolo anual criaria uma nova oportunidade de usar informação futura. O estudo futuro adequado é um braço separado, pré-registrado, com revisão trimestral ou por evento e notícias carimbadas no tempo, comparado à regra anual sem alterar esta última.</w:t>
+        <w:t>Notícias não entram no retorno histórico deste estudo. No acompanhamento corrente, um radar com Gemini lê fontes públicas, deduplica ocorrências e classifica alertas para revisão humana. Ele não altera ativos nem pesos. Avaliar se notícias acrescentam valor preditivo exige um braço prospectivo separado, com horário de publicação, corte verificável e decisões arquivadas antes do desfecho. Misturar notícias retrospectivamente ao protocolo anual criaria uma nova oportunidade de usar informação futura.</w:t>
       </w:r>
     </w:p>
     <w:p>
@@ -1165,7 +1165,7 @@
         <w:pStyle w:val="Normal"/>
       </w:pPr>
       <w:r>
-        <w:t>Quatro referências foram calculadas de forma independente.</w:t>
+        <w:t>Três referências foram calculadas de forma independente.</w:t>
       </w:r>
     </w:p>
     <w:p>
@@ -1204,19 +1204,6 @@
         </w:numPr>
       </w:pPr>
       <w:r>
-        <w:t>BOVA11, ETF negociável que busca acompanhar o Ibovespa e permite observar uma implementação passiva sujeita a taxa, custos de negociação e diferença de aderência (BlackRock, 2026).</w:t>
-      </w:r>
-    </w:p>
-    <w:p>
-      <w:pPr>
-        <w:pStyle w:val="Normal"/>
-        <w:ind w:firstLine="0"/>
-        <w:numPr>
-          <w:ilvl w:val="0"/>
-          <w:numId w:val="1"/>
-        </w:numPr>
-      </w:pPr>
-      <w:r>
         <w:t>Otimização média-variância sobre o mesmo universo elegível. Esse método estima retorno médio e covariância com dados anteriores e escolhe pesos que maximizam a relação entre retorno esperado e risco sob os mesmos limites de elegibilidade.</w:t>
       </w:r>
     </w:p>
@@ -1233,7 +1220,7 @@
         <w:pStyle w:val="Normal"/>
       </w:pPr>
       <w:r>
-        <w:t>Ibovespa e BOVA11 não são duplicatas. O primeiro mede o retorno total de uma carteira teórica e estabelece a referência econômica do mercado. O segundo representa um caminho efetivamente negociável para buscar essa exposição. A pequena diferença entre as duas séries é informativa, pois reúne taxa, fricções operacionais e erro de aderência. Todos os comparadores usam as mesmas datas de início e fim da carteira.</w:t>
+        <w:t>O Ibovespa mede o retorno total de uma carteira teórica e estabelece a referência econômica do mercado. Não é diretamente investível, mas evita duplicar no texto duas séries quase idênticas. Todos os comparadores usam as mesmas datas de início e fim da carteira.</w:t>
       </w:r>
     </w:p>
     <w:p>
@@ -1297,7 +1284,7 @@
         <w:pStyle w:val="Normal"/>
       </w:pPr>
       <w:r>
-        <w:t>A versão anual Benevente 1 foi registrada em 16 de agosto de 2026, com hash e data no repositório. O Benevente 2 e o protocolo de acompanhamento receberam registros próprios depois das respectivas mudanças. A política avaliada precisa superar, após imposto, o CDI e o ETF investível de mercado, manter queda máxima inferior a 35% e acumular pelo menos três anos antes de uma conclusão. Não existe resultado prospectivo suficiente na data deste artigo. A carteira formada em janeiro de 2026 é apenas carteira-sombra, pois antecede os registros. Uma regra não poderá ser alterada depois de observado um resultado desfavorável sem que a mudança constitua nova versão e nova contagem.</w:t>
+        <w:t>A versão anual Benevente 1 foi registrada em 16 de agosto de 2026, com hash e data no repositório. O Benevente 2 e o protocolo de acompanhamento receberam registros próprios depois das respectivas mudanças. O Benevente 2 é a estratégia principal em acompanhamento, enquanto o Benevente 1 permanece como base de seleção anual. Para sustentar uma conclusão futura, a versão precisa superar CDI e Ibovespa após custos e tributos aplicáveis, manter queda máxima inferior a 35% e acumular pelo menos três anos de observações posteriores ao registro. Não existe resultado prospectivo suficiente na data deste artigo. A carteira formada em janeiro de 2026 é apenas carteira-sombra, pois antecede os registros. Uma regra não poderá ser alterada depois de observado um resultado desfavorável sem que a mudança constitua nova versão e nova contagem.</w:t>
       </w:r>
     </w:p>
     <w:p>
@@ -1372,11 +1359,11 @@
         </w:tblBorders>
       </w:tblPr>
       <w:tblGrid>
-        <w:gridCol w:w="2332"/>
-        <w:gridCol w:w="1615"/>
-        <w:gridCol w:w="2243"/>
-        <w:gridCol w:w="1166"/>
-        <w:gridCol w:w="1704"/>
+        <w:gridCol w:w="2826"/>
+        <w:gridCol w:w="1496"/>
+        <w:gridCol w:w="2078"/>
+        <w:gridCol w:w="1081"/>
+        <w:gridCol w:w="1579"/>
       </w:tblGrid>
       <w:tr>
         <w:trPr>
@@ -1385,7 +1372,7 @@
         </w:trPr>
         <w:tc>
           <w:tcPr>
-            <w:tcW w:type="dxa" w:w="2332"/>
+            <w:tcW w:type="dxa" w:w="2826"/>
             <w:vAlign w:val="center"/>
             <w:tcBorders>
               <w:bottom w:val="single" w:sz="8" w:color="000000"/>
@@ -1410,7 +1397,7 @@
         </w:tc>
         <w:tc>
           <w:tcPr>
-            <w:tcW w:type="dxa" w:w="1615"/>
+            <w:tcW w:type="dxa" w:w="1496"/>
             <w:vAlign w:val="center"/>
             <w:tcBorders>
               <w:bottom w:val="single" w:sz="8" w:color="000000"/>
@@ -1435,7 +1422,7 @@
         </w:tc>
         <w:tc>
           <w:tcPr>
-            <w:tcW w:type="dxa" w:w="2243"/>
+            <w:tcW w:type="dxa" w:w="2078"/>
             <w:vAlign w:val="center"/>
             <w:tcBorders>
               <w:bottom w:val="single" w:sz="8" w:color="000000"/>
@@ -1460,7 +1447,7 @@
         </w:tc>
         <w:tc>
           <w:tcPr>
-            <w:tcW w:type="dxa" w:w="1166"/>
+            <w:tcW w:type="dxa" w:w="1081"/>
             <w:vAlign w:val="center"/>
             <w:tcBorders>
               <w:bottom w:val="single" w:sz="8" w:color="000000"/>
@@ -1485,7 +1472,7 @@
         </w:tc>
         <w:tc>
           <w:tcPr>
-            <w:tcW w:type="dxa" w:w="1704"/>
+            <w:tcW w:type="dxa" w:w="1579"/>
             <w:vAlign w:val="center"/>
             <w:tcBorders>
               <w:bottom w:val="single" w:sz="8" w:color="000000"/>
@@ -1515,7 +1502,7 @@
         </w:trPr>
         <w:tc>
           <w:tcPr>
-            <w:tcW w:type="dxa" w:w="2332"/>
+            <w:tcW w:type="dxa" w:w="2826"/>
             <w:vAlign w:val="center"/>
           </w:tcPr>
           <w:p>
@@ -1536,7 +1523,7 @@
         </w:tc>
         <w:tc>
           <w:tcPr>
-            <w:tcW w:type="dxa" w:w="1615"/>
+            <w:tcW w:type="dxa" w:w="1496"/>
             <w:vAlign w:val="center"/>
           </w:tcPr>
           <w:p>
@@ -1557,7 +1544,7 @@
         </w:tc>
         <w:tc>
           <w:tcPr>
-            <w:tcW w:type="dxa" w:w="2243"/>
+            <w:tcW w:type="dxa" w:w="2078"/>
             <w:vAlign w:val="center"/>
           </w:tcPr>
           <w:p>
@@ -1578,21 +1565,21 @@
         </w:tc>
         <w:tc>
           <w:tcPr>
-            <w:tcW w:type="dxa" w:w="1166"/>
-            <w:vAlign w:val="center"/>
-          </w:tcPr>
-          <w:p>
-            <w:pPr>
-              <w:keepNext/>
-              <w:spacing w:line="240" w:lineRule="auto" w:after="0"/>
-              <w:ind w:firstLine="0"/>
-              <w:jc w:val="left"/>
-            </w:pPr>
-          </w:p>
-        </w:tc>
-        <w:tc>
-          <w:tcPr>
-            <w:tcW w:type="dxa" w:w="1704"/>
+            <w:tcW w:type="dxa" w:w="1081"/>
+            <w:vAlign w:val="center"/>
+          </w:tcPr>
+          <w:p>
+            <w:pPr>
+              <w:keepNext/>
+              <w:spacing w:line="240" w:lineRule="auto" w:after="0"/>
+              <w:ind w:firstLine="0"/>
+              <w:jc w:val="left"/>
+            </w:pPr>
+          </w:p>
+        </w:tc>
+        <w:tc>
+          <w:tcPr>
+            <w:tcW w:type="dxa" w:w="1579"/>
             <w:vAlign w:val="center"/>
           </w:tcPr>
           <w:p>
@@ -1618,93 +1605,100 @@
         </w:trPr>
         <w:tc>
           <w:tcPr>
-            <w:tcW w:type="dxa" w:w="2332"/>
-            <w:vAlign w:val="center"/>
-          </w:tcPr>
-          <w:p>
-            <w:pPr>
-              <w:keepNext/>
-              <w:spacing w:line="240" w:lineRule="auto" w:after="0"/>
-              <w:ind w:firstLine="0"/>
-              <w:jc w:val="left"/>
-            </w:pPr>
-            <w:r>
-              <w:rPr>
-                <w:rFonts w:ascii="Times New Roman" w:hAnsi="Times New Roman"/>
-                <w:sz w:val="17"/>
-              </w:rPr>
-              <w:t>Benevente, após IR</w:t>
-            </w:r>
-          </w:p>
-        </w:tc>
-        <w:tc>
-          <w:tcPr>
-            <w:tcW w:type="dxa" w:w="1615"/>
-            <w:vAlign w:val="center"/>
-          </w:tcPr>
-          <w:p>
-            <w:pPr>
-              <w:keepNext/>
-              <w:spacing w:line="240" w:lineRule="auto" w:after="0"/>
-              <w:ind w:firstLine="0"/>
-              <w:jc w:val="left"/>
-            </w:pPr>
-            <w:r>
-              <w:rPr>
-                <w:rFonts w:ascii="Times New Roman" w:hAnsi="Times New Roman"/>
-                <w:sz w:val="17"/>
-              </w:rPr>
-              <w:t>16,03%</w:t>
-            </w:r>
-          </w:p>
-        </w:tc>
-        <w:tc>
-          <w:tcPr>
-            <w:tcW w:type="dxa" w:w="2243"/>
-            <w:vAlign w:val="center"/>
-          </w:tcPr>
-          <w:p>
-            <w:pPr>
-              <w:keepNext/>
-              <w:spacing w:line="240" w:lineRule="auto" w:after="0"/>
-              <w:ind w:firstLine="0"/>
-              <w:jc w:val="left"/>
-            </w:pPr>
-            <w:r>
-              <w:rPr>
-                <w:rFonts w:ascii="Times New Roman" w:hAnsi="Times New Roman"/>
-                <w:sz w:val="17"/>
-              </w:rPr>
-              <w:t>R$ 513.052</w:t>
-            </w:r>
-          </w:p>
-        </w:tc>
-        <w:tc>
-          <w:tcPr>
-            <w:tcW w:type="dxa" w:w="1166"/>
-            <w:vAlign w:val="center"/>
-          </w:tcPr>
-          <w:p>
-            <w:pPr>
-              <w:keepNext/>
-              <w:spacing w:line="240" w:lineRule="auto" w:after="0"/>
-              <w:ind w:firstLine="0"/>
-              <w:jc w:val="left"/>
-            </w:pPr>
-          </w:p>
-        </w:tc>
-        <w:tc>
-          <w:tcPr>
-            <w:tcW w:type="dxa" w:w="1704"/>
-            <w:vAlign w:val="center"/>
-          </w:tcPr>
-          <w:p>
-            <w:pPr>
-              <w:keepNext/>
-              <w:spacing w:line="240" w:lineRule="auto" w:after="0"/>
-              <w:ind w:firstLine="0"/>
-              <w:jc w:val="left"/>
-            </w:pPr>
+            <w:tcW w:type="dxa" w:w="2826"/>
+            <w:vAlign w:val="center"/>
+          </w:tcPr>
+          <w:p>
+            <w:pPr>
+              <w:keepNext/>
+              <w:spacing w:line="240" w:lineRule="auto" w:after="0"/>
+              <w:ind w:firstLine="0"/>
+              <w:jc w:val="left"/>
+            </w:pPr>
+            <w:r>
+              <w:rPr>
+                <w:rFonts w:ascii="Times New Roman" w:hAnsi="Times New Roman"/>
+                <w:sz w:val="17"/>
+              </w:rPr>
+              <w:t>Benevente 2, antes do IR incremental</w:t>
+            </w:r>
+          </w:p>
+        </w:tc>
+        <w:tc>
+          <w:tcPr>
+            <w:tcW w:type="dxa" w:w="1496"/>
+            <w:vAlign w:val="center"/>
+          </w:tcPr>
+          <w:p>
+            <w:pPr>
+              <w:keepNext/>
+              <w:spacing w:line="240" w:lineRule="auto" w:after="0"/>
+              <w:ind w:firstLine="0"/>
+              <w:jc w:val="left"/>
+            </w:pPr>
+            <w:r>
+              <w:rPr>
+                <w:rFonts w:ascii="Times New Roman" w:hAnsi="Times New Roman"/>
+                <w:sz w:val="17"/>
+              </w:rPr>
+              <w:t>18,45%</w:t>
+            </w:r>
+          </w:p>
+        </w:tc>
+        <w:tc>
+          <w:tcPr>
+            <w:tcW w:type="dxa" w:w="2078"/>
+            <w:vAlign w:val="center"/>
+          </w:tcPr>
+          <w:p>
+            <w:pPr>
+              <w:keepNext/>
+              <w:spacing w:line="240" w:lineRule="auto" w:after="0"/>
+              <w:ind w:firstLine="0"/>
+              <w:jc w:val="left"/>
+            </w:pPr>
+            <w:r>
+              <w:rPr>
+                <w:rFonts w:ascii="Times New Roman" w:hAnsi="Times New Roman"/>
+                <w:sz w:val="17"/>
+              </w:rPr>
+              <w:t>R$ 643.774</w:t>
+            </w:r>
+          </w:p>
+        </w:tc>
+        <w:tc>
+          <w:tcPr>
+            <w:tcW w:type="dxa" w:w="1081"/>
+            <w:vAlign w:val="center"/>
+          </w:tcPr>
+          <w:p>
+            <w:pPr>
+              <w:keepNext/>
+              <w:spacing w:line="240" w:lineRule="auto" w:after="0"/>
+              <w:ind w:firstLine="0"/>
+              <w:jc w:val="left"/>
+            </w:pPr>
+          </w:p>
+        </w:tc>
+        <w:tc>
+          <w:tcPr>
+            <w:tcW w:type="dxa" w:w="1579"/>
+            <w:vAlign w:val="center"/>
+          </w:tcPr>
+          <w:p>
+            <w:pPr>
+              <w:keepNext/>
+              <w:spacing w:line="240" w:lineRule="auto" w:after="0"/>
+              <w:ind w:firstLine="0"/>
+              <w:jc w:val="left"/>
+            </w:pPr>
+            <w:r>
+              <w:rPr>
+                <w:rFonts w:ascii="Times New Roman" w:hAnsi="Times New Roman"/>
+                <w:sz w:val="17"/>
+              </w:rPr>
+              <w:t>−28,7%</w:t>
+            </w:r>
           </w:p>
         </w:tc>
       </w:tr>
@@ -1714,106 +1708,99 @@
         </w:trPr>
         <w:tc>
           <w:tcPr>
-            <w:tcW w:type="dxa" w:w="2332"/>
-            <w:vAlign w:val="center"/>
-          </w:tcPr>
-          <w:p>
-            <w:pPr>
-              <w:keepNext/>
-              <w:spacing w:line="240" w:lineRule="auto" w:after="0"/>
-              <w:ind w:firstLine="0"/>
-              <w:jc w:val="left"/>
-            </w:pPr>
-            <w:r>
-              <w:rPr>
-                <w:rFonts w:ascii="Times New Roman" w:hAnsi="Times New Roman"/>
-                <w:sz w:val="17"/>
-              </w:rPr>
-              <w:t>Ibovespa</w:t>
-            </w:r>
-          </w:p>
-        </w:tc>
-        <w:tc>
-          <w:tcPr>
-            <w:tcW w:type="dxa" w:w="1615"/>
-            <w:vAlign w:val="center"/>
-          </w:tcPr>
-          <w:p>
-            <w:pPr>
-              <w:keepNext/>
-              <w:spacing w:line="240" w:lineRule="auto" w:after="0"/>
-              <w:ind w:firstLine="0"/>
-              <w:jc w:val="left"/>
-            </w:pPr>
-            <w:r>
-              <w:rPr>
-                <w:rFonts w:ascii="Times New Roman" w:hAnsi="Times New Roman"/>
-                <w:sz w:val="17"/>
-              </w:rPr>
-              <w:t>11,77%</w:t>
-            </w:r>
-          </w:p>
-        </w:tc>
-        <w:tc>
-          <w:tcPr>
-            <w:tcW w:type="dxa" w:w="2243"/>
-            <w:vAlign w:val="center"/>
-          </w:tcPr>
-          <w:p>
-            <w:pPr>
-              <w:keepNext/>
-              <w:spacing w:line="240" w:lineRule="auto" w:after="0"/>
-              <w:ind w:firstLine="0"/>
-              <w:jc w:val="left"/>
-            </w:pPr>
-            <w:r>
-              <w:rPr>
-                <w:rFonts w:ascii="Times New Roman" w:hAnsi="Times New Roman"/>
-                <w:sz w:val="17"/>
-              </w:rPr>
-              <w:t>R$ 340.068</w:t>
-            </w:r>
-          </w:p>
-        </w:tc>
-        <w:tc>
-          <w:tcPr>
-            <w:tcW w:type="dxa" w:w="1166"/>
-            <w:vAlign w:val="center"/>
-          </w:tcPr>
-          <w:p>
-            <w:pPr>
-              <w:keepNext/>
-              <w:spacing w:line="240" w:lineRule="auto" w:after="0"/>
-              <w:ind w:firstLine="0"/>
-              <w:jc w:val="left"/>
-            </w:pPr>
-            <w:r>
-              <w:rPr>
-                <w:rFonts w:ascii="Times New Roman" w:hAnsi="Times New Roman"/>
-                <w:sz w:val="17"/>
-              </w:rPr>
-              <w:t>7 de 11</w:t>
-            </w:r>
-          </w:p>
-        </w:tc>
-        <w:tc>
-          <w:tcPr>
-            <w:tcW w:type="dxa" w:w="1704"/>
-            <w:vAlign w:val="center"/>
-          </w:tcPr>
-          <w:p>
-            <w:pPr>
-              <w:keepNext/>
-              <w:spacing w:line="240" w:lineRule="auto" w:after="0"/>
-              <w:ind w:firstLine="0"/>
-              <w:jc w:val="left"/>
-            </w:pPr>
-            <w:r>
-              <w:rPr>
-                <w:rFonts w:ascii="Times New Roman" w:hAnsi="Times New Roman"/>
-                <w:sz w:val="17"/>
-              </w:rPr>
-              <w:t>−47,0%</w:t>
+            <w:tcW w:type="dxa" w:w="2826"/>
+            <w:vAlign w:val="center"/>
+          </w:tcPr>
+          <w:p>
+            <w:pPr>
+              <w:keepNext/>
+              <w:spacing w:line="240" w:lineRule="auto" w:after="0"/>
+              <w:ind w:firstLine="0"/>
+              <w:jc w:val="left"/>
+            </w:pPr>
+            <w:r>
+              <w:rPr>
+                <w:rFonts w:ascii="Times New Roman" w:hAnsi="Times New Roman"/>
+                <w:sz w:val="17"/>
+              </w:rPr>
+              <w:t>Benevente 2, após estimativa do IR incremental¹</w:t>
+            </w:r>
+          </w:p>
+        </w:tc>
+        <w:tc>
+          <w:tcPr>
+            <w:tcW w:type="dxa" w:w="1496"/>
+            <w:vAlign w:val="center"/>
+          </w:tcPr>
+          <w:p>
+            <w:pPr>
+              <w:keepNext/>
+              <w:spacing w:line="240" w:lineRule="auto" w:after="0"/>
+              <w:ind w:firstLine="0"/>
+              <w:jc w:val="left"/>
+            </w:pPr>
+            <w:r>
+              <w:rPr>
+                <w:rFonts w:ascii="Times New Roman" w:hAnsi="Times New Roman"/>
+                <w:sz w:val="17"/>
+              </w:rPr>
+              <w:t>18,29%</w:t>
+            </w:r>
+          </w:p>
+        </w:tc>
+        <w:tc>
+          <w:tcPr>
+            <w:tcW w:type="dxa" w:w="2078"/>
+            <w:vAlign w:val="center"/>
+          </w:tcPr>
+          <w:p>
+            <w:pPr>
+              <w:keepNext/>
+              <w:spacing w:line="240" w:lineRule="auto" w:after="0"/>
+              <w:ind w:firstLine="0"/>
+              <w:jc w:val="left"/>
+            </w:pPr>
+            <w:r>
+              <w:rPr>
+                <w:rFonts w:ascii="Times New Roman" w:hAnsi="Times New Roman"/>
+                <w:sz w:val="17"/>
+              </w:rPr>
+              <w:t>R$ 634.531</w:t>
+            </w:r>
+          </w:p>
+        </w:tc>
+        <w:tc>
+          <w:tcPr>
+            <w:tcW w:type="dxa" w:w="1081"/>
+            <w:vAlign w:val="center"/>
+          </w:tcPr>
+          <w:p>
+            <w:pPr>
+              <w:keepNext/>
+              <w:spacing w:line="240" w:lineRule="auto" w:after="0"/>
+              <w:ind w:firstLine="0"/>
+              <w:jc w:val="left"/>
+            </w:pPr>
+          </w:p>
+        </w:tc>
+        <w:tc>
+          <w:tcPr>
+            <w:tcW w:type="dxa" w:w="1579"/>
+            <w:vAlign w:val="center"/>
+          </w:tcPr>
+          <w:p>
+            <w:pPr>
+              <w:keepNext/>
+              <w:spacing w:line="240" w:lineRule="auto" w:after="0"/>
+              <w:ind w:firstLine="0"/>
+              <w:jc w:val="left"/>
+            </w:pPr>
+            <w:r>
+              <w:rPr>
+                <w:rFonts w:ascii="Times New Roman" w:hAnsi="Times New Roman"/>
+                <w:sz w:val="17"/>
+              </w:rPr>
+              <w:t>−28,7%</w:t>
             </w:r>
           </w:p>
         </w:tc>
@@ -1824,107 +1811,93 @@
         </w:trPr>
         <w:tc>
           <w:tcPr>
-            <w:tcW w:type="dxa" w:w="2332"/>
-            <w:vAlign w:val="center"/>
-          </w:tcPr>
-          <w:p>
-            <w:pPr>
-              <w:keepNext/>
-              <w:spacing w:line="240" w:lineRule="auto" w:after="0"/>
-              <w:ind w:firstLine="0"/>
-              <w:jc w:val="left"/>
-            </w:pPr>
-            <w:r>
-              <w:rPr>
-                <w:rFonts w:ascii="Times New Roman" w:hAnsi="Times New Roman"/>
-                <w:sz w:val="17"/>
-              </w:rPr>
-              <w:t>BOVA11 (ETF investível)</w:t>
-            </w:r>
-          </w:p>
-        </w:tc>
-        <w:tc>
-          <w:tcPr>
-            <w:tcW w:type="dxa" w:w="1615"/>
-            <w:vAlign w:val="center"/>
-          </w:tcPr>
-          <w:p>
-            <w:pPr>
-              <w:keepNext/>
-              <w:spacing w:line="240" w:lineRule="auto" w:after="0"/>
-              <w:ind w:firstLine="0"/>
-              <w:jc w:val="left"/>
-            </w:pPr>
-            <w:r>
-              <w:rPr>
-                <w:rFonts w:ascii="Times New Roman" w:hAnsi="Times New Roman"/>
-                <w:sz w:val="17"/>
-              </w:rPr>
-              <w:t>11,72%</w:t>
-            </w:r>
-          </w:p>
-        </w:tc>
-        <w:tc>
-          <w:tcPr>
-            <w:tcW w:type="dxa" w:w="2243"/>
-            <w:vAlign w:val="center"/>
-          </w:tcPr>
-          <w:p>
-            <w:pPr>
-              <w:keepNext/>
-              <w:spacing w:line="240" w:lineRule="auto" w:after="0"/>
-              <w:ind w:firstLine="0"/>
-              <w:jc w:val="left"/>
-            </w:pPr>
-            <w:r>
-              <w:rPr>
-                <w:rFonts w:ascii="Times New Roman" w:hAnsi="Times New Roman"/>
-                <w:sz w:val="17"/>
-              </w:rPr>
-              <w:t>R$ 338.545</w:t>
-            </w:r>
-          </w:p>
-        </w:tc>
-        <w:tc>
-          <w:tcPr>
-            <w:tcW w:type="dxa" w:w="1166"/>
-            <w:vAlign w:val="center"/>
-          </w:tcPr>
-          <w:p>
-            <w:pPr>
-              <w:keepNext/>
-              <w:spacing w:line="240" w:lineRule="auto" w:after="0"/>
-              <w:ind w:firstLine="0"/>
-              <w:jc w:val="left"/>
-            </w:pPr>
-            <w:r>
-              <w:rPr>
-                <w:rFonts w:ascii="Times New Roman" w:hAnsi="Times New Roman"/>
-                <w:sz w:val="17"/>
-              </w:rPr>
-              <w:t>7 de 11</w:t>
-            </w:r>
-          </w:p>
-        </w:tc>
-        <w:tc>
-          <w:tcPr>
-            <w:tcW w:type="dxa" w:w="1704"/>
-            <w:vAlign w:val="center"/>
-          </w:tcPr>
-          <w:p>
-            <w:pPr>
-              <w:keepNext/>
-              <w:spacing w:line="240" w:lineRule="auto" w:after="0"/>
-              <w:ind w:firstLine="0"/>
-              <w:jc w:val="left"/>
-            </w:pPr>
-            <w:r>
-              <w:rPr>
-                <w:rFonts w:ascii="Times New Roman" w:hAnsi="Times New Roman"/>
-                <w:sz w:val="17"/>
-              </w:rPr>
-              <w:t>−47,2%</w:t>
-            </w:r>
+            <w:tcW w:type="dxa" w:w="2826"/>
+            <w:vAlign w:val="center"/>
+          </w:tcPr>
+          <w:p>
+            <w:pPr>
+              <w:keepNext/>
+              <w:spacing w:line="240" w:lineRule="auto" w:after="0"/>
+              <w:ind w:firstLine="0"/>
+              <w:jc w:val="left"/>
+            </w:pPr>
+            <w:r>
+              <w:rPr>
+                <w:rFonts w:ascii="Times New Roman" w:hAnsi="Times New Roman"/>
+                <w:sz w:val="17"/>
+              </w:rPr>
+              <w:t>Benevente 1, após modelo anual de IR</w:t>
+            </w:r>
+          </w:p>
+        </w:tc>
+        <w:tc>
+          <w:tcPr>
+            <w:tcW w:type="dxa" w:w="1496"/>
+            <w:vAlign w:val="center"/>
+          </w:tcPr>
+          <w:p>
+            <w:pPr>
+              <w:keepNext/>
+              <w:spacing w:line="240" w:lineRule="auto" w:after="0"/>
+              <w:ind w:firstLine="0"/>
+              <w:jc w:val="left"/>
+            </w:pPr>
+            <w:r>
+              <w:rPr>
+                <w:rFonts w:ascii="Times New Roman" w:hAnsi="Times New Roman"/>
+                <w:sz w:val="17"/>
+              </w:rPr>
+              <w:t>16,03%</w:t>
+            </w:r>
+          </w:p>
+        </w:tc>
+        <w:tc>
+          <w:tcPr>
+            <w:tcW w:type="dxa" w:w="2078"/>
+            <w:vAlign w:val="center"/>
+          </w:tcPr>
+          <w:p>
+            <w:pPr>
+              <w:keepNext/>
+              <w:spacing w:line="240" w:lineRule="auto" w:after="0"/>
+              <w:ind w:firstLine="0"/>
+              <w:jc w:val="left"/>
+            </w:pPr>
+            <w:r>
+              <w:rPr>
+                <w:rFonts w:ascii="Times New Roman" w:hAnsi="Times New Roman"/>
+                <w:sz w:val="17"/>
+              </w:rPr>
+              <w:t>R$ 513.052</w:t>
+            </w:r>
+          </w:p>
+        </w:tc>
+        <w:tc>
+          <w:tcPr>
+            <w:tcW w:type="dxa" w:w="1081"/>
+            <w:vAlign w:val="center"/>
+          </w:tcPr>
+          <w:p>
+            <w:pPr>
+              <w:keepNext/>
+              <w:spacing w:line="240" w:lineRule="auto" w:after="0"/>
+              <w:ind w:firstLine="0"/>
+              <w:jc w:val="left"/>
+            </w:pPr>
+          </w:p>
+        </w:tc>
+        <w:tc>
+          <w:tcPr>
+            <w:tcW w:type="dxa" w:w="1579"/>
+            <w:vAlign w:val="center"/>
+          </w:tcPr>
+          <w:p>
+            <w:pPr>
+              <w:keepNext/>
+              <w:spacing w:line="240" w:lineRule="auto" w:after="0"/>
+              <w:ind w:firstLine="0"/>
+              <w:jc w:val="left"/>
+            </w:pPr>
           </w:p>
         </w:tc>
       </w:tr>
@@ -1934,106 +1907,106 @@
         </w:trPr>
         <w:tc>
           <w:tcPr>
-            <w:tcW w:type="dxa" w:w="2332"/>
-            <w:vAlign w:val="center"/>
-          </w:tcPr>
-          <w:p>
-            <w:pPr>
-              <w:keepNext/>
-              <w:spacing w:line="240" w:lineRule="auto" w:after="0"/>
-              <w:ind w:firstLine="0"/>
-              <w:jc w:val="left"/>
-            </w:pPr>
-            <w:r>
-              <w:rPr>
-                <w:rFonts w:ascii="Times New Roman" w:hAnsi="Times New Roman"/>
-                <w:sz w:val="17"/>
-              </w:rPr>
-              <w:t>CDI</w:t>
-            </w:r>
-          </w:p>
-        </w:tc>
-        <w:tc>
-          <w:tcPr>
-            <w:tcW w:type="dxa" w:w="1615"/>
-            <w:vAlign w:val="center"/>
-          </w:tcPr>
-          <w:p>
-            <w:pPr>
-              <w:keepNext/>
-              <w:spacing w:line="240" w:lineRule="auto" w:after="0"/>
-              <w:ind w:firstLine="0"/>
-              <w:jc w:val="left"/>
-            </w:pPr>
-            <w:r>
-              <w:rPr>
-                <w:rFonts w:ascii="Times New Roman" w:hAnsi="Times New Roman"/>
-                <w:sz w:val="17"/>
-              </w:rPr>
-              <w:t>9,61%</w:t>
-            </w:r>
-          </w:p>
-        </w:tc>
-        <w:tc>
-          <w:tcPr>
-            <w:tcW w:type="dxa" w:w="2243"/>
-            <w:vAlign w:val="center"/>
-          </w:tcPr>
-          <w:p>
-            <w:pPr>
-              <w:keepNext/>
-              <w:spacing w:line="240" w:lineRule="auto" w:after="0"/>
-              <w:ind w:firstLine="0"/>
-              <w:jc w:val="left"/>
-            </w:pPr>
-            <w:r>
-              <w:rPr>
-                <w:rFonts w:ascii="Times New Roman" w:hAnsi="Times New Roman"/>
-                <w:sz w:val="17"/>
-              </w:rPr>
-              <w:t>R$ 274.368</w:t>
-            </w:r>
-          </w:p>
-        </w:tc>
-        <w:tc>
-          <w:tcPr>
-            <w:tcW w:type="dxa" w:w="1166"/>
-            <w:vAlign w:val="center"/>
-          </w:tcPr>
-          <w:p>
-            <w:pPr>
-              <w:keepNext/>
-              <w:spacing w:line="240" w:lineRule="auto" w:after="0"/>
-              <w:ind w:firstLine="0"/>
-              <w:jc w:val="left"/>
-            </w:pPr>
-            <w:r>
-              <w:rPr>
-                <w:rFonts w:ascii="Times New Roman" w:hAnsi="Times New Roman"/>
-                <w:sz w:val="17"/>
-              </w:rPr>
-              <w:t>6 de 11</w:t>
-            </w:r>
-          </w:p>
-        </w:tc>
-        <w:tc>
-          <w:tcPr>
-            <w:tcW w:type="dxa" w:w="1704"/>
-            <w:vAlign w:val="center"/>
-          </w:tcPr>
-          <w:p>
-            <w:pPr>
-              <w:keepNext/>
-              <w:spacing w:line="240" w:lineRule="auto" w:after="0"/>
-              <w:ind w:firstLine="0"/>
-              <w:jc w:val="left"/>
-            </w:pPr>
-            <w:r>
-              <w:rPr>
-                <w:rFonts w:ascii="Times New Roman" w:hAnsi="Times New Roman"/>
-                <w:sz w:val="17"/>
-              </w:rPr>
-              <w:t>0%</w:t>
+            <w:tcW w:type="dxa" w:w="2826"/>
+            <w:vAlign w:val="center"/>
+          </w:tcPr>
+          <w:p>
+            <w:pPr>
+              <w:keepNext/>
+              <w:spacing w:line="240" w:lineRule="auto" w:after="0"/>
+              <w:ind w:firstLine="0"/>
+              <w:jc w:val="left"/>
+            </w:pPr>
+            <w:r>
+              <w:rPr>
+                <w:rFonts w:ascii="Times New Roman" w:hAnsi="Times New Roman"/>
+                <w:sz w:val="17"/>
+              </w:rPr>
+              <w:t>Ibovespa</w:t>
+            </w:r>
+          </w:p>
+        </w:tc>
+        <w:tc>
+          <w:tcPr>
+            <w:tcW w:type="dxa" w:w="1496"/>
+            <w:vAlign w:val="center"/>
+          </w:tcPr>
+          <w:p>
+            <w:pPr>
+              <w:keepNext/>
+              <w:spacing w:line="240" w:lineRule="auto" w:after="0"/>
+              <w:ind w:firstLine="0"/>
+              <w:jc w:val="left"/>
+            </w:pPr>
+            <w:r>
+              <w:rPr>
+                <w:rFonts w:ascii="Times New Roman" w:hAnsi="Times New Roman"/>
+                <w:sz w:val="17"/>
+              </w:rPr>
+              <w:t>11,77%</w:t>
+            </w:r>
+          </w:p>
+        </w:tc>
+        <w:tc>
+          <w:tcPr>
+            <w:tcW w:type="dxa" w:w="2078"/>
+            <w:vAlign w:val="center"/>
+          </w:tcPr>
+          <w:p>
+            <w:pPr>
+              <w:keepNext/>
+              <w:spacing w:line="240" w:lineRule="auto" w:after="0"/>
+              <w:ind w:firstLine="0"/>
+              <w:jc w:val="left"/>
+            </w:pPr>
+            <w:r>
+              <w:rPr>
+                <w:rFonts w:ascii="Times New Roman" w:hAnsi="Times New Roman"/>
+                <w:sz w:val="17"/>
+              </w:rPr>
+              <w:t>R$ 340.068</w:t>
+            </w:r>
+          </w:p>
+        </w:tc>
+        <w:tc>
+          <w:tcPr>
+            <w:tcW w:type="dxa" w:w="1081"/>
+            <w:vAlign w:val="center"/>
+          </w:tcPr>
+          <w:p>
+            <w:pPr>
+              <w:keepNext/>
+              <w:spacing w:line="240" w:lineRule="auto" w:after="0"/>
+              <w:ind w:firstLine="0"/>
+              <w:jc w:val="left"/>
+            </w:pPr>
+            <w:r>
+              <w:rPr>
+                <w:rFonts w:ascii="Times New Roman" w:hAnsi="Times New Roman"/>
+                <w:sz w:val="17"/>
+              </w:rPr>
+              <w:t>7 de 11</w:t>
+            </w:r>
+          </w:p>
+        </w:tc>
+        <w:tc>
+          <w:tcPr>
+            <w:tcW w:type="dxa" w:w="1579"/>
+            <w:vAlign w:val="center"/>
+          </w:tcPr>
+          <w:p>
+            <w:pPr>
+              <w:keepNext/>
+              <w:spacing w:line="240" w:lineRule="auto" w:after="0"/>
+              <w:ind w:firstLine="0"/>
+              <w:jc w:val="left"/>
+            </w:pPr>
+            <w:r>
+              <w:rPr>
+                <w:rFonts w:ascii="Times New Roman" w:hAnsi="Times New Roman"/>
+                <w:sz w:val="17"/>
+              </w:rPr>
+              <w:t>−47,0%</w:t>
             </w:r>
           </w:p>
         </w:tc>
@@ -2044,7 +2017,117 @@
         </w:trPr>
         <w:tc>
           <w:tcPr>
-            <w:tcW w:type="dxa" w:w="2332"/>
+            <w:tcW w:type="dxa" w:w="2826"/>
+            <w:vAlign w:val="center"/>
+          </w:tcPr>
+          <w:p>
+            <w:pPr>
+              <w:keepNext/>
+              <w:spacing w:line="240" w:lineRule="auto" w:after="0"/>
+              <w:ind w:firstLine="0"/>
+              <w:jc w:val="left"/>
+            </w:pPr>
+            <w:r>
+              <w:rPr>
+                <w:rFonts w:ascii="Times New Roman" w:hAnsi="Times New Roman"/>
+                <w:sz w:val="17"/>
+              </w:rPr>
+              <w:t>CDI</w:t>
+            </w:r>
+          </w:p>
+        </w:tc>
+        <w:tc>
+          <w:tcPr>
+            <w:tcW w:type="dxa" w:w="1496"/>
+            <w:vAlign w:val="center"/>
+          </w:tcPr>
+          <w:p>
+            <w:pPr>
+              <w:keepNext/>
+              <w:spacing w:line="240" w:lineRule="auto" w:after="0"/>
+              <w:ind w:firstLine="0"/>
+              <w:jc w:val="left"/>
+            </w:pPr>
+            <w:r>
+              <w:rPr>
+                <w:rFonts w:ascii="Times New Roman" w:hAnsi="Times New Roman"/>
+                <w:sz w:val="17"/>
+              </w:rPr>
+              <w:t>9,61%</w:t>
+            </w:r>
+          </w:p>
+        </w:tc>
+        <w:tc>
+          <w:tcPr>
+            <w:tcW w:type="dxa" w:w="2078"/>
+            <w:vAlign w:val="center"/>
+          </w:tcPr>
+          <w:p>
+            <w:pPr>
+              <w:keepNext/>
+              <w:spacing w:line="240" w:lineRule="auto" w:after="0"/>
+              <w:ind w:firstLine="0"/>
+              <w:jc w:val="left"/>
+            </w:pPr>
+            <w:r>
+              <w:rPr>
+                <w:rFonts w:ascii="Times New Roman" w:hAnsi="Times New Roman"/>
+                <w:sz w:val="17"/>
+              </w:rPr>
+              <w:t>R$ 274.368</w:t>
+            </w:r>
+          </w:p>
+        </w:tc>
+        <w:tc>
+          <w:tcPr>
+            <w:tcW w:type="dxa" w:w="1081"/>
+            <w:vAlign w:val="center"/>
+          </w:tcPr>
+          <w:p>
+            <w:pPr>
+              <w:keepNext/>
+              <w:spacing w:line="240" w:lineRule="auto" w:after="0"/>
+              <w:ind w:firstLine="0"/>
+              <w:jc w:val="left"/>
+            </w:pPr>
+            <w:r>
+              <w:rPr>
+                <w:rFonts w:ascii="Times New Roman" w:hAnsi="Times New Roman"/>
+                <w:sz w:val="17"/>
+              </w:rPr>
+              <w:t>6 de 11</w:t>
+            </w:r>
+          </w:p>
+        </w:tc>
+        <w:tc>
+          <w:tcPr>
+            <w:tcW w:type="dxa" w:w="1579"/>
+            <w:vAlign w:val="center"/>
+          </w:tcPr>
+          <w:p>
+            <w:pPr>
+              <w:keepNext/>
+              <w:spacing w:line="240" w:lineRule="auto" w:after="0"/>
+              <w:ind w:firstLine="0"/>
+              <w:jc w:val="left"/>
+            </w:pPr>
+            <w:r>
+              <w:rPr>
+                <w:rFonts w:ascii="Times New Roman" w:hAnsi="Times New Roman"/>
+                <w:sz w:val="17"/>
+              </w:rPr>
+              <w:t>0%</w:t>
+            </w:r>
+          </w:p>
+        </w:tc>
+      </w:tr>
+      <w:tr>
+        <w:trPr>
+          <w:cantSplit/>
+        </w:trPr>
+        <w:tc>
+          <w:tcPr>
+            <w:tcW w:type="dxa" w:w="2826"/>
             <w:vAlign w:val="center"/>
           </w:tcPr>
           <w:p>
@@ -2065,7 +2148,7 @@
         </w:tc>
         <w:tc>
           <w:tcPr>
-            <w:tcW w:type="dxa" w:w="1615"/>
+            <w:tcW w:type="dxa" w:w="1496"/>
             <w:vAlign w:val="center"/>
           </w:tcPr>
           <w:p>
@@ -2086,7 +2169,7 @@
         </w:tc>
         <w:tc>
           <w:tcPr>
-            <w:tcW w:type="dxa" w:w="2243"/>
+            <w:tcW w:type="dxa" w:w="2078"/>
             <w:vAlign w:val="center"/>
           </w:tcPr>
           <w:p>
@@ -2107,7 +2190,7 @@
         </w:tc>
         <w:tc>
           <w:tcPr>
-            <w:tcW w:type="dxa" w:w="1166"/>
+            <w:tcW w:type="dxa" w:w="1081"/>
             <w:vAlign w:val="center"/>
           </w:tcPr>
           <w:p>
@@ -2128,7 +2211,7 @@
         </w:tc>
         <w:tc>
           <w:tcPr>
-            <w:tcW w:type="dxa" w:w="1704"/>
+            <w:tcW w:type="dxa" w:w="1579"/>
             <w:vAlign w:val="center"/>
           </w:tcPr>
           <w:p>
@@ -2167,7 +2250,15 @@
         <w:pStyle w:val="Normal"/>
       </w:pPr>
       <w:r>
-        <w:t>A coluna em reais traduz a taxa anualizada em escala econômica. Sob as hipóteses do diagnóstico, R$ 100 mil teriam terminado em R$ 609.832 na carteira, R$ 340.068 no Ibovespa e R$ 274.368 no CDI. Esses valores dependem da qualidade da série reconstruída e devem ser lidos junto com a Seção 5.2.</w:t>
+        <w:t>¹ Estimativa agregada para R$ 100 mil, com alíquota de 15%, isenção mensal quando as vendas não superam R$ 20 mil e compensação de perdas. Ela mede apenas o imposto adicional causado pelas reduções intranuais do Benevente 2; não substitui a apuração por lote nem a conciliação de notas de corretagem.</w:t>
+      </w:r>
+    </w:p>
+    <w:p>
+      <w:pPr>
+        <w:pStyle w:val="Normal"/>
+      </w:pPr>
+      <w:r>
+        <w:t>A coluna em reais traduz a taxa anualizada em escala econômica. Sob as hipóteses do diagnóstico, R$ 100 mil teriam terminado em R$ 609.832 no Benevente 1, R$ 643.774 no Benevente 2 antes do imposto incremental, R$ 340.068 no Ibovespa e R$ 274.368 no CDI. Esses valores dependem da qualidade da série reconstruída e devem ser lidos junto com a Seção 5.2.</w:t>
       </w:r>
     </w:p>
     <w:p>
@@ -2183,7 +2274,7 @@
         <w:pStyle w:val="Normal"/>
       </w:pPr>
       <w:r>
-        <w:t>O retorno veio acompanhado de risco elevado. A queda máxima diária chegou a 47,8%, praticamente igual à do Ibovespa, 47,0%, e à do BOVA11, 47,2%. Entre 2018 e 2021, a política selecionada manteve 95% em ações e concentrou essa parcela em cinco ou seis emissores. O sistema não antecipou a Covid-19 e não protegeu o capital durante a queda. A carteira sofreu quase todo o recuo do mercado e recuperou-se depois. Portanto, o resultado é incompatível com a promessa de perfil conservador e não pode ser vendido como proteção de crise.</w:t>
+        <w:t>O retorno do Benevente 1 veio acompanhado de risco elevado. A queda máxima diária chegou a 47,8%, praticamente igual à do Ibovespa, 47,0%. Entre 2018 e 2021, a política selecionada manteve 95% em ações e concentrou essa parcela em cinco ou seis emissores. O Benevente 2, hoje adotado como referência principal de acompanhamento, preservou os mesmos ativos e reduziu a exposição somente depois de estresse observado, levando a queda máxima retrospectiva a 28,7%. A maior perda ocorreu na Covid-19; fora desse episódio, as quedas observadas foram menores. Isso torna a versão 2 mais compatível com uma política equilibrada, mas a amostra não permite classificá-la como conservadora nem afirmar proteção futura.</w:t>
       </w:r>
     </w:p>
     <w:p>
@@ -2709,7 +2800,7 @@
         <w:pStyle w:val="Normal"/>
       </w:pPr>
       <w:r>
-        <w:t>A reamostragem pareada preserva, em cada sorteio, o mesmo ano da estratégia e dos comparadores. Em 100 mil amostras, a probabilidade interna de excesso positivo foi alta, mas o intervalo de 95% ainda cruzou zero contra CDI, Ibovespa e BOVA11. Somente a comparação com a implementação específica de MVO permaneceu positiva em todo o intervalo. Isso não autoriza concluir que o Benevente supera esses referenciais na população; mostra apenas que a ordenação observada não dependeu de um único ano sorteado repetidamente.</w:t>
+        <w:t>A reamostragem pareada preserva, em cada sorteio, o mesmo ano da estratégia e dos comparadores. Em 100 mil amostras, a probabilidade interna de excesso positivo foi alta, mas o intervalo de 95% ainda cruzou zero contra CDI e Ibovespa. Somente a comparação com a implementação específica de MVO permaneceu positiva em todo o intervalo. Isso não autoriza concluir que o Benevente supera esses referenciais na população; mostra apenas que a ordenação observada não dependeu de um único ano sorteado repetidamente.</w:t>
       </w:r>
     </w:p>
     <w:p>
@@ -3052,7 +3143,7 @@
           </w:tcPr>
           <w:p>
             <w:pPr>
-              <w:keepNext/>
+              <w:keepNext w:val="0"/>
               <w:spacing w:line="240" w:lineRule="auto" w:after="0"/>
               <w:ind w:firstLine="0"/>
               <w:jc w:val="left"/>
@@ -3073,7 +3164,7 @@
           </w:tcPr>
           <w:p>
             <w:pPr>
-              <w:keepNext/>
+              <w:keepNext w:val="0"/>
               <w:spacing w:line="240" w:lineRule="auto" w:after="0"/>
               <w:ind w:firstLine="0"/>
               <w:jc w:val="left"/>
@@ -3094,7 +3185,7 @@
           </w:tcPr>
           <w:p>
             <w:pPr>
-              <w:keepNext/>
+              <w:keepNext w:val="0"/>
               <w:spacing w:line="240" w:lineRule="auto" w:after="0"/>
               <w:ind w:firstLine="0"/>
               <w:jc w:val="left"/>
@@ -3115,7 +3206,7 @@
           </w:tcPr>
           <w:p>
             <w:pPr>
-              <w:keepNext/>
+              <w:keepNext w:val="0"/>
               <w:spacing w:line="240" w:lineRule="auto" w:after="0"/>
               <w:ind w:firstLine="0"/>
               <w:jc w:val="left"/>
@@ -3126,95 +3217,6 @@
                 <w:sz w:val="17"/>
               </w:rPr>
               <w:t>−1,31 a +14,28 p.p.</w:t>
-            </w:r>
-          </w:p>
-        </w:tc>
-      </w:tr>
-      <w:tr>
-        <w:trPr>
-          <w:cantSplit/>
-        </w:trPr>
-        <w:tc>
-          <w:tcPr>
-            <w:tcW w:type="dxa" w:w="1639"/>
-            <w:vAlign w:val="center"/>
-          </w:tcPr>
-          <w:p>
-            <w:pPr>
-              <w:keepNext w:val="0"/>
-              <w:spacing w:line="240" w:lineRule="auto" w:after="0"/>
-              <w:ind w:firstLine="0"/>
-              <w:jc w:val="left"/>
-            </w:pPr>
-            <w:r>
-              <w:rPr>
-                <w:rFonts w:ascii="Times New Roman" w:hAnsi="Times New Roman"/>
-                <w:sz w:val="17"/>
-              </w:rPr>
-              <w:t>BOVA11</w:t>
-            </w:r>
-          </w:p>
-        </w:tc>
-        <w:tc>
-          <w:tcPr>
-            <w:tcW w:type="dxa" w:w="2795"/>
-            <w:vAlign w:val="center"/>
-          </w:tcPr>
-          <w:p>
-            <w:pPr>
-              <w:keepNext w:val="0"/>
-              <w:spacing w:line="240" w:lineRule="auto" w:after="0"/>
-              <w:ind w:firstLine="0"/>
-              <w:jc w:val="left"/>
-            </w:pPr>
-            <w:r>
-              <w:rPr>
-                <w:rFonts w:ascii="Times New Roman" w:hAnsi="Times New Roman"/>
-                <w:sz w:val="17"/>
-              </w:rPr>
-              <w:t>94,3%</w:t>
-            </w:r>
-          </w:p>
-        </w:tc>
-        <w:tc>
-          <w:tcPr>
-            <w:tcW w:type="dxa" w:w="2795"/>
-            <w:vAlign w:val="center"/>
-          </w:tcPr>
-          <w:p>
-            <w:pPr>
-              <w:keepNext w:val="0"/>
-              <w:spacing w:line="240" w:lineRule="auto" w:after="0"/>
-              <w:ind w:firstLine="0"/>
-              <w:jc w:val="left"/>
-            </w:pPr>
-            <w:r>
-              <w:rPr>
-                <w:rFonts w:ascii="Times New Roman" w:hAnsi="Times New Roman"/>
-                <w:sz w:val="17"/>
-              </w:rPr>
-              <w:t>+5,98 p.p.</w:t>
-            </w:r>
-          </w:p>
-        </w:tc>
-        <w:tc>
-          <w:tcPr>
-            <w:tcW w:type="dxa" w:w="1831"/>
-            <w:vAlign w:val="center"/>
-          </w:tcPr>
-          <w:p>
-            <w:pPr>
-              <w:keepNext w:val="0"/>
-              <w:spacing w:line="240" w:lineRule="auto" w:after="0"/>
-              <w:ind w:firstLine="0"/>
-              <w:jc w:val="left"/>
-            </w:pPr>
-            <w:r>
-              <w:rPr>
-                <w:rFonts w:ascii="Times New Roman" w:hAnsi="Times New Roman"/>
-                <w:sz w:val="17"/>
-              </w:rPr>
-              <w:t>−1,34 a +14,41 p.p.</w:t>
             </w:r>
           </w:p>
         </w:tc>
@@ -4305,7 +4307,7 @@
         <w:pStyle w:val="Normal"/>
       </w:pPr>
       <w:r>
-        <w:t>Proteção intranual concebida depois da Covid-19. O Benevente 2 reduz a exposição após estresse de queda e volatilidade do Ibovespa. No histórico, a queda máxima recuou de 47,8% para 28,7%, sem diferença detectável de retorno entre 2019 e 2025 (p = 0,964). Por perfil, a proteção reduziu a queda de 18,9% para 9,9% no conservador, de 28,1% para 17,9% no equilibrado e de 37,6% para 29,3% no arrojado, com pequena redução do CAGR. Em 5.000 reamostragens de blocos, o percentil adverso de 2,5% chegou a 14,2%, 27,7% e 49,1%. A regra foi registrada em 20 de agosto de 2026 para acompanhamento em 2027. Ela permanece retrospectiva, sem imposto intranual, e não integra o resultado principal.</w:t>
+        <w:t>Proteção intranual concebida depois da Covid-19. O Benevente 2 reduz a exposição após estresse de queda e volatilidade do Ibovespa. No histórico, a queda máxima recuou de 47,8% para 28,7%. A configuração escolhida somente com 2015–2018 também elevou o CAGR de 17,86% para 18,45%, mas a diferença anual de retorno em 2019–2025 não foi detectável (p = 0,964). Para R$ 100 mil, a estimativa agregada do imposto incremental das reduções foi de R$ 2.195 e levou o valor terminal estimado de R$ 643.774 para R$ 634.531, antes da tributação já pertencente à revisão anual. A regra é a referência principal para a carteira-sombra; sua evidência histórica permanece retrospectiva.</w:t>
       </w:r>
     </w:p>
     <w:p>
@@ -5480,7 +5482,7 @@
         <w:pStyle w:val="Normal"/>
       </w:pPr>
       <w:r>
-        <w:t>O uso começa pela política da instituição. Depois de escolher o perfil e aceitar seus limites, o usuário vê quais arquivos e demonstrações estavam disponíveis e quais passaram na validação. A triagem mostra aprovados e reprovados com o respectivo motivo. A carteira candidata apresenta pesos, parcela defensiva, custo e comparação com CDI, Ibovespa, BOVA11 e MVO. Em seguida, o profissional revisa a tese em linguagem natural, registra riscos, aprova ou rejeita a proposta e informa a justificativa. O dossiê final reúne esse percurso e a versão da regra. Laboratório e documento de decisão são, portanto, duas vistas do mesmo registro, e não etapas desconectadas.</w:t>
+        <w:t>O uso começa pela política equilibrada em estudo. O usuário vê quais arquivos e demonstrações estavam disponíveis e quais passaram na validação. A triagem mostra aprovados e reprovados com o respectivo motivo. A carteira candidata apresenta pesos, parcela defensiva, custo e comparação com CDI, Ibovespa e MVO. Em seguida, o profissional revisa a tese em linguagem natural, registra riscos, aprova ou rejeita a proposta e informa a justificativa. O dossiê final reúne esse percurso e a versão da regra. Laboratório e documento de decisão são, portanto, duas vistas do mesmo registro, e não etapas desconectadas.</w:t>
       </w:r>
     </w:p>
     <w:p>
@@ -6198,15 +6200,15 @@
         <w:pStyle w:val="Normal"/>
       </w:pPr>
       <w:r>
-        <w:t>A terceira é econômica. A queda máxima diária chegou a 47,8%, nível incompatível com um perfil conservador e ligeiramente pior que os 47,0% do Ibovespa. O protótipo não demonstrou proteção de capital. A extensão de controle de risco concebida depois da Covid-19 é retrospectiva, não tem imposto intranual conciliado e não demonstrou retorno adicional.</w:t>
-      </w:r>
-    </w:p>
-    <w:p>
-      <w:pPr>
-        <w:pStyle w:val="Normal"/>
-      </w:pPr>
-      <w:r>
-        <w:t>Por fim, o produto não elimina responsabilidade profissional. Uso comercial exige enquadramento regulatório, política de suitability, segurança, contrato de fontes e aprovação humana. O modelo de linguagem não antecipou a Covid-19, não seleciona ativos e não define pesos. Notícias também não entram no protocolo atual porque não há, neste experimento, um arquivo histórico com horário de publicação e corte verificável.</w:t>
+        <w:t>A terceira é econômica. A queda máxima diária do Benevente 1 chegou a 47,8%, ligeiramente pior que os 47,0% do Ibovespa. O Benevente 2 reduziu essa marca retrospectiva para 28,7% e melhorou o retorno pontual, mas foi concebido depois da Covid-19, não possui imposto intranual conciliado por lote e ainda não demonstrou benefício prospectivo.</w:t>
+      </w:r>
+    </w:p>
+    <w:p>
+      <w:pPr>
+        <w:pStyle w:val="Normal"/>
+      </w:pPr>
+      <w:r>
+        <w:t>Por fim, o produto não elimina responsabilidade profissional. Uso comercial exige enquadramento regulatório, política de suitability, segurança, contrato de fontes e aprovação humana. O modelo de linguagem não antecipou a Covid-19, não seleciona ativos e não define pesos. O radar atual lê e classifica notícias com Gemini para alerta humano, mas não participa do retorno histórico nem muda a carteira.</w:t>
       </w:r>
     </w:p>
     <w:p>
@@ -6431,25 +6433,6 @@
       </w:r>
       <w:r>
         <w:t>(5), 28–43. https://doi.org/10.2469/faj.v48.n5.28</w:t>
-      </w:r>
-    </w:p>
-    <w:p>
-      <w:pPr>
-        <w:pStyle w:val="Normal"/>
-        <w:ind w:left="425" w:hanging="425"/>
-        <w:jc w:val="left"/>
-      </w:pPr>
-      <w:r>
-        <w:t xml:space="preserve">BlackRock. (2026). </w:t>
-      </w:r>
-      <w:r>
-        <w:rPr>
-          <w:i/>
-        </w:rPr>
-        <w:t>iShares Ibovespa Fundo de Índice (BOVA11): factsheet</w:t>
-      </w:r>
-      <w:r>
-        <w:t>. https://www.blackrock.com/br/literature/fact-sheet/bova11-ishares-ibovespa-fundo-de-ndice-fund-fact-sheet-pt-lm.pdf</w:t>
       </w:r>
     </w:p>
     <w:p>

</xml_diff>

<commit_message>
Consolida estágio e hierarquia das estratégias
</commit_message>
<xml_diff>
--- a/outputs/Benevente_Wealth_System_BTECH_Final.docx
+++ b/outputs/Benevente_Wealth_System_BTECH_Final.docx
@@ -1284,7 +1284,7 @@
         <w:pStyle w:val="Normal"/>
       </w:pPr>
       <w:r>
-        <w:t>A versão anual Benevente 1 foi registrada em 16 de agosto de 2026, com hash e data no repositório. O Benevente 2 e o protocolo de acompanhamento receberam registros próprios depois das respectivas mudanças. O Benevente 2 é a estratégia principal em acompanhamento, enquanto o Benevente 1 permanece como base de seleção anual. Para sustentar uma conclusão futura, a versão precisa superar CDI e Ibovespa após custos e tributos aplicáveis, manter queda máxima inferior a 35% e acumular pelo menos três anos de observações posteriores ao registro. Não existe resultado prospectivo suficiente na data deste artigo. A carteira formada em janeiro de 2026 é apenas carteira-sombra, pois antecede os registros. Uma regra não poderá ser alterada depois de observado um resultado desfavorável sem que a mudança constitua nova versão e nova contagem.</w:t>
+        <w:t>A versão anual Benevente 1 foi registrada em 16 de agosto de 2026, com hash e data no repositório. O Benevente 2 e o protocolo de acompanhamento receberam registros próprios depois das respectivas mudanças. O Benevente 1 permanece como a regra anual publicada. O Benevente 2 é a extensão de risco acompanhada em carteira-sombra desde 2026; seu histórico de 2015 a 2025 continua sendo diagnóstico retrospectivo, não validação prospectiva. Para sustentar uma conclusão futura, a versão precisa superar CDI e Ibovespa após custos e tributos aplicáveis, manter queda máxima inferior a 35% e acumular pelo menos três anos de observações posteriores ao registro. Não existe resultado prospectivo suficiente na data deste artigo. A carteira formada em janeiro de 2026 é apenas carteira-sombra, pois antecede os registros. Uma regra não poderá ser alterada depois de observado um resultado desfavorável sem que a mudança constitua nova versão e nova contagem.</w:t>
       </w:r>
     </w:p>
     <w:p>
@@ -2274,7 +2274,7 @@
         <w:pStyle w:val="Normal"/>
       </w:pPr>
       <w:r>
-        <w:t>O retorno do Benevente 1 veio acompanhado de risco elevado. A queda máxima diária chegou a 47,8%, praticamente igual à do Ibovespa, 47,0%. Entre 2018 e 2021, a política selecionada manteve 95% em ações e concentrou essa parcela em cinco ou seis emissores. O Benevente 2, hoje adotado como referência principal de acompanhamento, preservou os mesmos ativos e reduziu a exposição somente depois de estresse observado, levando a queda máxima retrospectiva a 28,7%. A maior perda ocorreu na Covid-19; fora desse episódio, as quedas observadas foram menores. Isso torna a versão 2 mais compatível com uma política equilibrada, mas a amostra não permite classificá-la como conservadora nem afirmar proteção futura.</w:t>
+        <w:t>O retorno do Benevente 1 veio acompanhado de risco elevado. A queda máxima diária chegou a 47,8%, praticamente igual à do Ibovespa, 47,0%. Entre 2018 e 2021, a política selecionada manteve 95% em ações e concentrou essa parcela em cinco ou seis emissores. O Benevente 2, extensão de risco hoje acompanhada em carteira-sombra, preservou os mesmos ativos e reduziu a exposição somente depois de estresse observado, levando a queda máxima retrospectiva a 28,7%. A maior perda ocorreu na Covid-19; fora desse episódio, as quedas observadas foram menores. Isso torna a versão 2 mais compatível com uma política equilibrada, mas a amostra não permite classificá-la como conservadora nem afirmar proteção futura.</w:t>
       </w:r>
     </w:p>
     <w:p>
@@ -4307,7 +4307,7 @@
         <w:pStyle w:val="Normal"/>
       </w:pPr>
       <w:r>
-        <w:t>Proteção intranual concebida depois da Covid-19. O Benevente 2 reduz a exposição após estresse de queda e volatilidade do Ibovespa. No histórico, a queda máxima recuou de 47,8% para 28,7%. A configuração escolhida somente com 2015–2018 também elevou o CAGR de 17,86% para 18,45%, mas a diferença anual de retorno em 2019–2025 não foi detectável (p = 0,964). Para R$ 100 mil, a estimativa agregada do imposto incremental das reduções foi de R$ 2.195 e levou o valor terminal estimado de R$ 643.774 para R$ 634.531, antes da tributação já pertencente à revisão anual. A regra é a referência principal para a carteira-sombra; sua evidência histórica permanece retrospectiva.</w:t>
+        <w:t>Proteção intranual concebida depois da Covid-19. O Benevente 2 reduz a exposição após estresse de queda e volatilidade do Ibovespa. No histórico, a queda máxima recuou de 47,8% para 28,7%. A configuração escolhida somente com 2015–2018 também elevou o CAGR de 17,86% para 18,45%, mas a diferença anual de retorno em 2019–2025 não foi detectável (p = 0,964). Para R$ 100 mil, a estimativa agregada do imposto incremental das reduções foi de R$ 2.195 e levou o valor terminal estimado de R$ 643.774 para R$ 634.531, antes da tributação já pertencente à revisão anual. A extensão é acompanhada em carteira-sombra desde 2026; sua evidência histórica permanece retrospectiva.</w:t>
       </w:r>
     </w:p>
     <w:p>

</xml_diff>

<commit_message>
outputs/ regenerado das fontes atualizadas (resultado posterior incluído)
- BTech: .docx reconstruído de paper/fucape_btech_2026.md e exportado a
  PDF via LibreOffice; IEEE: _Final.tex copiado de paper/ieee_cifer_2027.tex
  e compilado com Tectonic 0.17.0; suplemento anônimo reconstruído
  (byte-idêntico — build determinístico).
- Conferido por extração de texto nos dois PDFs: Seção 4.1.1, 256
  candidatos, DSR 0,777, hash fc5521f1 e a frase de contrato da fronteira.
- Removido outputs/Benevente_Quant_AI_IEEE.tex (cópia de 20/08 sem o
  resultado posterior, sem referências) e os intermediários .aux/.log/.out.
- Checklist de submissão atualizado: a nota de "precisa regenerar" virou
  registro de quando e como foi regenerado.
</commit_message>
<xml_diff>
--- a/outputs/Benevente_Wealth_System_BTECH_Final.docx
+++ b/outputs/Benevente_Wealth_System_BTECH_Final.docx
@@ -59,7 +59,7 @@
         <w:ind w:firstLine="0"/>
       </w:pPr>
       <w:r>
-        <w:t>Decisões de carteira precisam continuar explicáveis depois de executadas. Este trabalho constrói e avalia o Benevente Wealth System, um artefato que registra os dados admitidos, a regra quantitativa, a carteira proposta, a explicação e a aprovação humana. A pesquisa segue design science e combina testes funcionais, auditoria adversarial e diagnóstico sequencial de onze decisões entre 2015 e 2025. Sete controles capazes de impedir inflação artificial dos resultados foram incorporados. A auditoria também revelou que 13,9% da exposição acumulada a ações dependia de proventos imputados. A tentativa de reconstruir 56 observações ativo-ano com fechamentos brutos e eventos da página atual da B3 comparou 54, encontrou sete divergências superiores a cinco pontos percentuais e deixou duas sem resposta. O sistema recusou o selo de reconciliação. Os retornos são, portanto, diagnóstico de desenvolvimento, não validação comercial. Na reamostragem pareada, os intervalos de 95% do excesso de retorno cruzam zero contra CDI e Ibovespa. O Benevente 1 foi registrado em 16 de agosto de 2026; extensões posteriores não herdam essa data. O modelo de linguagem não demonstrou ganho de retorno e permanece restrito à explicação. A contribuição comprovada é separar, de forma verificável, dado, cálculo, linguagem e responsabilidade.</w:t>
+        <w:t>Decisões de carteira precisam continuar explicáveis depois de executadas. Este trabalho constrói e avalia o Benevente Wealth System, um artefato que registra os dados admitidos, a regra quantitativa, a carteira proposta, a explicação e a aprovação humana. A pesquisa segue design science e combina testes funcionais, auditoria adversarial e diagnóstico sequencial de onze decisões entre 2015 e 2025. Sete controles capazes de impedir inflação artificial dos resultados foram incorporados. A auditoria também revelou que 13,9% da exposição acumulada a ações dependia de proventos imputados. A reconstrução de 56 observações ativo-ano com eventos da página atual da B3 comparou 54, achou sete divergências acima de cinco pontos percentuais e deixou duas sem resposta; o selo de reconciliação foi recusado. Os retornos são, portanto, diagnóstico de desenvolvimento, não validação comercial. Na reamostragem pareada, os intervalos de 95% do excesso de retorno cruzam zero contra CDI e Ibovespa. O Benevente 1 foi registrado em 16 de agosto de 2026; extensões posteriores não herdam essa data. Atualização posterior (25/08/2026): a seleção aninhada foi aposentada por medição — 36 → 256 candidatos custou 2,63 p.p. ao ano — e a política vigente é declarada e congelada por perfil (Seção 4.1.1). O modelo de linguagem não demonstrou ganho de retorno e permanece restrito à explicação. A contribuição comprovada é separar, de forma verificável, dado, cálculo, linguagem e responsabilidade.</w:t>
       </w:r>
     </w:p>
     <w:p>
@@ -91,7 +91,7 @@
         <w:pStyle w:val="Normal"/>
       </w:pPr>
       <w:r>
-        <w:t>Este trabalho parte de um problema operacional: a recomendação é produzida hoje, mas pode precisar ser defendida anos depois. Sem preservar o dado admitido, a versão da regra e a aprovação, a justificativa posterior pode incorporar informações inexistentes na decisão. O Benevente produz a proposta e seu registro verificável. A intensidade do problema e a disposição a pagar ainda precisam ser medidas em piloto. O artigo não atribui ao artefato impacto regional ou demanda comercial não observados.</w:t>
+        <w:t>O problema é operacional: a recomendação é produzida hoje e defendida anos depois; sem preservar dado admitido, versão da regra e aprovação, a justificativa posterior incorpora informação que não existia. O Benevente produz proposta e registro verificável no mesmo fluxo. Intensidade do problema e disposição a pagar ainda dependem de piloto; o artigo não presume impacto regional nem demanda.</w:t>
       </w:r>
     </w:p>
     <w:p>
@@ -146,7 +146,7 @@
         <w:pStyle w:val="Normal"/>
       </w:pPr>
       <w:r>
-        <w:t>Planilhas sem controle de versão podem sobrescrever estados, misturar regra e dado e perder autoria. Sistemas fechados podem entregar uma carteira sem evidenciar o critério. O artefato deve permitir que uma pessoa independente refaça a decisão sem depender da memória de quem a produziu.</w:t>
+        <w:t>Planilha sobrescreve estado e perde autoria; sistema fechado entrega carteira sem evidenciar critério. O artefato deve permitir que um terceiro refaça a decisão sem depender da memória de quem a produziu.</w:t>
       </w:r>
     </w:p>
     <w:p>
@@ -178,7 +178,7 @@
         <w:pStyle w:val="Normal"/>
       </w:pPr>
       <w:r>
-        <w:t>O público inicial do Benevente são escritórios de investimento, consultorias de valores mobiliários e estruturas de gestão patrimonial que precisam recomendar, revisar e defender carteiras. Nesse ambiente, a dificuldade não termina quando o peso de cada ativo é calculado. A instituição precisa preservar o contexto da decisão, demonstrar por que um ativo foi aceito ou recusado e comparar o resultado com alternativas reconhecíveis pelo cliente. O piloto comercial proposto poderá ser realizado no Espírito Santo por conveniência e aderência ao congresso, mas sua função será medir o problema e a utilidade do artefato, não confirmar antecipadamente um efeito sobre a economia local.</w:t>
+        <w:t>O público inicial são escritórios de investimento, consultorias de valores mobiliários e gestão patrimonial que precisam recomendar, revisar e defender carteiras: preservar o contexto da decisão, demonstrar por que cada ativo entrou ou não, e comparar com alternativas reconhecíveis pelo cliente. O piloto comercial proposto poderá ser realizado no Espírito Santo por conveniência e aderência ao congresso, mas sua função será medir o problema e a utilidade do artefato, não confirmar antecipadamente um efeito sobre a economia local.</w:t>
       </w:r>
     </w:p>
     <w:p>
@@ -220,7 +220,7 @@
         <w:pStyle w:val="Normal"/>
       </w:pPr>
       <w:r>
-        <w:t>Os estudos recentes também recomendam separar utilidade narrativa de capacidade preditiva. Perlin et al. (2025) executaram 30 mil simulações com 1.522 empresas anonimizadas e não encontraram superioridade consistente do Gemini sobre 1/N ou S&amp;P 500, sobretudo em horizontes longos. Pelster e Val (2024) adotaram um experimento ao vivo, desenho mais adequado para evitar conhecimento posterior. Kim, Muhn e Nikolaev (2024) reportam que modelos podem extrair informações narrativas úteis de demonstrativos anonimizados, sem que isso implique alfa de negociação. Li et al. (2026), no FINSABER, mostram que vantagens aparentes se deterioram em universos amplos, horizontes longos e regimes distintos. FINCON (Yu et al., 2024) inspira a divisão de responsabilidades, não autonomia de negociação. Esse conjunto sustenta a escolha do Benevente: a regra determinística calcula, o modelo apenas explica fatos aprovados e sua utilidade será avaliada prospectivamente.</w:t>
+        <w:t>A literatura recente separa utilidade narrativa de capacidade preditiva: Perlin et al. (2025), com 30 mil simulações e 1.522 empresas anonimizadas, não encontram superioridade consistente de LLM sobre 1/N ou S&amp;P 500; Pelster e Val (2024) defendem o experimento ao vivo contra conhecimento posterior; Kim, Muhn e Nikolaev (2024) mostram extração narrativa útil sem alfa de negociação; Li et al. (2026, FINSABER) veem vantagens aparentes se deteriorarem em universos amplos e regimes distintos; FINCON (Yu et al., 2024) inspira divisão de responsabilidades, não autonomia. Esse conjunto sustenta a escolha do Benevente: a regra calcula, o modelo apenas explica fatos aprovados, e a utilidade será avaliada prospectivamente.</w:t>
       </w:r>
     </w:p>
     <w:p>
@@ -871,7 +871,7 @@
         <w:pStyle w:val="Normal"/>
       </w:pPr>
       <w:r>
-        <w:t>Preços deslistados exigem tratamento de eventos societários sem a ajuda do provedor. A primeira versão detectava razões de preço redondas e obteve precisão de 88,1%, mas recall de apenas 23,3% contra o arquivo de eventos disponível. Para retirar essa heurística da posição de fonte principal, uma nova rotina consultou diretamente a página pública da B3 (B3, 2026b). A página respondeu para 475 das 497 séries. Depois de excluir eventos anteriores ao intervalo realmente observado de cada código, o arquivo contém 9.772 registros, 127 subscrições e 153 eventos manuais. Vinte e dois códigos não foram devolvidos. A auditoria também corrigiu uma interpretação indevida: resposta do endpoint não significa cobertura histórica completa. Entre as 56 observações ativo-ano efetivamente mantidas, 54 puderam ser reconstruídas com o arquivo atual; sete divergiram do retorno ajustado publicado em mais de cinco pontos percentuais e duas observações de MRFG3 ficaram sem resposta. Nenhum evento manual coincidiu com uma posição aberta. A série publicada não foi requalificada: ela continua como dado de pesquisa até que uma base histórica primária ou licenciada consiga reproduzir cada retorno desde o preço bruto.</w:t>
+        <w:t>Preços deslistados exigem eventos societários sem ajuda do provedor. O detector de razões redondas obteve precisão de 88,1% e recall de 23,3%; para tirá-lo da posição de fonte principal, uma rotina consultou a página pública da B3 (2026b), que respondeu para 475 das 497 séries — 9.772 registros, 127 subscrições, 153 eventos manuais; 22 códigos sem resposta. Resposta do endpoint não significa cobertura histórica completa. Entre as 56 observações ativo-ano efetivamente mantidas, 54 puderam ser reconstruídas com o arquivo atual; sete divergiram do retorno ajustado publicado em mais de cinco pontos percentuais e duas observações de MRFG3 ficaram sem resposta. Nenhum evento manual coincidiu com uma posição aberta. A série publicada não foi requalificada: ela continua como dado de pesquisa até que uma base histórica primária ou licenciada consiga reproduzir cada retorno desde o preço bruto.</w:t>
       </w:r>
     </w:p>
     <w:p>
@@ -920,7 +920,7 @@
         <w:pStyle w:val="Normal"/>
       </w:pPr>
       <w:r>
-        <w:t>Depois da triagem, cada ativo recebe um escore comparável dentro do universo disponível naquele janeiro. A estratégia publicada faz um corte nos melhores emissores, mantém apenas uma classe por emissor e distribui o orçamento de renda variável proporcionalmente ao escore, sujeito ao número de posições e aos limites da configuração. O saldo fica no CDI. A configuração completa — família de fatores, número de posições e orçamento de ações — é escolhida anualmente pelo desempenho ajustado ao risco nos anos já encerrados. A otimização média-variância não define essa carteira. Ela é calculada de modo independente, sobre o mesmo universo elegível, para medir o que uma carteira puramente quantitativa de média e covariância teria produzido.</w:t>
+        <w:t>Depois da triagem, cada ativo recebe um escore comparável dentro do universo disponível naquele janeiro. A estratégia publicada faz um corte nos melhores emissores, mantém apenas uma classe por emissor e distribui o orçamento de renda variável proporcionalmente ao escore, sujeito ao número de posições e aos limites da configuração. O saldo fica no CDI. No período aqui avaliado, a configuração completa — família de fatores, número de posições e orçamento de ações — era escolhida ano a ano pela seleção aninhada da Seção 4.1; desde 25/08/2026 ela é declarada e congelada por perfil (Seção 4.1.1).</w:t>
       </w:r>
     </w:p>
     <w:p>
@@ -952,23 +952,23 @@
         <w:pStyle w:val="Normal"/>
       </w:pPr>
       <w:r>
-        <w:t>A cadência anual é uma hipótese coerente com a natureza do sinal e, neste estudo, uma escolha empiricamente testada. Qualidade, retorno sobre capital, alavancagem e geração de caixa são grandezas divulgadas em ciclos contábeis e cuja tese econômica precisa de tempo para aparecer no preço. Uma troca mensal baseada nelas pode vender uma empresa antes que a melhora operacional seja reconhecida e aumenta o número de decisões que precisam ser justificadas. A revisão em janeiro também cria uma fronteira operacional simples: tudo o que foi publicado até a data pode entrar; tudo o que veio depois pertence ao próximo ciclo.</w:t>
-      </w:r>
-    </w:p>
-    <w:p>
-      <w:pPr>
-        <w:pStyle w:val="Normal"/>
-      </w:pPr>
-      <w:r>
-        <w:t>Anual não significa que o sistema ignora o risco durante doze meses. Preços, concentração, liquidez e eventos materiais podem ser monitorados continuamente, e uma política institucional pode prever um gatilho extraordinário. Significa apenas que a reseleção sistemática da cesta acontece uma vez por ano. No teste de robustez, mantendo regra e dados constantes, a reseleção anual superou as versões trimestral e mensal antes mesmo dos custos. Com apenas onze anos pareados, isso não prova que a frequência anual seja universalmente ótima; mostra que não houve evidência para substituir a regra mais simples nesta amostra.</w:t>
-      </w:r>
-    </w:p>
-    <w:p>
-      <w:pPr>
-        <w:pStyle w:val="Normal"/>
-      </w:pPr>
-      <w:r>
-        <w:t>Notícias não entram no retorno histórico deste estudo. No acompanhamento corrente, um radar com Gemini lê fontes públicas, deduplica ocorrências e classifica alertas para revisão humana. Ele não altera ativos nem pesos. Avaliar se notícias acrescentam valor preditivo exige um braço prospectivo separado, com horário de publicação, corte verificável e decisões arquivadas antes do desfecho. Misturar notícias retrospectivamente ao protocolo anual criaria uma nova oportunidade de usar informação futura.</w:t>
+        <w:t>A cadência anual é coerente com o sinal e foi testada: fundamentos são divulgados em ciclos contábeis e a tese precisa de tempo para aparecer no preço; troca mensal vende a empresa antes do reconhecimento e multiplica decisões a justificar. A revisão em janeiro cria uma fronteira simples — o publicado até a data entra, o resto pertence ao próximo ciclo.</w:t>
+      </w:r>
+    </w:p>
+    <w:p>
+      <w:pPr>
+        <w:pStyle w:val="Normal"/>
+      </w:pPr>
+      <w:r>
+        <w:t>Anual não significa ignorar risco por doze meses — preço, concentração, liquidez e eventos seguem monitorados, e uma política institucional pode prever gatilho extraordinário; significa que a reseleção sistemática ocorre uma vez ao ano. Mantidas regra e dados, a cadência anual superou trimestral e mensal antes dos custos; onze anos pareados não provam otimalidade, apenas ausência de evidência para trocar a regra mais simples.</w:t>
+      </w:r>
+    </w:p>
+    <w:p>
+      <w:pPr>
+        <w:pStyle w:val="Normal"/>
+      </w:pPr>
+      <w:r>
+        <w:t>Notícias não entram no retorno histórico. No acompanhamento corrente, um radar com Gemini lê fontes públicas e classifica alertas para revisão humana, sem alterar ativos ou pesos; avaliá-las exige braço prospectivo com horário de publicação e decisões arquivadas antes do desfecho — misturá-las retrospectivamente reabriria o uso de informação futura.</w:t>
       </w:r>
     </w:p>
     <w:p>
@@ -1154,6 +1154,30 @@
     </w:p>
     <w:p>
       <w:pPr>
+        <w:pStyle w:val="Normal"/>
+      </w:pPr>
+      <w:r>
+        <w:t>4.1.1 Resultado posterior: o limite de capacidade da própria busca (25/08/2026)</w:t>
+      </w:r>
+    </w:p>
+    <w:p>
+      <w:pPr>
+        <w:pStyle w:val="Normal"/>
+      </w:pPr>
+      <w:r>
+        <w:t>Após o fechamento deste texto, a defesa da Seção 4.1 foi testada em si mesma: com insumos, código e janela idênticos (as 36 configurações compartilhadas reproduzem com diferença máxima de 5,6×10⁻¹⁷), a mesma seleção aninhada sobre 256 candidatos rendeu 12,68% ao ano contra 15,31% da grade de 36, e o Sharpe deflacionado caiu de 0,957 para 0,777, abaixo da significância — o máximo esperado sob a hipótese nula subiu de 0,375 para 0,746. Em 2018, o seletor amplo dedicou o ano a uma configuração que rendeu −7,2% contra 6,4% do CDI. A seleção aninhada tem, portanto, um limite de capacidade: dez observações anuais não ranqueiam 256 candidatos, e ultrapassá-lo degrada em silêncio a garantia que o protocolo oferece.</w:t>
+      </w:r>
+    </w:p>
+    <w:p>
+      <w:pPr>
+        <w:pStyle w:val="Normal"/>
+      </w:pPr>
+      <w:r>
+        <w:t>A resposta foi declarar em vez de buscar: uma configuração por perfil — conservador (35% em ações, 12 emissores), equilibrado (55%, 8) e arrojado (75%, 5), com um quinto do orçamento de ações num fundo B3 do S&amp;P 500 em reais — congelada no registro benevente_profile_ladder_v2 (SHA-256 fc5521f1…), com assinante, critério de falseamento e amostra confirmatória a partir de 2027. No diagnóstico 2015–2025, cada perfil bateu o CDI em 8 de 11 anos, com quedas máximas de −9,2%, −17,9% e −28,9% sob a camada de proteção. O experimento completo está em manuscrito próprio (declared_over_searched_2026), e todo número publicado é conferido por máquina contra os artefatos. A mesma auditoria corrigiu a referência do Ibovespa para a série datada de origem (11,74% a.a., queda de −46,8%), após constatar deriva na curva rebaseada do motor.</w:t>
+      </w:r>
+    </w:p>
+    <w:p>
+      <w:pPr>
         <w:pStyle w:val="Heading2"/>
       </w:pPr>
       <w:r>
@@ -1308,15 +1332,15 @@
         <w:pStyle w:val="Normal"/>
       </w:pPr>
       <w:r>
-        <w:t>O artefato produziu, para cada decisão anual, um registro com fontes, hashes, elegibilidade, ranking, pesos, custos estimados, comparadores e justificativa. Os testes de integridade recusaram arquivos alterados, pesos que não somavam 100%, ordens acima do limite de liquidez e fundamentos recebidos depois da decisão. A auditoria adversarial descrita na Seção 5.7 encontrou sete defeitos no próprio processo de pesquisa. Corrigi-los mudou as métricas, o que demonstra que o registro é capaz de contestar o resultado que o sistema produz.</w:t>
-      </w:r>
-    </w:p>
-    <w:p>
-      <w:pPr>
-        <w:pStyle w:val="Normal"/>
-      </w:pPr>
-      <w:r>
-        <w:t>A Tabela 2 apresenta o diagnóstico financeiro de onze decisões, de 2015 a 2025, líquido de custos estimados. Ele descreve o comportamento do protótipo durante o desenvolvimento. Não é validação prospectiva nem demonstração de que a carteira repetirá o desempenho.</w:t>
+        <w:t>Cada decisão anual saiu com fontes, hashes, elegibilidade, ranking, pesos, custos, comparadores e justificativa; os testes de integridade recusaram arquivo alterado, peso que não soma 100%, ordem acima da liquidez e fundamento recebido após a decisão. A auditoria adversarial (Seção 5.7) achou sete defeitos no próprio processo, e corrigi-los mudou as métricas — o registro contesta o resultado que o sistema produz.</w:t>
+      </w:r>
+    </w:p>
+    <w:p>
+      <w:pPr>
+        <w:pStyle w:val="Normal"/>
+      </w:pPr>
+      <w:r>
+        <w:t>A Tabela 2 apresenta o diagnóstico de onze decisões (2015–2025), líquido de custos estimados: comportamento do protótipo no desenvolvimento, não validação prospectiva nem promessa de repetição.</w:t>
       </w:r>
     </w:p>
     <w:p>
@@ -3634,15 +3658,39 @@
         <w:pStyle w:val="Normal"/>
       </w:pPr>
       <w:r>
-        <w:t>Cinco hipóteses foram testadas e nenhuma se sustentou de forma suficiente para substituir a política principal. Elas são publicadas porque um artefato que só reporta o que deu certo não é auditável.</w:t>
-      </w:r>
-    </w:p>
-    <w:p>
-      <w:pPr>
-        <w:pStyle w:val="Normal"/>
-      </w:pPr>
-      <w:r>
-        <w:t>Previsão anual de regime. Testamos se indicadores disponíveis em janeiro, entre prêmio de lucro sobre o CDI, nível do CDI, retorno e volatilidade do mercado nos doze meses anteriores e distância do topo, anteciparam se o ano seria de ações ou de caixa. Sobre 8 anos, o melhor preditor acertou 3 de 4 chamadas efetivas, com p de 0,31 contra cara-ou-coroa. Um acerto de 75% em quatro tentativas não distingue habilidade de sorte. O prêmio disponível para quem acertasse todas as chamadas era de 6,5 pontos percentuais ao ano, e permanece inalcançável. Sem sinal.</w:t>
+        <w:t>Oito hipóteses foram testadas e nenhuma se sustentou de forma suficiente para substituir a política principal. Elas são publicadas porque um artefato que só reporta o que deu certo não é auditável.</w:t>
+      </w:r>
+    </w:p>
+    <w:p>
+      <w:pPr>
+        <w:pStyle w:val="Normal"/>
+      </w:pPr>
+      <w:r>
+        <w:t>Ampliar a busca de configurações. Ver Seção 4.1.1: 36 → 256 candidatos custou 2,63 pontos percentuais ao ano e a significância. É a rejeição que reorganizou o protocolo.</w:t>
+      </w:r>
+    </w:p>
+    <w:p>
+      <w:pPr>
+        <w:pStyle w:val="Normal"/>
+      </w:pPr>
+      <w:r>
+        <w:t>Pesar pelo inverso da volatilidade. Contra o peso publicado, perdeu em 8 de 8 configurações — 0,95 ponto de queda a menos por 2,11 pontos de retorno — e piorou o pior ano justamente nas cestas largas onde deveria ajudar.</w:t>
+      </w:r>
+    </w:p>
+    <w:p>
+      <w:pPr>
+        <w:pStyle w:val="Normal"/>
+      </w:pPr>
+      <w:r>
+        <w:t>Meta de volatilidade em janeiro. Cortou exposição em 5 de 13 anos, sempre depois de um estresse e nunca antes: 2020 rodou cheio e a queda máxima não mudou um dia; 2016 foi cortado a 8,8% de ações num ano de +35%.</w:t>
+      </w:r>
+    </w:p>
+    <w:p>
+      <w:pPr>
+        <w:pStyle w:val="Normal"/>
+      </w:pPr>
+      <w:r>
+        <w:t>Previsão anual de regime. Cinco indicadores disponíveis em janeiro (prêmio de lucro sobre o CDI, nível do CDI, retorno e volatilidade de doze meses, distância do topo) tentaram antecipar se o ano seria de ações ou de caixa. O melhor acertou 3 de 4 chamadas (p = 0,31): sorte e habilidade indistinguíveis, com prêmio potencial de 6,5 p.p. ao ano inalcançado. Sem sinal.</w:t>
       </w:r>
     </w:p>
     <w:p>
@@ -3658,7 +3706,7 @@
         <w:pStyle w:val="Normal"/>
       </w:pPr>
       <w:r>
-        <w:t>Reseleção mais frequente da cesta. A objeção seguinte é diferente da anterior e precisa ser separada dela: não se a proporção entre ações e caixa deve mudar mais vezes, que é o que o parágrafo acima rejeita, mas se a própria cesta deveria ser retriada, reordenada e reotimizada mais vezes por ano. Testamos três cadências com a mesma regra, os mesmos limites e o mesmo painel, variando apenas as datas de decisão.</w:t>
+        <w:t>Reseleção mais frequente da cesta. Questão distinta da anterior: não a proporção ações/caixa, mas se a própria cesta deveria ser retriada mais vezes por ano. Três cadências, mesma regra, mesmos limites, mesmo painel; só as datas de decisão variam.</w:t>
       </w:r>
     </w:p>
     <w:p>
@@ -4283,15 +4331,15 @@
         <w:pStyle w:val="Normal"/>
       </w:pPr>
       <w:r>
-        <w:t>Nenhuma cadência mais rápida superou a anual. Pareando por ano-calendário, a trimestral fica 1,55 ponto percentual abaixo ao ano após imposto, com p de 0,376, e a mensal 3,27 pontos abaixo, com p de 0,306. A leitura correta é que não há evidência de que decidir mais vezes ajude, e não que esteja provado que atrapalhe: onze anos pareados não sustentam a afirmação mais forte.</w:t>
-      </w:r>
-    </w:p>
-    <w:p>
-      <w:pPr>
-        <w:pStyle w:val="Normal"/>
-      </w:pPr>
-      <w:r>
-        <w:t>A diferença surgiu antes dos custos: o retorno bruto caiu 4,66 pontos da cadência anual para a mensal. O sinal combina qualidade, valor e momento, grandezas de maturação lenta. O modelo tributário subestima o imposto do braço mensal ao não acompanhar o lote vendido; esse viés favorece a alternativa que mesmo assim não venceu.</w:t>
+        <w:t>Nenhuma cadência mais rápida superou a anual: pareada por ano-calendário e após imposto, a trimestral fica 1,55 p.p. abaixo (p = 0,376) e a mensal 3,27 (p = 0,306). A leitura correta é ausência de evidência a favor, não prova de prejuízo.</w:t>
+      </w:r>
+    </w:p>
+    <w:p>
+      <w:pPr>
+        <w:pStyle w:val="Normal"/>
+      </w:pPr>
+      <w:r>
+        <w:t>A diferença nasce antes dos custos — o bruto cai 4,66 pontos de anual para mensal; o sinal amadurece devagar. O modelo tributário até favorece o braço mensal, que mesmo assim não venceu.</w:t>
       </w:r>
     </w:p>
     <w:p>
@@ -5530,7 +5578,7 @@
         <w:pStyle w:val="Normal"/>
       </w:pPr>
       <w:r>
-        <w:t>A Tabela 9 delimita o que pode ser afirmado na data da submissão. Ela também serve como contrato de comunicação para a demonstração do produto.</w:t>
+        <w:t>A Tabela 9 delimita o que pode ser afirmado na submissão e é o contrato de comunicação da demonstração.</w:t>
       </w:r>
     </w:p>
     <w:p>
@@ -6160,7 +6208,7 @@
         <w:pStyle w:val="Normal"/>
       </w:pPr>
       <w:r>
-        <w:t>A matriz converge com a literatura externa. A ausência de alfa atribuído ao modelo é compatível com Perlin et al. (2025) e com o desgaste de vantagens em testes longos descrito por Li et al. (2026). O valor narrativo ainda plausível acompanha Kim et al. (2024), mas não autoriza pesos. A linha prospectiva adota a exigência empírica ilustrada por Pelster e Val (2024). Assim, cada achado externo reforça uma fronteira do artefato: cálculo determinístico, explicação limitada e responsabilidade humana.</w:t>
+        <w:t>A matriz converge com a literatura: sem alfa do modelo (Perlin et al., 2025; Li et al., 2026), valor narrativo plausível sem autorizar pesos (Kim et al., 2024), exigência prospectiva (Pelster &amp; Val, 2024). Cada achado externo reforça uma fronteira do artefato.</w:t>
       </w:r>
     </w:p>
     <w:p>
@@ -6184,7 +6232,7 @@
         <w:pStyle w:val="Normal"/>
       </w:pPr>
       <w:r>
-        <w:t>A primeira limitação é temporal. Onze decisões anuais são poucas, e a janela avaliada também serviu ao desenvolvimento. O prêmio de retrospectiva de 0,65 ponto percentual e o Sharpe deflacionado tratam parte do risco de múltiplas tentativas, mas não equivalem a validação prospectiva. A reamostragem também não cria regimes que a história não contém.</w:t>
+        <w:t>A primeira limitação é temporal: onze decisões anuais são poucas, e a janela também serviu ao desenvolvimento. O prêmio de retrospectiva de 0,65 ponto percentual e o Sharpe deflacionado tratam parte do risco de múltiplas tentativas, mas não equivalem a validação prospectiva. A reamostragem também não cria regimes que a história não contém.</w:t>
       </w:r>
     </w:p>
     <w:p>
@@ -6208,7 +6256,7 @@
         <w:pStyle w:val="Normal"/>
       </w:pPr>
       <w:r>
-        <w:t>Por fim, o produto não elimina responsabilidade profissional. Uso comercial exige enquadramento regulatório, política de suitability, segurança, contrato de fontes e aprovação humana. O modelo de linguagem não antecipou a Covid-19, não seleciona ativos e não define pesos. O radar atual lê e classifica notícias com Gemini para alerta humano, mas não participa do retorno histórico nem muda a carteira.</w:t>
+        <w:t>Por fim, o produto não elimina responsabilidade profissional: uso comercial exige enquadramento regulatório, suitability, segurança, contrato de fontes e aprovação humana. O modelo de linguagem não antecipou a Covid-19, não seleciona ativos e não define pesos. O radar atual lê e classifica notícias com Gemini para alerta humano, mas não participa do retorno histórico nem muda a carteira.</w:t>
       </w:r>
     </w:p>
     <w:p>
@@ -6224,7 +6272,7 @@
         <w:pStyle w:val="Normal"/>
       </w:pPr>
       <w:r>
-        <w:t>O passo científico prioritário é acumular decisões depois do registro congelado. Em paralelo, uma versão institucional precisará adquirir ou construir um livro histórico de eventos capaz de cobrir os 22 códigos não devolvidos e reproduzir as sete diferenças materiais encontradas no escopo da estratégia. A reamostragem em blocos já mede dependência serial curta; testes seguintes devem acrescentar trajetórias sintéticas com regimes de baixa prolongada que não estejam limitadas à ordem histórica. Simulação não substitui observação futura. Um estudo com notícias deve ser registrado como braço separado, com frequência trimestral ou orientada a eventos e horário verificável. O passo de produto é um piloto silencioso, sem execução automática, capaz de medir tempo, completude documental, divergência de custos, compreensão do usuário e disposição a pagar.</w:t>
+        <w:t>O passo científico prioritário é acumular decisões após o registro congelado. Em paralelo, uma versão institucional precisará adquirir ou construir um livro histórico de eventos capaz de cobrir os 22 códigos não devolvidos e reproduzir as sete diferenças materiais encontradas no escopo da estratégia. A reamostragem em blocos já mede dependência serial curta; testes seguintes devem acrescentar trajetórias sintéticas com regimes de baixa prolongada que não estejam limitadas à ordem histórica. Simulação não substitui observação futura. Um estudo com notícias deve ser registrado como braço separado, com frequência trimestral ou orientada a eventos e horário verificável. O passo de produto é um piloto silencioso, sem execução automática, capaz de medir tempo, completude documental, divergência de custos, compreensão do usuário e disposição a pagar.</w:t>
       </w:r>
     </w:p>
     <w:p>
@@ -6248,15 +6296,26 @@
         <w:pStyle w:val="Normal"/>
       </w:pPr>
       <w:r>
-        <w:t>No diagnóstico de 2015 a 2025, a carteira apresentou retorno anualizado superior aos comparadores e queda máxima semelhante à do mercado. A incerteza da amostra e a dependência parcial de séries imputadas impedem tratar essa diferença como superioridade comprovada. Os testes negativos são informativos: a frequência anual não perdeu para reseleções mais rápidas, o modelo de linguagem não acrescentou retorno e a alocação direta por texto produziu carteiras aritmeticamente inconsistentes em parte dos anos. Esses achados justificam um sistema em que a matemática calcula a alocação, a linguagem ajuda a compreendê-la e uma pessoa conserva a responsabilidade final.</w:t>
-      </w:r>
-    </w:p>
-    <w:p>
-      <w:pPr>
-        <w:pStyle w:val="Normal"/>
-      </w:pPr>
-      <w:r>
-        <w:t>A conclusão comprovada é mais estreita e mais defensável que a versão anterior do artigo: o artefato cria uma cadeia auditável e usa essa cadeia para descobrir erros que mudam o próprio resultado. A tentativa de reconciliação é parte desse resultado porque o sistema recusou uma fonte primária incapaz de reproduzir integralmente a série publicada. A viabilidade comercial será confirmada somente se um piloto mostrar ganho de tempo, completude documental, compreensão e disposição a pagar. A validade financeira exigirá uma base histórica reconciliável e dados posteriores ao registro; a política de risco começa sua amostra confirmatória em 2027. Até lá, o desempenho histórico permanece diagnóstico de desenvolvimento.</w:t>
+        <w:t>No diagnóstico 2015–2025, o retorno anualizado superou os comparadores com queda máxima semelhante à do mercado; incerteza amostral e imputação parcial impedem tratar isso como superioridade comprovada. Os negativos são informativos — reselecionar mais rápido não ajudou, o modelo de linguagem não acrescentou retorno, a alocação direta por texto saiu aritmeticamente inconsistente em parte dos anos, e a própria busca de configurações se degradou ao ser ampliada (Seção 4.1.1). Justifica-se um sistema em que a matemática calcula, a linguagem explica e uma pessoa responde.</w:t>
+      </w:r>
+    </w:p>
+    <w:p>
+      <w:pPr>
+        <w:pStyle w:val="Normal"/>
+      </w:pPr>
+      <w:r>
+        <w:t>A conclusão comprovada é estreita e defensável: o artefato cria uma cadeia auditável e a usa para descobrir erros que mudam o próprio resultado — inclusive recusando uma fonte primária incapaz de reproduzir a série publicada. A viabilidade comercial será confirmada somente se um piloto mostrar ganho de tempo, completude documental, compreensão e disposição a pagar. A validade financeira exigirá uma base histórica reconciliável e dados posteriores ao registro; a política de risco começa sua amostra confirmatória em 2027. Até lá, o desempenho histórico permanece diagnóstico de desenvolvimento.</w:t>
+      </w:r>
+    </w:p>
+    <w:p>
+      <w:pPr>
+        <w:pStyle w:val="Normal"/>
+      </w:pPr>
+      <w:r>
+        <w:t>Nota (25/08/2026).</w:t>
+      </w:r>
+      <w:r>
+        <w:t xml:space="preserve"> O ciclo de auditoria alcançou o próprio protocolo: a busca aninhada foi aposentada por medição (Seção 4.1.1) e substituída por políticas declaradas e congeladas por perfil. Os números aqui reportados permanecem reprodutíveis e descrevem a regra do período; o que muda é a alegação — de "escolher sem ler a resposta" para "medir o limite dessa escolha e declarar quando ele é atingido".</w:t>
       </w:r>
     </w:p>
     <w:p>
@@ -6547,25 +6606,6 @@
       </w:r>
       <w:r>
         <w:t>(1), 1–22. https://doi.org/10.1016/j.jfineco.2014.10.010</w:t>
-      </w:r>
-    </w:p>
-    <w:p>
-      <w:pPr>
-        <w:pStyle w:val="Normal"/>
-        <w:ind w:left="425" w:hanging="425"/>
-        <w:jc w:val="left"/>
-      </w:pPr>
-      <w:r>
-        <w:t xml:space="preserve">Harvey, C. R., Liu, Y., &amp; Zhu, H. (2016). … and the cross-section of expected returns. </w:t>
-      </w:r>
-      <w:r>
-        <w:rPr>
-          <w:i/>
-        </w:rPr>
-        <w:t>Review of Financial Studies, 29</w:t>
-      </w:r>
-      <w:r>
-        <w:t>(1), 5–68. https://doi.org/10.1093/rfs/hhv059</w:t>
       </w:r>
     </w:p>
     <w:p>

</xml_diff>